<commit_message>
Fix docx: embed screenshot and apply black-gold aesthetic
</commit_message>
<xml_diff>
--- a/assignment_1/DOCUMENTATION.docx
+++ b/assignment_1/DOCUMENTATION.docx
@@ -2,89 +2,227 @@
 <file path=word/document.xml><?xml version="1.0" encoding="utf-8"?>
 <w:document xmlns:wpc="http://schemas.microsoft.com/office/word/2010/wordprocessingCanvas" xmlns:mo="http://schemas.microsoft.com/office/mac/office/2008/main" xmlns:mc="http://schemas.openxmlformats.org/markup-compatibility/2006" xmlns:mv="urn:schemas-microsoft-com:mac:vml" xmlns:o="urn:schemas-microsoft-com:office:office" xmlns:r="http://schemas.openxmlformats.org/officeDocument/2006/relationships" xmlns:m="http://schemas.openxmlformats.org/officeDocument/2006/math" xmlns:v="urn:schemas-microsoft-com:vml" xmlns:wp14="http://schemas.microsoft.com/office/word/2010/wordprocessingDrawing" xmlns:wp="http://schemas.openxmlformats.org/drawingml/2006/wordprocessingDrawing" xmlns:w10="urn:schemas-microsoft-com:office:word" xmlns:w="http://schemas.openxmlformats.org/wordprocessingml/2006/main" xmlns:w14="http://schemas.microsoft.com/office/word/2010/wordml" xmlns:wpg="http://schemas.microsoft.com/office/word/2010/wordprocessingGroup" xmlns:wpi="http://schemas.microsoft.com/office/word/2010/wordprocessingInk" xmlns:wne="http://schemas.microsoft.com/office/word/2006/wordml" xmlns:wps="http://schemas.microsoft.com/office/word/2010/wordprocessingShape" mc:Ignorable="w14 wp14">
   <w:body>
+    <w:tbl>
+      <w:tblPr>
+        <w:tblW w:type="auto" w:w="0"/>
+        <w:jc w:val="center"/>
+        <w:tblLook w:firstColumn="1" w:firstRow="1" w:lastColumn="0" w:lastRow="0" w:noHBand="0" w:noVBand="1" w:val="04A0"/>
+      </w:tblPr>
+      <w:tblGrid>
+        <w:gridCol w:w="9072"/>
+      </w:tblGrid>
+      <w:tr>
+        <w:tc>
+          <w:tcPr>
+            <w:tcW w:type="dxa" w:w="8640"/>
+            <w:shd w:fill="0a0a0a"/>
+            <w:tcBorders>
+              <w:top w:val="single" w:sz="12" w:color="d4af37"/>
+              <w:left w:val="single" w:sz="12" w:color="d4af37"/>
+              <w:bottom w:val="single" w:sz="12" w:color="d4af37"/>
+              <w:right w:val="single" w:sz="12" w:color="d4af37"/>
+            </w:tcBorders>
+          </w:tcPr>
+          <w:p>
+            <w:pPr>
+              <w:jc w:val="center"/>
+            </w:pPr>
+            <w:r>
+              <w:rPr>
+                <w:rFonts w:ascii="Arial" w:hAnsi="Arial"/>
+                <w:b/>
+                <w:color w:val="D4AF37"/>
+                <w:sz w:val="56"/>
+              </w:rPr>
+              <w:br/>
+              <w:br/>
+              <w:t>COMMUNITY BOARD GAME</w:t>
+              <w:br/>
+              <w:t>LENDING LIBRARY</w:t>
+              <w:br/>
+            </w:r>
+            <w:r>
+              <w:rPr>
+                <w:rFonts w:ascii="Arial" w:hAnsi="Arial"/>
+                <w:b/>
+                <w:color w:val="FFDF80"/>
+                <w:sz w:val="32"/>
+              </w:rPr>
+              <w:t>Dart Console Application</w:t>
+              <w:br/>
+              <w:br/>
+            </w:r>
+            <w:r>
+              <w:rPr>
+                <w:rFonts w:ascii="Arial" w:hAnsi="Arial"/>
+                <w:b w:val="0"/>
+                <w:color w:val="E6E6E6"/>
+                <w:sz w:val="26"/>
+              </w:rPr>
+              <w:t>Name: Soumitra Deshpande</w:t>
+              <w:br/>
+            </w:r>
+            <w:r>
+              <w:rPr>
+                <w:rFonts w:ascii="Arial" w:hAnsi="Arial"/>
+                <w:b w:val="0"/>
+                <w:color w:val="E6E6E6"/>
+                <w:sz w:val="26"/>
+              </w:rPr>
+              <w:t>Roll No: 150096724035</w:t>
+              <w:br/>
+            </w:r>
+            <w:r>
+              <w:rPr>
+                <w:rFonts w:ascii="Arial" w:hAnsi="Arial"/>
+                <w:b w:val="0"/>
+                <w:color w:val="E6E6E6"/>
+                <w:sz w:val="24"/>
+              </w:rPr>
+              <w:t>Environment: Dart SDK 3.x</w:t>
+              <w:br/>
+              <w:br/>
+            </w:r>
+            <w:r>
+              <w:rPr>
+                <w:rFonts w:ascii="Arial" w:hAnsi="Arial"/>
+                <w:b w:val="0"/>
+                <w:color w:val="D4AF37"/>
+                <w:sz w:val="22"/>
+              </w:rPr>
+              <w:t>August 2026</w:t>
+              <w:br/>
+              <w:br/>
+            </w:r>
+          </w:p>
+        </w:tc>
+      </w:tr>
+    </w:tbl>
     <w:p>
-      <w:pPr>
-        <w:pStyle w:val="Title"/>
-        <w:jc w:val="center"/>
-      </w:pPr>
       <w:r>
-        <w:t>Community Board Game Lending Library</w:t>
+        <w:br w:type="page"/>
       </w:r>
     </w:p>
     <w:p>
-      <w:pPr>
-        <w:jc w:val="center"/>
-      </w:pPr>
       <w:r>
         <w:rPr>
-          <w:b/>
-          <w:sz w:val="24"/>
+          <w:rFonts w:ascii="Arial" w:hAnsi="Arial"/>
+          <w:b w:val="0"/>
+          <w:color w:val="E6E6E6"/>
+          <w:sz w:val="22"/>
         </w:rPr>
-        <w:t>Assignment 1 — Dart Console Application</w:t>
-        <w:br/>
       </w:r>
       <w:r>
         <w:rPr>
+          <w:rFonts w:ascii="Arial" w:hAnsi="Arial"/>
+          <w:b/>
+          <w:color w:val="FFDF80"/>
           <w:sz w:val="22"/>
-        </w:rPr>
-        <w:t>Name: Soumitra Deshpande</w:t>
-        <w:br/>
-        <w:t>Roll No: 150096724035</w:t>
-        <w:br/>
-        <w:t>Environment: Dart SDK 3.x</w:t>
-      </w:r>
-    </w:p>
-    <w:p/>
-    <w:p>
-      <w:r/>
-      <w:r>
-        <w:rPr>
-          <w:b/>
         </w:rPr>
         <w:t>Assignment 1 — Dart Console Application</w:t>
       </w:r>
       <w:r>
+        <w:rPr>
+          <w:rFonts w:ascii="Arial" w:hAnsi="Arial"/>
+          <w:b w:val="0"/>
+          <w:color w:val="E6E6E6"/>
+          <w:sz w:val="22"/>
+        </w:rPr>
         <w:t xml:space="preserve">  </w:t>
       </w:r>
     </w:p>
     <w:p>
-      <w:r/>
       <w:r>
         <w:rPr>
+          <w:rFonts w:ascii="Arial" w:hAnsi="Arial"/>
+          <w:b w:val="0"/>
+          <w:color w:val="E6E6E6"/>
+          <w:sz w:val="22"/>
+        </w:rPr>
+      </w:r>
+      <w:r>
+        <w:rPr>
+          <w:rFonts w:ascii="Arial" w:hAnsi="Arial"/>
           <w:b/>
+          <w:color w:val="FFDF80"/>
+          <w:sz w:val="22"/>
         </w:rPr>
         <w:t>Name:</w:t>
       </w:r>
       <w:r>
+        <w:rPr>
+          <w:rFonts w:ascii="Arial" w:hAnsi="Arial"/>
+          <w:b w:val="0"/>
+          <w:color w:val="E6E6E6"/>
+          <w:sz w:val="22"/>
+        </w:rPr>
         <w:t xml:space="preserve"> Soumitra Deshpande  </w:t>
       </w:r>
     </w:p>
     <w:p>
-      <w:r/>
       <w:r>
         <w:rPr>
+          <w:rFonts w:ascii="Arial" w:hAnsi="Arial"/>
+          <w:b w:val="0"/>
+          <w:color w:val="E6E6E6"/>
+          <w:sz w:val="22"/>
+        </w:rPr>
+      </w:r>
+      <w:r>
+        <w:rPr>
+          <w:rFonts w:ascii="Arial" w:hAnsi="Arial"/>
           <w:b/>
+          <w:color w:val="FFDF80"/>
+          <w:sz w:val="22"/>
         </w:rPr>
         <w:t>Roll No:</w:t>
       </w:r>
       <w:r>
+        <w:rPr>
+          <w:rFonts w:ascii="Arial" w:hAnsi="Arial"/>
+          <w:b w:val="0"/>
+          <w:color w:val="E6E6E6"/>
+          <w:sz w:val="22"/>
+        </w:rPr>
         <w:t xml:space="preserve"> 150096724035  </w:t>
       </w:r>
     </w:p>
     <w:p>
-      <w:r/>
       <w:r>
         <w:rPr>
+          <w:rFonts w:ascii="Arial" w:hAnsi="Arial"/>
+          <w:b w:val="0"/>
+          <w:color w:val="E6E6E6"/>
+          <w:sz w:val="22"/>
+        </w:rPr>
+      </w:r>
+      <w:r>
+        <w:rPr>
+          <w:rFonts w:ascii="Arial" w:hAnsi="Arial"/>
           <w:b/>
+          <w:color w:val="FFDF80"/>
+          <w:sz w:val="22"/>
         </w:rPr>
         <w:t>Environment:</w:t>
       </w:r>
       <w:r>
+        <w:rPr>
+          <w:rFonts w:ascii="Arial" w:hAnsi="Arial"/>
+          <w:b w:val="0"/>
+          <w:color w:val="E6E6E6"/>
+          <w:sz w:val="22"/>
+        </w:rPr>
         <w:t xml:space="preserve"> Dart SDK 3.x</w:t>
       </w:r>
     </w:p>
     <w:p>
       <w:r>
+        <w:rPr>
+          <w:rFonts w:ascii="Arial" w:hAnsi="Arial"/>
+          <w:b w:val="0"/>
+          <w:color w:val="E6E6E6"/>
+          <w:sz w:val="22"/>
+        </w:rPr>
         <w:t>---</w:t>
       </w:r>
     </w:p>
@@ -98,15 +236,30 @@
     </w:p>
     <w:p>
       <w:r>
+        <w:rPr>
+          <w:rFonts w:ascii="Arial" w:hAnsi="Arial"/>
+          <w:b w:val="0"/>
+          <w:color w:val="E6E6E6"/>
+          <w:sz w:val="22"/>
+        </w:rPr>
         <w:t xml:space="preserve">This project models a </w:t>
       </w:r>
       <w:r>
         <w:rPr>
+          <w:rFonts w:ascii="Arial" w:hAnsi="Arial"/>
           <w:b/>
+          <w:color w:val="FFDF80"/>
+          <w:sz w:val="22"/>
         </w:rPr>
         <w:t>community board game lending library</w:t>
       </w:r>
       <w:r>
+        <w:rPr>
+          <w:rFonts w:ascii="Arial" w:hAnsi="Arial"/>
+          <w:b w:val="0"/>
+          <w:color w:val="E6E6E6"/>
+          <w:sz w:val="22"/>
+        </w:rPr>
         <w:t xml:space="preserve"> as a console application in Dart. Instead of the usual physical/digital book catalog, it manages tabletop games: board games, card games, and RPG manuals. The app demonstrates variables, control flow, loops, functions, and object-oriented inheritance in a clean, modular way.</w:t>
       </w:r>
     </w:p>
@@ -120,26 +273,56 @@
     </w:p>
     <w:p>
       <w:r>
+        <w:rPr>
+          <w:rFonts w:ascii="Arial" w:hAnsi="Arial"/>
+          <w:b w:val="0"/>
+          <w:color w:val="E6E6E6"/>
+          <w:sz w:val="22"/>
+        </w:rPr>
         <w:t>- Model real-world game lending with an abstract base class and subclasses.</w:t>
       </w:r>
     </w:p>
     <w:p>
       <w:r>
+        <w:rPr>
+          <w:rFonts w:ascii="Arial" w:hAnsi="Arial"/>
+          <w:b w:val="0"/>
+          <w:color w:val="E6E6E6"/>
+          <w:sz w:val="22"/>
+        </w:rPr>
         <w:t>- Use `List&lt;Game&gt;` for the catalog and `Map&lt;String, Member&gt;` for member lookup.</w:t>
       </w:r>
     </w:p>
     <w:p>
       <w:r>
+        <w:rPr>
+          <w:rFonts w:ascii="Arial" w:hAnsi="Arial"/>
+          <w:b w:val="0"/>
+          <w:color w:val="E6E6E6"/>
+          <w:sz w:val="22"/>
+        </w:rPr>
         <w:t>- Implement named parameters, default values, and typed return values.</w:t>
       </w:r>
     </w:p>
     <w:p>
       <w:r>
+        <w:rPr>
+          <w:rFonts w:ascii="Arial" w:hAnsi="Arial"/>
+          <w:b w:val="0"/>
+          <w:color w:val="E6E6E6"/>
+          <w:sz w:val="22"/>
+        </w:rPr>
         <w:t>- Use `for`, `while`, and `for-in` loops for different operations.</w:t>
       </w:r>
     </w:p>
     <w:p>
       <w:r>
+        <w:rPr>
+          <w:rFonts w:ascii="Arial" w:hAnsi="Arial"/>
+          <w:b w:val="0"/>
+          <w:color w:val="E6E6E6"/>
+          <w:sz w:val="22"/>
+        </w:rPr>
         <w:t>---</w:t>
       </w:r>
     </w:p>
@@ -153,31 +336,60 @@
     </w:p>
     <w:tbl>
       <w:tblPr>
-        <w:tblStyle w:val="LightGrid-Accent1"/>
+        <w:tblStyle w:val="TableGrid"/>
         <w:tblW w:type="auto" w:w="0"/>
+        <w:jc w:val="center"/>
         <w:tblLook w:firstColumn="1" w:firstRow="1" w:lastColumn="0" w:lastRow="0" w:noHBand="0" w:noVBand="1" w:val="04A0"/>
       </w:tblPr>
       <w:tblGrid>
-        <w:gridCol w:w="4320"/>
-        <w:gridCol w:w="4320"/>
+        <w:gridCol w:w="4536"/>
+        <w:gridCol w:w="4536"/>
       </w:tblGrid>
       <w:tr>
         <w:tc>
           <w:tcPr>
-            <w:tcW w:type="dxa" w:w="4320"/>
+            <w:tcW w:type="dxa" w:w="4536"/>
+            <w:shd w:fill="d4af37"/>
+            <w:tcBorders>
+              <w:top w:val="single" w:sz="6" w:color="d4af37"/>
+              <w:left w:val="single" w:sz="6" w:color="d4af37"/>
+              <w:bottom w:val="single" w:sz="6" w:color="d4af37"/>
+              <w:right w:val="single" w:sz="6" w:color="d4af37"/>
+            </w:tcBorders>
           </w:tcPr>
           <w:p>
+            <w:r/>
             <w:r>
+              <w:rPr>
+                <w:rFonts w:ascii="Arial" w:hAnsi="Arial"/>
+                <w:b/>
+                <w:color w:val="0A0A0A"/>
+                <w:sz w:val="22"/>
+              </w:rPr>
               <w:t>Concept</w:t>
             </w:r>
           </w:p>
         </w:tc>
         <w:tc>
           <w:tcPr>
-            <w:tcW w:type="dxa" w:w="4320"/>
+            <w:tcW w:type="dxa" w:w="4536"/>
+            <w:shd w:fill="d4af37"/>
+            <w:tcBorders>
+              <w:top w:val="single" w:sz="6" w:color="d4af37"/>
+              <w:left w:val="single" w:sz="6" w:color="d4af37"/>
+              <w:bottom w:val="single" w:sz="6" w:color="d4af37"/>
+              <w:right w:val="single" w:sz="6" w:color="d4af37"/>
+            </w:tcBorders>
           </w:tcPr>
           <w:p>
+            <w:r/>
             <w:r>
+              <w:rPr>
+                <w:rFonts w:ascii="Arial" w:hAnsi="Arial"/>
+                <w:b/>
+                <w:color w:val="0A0A0A"/>
+                <w:sz w:val="22"/>
+              </w:rPr>
               <w:t>Usage in Project</w:t>
             </w:r>
           </w:p>
@@ -186,20 +398,48 @@
       <w:tr>
         <w:tc>
           <w:tcPr>
-            <w:tcW w:type="dxa" w:w="4320"/>
+            <w:tcW w:type="dxa" w:w="4536"/>
+            <w:shd w:fill="1e1e1e"/>
+            <w:tcBorders>
+              <w:top w:val="single" w:sz="4" w:color="d4af37"/>
+              <w:left w:val="single" w:sz="4" w:color="d4af37"/>
+              <w:bottom w:val="single" w:sz="4" w:color="d4af37"/>
+              <w:right w:val="single" w:sz="4" w:color="d4af37"/>
+            </w:tcBorders>
           </w:tcPr>
           <w:p>
+            <w:r/>
             <w:r>
+              <w:rPr>
+                <w:rFonts w:ascii="Arial" w:hAnsi="Arial"/>
+                <w:b w:val="0"/>
+                <w:color w:val="E6E6E6"/>
+                <w:sz w:val="22"/>
+              </w:rPr>
               <w:t>**Variables**</w:t>
             </w:r>
           </w:p>
         </w:tc>
         <w:tc>
           <w:tcPr>
-            <w:tcW w:type="dxa" w:w="4320"/>
+            <w:tcW w:type="dxa" w:w="4536"/>
+            <w:shd w:fill="1e1e1e"/>
+            <w:tcBorders>
+              <w:top w:val="single" w:sz="4" w:color="d4af37"/>
+              <w:left w:val="single" w:sz="4" w:color="d4af37"/>
+              <w:bottom w:val="single" w:sz="4" w:color="d4af37"/>
+              <w:right w:val="single" w:sz="4" w:color="d4af37"/>
+            </w:tcBorders>
           </w:tcPr>
           <w:p>
+            <w:r/>
             <w:r>
+              <w:rPr>
+                <w:rFonts w:ascii="Arial" w:hAnsi="Arial"/>
+                <w:b w:val="0"/>
+                <w:color w:val="E6E6E6"/>
+                <w:sz w:val="22"/>
+              </w:rPr>
               <w:t>`String`, `int`, `double`, `bool`, `List&lt;Game&gt;`, `Map&lt;String, Member&gt;`</w:t>
             </w:r>
           </w:p>
@@ -208,20 +448,48 @@
       <w:tr>
         <w:tc>
           <w:tcPr>
-            <w:tcW w:type="dxa" w:w="4320"/>
+            <w:tcW w:type="dxa" w:w="4536"/>
+            <w:shd w:fill="1e1e1e"/>
+            <w:tcBorders>
+              <w:top w:val="single" w:sz="4" w:color="d4af37"/>
+              <w:left w:val="single" w:sz="4" w:color="d4af37"/>
+              <w:bottom w:val="single" w:sz="4" w:color="d4af37"/>
+              <w:right w:val="single" w:sz="4" w:color="d4af37"/>
+            </w:tcBorders>
           </w:tcPr>
           <w:p>
+            <w:r/>
             <w:r>
+              <w:rPr>
+                <w:rFonts w:ascii="Arial" w:hAnsi="Arial"/>
+                <w:b w:val="0"/>
+                <w:color w:val="E6E6E6"/>
+                <w:sz w:val="22"/>
+              </w:rPr>
               <w:t>**Null Safety**</w:t>
             </w:r>
           </w:p>
         </w:tc>
         <w:tc>
           <w:tcPr>
-            <w:tcW w:type="dxa" w:w="4320"/>
+            <w:tcW w:type="dxa" w:w="4536"/>
+            <w:shd w:fill="1e1e1e"/>
+            <w:tcBorders>
+              <w:top w:val="single" w:sz="4" w:color="d4af37"/>
+              <w:left w:val="single" w:sz="4" w:color="d4af37"/>
+              <w:bottom w:val="single" w:sz="4" w:color="d4af37"/>
+              <w:right w:val="single" w:sz="4" w:color="d4af37"/>
+            </w:tcBorders>
           </w:tcPr>
           <w:p>
+            <w:r/>
             <w:r>
+              <w:rPr>
+                <w:rFonts w:ascii="Arial" w:hAnsi="Arial"/>
+                <w:b w:val="0"/>
+                <w:color w:val="E6E6E6"/>
+                <w:sz w:val="22"/>
+              </w:rPr>
               <w:t>`Game?` for nullable search results; `required` named params</w:t>
             </w:r>
           </w:p>
@@ -230,20 +498,48 @@
       <w:tr>
         <w:tc>
           <w:tcPr>
-            <w:tcW w:type="dxa" w:w="4320"/>
+            <w:tcW w:type="dxa" w:w="4536"/>
+            <w:shd w:fill="1e1e1e"/>
+            <w:tcBorders>
+              <w:top w:val="single" w:sz="4" w:color="d4af37"/>
+              <w:left w:val="single" w:sz="4" w:color="d4af37"/>
+              <w:bottom w:val="single" w:sz="4" w:color="d4af37"/>
+              <w:right w:val="single" w:sz="4" w:color="d4af37"/>
+            </w:tcBorders>
           </w:tcPr>
           <w:p>
+            <w:r/>
             <w:r>
+              <w:rPr>
+                <w:rFonts w:ascii="Arial" w:hAnsi="Arial"/>
+                <w:b w:val="0"/>
+                <w:color w:val="E6E6E6"/>
+                <w:sz w:val="22"/>
+              </w:rPr>
               <w:t>**Functions**</w:t>
             </w:r>
           </w:p>
         </w:tc>
         <w:tc>
           <w:tcPr>
-            <w:tcW w:type="dxa" w:w="4320"/>
+            <w:tcW w:type="dxa" w:w="4536"/>
+            <w:shd w:fill="1e1e1e"/>
+            <w:tcBorders>
+              <w:top w:val="single" w:sz="4" w:color="d4af37"/>
+              <w:left w:val="single" w:sz="4" w:color="d4af37"/>
+              <w:bottom w:val="single" w:sz="4" w:color="d4af37"/>
+              <w:right w:val="single" w:sz="4" w:color="d4af37"/>
+            </w:tcBorders>
           </w:tcPr>
           <w:p>
+            <w:r/>
             <w:r>
+              <w:rPr>
+                <w:rFonts w:ascii="Arial" w:hAnsi="Arial"/>
+                <w:b w:val="0"/>
+                <w:color w:val="E6E6E6"/>
+                <w:sz w:val="22"/>
+              </w:rPr>
               <w:t>Named params with `required`, optional defaults (`dailyRate = 1.5`), typed returns</w:t>
             </w:r>
           </w:p>
@@ -252,20 +548,48 @@
       <w:tr>
         <w:tc>
           <w:tcPr>
-            <w:tcW w:type="dxa" w:w="4320"/>
+            <w:tcW w:type="dxa" w:w="4536"/>
+            <w:shd w:fill="1e1e1e"/>
+            <w:tcBorders>
+              <w:top w:val="single" w:sz="4" w:color="d4af37"/>
+              <w:left w:val="single" w:sz="4" w:color="d4af37"/>
+              <w:bottom w:val="single" w:sz="4" w:color="d4af37"/>
+              <w:right w:val="single" w:sz="4" w:color="d4af37"/>
+            </w:tcBorders>
           </w:tcPr>
           <w:p>
+            <w:r/>
             <w:r>
+              <w:rPr>
+                <w:rFonts w:ascii="Arial" w:hAnsi="Arial"/>
+                <w:b w:val="0"/>
+                <w:color w:val="E6E6E6"/>
+                <w:sz w:val="22"/>
+              </w:rPr>
               <w:t>**Loops**</w:t>
             </w:r>
           </w:p>
         </w:tc>
         <w:tc>
           <w:tcPr>
-            <w:tcW w:type="dxa" w:w="4320"/>
+            <w:tcW w:type="dxa" w:w="4536"/>
+            <w:shd w:fill="1e1e1e"/>
+            <w:tcBorders>
+              <w:top w:val="single" w:sz="4" w:color="d4af37"/>
+              <w:left w:val="single" w:sz="4" w:color="d4af37"/>
+              <w:bottom w:val="single" w:sz="4" w:color="d4af37"/>
+              <w:right w:val="single" w:sz="4" w:color="d4af37"/>
+            </w:tcBorders>
           </w:tcPr>
           <w:p>
+            <w:r/>
             <w:r>
+              <w:rPr>
+                <w:rFonts w:ascii="Arial" w:hAnsi="Arial"/>
+                <w:b w:val="0"/>
+                <w:color w:val="E6E6E6"/>
+                <w:sz w:val="22"/>
+              </w:rPr>
               <w:t>Indexed `for` in catalog list, `while` in recommendation search, `for-in` for member borrows</w:t>
             </w:r>
           </w:p>
@@ -274,20 +598,48 @@
       <w:tr>
         <w:tc>
           <w:tcPr>
-            <w:tcW w:type="dxa" w:w="4320"/>
+            <w:tcW w:type="dxa" w:w="4536"/>
+            <w:shd w:fill="1e1e1e"/>
+            <w:tcBorders>
+              <w:top w:val="single" w:sz="4" w:color="d4af37"/>
+              <w:left w:val="single" w:sz="4" w:color="d4af37"/>
+              <w:bottom w:val="single" w:sz="4" w:color="d4af37"/>
+              <w:right w:val="single" w:sz="4" w:color="d4af37"/>
+            </w:tcBorders>
           </w:tcPr>
           <w:p>
+            <w:r/>
             <w:r>
+              <w:rPr>
+                <w:rFonts w:ascii="Arial" w:hAnsi="Arial"/>
+                <w:b w:val="0"/>
+                <w:color w:val="E6E6E6"/>
+                <w:sz w:val="22"/>
+              </w:rPr>
               <w:t>**Collections**</w:t>
             </w:r>
           </w:p>
         </w:tc>
         <w:tc>
           <w:tcPr>
-            <w:tcW w:type="dxa" w:w="4320"/>
+            <w:tcW w:type="dxa" w:w="4536"/>
+            <w:shd w:fill="1e1e1e"/>
+            <w:tcBorders>
+              <w:top w:val="single" w:sz="4" w:color="d4af37"/>
+              <w:left w:val="single" w:sz="4" w:color="d4af37"/>
+              <w:bottom w:val="single" w:sz="4" w:color="d4af37"/>
+              <w:right w:val="single" w:sz="4" w:color="d4af37"/>
+            </w:tcBorders>
           </w:tcPr>
           <w:p>
+            <w:r/>
             <w:r>
+              <w:rPr>
+                <w:rFonts w:ascii="Arial" w:hAnsi="Arial"/>
+                <w:b w:val="0"/>
+                <w:color w:val="E6E6E6"/>
+                <w:sz w:val="22"/>
+              </w:rPr>
               <w:t>`List` for catalog and borrowed items, `Map` for member registry</w:t>
             </w:r>
           </w:p>
@@ -296,6 +648,12 @@
     </w:tbl>
     <w:p>
       <w:r>
+        <w:rPr>
+          <w:rFonts w:ascii="Arial" w:hAnsi="Arial"/>
+          <w:b w:val="0"/>
+          <w:color w:val="E6E6E6"/>
+          <w:sz w:val="22"/>
+        </w:rPr>
         <w:t>---</w:t>
       </w:r>
     </w:p>
@@ -317,57 +675,117 @@
     </w:p>
     <w:p>
       <w:r>
+        <w:rPr>
+          <w:rFonts w:ascii="Arial" w:hAnsi="Arial"/>
+          <w:b w:val="0"/>
+          <w:color w:val="E6E6E6"/>
+          <w:sz w:val="22"/>
+        </w:rPr>
         <w:t xml:space="preserve">1. </w:t>
       </w:r>
       <w:r>
         <w:rPr>
+          <w:rFonts w:ascii="Arial" w:hAnsi="Arial"/>
           <w:b/>
+          <w:color w:val="FFDF80"/>
+          <w:sz w:val="22"/>
         </w:rPr>
         <w:t>Abstraction</w:t>
       </w:r>
       <w:r>
+        <w:rPr>
+          <w:rFonts w:ascii="Arial" w:hAnsi="Arial"/>
+          <w:b w:val="0"/>
+          <w:color w:val="E6E6E6"/>
+          <w:sz w:val="22"/>
+        </w:rPr>
         <w:t xml:space="preserve"> — `Game` is abstract; it defines the contract `describe()` without implementation.</w:t>
       </w:r>
     </w:p>
     <w:p>
       <w:r>
+        <w:rPr>
+          <w:rFonts w:ascii="Arial" w:hAnsi="Arial"/>
+          <w:b w:val="0"/>
+          <w:color w:val="E6E6E6"/>
+          <w:sz w:val="22"/>
+        </w:rPr>
         <w:t xml:space="preserve">2. </w:t>
       </w:r>
       <w:r>
         <w:rPr>
+          <w:rFonts w:ascii="Arial" w:hAnsi="Arial"/>
           <w:b/>
+          <w:color w:val="FFDF80"/>
+          <w:sz w:val="22"/>
         </w:rPr>
         <w:t>Inheritance</w:t>
       </w:r>
       <w:r>
+        <w:rPr>
+          <w:rFonts w:ascii="Arial" w:hAnsi="Arial"/>
+          <w:b w:val="0"/>
+          <w:color w:val="E6E6E6"/>
+          <w:sz w:val="22"/>
+        </w:rPr>
         <w:t xml:space="preserve"> — `BoardGame`, `CardGame`, and `RPGManual` extend `Game` using `super` parameters.</w:t>
       </w:r>
     </w:p>
     <w:p>
       <w:r>
+        <w:rPr>
+          <w:rFonts w:ascii="Arial" w:hAnsi="Arial"/>
+          <w:b w:val="0"/>
+          <w:color w:val="E6E6E6"/>
+          <w:sz w:val="22"/>
+        </w:rPr>
         <w:t xml:space="preserve">3. </w:t>
       </w:r>
       <w:r>
         <w:rPr>
+          <w:rFonts w:ascii="Arial" w:hAnsi="Arial"/>
           <w:b/>
+          <w:color w:val="FFDF80"/>
+          <w:sz w:val="22"/>
         </w:rPr>
         <w:t>Polymorphism</w:t>
       </w:r>
       <w:r>
+        <w:rPr>
+          <w:rFonts w:ascii="Arial" w:hAnsi="Arial"/>
+          <w:b w:val="0"/>
+          <w:color w:val="E6E6E6"/>
+          <w:sz w:val="22"/>
+        </w:rPr>
         <w:t xml:space="preserve"> — Each subclass `@override` the `describe()` method for its own output format.</w:t>
       </w:r>
     </w:p>
     <w:p>
       <w:r>
+        <w:rPr>
+          <w:rFonts w:ascii="Arial" w:hAnsi="Arial"/>
+          <w:b w:val="0"/>
+          <w:color w:val="E6E6E6"/>
+          <w:sz w:val="22"/>
+        </w:rPr>
         <w:t xml:space="preserve">4. </w:t>
       </w:r>
       <w:r>
         <w:rPr>
+          <w:rFonts w:ascii="Arial" w:hAnsi="Arial"/>
           <w:b/>
+          <w:color w:val="FFDF80"/>
+          <w:sz w:val="22"/>
         </w:rPr>
         <w:t>Encapsulation</w:t>
       </w:r>
       <w:r>
+        <w:rPr>
+          <w:rFonts w:ascii="Arial" w:hAnsi="Arial"/>
+          <w:b w:val="0"/>
+          <w:color w:val="E6E6E6"/>
+          <w:sz w:val="22"/>
+        </w:rPr>
         <w:t xml:space="preserve"> — `GameLibrary` controls catalog and borrow logic; `Member` owns its borrow list.</w:t>
       </w:r>
     </w:p>
@@ -379,112 +797,139 @@
         <w:t>Class Hierarchy</w:t>
       </w:r>
     </w:p>
+    <w:tbl>
+      <w:tblPr>
+        <w:tblW w:type="auto" w:w="0"/>
+        <w:jc w:val="left"/>
+        <w:tblLook w:firstColumn="1" w:firstRow="1" w:lastColumn="0" w:lastRow="0" w:noHBand="0" w:noVBand="1" w:val="04A0"/>
+      </w:tblPr>
+      <w:tblGrid>
+        <w:gridCol w:w="9072"/>
+      </w:tblGrid>
+      <w:tr>
+        <w:tc>
+          <w:tcPr>
+            <w:tcW w:type="dxa" w:w="8640"/>
+            <w:shd w:fill="1e1e1e"/>
+            <w:tcBorders>
+              <w:top w:val="single" w:sz="4" w:color="d4af37"/>
+              <w:left w:val="single" w:sz="4" w:color="d4af37"/>
+              <w:bottom w:val="single" w:sz="4" w:color="d4af37"/>
+              <w:right w:val="single" w:sz="4" w:color="d4af37"/>
+            </w:tcBorders>
+          </w:tcPr>
+          <w:p>
+            <w:r>
+              <w:rPr>
+                <w:rFonts w:ascii="Consolas" w:hAnsi="Consolas"/>
+                <w:b w:val="0"/>
+                <w:color w:val="E6E6E6"/>
+                <w:sz w:val="18"/>
+              </w:rPr>
+              <w:t>classDiagram</w:t>
+              <w:br/>
+              <w:t xml:space="preserve">    direction TB</w:t>
+              <w:br/>
+              <w:t xml:space="preserve">    class Game {</w:t>
+              <w:br/>
+              <w:t xml:space="preserve">        &lt;&lt;abstract&gt;&gt;</w:t>
+              <w:br/>
+              <w:t xml:space="preserve">        +String id</w:t>
+              <w:br/>
+              <w:t xml:space="preserve">        +String title</w:t>
+              <w:br/>
+              <w:t xml:space="preserve">        +String publisher</w:t>
+              <w:br/>
+              <w:t xml:space="preserve">        +int releaseYear</w:t>
+              <w:br/>
+              <w:t xml:space="preserve">        +String genre</w:t>
+              <w:br/>
+              <w:t xml:space="preserve">        +bool isAvailable</w:t>
+              <w:br/>
+              <w:t xml:space="preserve">        +describe()* void</w:t>
+              <w:br/>
+              <w:t xml:space="preserve">    }</w:t>
+              <w:br/>
+              <w:t xml:space="preserve">    class BoardGame {</w:t>
+              <w:br/>
+              <w:t xml:space="preserve">        +int playerCountMin</w:t>
+              <w:br/>
+              <w:t xml:space="preserve">        +int playerCountMax</w:t>
+              <w:br/>
+              <w:t xml:space="preserve">        +int playTimeMinutes</w:t>
+              <w:br/>
+              <w:t xml:space="preserve">        +double complexityRating</w:t>
+              <w:br/>
+              <w:t xml:space="preserve">        +describe() void</w:t>
+              <w:br/>
+              <w:t xml:space="preserve">    }</w:t>
+              <w:br/>
+              <w:t xml:space="preserve">    class CardGame {</w:t>
+              <w:br/>
+              <w:t xml:space="preserve">        +int deckSize</w:t>
+              <w:br/>
+              <w:t xml:space="preserve">        +int avgPlayTimeMinutes</w:t>
+              <w:br/>
+              <w:t xml:space="preserve">        +describe() void</w:t>
+              <w:br/>
+              <w:t xml:space="preserve">    }</w:t>
+              <w:br/>
+              <w:t xml:space="preserve">    class RPGManual {</w:t>
+              <w:br/>
+              <w:t xml:space="preserve">        +String edition</w:t>
+              <w:br/>
+              <w:t xml:space="preserve">        +int pageCount</w:t>
+              <w:br/>
+              <w:t xml:space="preserve">        +describe() void</w:t>
+              <w:br/>
+              <w:t xml:space="preserve">    }</w:t>
+              <w:br/>
+              <w:t xml:space="preserve">    class Member {</w:t>
+              <w:br/>
+              <w:t xml:space="preserve">        +String memberId</w:t>
+              <w:br/>
+              <w:t xml:space="preserve">        +String name</w:t>
+              <w:br/>
+              <w:t xml:space="preserve">        +List~Game~ borrowedGames</w:t>
+              <w:br/>
+              <w:t xml:space="preserve">        +showBorrowedGames() void</w:t>
+              <w:br/>
+              <w:t xml:space="preserve">    }</w:t>
+              <w:br/>
+              <w:t xml:space="preserve">    class GameLibrary {</w:t>
+              <w:br/>
+              <w:t xml:space="preserve">        +List~Game~ catalog</w:t>
+              <w:br/>
+              <w:t xml:space="preserve">        +Map~String,Member~ members</w:t>
+              <w:br/>
+              <w:t xml:space="preserve">        +addGame() void</w:t>
+              <w:br/>
+              <w:t xml:space="preserve">        +borrowGame() bool</w:t>
+              <w:br/>
+              <w:t xml:space="preserve">        +returnGame() bool</w:t>
+              <w:br/>
+              <w:t xml:space="preserve">        +recommendForPlayers() void</w:t>
+              <w:br/>
+              <w:t xml:space="preserve">    }</w:t>
+              <w:br/>
+              <w:t xml:space="preserve">    Game &lt;|-- BoardGame</w:t>
+              <w:br/>
+              <w:t xml:space="preserve">    Game &lt;|-- CardGame</w:t>
+              <w:br/>
+              <w:t xml:space="preserve">    Game &lt;|-- RPGManual</w:t>
+            </w:r>
+          </w:p>
+        </w:tc>
+      </w:tr>
+    </w:tbl>
     <w:p>
-      <w:pPr>
-        <w:spacing w:before="40" w:after="120"/>
-        <w:ind w:left="288"/>
-      </w:pPr>
       <w:r>
         <w:rPr>
-          <w:rFonts w:ascii="Consolas" w:hAnsi="Consolas"/>
-          <w:color w:val="323232"/>
-          <w:sz w:val="18"/>
+          <w:rFonts w:ascii="Arial" w:hAnsi="Arial"/>
+          <w:b w:val="0"/>
+          <w:color w:val="E6E6E6"/>
+          <w:sz w:val="22"/>
         </w:rPr>
-        <w:t>classDiagram</w:t>
-        <w:br/>
-        <w:t xml:space="preserve">    direction TB</w:t>
-        <w:br/>
-        <w:t xml:space="preserve">    class Game {</w:t>
-        <w:br/>
-        <w:t xml:space="preserve">        &lt;&lt;abstract&gt;&gt;</w:t>
-        <w:br/>
-        <w:t xml:space="preserve">        +String id</w:t>
-        <w:br/>
-        <w:t xml:space="preserve">        +String title</w:t>
-        <w:br/>
-        <w:t xml:space="preserve">        +String publisher</w:t>
-        <w:br/>
-        <w:t xml:space="preserve">        +int releaseYear</w:t>
-        <w:br/>
-        <w:t xml:space="preserve">        +String genre</w:t>
-        <w:br/>
-        <w:t xml:space="preserve">        +bool isAvailable</w:t>
-        <w:br/>
-        <w:t xml:space="preserve">        +describe()* void</w:t>
-        <w:br/>
-        <w:t xml:space="preserve">    }</w:t>
-        <w:br/>
-        <w:t xml:space="preserve">    class BoardGame {</w:t>
-        <w:br/>
-        <w:t xml:space="preserve">        +int playerCountMin</w:t>
-        <w:br/>
-        <w:t xml:space="preserve">        +int playerCountMax</w:t>
-        <w:br/>
-        <w:t xml:space="preserve">        +int playTimeMinutes</w:t>
-        <w:br/>
-        <w:t xml:space="preserve">        +double complexityRating</w:t>
-        <w:br/>
-        <w:t xml:space="preserve">        +describe() void</w:t>
-        <w:br/>
-        <w:t xml:space="preserve">    }</w:t>
-        <w:br/>
-        <w:t xml:space="preserve">    class CardGame {</w:t>
-        <w:br/>
-        <w:t xml:space="preserve">        +int deckSize</w:t>
-        <w:br/>
-        <w:t xml:space="preserve">        +int avgPlayTimeMinutes</w:t>
-        <w:br/>
-        <w:t xml:space="preserve">        +describe() void</w:t>
-        <w:br/>
-        <w:t xml:space="preserve">    }</w:t>
-        <w:br/>
-        <w:t xml:space="preserve">    class RPGManual {</w:t>
-        <w:br/>
-        <w:t xml:space="preserve">        +String edition</w:t>
-        <w:br/>
-        <w:t xml:space="preserve">        +int pageCount</w:t>
-        <w:br/>
-        <w:t xml:space="preserve">        +describe() void</w:t>
-        <w:br/>
-        <w:t xml:space="preserve">    }</w:t>
-        <w:br/>
-        <w:t xml:space="preserve">    class Member {</w:t>
-        <w:br/>
-        <w:t xml:space="preserve">        +String memberId</w:t>
-        <w:br/>
-        <w:t xml:space="preserve">        +String name</w:t>
-        <w:br/>
-        <w:t xml:space="preserve">        +List~Game~ borrowedGames</w:t>
-        <w:br/>
-        <w:t xml:space="preserve">        +showBorrowedGames() void</w:t>
-        <w:br/>
-        <w:t xml:space="preserve">    }</w:t>
-        <w:br/>
-        <w:t xml:space="preserve">    class GameLibrary {</w:t>
-        <w:br/>
-        <w:t xml:space="preserve">        +List~Game~ catalog</w:t>
-        <w:br/>
-        <w:t xml:space="preserve">        +Map~String,Member~ members</w:t>
-        <w:br/>
-        <w:t xml:space="preserve">        +addGame() void</w:t>
-        <w:br/>
-        <w:t xml:space="preserve">        +borrowGame() bool</w:t>
-        <w:br/>
-        <w:t xml:space="preserve">        +returnGame() bool</w:t>
-        <w:br/>
-        <w:t xml:space="preserve">        +recommendForPlayers() void</w:t>
-        <w:br/>
-        <w:t xml:space="preserve">    }</w:t>
-        <w:br/>
-        <w:t xml:space="preserve">    Game &lt;|-- BoardGame</w:t>
-        <w:br/>
-        <w:t xml:space="preserve">    Game &lt;|-- CardGame</w:t>
-        <w:br/>
-        <w:t xml:space="preserve">    Game &lt;|-- RPGManual</w:t>
-      </w:r>
-    </w:p>
-    <w:p>
-      <w:r>
         <w:t>---</w:t>
       </w:r>
     </w:p>
@@ -496,52 +941,79 @@
         <w:t>4. System Architecture</w:t>
       </w:r>
     </w:p>
+    <w:tbl>
+      <w:tblPr>
+        <w:tblW w:type="auto" w:w="0"/>
+        <w:jc w:val="left"/>
+        <w:tblLook w:firstColumn="1" w:firstRow="1" w:lastColumn="0" w:lastRow="0" w:noHBand="0" w:noVBand="1" w:val="04A0"/>
+      </w:tblPr>
+      <w:tblGrid>
+        <w:gridCol w:w="9072"/>
+      </w:tblGrid>
+      <w:tr>
+        <w:tc>
+          <w:tcPr>
+            <w:tcW w:type="dxa" w:w="8640"/>
+            <w:shd w:fill="1e1e1e"/>
+            <w:tcBorders>
+              <w:top w:val="single" w:sz="4" w:color="d4af37"/>
+              <w:left w:val="single" w:sz="4" w:color="d4af37"/>
+              <w:bottom w:val="single" w:sz="4" w:color="d4af37"/>
+              <w:right w:val="single" w:sz="4" w:color="d4af37"/>
+            </w:tcBorders>
+          </w:tcPr>
+          <w:p>
+            <w:r>
+              <w:rPr>
+                <w:rFonts w:ascii="Consolas" w:hAnsi="Consolas"/>
+                <w:b w:val="0"/>
+                <w:color w:val="E6E6E6"/>
+                <w:sz w:val="18"/>
+              </w:rPr>
+              <w:t>┌─────────────────────────────────────┐</w:t>
+              <w:br/>
+              <w:t>│           main.dart                 │</w:t>
+              <w:br/>
+              <w:t>│  Creates games, members, and runs   │</w:t>
+              <w:br/>
+              <w:t>│  the demonstration workflow.        │</w:t>
+              <w:br/>
+              <w:t>└──────────────┬──────────────────────┘</w:t>
+              <w:br/>
+              <w:t xml:space="preserve">               │</w:t>
+              <w:br/>
+              <w:t>┌──────────────▼──────────────────────┐</w:t>
+              <w:br/>
+              <w:t>│         GameLibrary                 │</w:t>
+              <w:br/>
+              <w:t>│  Catalog (List&lt;Game&gt;)               │</w:t>
+              <w:br/>
+              <w:t>│  Members (Map&lt;String, Member&gt;)      │</w:t>
+              <w:br/>
+              <w:t>└──────────────┬──────────────────────┘</w:t>
+              <w:br/>
+              <w:t xml:space="preserve">               │ uses</w:t>
+              <w:br/>
+              <w:t>┌──────────────▼──────────────────────┐</w:t>
+              <w:br/>
+              <w:t>│  BoardGame / CardGame / RPGManual   │</w:t>
+              <w:br/>
+              <w:t>│  (inherit from abstract Game)       │</w:t>
+              <w:br/>
+              <w:t>└─────────────────────────────────────┘</w:t>
+            </w:r>
+          </w:p>
+        </w:tc>
+      </w:tr>
+    </w:tbl>
     <w:p>
-      <w:pPr>
-        <w:spacing w:before="40" w:after="120"/>
-        <w:ind w:left="288"/>
-      </w:pPr>
       <w:r>
         <w:rPr>
-          <w:rFonts w:ascii="Consolas" w:hAnsi="Consolas"/>
-          <w:color w:val="323232"/>
-          <w:sz w:val="18"/>
+          <w:rFonts w:ascii="Arial" w:hAnsi="Arial"/>
+          <w:b w:val="0"/>
+          <w:color w:val="E6E6E6"/>
+          <w:sz w:val="22"/>
         </w:rPr>
-        <w:t>┌─────────────────────────────────────┐</w:t>
-        <w:br/>
-        <w:t>│           main.dart                 │</w:t>
-        <w:br/>
-        <w:t>│  Creates games, members, and runs   │</w:t>
-        <w:br/>
-        <w:t>│  the demonstration workflow.        │</w:t>
-        <w:br/>
-        <w:t>└──────────────┬──────────────────────┘</w:t>
-        <w:br/>
-        <w:t xml:space="preserve">               │</w:t>
-        <w:br/>
-        <w:t>┌──────────────▼──────────────────────┐</w:t>
-        <w:br/>
-        <w:t>│         GameLibrary                 │</w:t>
-        <w:br/>
-        <w:t>│  Catalog (List&lt;Game&gt;)               │</w:t>
-        <w:br/>
-        <w:t>│  Members (Map&lt;String, Member&gt;)      │</w:t>
-        <w:br/>
-        <w:t>└──────────────┬──────────────────────┘</w:t>
-        <w:br/>
-        <w:t xml:space="preserve">               │ uses</w:t>
-        <w:br/>
-        <w:t>┌──────────────▼──────────────────────┐</w:t>
-        <w:br/>
-        <w:t>│  BoardGame / CardGame / RPGManual   │</w:t>
-        <w:br/>
-        <w:t>│  (inherit from abstract Game)       │</w:t>
-        <w:br/>
-        <w:t>└─────────────────────────────────────┘</w:t>
-      </w:r>
-    </w:p>
-    <w:p>
-      <w:r>
         <w:t>---</w:t>
       </w:r>
     </w:p>
@@ -555,42 +1027,85 @@
     </w:p>
     <w:tbl>
       <w:tblPr>
-        <w:tblStyle w:val="LightGrid-Accent1"/>
+        <w:tblStyle w:val="TableGrid"/>
         <w:tblW w:type="auto" w:w="0"/>
+        <w:jc w:val="center"/>
         <w:tblLook w:firstColumn="1" w:firstRow="1" w:lastColumn="0" w:lastRow="0" w:noHBand="0" w:noVBand="1" w:val="04A0"/>
       </w:tblPr>
       <w:tblGrid>
-        <w:gridCol w:w="2880"/>
-        <w:gridCol w:w="2880"/>
-        <w:gridCol w:w="2880"/>
+        <w:gridCol w:w="3024"/>
+        <w:gridCol w:w="3024"/>
+        <w:gridCol w:w="3024"/>
       </w:tblGrid>
       <w:tr>
         <w:tc>
           <w:tcPr>
-            <w:tcW w:type="dxa" w:w="2880"/>
+            <w:tcW w:type="dxa" w:w="3024"/>
+            <w:shd w:fill="d4af37"/>
+            <w:tcBorders>
+              <w:top w:val="single" w:sz="6" w:color="d4af37"/>
+              <w:left w:val="single" w:sz="6" w:color="d4af37"/>
+              <w:bottom w:val="single" w:sz="6" w:color="d4af37"/>
+              <w:right w:val="single" w:sz="6" w:color="d4af37"/>
+            </w:tcBorders>
           </w:tcPr>
           <w:p>
+            <w:r/>
             <w:r>
+              <w:rPr>
+                <w:rFonts w:ascii="Arial" w:hAnsi="Arial"/>
+                <w:b/>
+                <w:color w:val="0A0A0A"/>
+                <w:sz w:val="22"/>
+              </w:rPr>
               <w:t>Operation</w:t>
             </w:r>
           </w:p>
         </w:tc>
         <w:tc>
           <w:tcPr>
-            <w:tcW w:type="dxa" w:w="2880"/>
+            <w:tcW w:type="dxa" w:w="3024"/>
+            <w:shd w:fill="d4af37"/>
+            <w:tcBorders>
+              <w:top w:val="single" w:sz="6" w:color="d4af37"/>
+              <w:left w:val="single" w:sz="6" w:color="d4af37"/>
+              <w:bottom w:val="single" w:sz="6" w:color="d4af37"/>
+              <w:right w:val="single" w:sz="6" w:color="d4af37"/>
+            </w:tcBorders>
           </w:tcPr>
           <w:p>
+            <w:r/>
             <w:r>
+              <w:rPr>
+                <w:rFonts w:ascii="Arial" w:hAnsi="Arial"/>
+                <w:b/>
+                <w:color w:val="0A0A0A"/>
+                <w:sz w:val="22"/>
+              </w:rPr>
               <w:t>Structure</w:t>
             </w:r>
           </w:p>
         </w:tc>
         <w:tc>
           <w:tcPr>
-            <w:tcW w:type="dxa" w:w="2880"/>
+            <w:tcW w:type="dxa" w:w="3024"/>
+            <w:shd w:fill="d4af37"/>
+            <w:tcBorders>
+              <w:top w:val="single" w:sz="6" w:color="d4af37"/>
+              <w:left w:val="single" w:sz="6" w:color="d4af37"/>
+              <w:bottom w:val="single" w:sz="6" w:color="d4af37"/>
+              <w:right w:val="single" w:sz="6" w:color="d4af37"/>
+            </w:tcBorders>
           </w:tcPr>
           <w:p>
+            <w:r/>
             <w:r>
+              <w:rPr>
+                <w:rFonts w:ascii="Arial" w:hAnsi="Arial"/>
+                <w:b/>
+                <w:color w:val="0A0A0A"/>
+                <w:sz w:val="22"/>
+              </w:rPr>
               <w:t>Average Complexity</w:t>
             </w:r>
           </w:p>
@@ -599,30 +1114,72 @@
       <w:tr>
         <w:tc>
           <w:tcPr>
-            <w:tcW w:type="dxa" w:w="2880"/>
+            <w:tcW w:type="dxa" w:w="3024"/>
+            <w:shd w:fill="1e1e1e"/>
+            <w:tcBorders>
+              <w:top w:val="single" w:sz="4" w:color="d4af37"/>
+              <w:left w:val="single" w:sz="4" w:color="d4af37"/>
+              <w:bottom w:val="single" w:sz="4" w:color="d4af37"/>
+              <w:right w:val="single" w:sz="4" w:color="d4af37"/>
+            </w:tcBorders>
           </w:tcPr>
           <w:p>
+            <w:r/>
             <w:r>
+              <w:rPr>
+                <w:rFonts w:ascii="Arial" w:hAnsi="Arial"/>
+                <w:b w:val="0"/>
+                <w:color w:val="E6E6E6"/>
+                <w:sz w:val="22"/>
+              </w:rPr>
               <w:t>Add game</w:t>
             </w:r>
           </w:p>
         </w:tc>
         <w:tc>
           <w:tcPr>
-            <w:tcW w:type="dxa" w:w="2880"/>
+            <w:tcW w:type="dxa" w:w="3024"/>
+            <w:shd w:fill="1e1e1e"/>
+            <w:tcBorders>
+              <w:top w:val="single" w:sz="4" w:color="d4af37"/>
+              <w:left w:val="single" w:sz="4" w:color="d4af37"/>
+              <w:bottom w:val="single" w:sz="4" w:color="d4af37"/>
+              <w:right w:val="single" w:sz="4" w:color="d4af37"/>
+            </w:tcBorders>
           </w:tcPr>
           <w:p>
+            <w:r/>
             <w:r>
+              <w:rPr>
+                <w:rFonts w:ascii="Arial" w:hAnsi="Arial"/>
+                <w:b w:val="0"/>
+                <w:color w:val="E6E6E6"/>
+                <w:sz w:val="22"/>
+              </w:rPr>
               <w:t>`List.add`</w:t>
             </w:r>
           </w:p>
         </w:tc>
         <w:tc>
           <w:tcPr>
-            <w:tcW w:type="dxa" w:w="2880"/>
+            <w:tcW w:type="dxa" w:w="3024"/>
+            <w:shd w:fill="1e1e1e"/>
+            <w:tcBorders>
+              <w:top w:val="single" w:sz="4" w:color="d4af37"/>
+              <w:left w:val="single" w:sz="4" w:color="d4af37"/>
+              <w:bottom w:val="single" w:sz="4" w:color="d4af37"/>
+              <w:right w:val="single" w:sz="4" w:color="d4af37"/>
+            </w:tcBorders>
           </w:tcPr>
           <w:p>
+            <w:r/>
             <w:r>
+              <w:rPr>
+                <w:rFonts w:ascii="Arial" w:hAnsi="Arial"/>
+                <w:b w:val="0"/>
+                <w:color w:val="E6E6E6"/>
+                <w:sz w:val="22"/>
+              </w:rPr>
               <w:t>O(1) amortized</w:t>
             </w:r>
           </w:p>
@@ -631,30 +1188,72 @@
       <w:tr>
         <w:tc>
           <w:tcPr>
-            <w:tcW w:type="dxa" w:w="2880"/>
+            <w:tcW w:type="dxa" w:w="3024"/>
+            <w:shd w:fill="1e1e1e"/>
+            <w:tcBorders>
+              <w:top w:val="single" w:sz="4" w:color="d4af37"/>
+              <w:left w:val="single" w:sz="4" w:color="d4af37"/>
+              <w:bottom w:val="single" w:sz="4" w:color="d4af37"/>
+              <w:right w:val="single" w:sz="4" w:color="d4af37"/>
+            </w:tcBorders>
           </w:tcPr>
           <w:p>
+            <w:r/>
             <w:r>
+              <w:rPr>
+                <w:rFonts w:ascii="Arial" w:hAnsi="Arial"/>
+                <w:b w:val="0"/>
+                <w:color w:val="E6E6E6"/>
+                <w:sz w:val="22"/>
+              </w:rPr>
               <w:t>Register member</w:t>
             </w:r>
           </w:p>
         </w:tc>
         <w:tc>
           <w:tcPr>
-            <w:tcW w:type="dxa" w:w="2880"/>
+            <w:tcW w:type="dxa" w:w="3024"/>
+            <w:shd w:fill="1e1e1e"/>
+            <w:tcBorders>
+              <w:top w:val="single" w:sz="4" w:color="d4af37"/>
+              <w:left w:val="single" w:sz="4" w:color="d4af37"/>
+              <w:bottom w:val="single" w:sz="4" w:color="d4af37"/>
+              <w:right w:val="single" w:sz="4" w:color="d4af37"/>
+            </w:tcBorders>
           </w:tcPr>
           <w:p>
+            <w:r/>
             <w:r>
+              <w:rPr>
+                <w:rFonts w:ascii="Arial" w:hAnsi="Arial"/>
+                <w:b w:val="0"/>
+                <w:color w:val="E6E6E6"/>
+                <w:sz w:val="22"/>
+              </w:rPr>
               <w:t>`Map` insertion</w:t>
             </w:r>
           </w:p>
         </w:tc>
         <w:tc>
           <w:tcPr>
-            <w:tcW w:type="dxa" w:w="2880"/>
+            <w:tcW w:type="dxa" w:w="3024"/>
+            <w:shd w:fill="1e1e1e"/>
+            <w:tcBorders>
+              <w:top w:val="single" w:sz="4" w:color="d4af37"/>
+              <w:left w:val="single" w:sz="4" w:color="d4af37"/>
+              <w:bottom w:val="single" w:sz="4" w:color="d4af37"/>
+              <w:right w:val="single" w:sz="4" w:color="d4af37"/>
+            </w:tcBorders>
           </w:tcPr>
           <w:p>
+            <w:r/>
             <w:r>
+              <w:rPr>
+                <w:rFonts w:ascii="Arial" w:hAnsi="Arial"/>
+                <w:b w:val="0"/>
+                <w:color w:val="E6E6E6"/>
+                <w:sz w:val="22"/>
+              </w:rPr>
               <w:t>O(1)</w:t>
             </w:r>
           </w:p>
@@ -663,30 +1262,72 @@
       <w:tr>
         <w:tc>
           <w:tcPr>
-            <w:tcW w:type="dxa" w:w="2880"/>
+            <w:tcW w:type="dxa" w:w="3024"/>
+            <w:shd w:fill="1e1e1e"/>
+            <w:tcBorders>
+              <w:top w:val="single" w:sz="4" w:color="d4af37"/>
+              <w:left w:val="single" w:sz="4" w:color="d4af37"/>
+              <w:bottom w:val="single" w:sz="4" w:color="d4af37"/>
+              <w:right w:val="single" w:sz="4" w:color="d4af37"/>
+            </w:tcBorders>
           </w:tcPr>
           <w:p>
+            <w:r/>
             <w:r>
+              <w:rPr>
+                <w:rFonts w:ascii="Arial" w:hAnsi="Arial"/>
+                <w:b w:val="0"/>
+                <w:color w:val="E6E6E6"/>
+                <w:sz w:val="22"/>
+              </w:rPr>
               <w:t>Find game by ID</w:t>
             </w:r>
           </w:p>
         </w:tc>
         <w:tc>
           <w:tcPr>
-            <w:tcW w:type="dxa" w:w="2880"/>
+            <w:tcW w:type="dxa" w:w="3024"/>
+            <w:shd w:fill="1e1e1e"/>
+            <w:tcBorders>
+              <w:top w:val="single" w:sz="4" w:color="d4af37"/>
+              <w:left w:val="single" w:sz="4" w:color="d4af37"/>
+              <w:bottom w:val="single" w:sz="4" w:color="d4af37"/>
+              <w:right w:val="single" w:sz="4" w:color="d4af37"/>
+            </w:tcBorders>
           </w:tcPr>
           <w:p>
+            <w:r/>
             <w:r>
+              <w:rPr>
+                <w:rFonts w:ascii="Arial" w:hAnsi="Arial"/>
+                <w:b w:val="0"/>
+                <w:color w:val="E6E6E6"/>
+                <w:sz w:val="22"/>
+              </w:rPr>
               <w:t>Linear scan of `List`</w:t>
             </w:r>
           </w:p>
         </w:tc>
         <w:tc>
           <w:tcPr>
-            <w:tcW w:type="dxa" w:w="2880"/>
+            <w:tcW w:type="dxa" w:w="3024"/>
+            <w:shd w:fill="1e1e1e"/>
+            <w:tcBorders>
+              <w:top w:val="single" w:sz="4" w:color="d4af37"/>
+              <w:left w:val="single" w:sz="4" w:color="d4af37"/>
+              <w:bottom w:val="single" w:sz="4" w:color="d4af37"/>
+              <w:right w:val="single" w:sz="4" w:color="d4af37"/>
+            </w:tcBorders>
           </w:tcPr>
           <w:p>
+            <w:r/>
             <w:r>
+              <w:rPr>
+                <w:rFonts w:ascii="Arial" w:hAnsi="Arial"/>
+                <w:b w:val="0"/>
+                <w:color w:val="E6E6E6"/>
+                <w:sz w:val="22"/>
+              </w:rPr>
               <w:t>O(n)</w:t>
             </w:r>
           </w:p>
@@ -695,30 +1336,72 @@
       <w:tr>
         <w:tc>
           <w:tcPr>
-            <w:tcW w:type="dxa" w:w="2880"/>
+            <w:tcW w:type="dxa" w:w="3024"/>
+            <w:shd w:fill="1e1e1e"/>
+            <w:tcBorders>
+              <w:top w:val="single" w:sz="4" w:color="d4af37"/>
+              <w:left w:val="single" w:sz="4" w:color="d4af37"/>
+              <w:bottom w:val="single" w:sz="4" w:color="d4af37"/>
+              <w:right w:val="single" w:sz="4" w:color="d4af37"/>
+            </w:tcBorders>
           </w:tcPr>
           <w:p>
+            <w:r/>
             <w:r>
+              <w:rPr>
+                <w:rFonts w:ascii="Arial" w:hAnsi="Arial"/>
+                <w:b w:val="0"/>
+                <w:color w:val="E6E6E6"/>
+                <w:sz w:val="22"/>
+              </w:rPr>
               <w:t>Find member by ID</w:t>
             </w:r>
           </w:p>
         </w:tc>
         <w:tc>
           <w:tcPr>
-            <w:tcW w:type="dxa" w:w="2880"/>
+            <w:tcW w:type="dxa" w:w="3024"/>
+            <w:shd w:fill="1e1e1e"/>
+            <w:tcBorders>
+              <w:top w:val="single" w:sz="4" w:color="d4af37"/>
+              <w:left w:val="single" w:sz="4" w:color="d4af37"/>
+              <w:bottom w:val="single" w:sz="4" w:color="d4af37"/>
+              <w:right w:val="single" w:sz="4" w:color="d4af37"/>
+            </w:tcBorders>
           </w:tcPr>
           <w:p>
+            <w:r/>
             <w:r>
+              <w:rPr>
+                <w:rFonts w:ascii="Arial" w:hAnsi="Arial"/>
+                <w:b w:val="0"/>
+                <w:color w:val="E6E6E6"/>
+                <w:sz w:val="22"/>
+              </w:rPr>
               <w:t>`Map` lookup</w:t>
             </w:r>
           </w:p>
         </w:tc>
         <w:tc>
           <w:tcPr>
-            <w:tcW w:type="dxa" w:w="2880"/>
+            <w:tcW w:type="dxa" w:w="3024"/>
+            <w:shd w:fill="1e1e1e"/>
+            <w:tcBorders>
+              <w:top w:val="single" w:sz="4" w:color="d4af37"/>
+              <w:left w:val="single" w:sz="4" w:color="d4af37"/>
+              <w:bottom w:val="single" w:sz="4" w:color="d4af37"/>
+              <w:right w:val="single" w:sz="4" w:color="d4af37"/>
+            </w:tcBorders>
           </w:tcPr>
           <w:p>
+            <w:r/>
             <w:r>
+              <w:rPr>
+                <w:rFonts w:ascii="Arial" w:hAnsi="Arial"/>
+                <w:b w:val="0"/>
+                <w:color w:val="E6E6E6"/>
+                <w:sz w:val="22"/>
+              </w:rPr>
               <w:t>O(1)</w:t>
             </w:r>
           </w:p>
@@ -727,30 +1410,72 @@
       <w:tr>
         <w:tc>
           <w:tcPr>
-            <w:tcW w:type="dxa" w:w="2880"/>
+            <w:tcW w:type="dxa" w:w="3024"/>
+            <w:shd w:fill="1e1e1e"/>
+            <w:tcBorders>
+              <w:top w:val="single" w:sz="4" w:color="d4af37"/>
+              <w:left w:val="single" w:sz="4" w:color="d4af37"/>
+              <w:bottom w:val="single" w:sz="4" w:color="d4af37"/>
+              <w:right w:val="single" w:sz="4" w:color="d4af37"/>
+            </w:tcBorders>
           </w:tcPr>
           <w:p>
+            <w:r/>
             <w:r>
+              <w:rPr>
+                <w:rFonts w:ascii="Arial" w:hAnsi="Arial"/>
+                <w:b w:val="0"/>
+                <w:color w:val="E6E6E6"/>
+                <w:sz w:val="22"/>
+              </w:rPr>
               <w:t>Recommend games</w:t>
             </w:r>
           </w:p>
         </w:tc>
         <w:tc>
           <w:tcPr>
-            <w:tcW w:type="dxa" w:w="2880"/>
+            <w:tcW w:type="dxa" w:w="3024"/>
+            <w:shd w:fill="1e1e1e"/>
+            <w:tcBorders>
+              <w:top w:val="single" w:sz="4" w:color="d4af37"/>
+              <w:left w:val="single" w:sz="4" w:color="d4af37"/>
+              <w:bottom w:val="single" w:sz="4" w:color="d4af37"/>
+              <w:right w:val="single" w:sz="4" w:color="d4af37"/>
+            </w:tcBorders>
           </w:tcPr>
           <w:p>
+            <w:r/>
             <w:r>
+              <w:rPr>
+                <w:rFonts w:ascii="Arial" w:hAnsi="Arial"/>
+                <w:b w:val="0"/>
+                <w:color w:val="E6E6E6"/>
+                <w:sz w:val="22"/>
+              </w:rPr>
               <w:t>Linear `while` scan</w:t>
             </w:r>
           </w:p>
         </w:tc>
         <w:tc>
           <w:tcPr>
-            <w:tcW w:type="dxa" w:w="2880"/>
+            <w:tcW w:type="dxa" w:w="3024"/>
+            <w:shd w:fill="1e1e1e"/>
+            <w:tcBorders>
+              <w:top w:val="single" w:sz="4" w:color="d4af37"/>
+              <w:left w:val="single" w:sz="4" w:color="d4af37"/>
+              <w:bottom w:val="single" w:sz="4" w:color="d4af37"/>
+              <w:right w:val="single" w:sz="4" w:color="d4af37"/>
+            </w:tcBorders>
           </w:tcPr>
           <w:p>
+            <w:r/>
             <w:r>
+              <w:rPr>
+                <w:rFonts w:ascii="Arial" w:hAnsi="Arial"/>
+                <w:b w:val="0"/>
+                <w:color w:val="E6E6E6"/>
+                <w:sz w:val="22"/>
+              </w:rPr>
               <w:t>O(n)</w:t>
             </w:r>
           </w:p>
@@ -759,6 +1484,12 @@
     </w:tbl>
     <w:p>
       <w:r>
+        <w:rPr>
+          <w:rFonts w:ascii="Arial" w:hAnsi="Arial"/>
+          <w:b w:val="0"/>
+          <w:color w:val="E6E6E6"/>
+          <w:sz w:val="22"/>
+        </w:rPr>
         <w:t>---</w:t>
       </w:r>
     </w:p>
@@ -780,6 +1511,12 @@
     </w:p>
     <w:p>
       <w:r>
+        <w:rPr>
+          <w:rFonts w:ascii="Arial" w:hAnsi="Arial"/>
+          <w:b w:val="0"/>
+          <w:color w:val="E6E6E6"/>
+          <w:sz w:val="22"/>
+        </w:rPr>
         <w:t>Abstract base class `Game`. Holds common fields (`id`, `title`, `publisher`, `releaseYear`, `genre`, `isAvailable`) and declares the abstract `describe()` method.</w:t>
       </w:r>
     </w:p>
@@ -793,6 +1530,12 @@
     </w:p>
     <w:p>
       <w:r>
+        <w:rPr>
+          <w:rFonts w:ascii="Arial" w:hAnsi="Arial"/>
+          <w:b w:val="0"/>
+          <w:color w:val="E6E6E6"/>
+          <w:sz w:val="22"/>
+        </w:rPr>
         <w:t>Subclass for board games. Adds `playerCountMin`, `playerCountMax`, `playTimeMinutes`, and `complexityRating`.</w:t>
       </w:r>
     </w:p>
@@ -806,6 +1549,12 @@
     </w:p>
     <w:p>
       <w:r>
+        <w:rPr>
+          <w:rFonts w:ascii="Arial" w:hAnsi="Arial"/>
+          <w:b w:val="0"/>
+          <w:color w:val="E6E6E6"/>
+          <w:sz w:val="22"/>
+        </w:rPr>
         <w:t>Subclass for card games. Adds `deckSize` and `avgPlayTimeMinutes`.</w:t>
       </w:r>
     </w:p>
@@ -819,6 +1568,12 @@
     </w:p>
     <w:p>
       <w:r>
+        <w:rPr>
+          <w:rFonts w:ascii="Arial" w:hAnsi="Arial"/>
+          <w:b w:val="0"/>
+          <w:color w:val="E6E6E6"/>
+          <w:sz w:val="22"/>
+        </w:rPr>
         <w:t>Subclass for RPG manuals. Adds `edition` and `pageCount`.</w:t>
       </w:r>
     </w:p>
@@ -832,6 +1587,12 @@
     </w:p>
     <w:p>
       <w:r>
+        <w:rPr>
+          <w:rFonts w:ascii="Arial" w:hAnsi="Arial"/>
+          <w:b w:val="0"/>
+          <w:color w:val="E6E6E6"/>
+          <w:sz w:val="22"/>
+        </w:rPr>
         <w:t>Represents a library member. Tracks `memberId`, `name`, and a `List&lt;Game&gt;` of borrowed items.</w:t>
       </w:r>
     </w:p>
@@ -845,6 +1606,12 @@
     </w:p>
     <w:p>
       <w:r>
+        <w:rPr>
+          <w:rFonts w:ascii="Arial" w:hAnsi="Arial"/>
+          <w:b w:val="0"/>
+          <w:color w:val="E6E6E6"/>
+          <w:sz w:val="22"/>
+        </w:rPr>
         <w:t>Central controller. Manages catalog and members, handles borrow/return logic, and recommends board games by player count using a `while` loop.</w:t>
       </w:r>
     </w:p>
@@ -858,6 +1625,12 @@
     </w:p>
     <w:p>
       <w:r>
+        <w:rPr>
+          <w:rFonts w:ascii="Arial" w:hAnsi="Arial"/>
+          <w:b w:val="0"/>
+          <w:color w:val="E6E6E6"/>
+          <w:sz w:val="22"/>
+        </w:rPr>
         <w:t>Pure utility function with named parameters and a default rate. Applies multipliers based on game type.</w:t>
       </w:r>
     </w:p>
@@ -871,11 +1644,23 @@
     </w:p>
     <w:p>
       <w:r>
+        <w:rPr>
+          <w:rFonts w:ascii="Arial" w:hAnsi="Arial"/>
+          <w:b w:val="0"/>
+          <w:color w:val="E6E6E6"/>
+          <w:sz w:val="22"/>
+        </w:rPr>
         <w:t>Driver script. Creates sample data, runs catalog listing, borrows, recommends, returns, and prints late fees.</w:t>
       </w:r>
     </w:p>
     <w:p>
       <w:r>
+        <w:rPr>
+          <w:rFonts w:ascii="Arial" w:hAnsi="Arial"/>
+          <w:b w:val="0"/>
+          <w:color w:val="E6E6E6"/>
+          <w:sz w:val="22"/>
+        </w:rPr>
         <w:t>---</w:t>
       </w:r>
     </w:p>
@@ -889,31 +1674,60 @@
     </w:p>
     <w:tbl>
       <w:tblPr>
-        <w:tblStyle w:val="LightGrid-Accent1"/>
+        <w:tblStyle w:val="TableGrid"/>
         <w:tblW w:type="auto" w:w="0"/>
+        <w:jc w:val="center"/>
         <w:tblLook w:firstColumn="1" w:firstRow="1" w:lastColumn="0" w:lastRow="0" w:noHBand="0" w:noVBand="1" w:val="04A0"/>
       </w:tblPr>
       <w:tblGrid>
-        <w:gridCol w:w="4320"/>
-        <w:gridCol w:w="4320"/>
+        <w:gridCol w:w="4536"/>
+        <w:gridCol w:w="4536"/>
       </w:tblGrid>
       <w:tr>
         <w:tc>
           <w:tcPr>
-            <w:tcW w:type="dxa" w:w="4320"/>
+            <w:tcW w:type="dxa" w:w="4536"/>
+            <w:shd w:fill="d4af37"/>
+            <w:tcBorders>
+              <w:top w:val="single" w:sz="6" w:color="d4af37"/>
+              <w:left w:val="single" w:sz="6" w:color="d4af37"/>
+              <w:bottom w:val="single" w:sz="6" w:color="d4af37"/>
+              <w:right w:val="single" w:sz="6" w:color="d4af37"/>
+            </w:tcBorders>
           </w:tcPr>
           <w:p>
+            <w:r/>
             <w:r>
+              <w:rPr>
+                <w:rFonts w:ascii="Arial" w:hAnsi="Arial"/>
+                <w:b/>
+                <w:color w:val="0A0A0A"/>
+                <w:sz w:val="22"/>
+              </w:rPr>
               <w:t>Scenario</w:t>
             </w:r>
           </w:p>
         </w:tc>
         <w:tc>
           <w:tcPr>
-            <w:tcW w:type="dxa" w:w="4320"/>
+            <w:tcW w:type="dxa" w:w="4536"/>
+            <w:shd w:fill="d4af37"/>
+            <w:tcBorders>
+              <w:top w:val="single" w:sz="6" w:color="d4af37"/>
+              <w:left w:val="single" w:sz="6" w:color="d4af37"/>
+              <w:bottom w:val="single" w:sz="6" w:color="d4af37"/>
+              <w:right w:val="single" w:sz="6" w:color="d4af37"/>
+            </w:tcBorders>
           </w:tcPr>
           <w:p>
+            <w:r/>
             <w:r>
+              <w:rPr>
+                <w:rFonts w:ascii="Arial" w:hAnsi="Arial"/>
+                <w:b/>
+                <w:color w:val="0A0A0A"/>
+                <w:sz w:val="22"/>
+              </w:rPr>
               <w:t>Handling</w:t>
             </w:r>
           </w:p>
@@ -922,20 +1736,48 @@
       <w:tr>
         <w:tc>
           <w:tcPr>
-            <w:tcW w:type="dxa" w:w="4320"/>
+            <w:tcW w:type="dxa" w:w="4536"/>
+            <w:shd w:fill="1e1e1e"/>
+            <w:tcBorders>
+              <w:top w:val="single" w:sz="4" w:color="d4af37"/>
+              <w:left w:val="single" w:sz="4" w:color="d4af37"/>
+              <w:bottom w:val="single" w:sz="4" w:color="d4af37"/>
+              <w:right w:val="single" w:sz="4" w:color="d4af37"/>
+            </w:tcBorders>
           </w:tcPr>
           <w:p>
+            <w:r/>
             <w:r>
+              <w:rPr>
+                <w:rFonts w:ascii="Arial" w:hAnsi="Arial"/>
+                <w:b w:val="0"/>
+                <w:color w:val="E6E6E6"/>
+                <w:sz w:val="22"/>
+              </w:rPr>
               <w:t>Member not found</w:t>
             </w:r>
           </w:p>
         </w:tc>
         <w:tc>
           <w:tcPr>
-            <w:tcW w:type="dxa" w:w="4320"/>
+            <w:tcW w:type="dxa" w:w="4536"/>
+            <w:shd w:fill="1e1e1e"/>
+            <w:tcBorders>
+              <w:top w:val="single" w:sz="4" w:color="d4af37"/>
+              <w:left w:val="single" w:sz="4" w:color="d4af37"/>
+              <w:bottom w:val="single" w:sz="4" w:color="d4af37"/>
+              <w:right w:val="single" w:sz="4" w:color="d4af37"/>
+            </w:tcBorders>
           </w:tcPr>
           <w:p>
+            <w:r/>
             <w:r>
+              <w:rPr>
+                <w:rFonts w:ascii="Arial" w:hAnsi="Arial"/>
+                <w:b w:val="0"/>
+                <w:color w:val="E6E6E6"/>
+                <w:sz w:val="22"/>
+              </w:rPr>
               <w:t>`Map` lookup returns `null`; prints error and returns `false`</w:t>
             </w:r>
           </w:p>
@@ -944,20 +1786,48 @@
       <w:tr>
         <w:tc>
           <w:tcPr>
-            <w:tcW w:type="dxa" w:w="4320"/>
+            <w:tcW w:type="dxa" w:w="4536"/>
+            <w:shd w:fill="1e1e1e"/>
+            <w:tcBorders>
+              <w:top w:val="single" w:sz="4" w:color="d4af37"/>
+              <w:left w:val="single" w:sz="4" w:color="d4af37"/>
+              <w:bottom w:val="single" w:sz="4" w:color="d4af37"/>
+              <w:right w:val="single" w:sz="4" w:color="d4af37"/>
+            </w:tcBorders>
           </w:tcPr>
           <w:p>
+            <w:r/>
             <w:r>
+              <w:rPr>
+                <w:rFonts w:ascii="Arial" w:hAnsi="Arial"/>
+                <w:b w:val="0"/>
+                <w:color w:val="E6E6E6"/>
+                <w:sz w:val="22"/>
+              </w:rPr>
               <w:t>Game not found</w:t>
             </w:r>
           </w:p>
         </w:tc>
         <w:tc>
           <w:tcPr>
-            <w:tcW w:type="dxa" w:w="4320"/>
+            <w:tcW w:type="dxa" w:w="4536"/>
+            <w:shd w:fill="1e1e1e"/>
+            <w:tcBorders>
+              <w:top w:val="single" w:sz="4" w:color="d4af37"/>
+              <w:left w:val="single" w:sz="4" w:color="d4af37"/>
+              <w:bottom w:val="single" w:sz="4" w:color="d4af37"/>
+              <w:right w:val="single" w:sz="4" w:color="d4af37"/>
+            </w:tcBorders>
           </w:tcPr>
           <w:p>
+            <w:r/>
             <w:r>
+              <w:rPr>
+                <w:rFonts w:ascii="Arial" w:hAnsi="Arial"/>
+                <w:b w:val="0"/>
+                <w:color w:val="E6E6E6"/>
+                <w:sz w:val="22"/>
+              </w:rPr>
               <w:t>Search returns `null`; prints error and returns `false`</w:t>
             </w:r>
           </w:p>
@@ -966,20 +1836,48 @@
       <w:tr>
         <w:tc>
           <w:tcPr>
-            <w:tcW w:type="dxa" w:w="4320"/>
+            <w:tcW w:type="dxa" w:w="4536"/>
+            <w:shd w:fill="1e1e1e"/>
+            <w:tcBorders>
+              <w:top w:val="single" w:sz="4" w:color="d4af37"/>
+              <w:left w:val="single" w:sz="4" w:color="d4af37"/>
+              <w:bottom w:val="single" w:sz="4" w:color="d4af37"/>
+              <w:right w:val="single" w:sz="4" w:color="d4af37"/>
+            </w:tcBorders>
           </w:tcPr>
           <w:p>
+            <w:r/>
             <w:r>
+              <w:rPr>
+                <w:rFonts w:ascii="Arial" w:hAnsi="Arial"/>
+                <w:b w:val="0"/>
+                <w:color w:val="E6E6E6"/>
+                <w:sz w:val="22"/>
+              </w:rPr>
               <w:t>Game already borrowed</w:t>
             </w:r>
           </w:p>
         </w:tc>
         <w:tc>
           <w:tcPr>
-            <w:tcW w:type="dxa" w:w="4320"/>
+            <w:tcW w:type="dxa" w:w="4536"/>
+            <w:shd w:fill="1e1e1e"/>
+            <w:tcBorders>
+              <w:top w:val="single" w:sz="4" w:color="d4af37"/>
+              <w:left w:val="single" w:sz="4" w:color="d4af37"/>
+              <w:bottom w:val="single" w:sz="4" w:color="d4af37"/>
+              <w:right w:val="single" w:sz="4" w:color="d4af37"/>
+            </w:tcBorders>
           </w:tcPr>
           <w:p>
+            <w:r/>
             <w:r>
+              <w:rPr>
+                <w:rFonts w:ascii="Arial" w:hAnsi="Arial"/>
+                <w:b w:val="0"/>
+                <w:color w:val="E6E6E6"/>
+                <w:sz w:val="22"/>
+              </w:rPr>
               <w:t>Checks `isAvailable` before lending</w:t>
             </w:r>
           </w:p>
@@ -988,20 +1886,48 @@
       <w:tr>
         <w:tc>
           <w:tcPr>
-            <w:tcW w:type="dxa" w:w="4320"/>
+            <w:tcW w:type="dxa" w:w="4536"/>
+            <w:shd w:fill="1e1e1e"/>
+            <w:tcBorders>
+              <w:top w:val="single" w:sz="4" w:color="d4af37"/>
+              <w:left w:val="single" w:sz="4" w:color="d4af37"/>
+              <w:bottom w:val="single" w:sz="4" w:color="d4af37"/>
+              <w:right w:val="single" w:sz="4" w:color="d4af37"/>
+            </w:tcBorders>
           </w:tcPr>
           <w:p>
+            <w:r/>
             <w:r>
+              <w:rPr>
+                <w:rFonts w:ascii="Arial" w:hAnsi="Arial"/>
+                <w:b w:val="0"/>
+                <w:color w:val="E6E6E6"/>
+                <w:sz w:val="22"/>
+              </w:rPr>
               <w:t>Returning a game not borrowed</w:t>
             </w:r>
           </w:p>
         </w:tc>
         <w:tc>
           <w:tcPr>
-            <w:tcW w:type="dxa" w:w="4320"/>
+            <w:tcW w:type="dxa" w:w="4536"/>
+            <w:shd w:fill="1e1e1e"/>
+            <w:tcBorders>
+              <w:top w:val="single" w:sz="4" w:color="d4af37"/>
+              <w:left w:val="single" w:sz="4" w:color="d4af37"/>
+              <w:bottom w:val="single" w:sz="4" w:color="d4af37"/>
+              <w:right w:val="single" w:sz="4" w:color="d4af37"/>
+            </w:tcBorders>
           </w:tcPr>
           <w:p>
+            <w:r/>
             <w:r>
+              <w:rPr>
+                <w:rFonts w:ascii="Arial" w:hAnsi="Arial"/>
+                <w:b w:val="0"/>
+                <w:color w:val="E6E6E6"/>
+                <w:sz w:val="22"/>
+              </w:rPr>
               <w:t>Validates `borrowedGames.contains(game)`</w:t>
             </w:r>
           </w:p>
@@ -1010,20 +1936,48 @@
       <w:tr>
         <w:tc>
           <w:tcPr>
-            <w:tcW w:type="dxa" w:w="4320"/>
+            <w:tcW w:type="dxa" w:w="4536"/>
+            <w:shd w:fill="1e1e1e"/>
+            <w:tcBorders>
+              <w:top w:val="single" w:sz="4" w:color="d4af37"/>
+              <w:left w:val="single" w:sz="4" w:color="d4af37"/>
+              <w:bottom w:val="single" w:sz="4" w:color="d4af37"/>
+              <w:right w:val="single" w:sz="4" w:color="d4af37"/>
+            </w:tcBorders>
           </w:tcPr>
           <w:p>
+            <w:r/>
             <w:r>
+              <w:rPr>
+                <w:rFonts w:ascii="Arial" w:hAnsi="Arial"/>
+                <w:b w:val="0"/>
+                <w:color w:val="E6E6E6"/>
+                <w:sz w:val="22"/>
+              </w:rPr>
               <w:t>Zero/negative overdue days</w:t>
             </w:r>
           </w:p>
         </w:tc>
         <w:tc>
           <w:tcPr>
-            <w:tcW w:type="dxa" w:w="4320"/>
+            <w:tcW w:type="dxa" w:w="4536"/>
+            <w:shd w:fill="1e1e1e"/>
+            <w:tcBorders>
+              <w:top w:val="single" w:sz="4" w:color="d4af37"/>
+              <w:left w:val="single" w:sz="4" w:color="d4af37"/>
+              <w:bottom w:val="single" w:sz="4" w:color="d4af37"/>
+              <w:right w:val="single" w:sz="4" w:color="d4af37"/>
+            </w:tcBorders>
           </w:tcPr>
           <w:p>
+            <w:r/>
             <w:r>
+              <w:rPr>
+                <w:rFonts w:ascii="Arial" w:hAnsi="Arial"/>
+                <w:b w:val="0"/>
+                <w:color w:val="E6E6E6"/>
+                <w:sz w:val="22"/>
+              </w:rPr>
               <w:t>`calculateLateFee` returns `0.0`</w:t>
             </w:r>
           </w:p>
@@ -1032,20 +1986,48 @@
       <w:tr>
         <w:tc>
           <w:tcPr>
-            <w:tcW w:type="dxa" w:w="4320"/>
+            <w:tcW w:type="dxa" w:w="4536"/>
+            <w:shd w:fill="1e1e1e"/>
+            <w:tcBorders>
+              <w:top w:val="single" w:sz="4" w:color="d4af37"/>
+              <w:left w:val="single" w:sz="4" w:color="d4af37"/>
+              <w:bottom w:val="single" w:sz="4" w:color="d4af37"/>
+              <w:right w:val="single" w:sz="4" w:color="d4af37"/>
+            </w:tcBorders>
           </w:tcPr>
           <w:p>
+            <w:r/>
             <w:r>
+              <w:rPr>
+                <w:rFonts w:ascii="Arial" w:hAnsi="Arial"/>
+                <w:b w:val="0"/>
+                <w:color w:val="E6E6E6"/>
+                <w:sz w:val="22"/>
+              </w:rPr>
               <w:t>No recommendations found</w:t>
             </w:r>
           </w:p>
         </w:tc>
         <w:tc>
           <w:tcPr>
-            <w:tcW w:type="dxa" w:w="4320"/>
+            <w:tcW w:type="dxa" w:w="4536"/>
+            <w:shd w:fill="1e1e1e"/>
+            <w:tcBorders>
+              <w:top w:val="single" w:sz="4" w:color="d4af37"/>
+              <w:left w:val="single" w:sz="4" w:color="d4af37"/>
+              <w:bottom w:val="single" w:sz="4" w:color="d4af37"/>
+              <w:right w:val="single" w:sz="4" w:color="d4af37"/>
+            </w:tcBorders>
           </w:tcPr>
           <w:p>
+            <w:r/>
             <w:r>
+              <w:rPr>
+                <w:rFonts w:ascii="Arial" w:hAnsi="Arial"/>
+                <w:b w:val="0"/>
+                <w:color w:val="E6E6E6"/>
+                <w:sz w:val="22"/>
+              </w:rPr>
               <w:t>Prints a clear "No available board games found" message</w:t>
             </w:r>
           </w:p>
@@ -1054,6 +2036,12 @@
     </w:tbl>
     <w:p>
       <w:r>
+        <w:rPr>
+          <w:rFonts w:ascii="Arial" w:hAnsi="Arial"/>
+          <w:b w:val="0"/>
+          <w:color w:val="E6E6E6"/>
+          <w:sz w:val="22"/>
+        </w:rPr>
         <w:t>---</w:t>
       </w:r>
     </w:p>
@@ -1067,105 +2055,219 @@
     </w:p>
     <w:p>
       <w:r>
+        <w:rPr>
+          <w:rFonts w:ascii="Arial" w:hAnsi="Arial"/>
+          <w:b w:val="0"/>
+          <w:color w:val="E6E6E6"/>
+          <w:sz w:val="22"/>
+        </w:rPr>
         <w:t>1. `GameLibrary` is instantiated.</w:t>
       </w:r>
     </w:p>
     <w:p>
       <w:r>
+        <w:rPr>
+          <w:rFonts w:ascii="Arial" w:hAnsi="Arial"/>
+          <w:b w:val="0"/>
+          <w:color w:val="E6E6E6"/>
+          <w:sz w:val="22"/>
+        </w:rPr>
         <w:t>2. Four games are added to the catalog: two board games, one card game, one RPG manual.</w:t>
       </w:r>
     </w:p>
     <w:p>
       <w:r>
+        <w:rPr>
+          <w:rFonts w:ascii="Arial" w:hAnsi="Arial"/>
+          <w:b w:val="0"/>
+          <w:color w:val="E6E6E6"/>
+          <w:sz w:val="22"/>
+        </w:rPr>
         <w:t xml:space="preserve">3. Two members are registered: </w:t>
       </w:r>
       <w:r>
         <w:rPr>
+          <w:rFonts w:ascii="Arial" w:hAnsi="Arial"/>
           <w:b/>
+          <w:color w:val="FFDF80"/>
+          <w:sz w:val="22"/>
         </w:rPr>
         <w:t>Soumitra Deshpande</w:t>
       </w:r>
       <w:r>
+        <w:rPr>
+          <w:rFonts w:ascii="Arial" w:hAnsi="Arial"/>
+          <w:b w:val="0"/>
+          <w:color w:val="E6E6E6"/>
+          <w:sz w:val="22"/>
+        </w:rPr>
         <w:t xml:space="preserve"> and </w:t>
       </w:r>
       <w:r>
         <w:rPr>
+          <w:rFonts w:ascii="Arial" w:hAnsi="Arial"/>
           <w:b/>
+          <w:color w:val="FFDF80"/>
+          <w:sz w:val="22"/>
         </w:rPr>
         <w:t>Alex Chen</w:t>
       </w:r>
       <w:r>
+        <w:rPr>
+          <w:rFonts w:ascii="Arial" w:hAnsi="Arial"/>
+          <w:b w:val="0"/>
+          <w:color w:val="E6E6E6"/>
+          <w:sz w:val="22"/>
+        </w:rPr>
         <w:t>.</w:t>
       </w:r>
     </w:p>
     <w:p>
       <w:r>
+        <w:rPr>
+          <w:rFonts w:ascii="Arial" w:hAnsi="Arial"/>
+          <w:b w:val="0"/>
+          <w:color w:val="E6E6E6"/>
+          <w:sz w:val="22"/>
+        </w:rPr>
         <w:t>4. `listCatalog()` prints all games with an indexed `for` loop.</w:t>
       </w:r>
     </w:p>
     <w:p>
       <w:r>
+        <w:rPr>
+          <w:rFonts w:ascii="Arial" w:hAnsi="Arial"/>
+          <w:b w:val="0"/>
+          <w:color w:val="E6E6E6"/>
+          <w:sz w:val="22"/>
+        </w:rPr>
         <w:t xml:space="preserve">5. Soumitra borrows </w:t>
       </w:r>
       <w:r>
         <w:rPr>
+          <w:rFonts w:ascii="Arial" w:hAnsi="Arial"/>
           <w:b/>
+          <w:color w:val="FFDF80"/>
+          <w:sz w:val="22"/>
         </w:rPr>
         <w:t>Wingspan</w:t>
       </w:r>
       <w:r>
+        <w:rPr>
+          <w:rFonts w:ascii="Arial" w:hAnsi="Arial"/>
+          <w:b w:val="0"/>
+          <w:color w:val="E6E6E6"/>
+          <w:sz w:val="22"/>
+        </w:rPr>
         <w:t xml:space="preserve">; Alex borrows </w:t>
       </w:r>
       <w:r>
         <w:rPr>
+          <w:rFonts w:ascii="Arial" w:hAnsi="Arial"/>
           <w:b/>
+          <w:color w:val="FFDF80"/>
+          <w:sz w:val="22"/>
         </w:rPr>
         <w:t>Love Letter</w:t>
       </w:r>
       <w:r>
+        <w:rPr>
+          <w:rFonts w:ascii="Arial" w:hAnsi="Arial"/>
+          <w:b w:val="0"/>
+          <w:color w:val="E6E6E6"/>
+          <w:sz w:val="22"/>
+        </w:rPr>
         <w:t>.</w:t>
       </w:r>
     </w:p>
     <w:p>
       <w:r>
+        <w:rPr>
+          <w:rFonts w:ascii="Arial" w:hAnsi="Arial"/>
+          <w:b w:val="0"/>
+          <w:color w:val="E6E6E6"/>
+          <w:sz w:val="22"/>
+        </w:rPr>
         <w:t xml:space="preserve">6. `recommendForPlayers(3)` uses a `while` loop and finds </w:t>
       </w:r>
       <w:r>
         <w:rPr>
+          <w:rFonts w:ascii="Arial" w:hAnsi="Arial"/>
           <w:b/>
+          <w:color w:val="FFDF80"/>
+          <w:sz w:val="22"/>
         </w:rPr>
         <w:t>Catan</w:t>
       </w:r>
       <w:r>
+        <w:rPr>
+          <w:rFonts w:ascii="Arial" w:hAnsi="Arial"/>
+          <w:b w:val="0"/>
+          <w:color w:val="E6E6E6"/>
+          <w:sz w:val="22"/>
+        </w:rPr>
         <w:t>.</w:t>
       </w:r>
     </w:p>
     <w:p>
       <w:r>
+        <w:rPr>
+          <w:rFonts w:ascii="Arial" w:hAnsi="Arial"/>
+          <w:b w:val="0"/>
+          <w:color w:val="E6E6E6"/>
+          <w:sz w:val="22"/>
+        </w:rPr>
         <w:t xml:space="preserve">7. Soumitra returns </w:t>
       </w:r>
       <w:r>
         <w:rPr>
+          <w:rFonts w:ascii="Arial" w:hAnsi="Arial"/>
           <w:b/>
+          <w:color w:val="FFDF80"/>
+          <w:sz w:val="22"/>
         </w:rPr>
         <w:t>Wingspan</w:t>
       </w:r>
       <w:r>
+        <w:rPr>
+          <w:rFonts w:ascii="Arial" w:hAnsi="Arial"/>
+          <w:b w:val="0"/>
+          <w:color w:val="E6E6E6"/>
+          <w:sz w:val="22"/>
+        </w:rPr>
         <w:t>.</w:t>
       </w:r>
     </w:p>
     <w:p>
       <w:r>
+        <w:rPr>
+          <w:rFonts w:ascii="Arial" w:hAnsi="Arial"/>
+          <w:b w:val="0"/>
+          <w:color w:val="E6E6E6"/>
+          <w:sz w:val="22"/>
+        </w:rPr>
         <w:t>8. `for-in` loop prints each member's current borrow list.</w:t>
       </w:r>
     </w:p>
     <w:p>
       <w:r>
+        <w:rPr>
+          <w:rFonts w:ascii="Arial" w:hAnsi="Arial"/>
+          <w:b w:val="0"/>
+          <w:color w:val="E6E6E6"/>
+          <w:sz w:val="22"/>
+        </w:rPr>
         <w:t>9. Late fees are calculated for card game and RPG manual.</w:t>
       </w:r>
     </w:p>
     <w:p>
       <w:r>
+        <w:rPr>
+          <w:rFonts w:ascii="Arial" w:hAnsi="Arial"/>
+          <w:b w:val="0"/>
+          <w:color w:val="E6E6E6"/>
+          <w:sz w:val="22"/>
+        </w:rPr>
         <w:t>---</w:t>
       </w:r>
     </w:p>
@@ -1179,97 +2281,189 @@
     </w:p>
     <w:p>
       <w:r>
+        <w:rPr>
+          <w:rFonts w:ascii="Arial" w:hAnsi="Arial"/>
+          <w:b w:val="0"/>
+          <w:color w:val="E6E6E6"/>
+          <w:sz w:val="22"/>
+        </w:rPr>
         <w:t>The program was executed successfully with the following output:</w:t>
+      </w:r>
+    </w:p>
+    <w:tbl>
+      <w:tblPr>
+        <w:tblW w:type="auto" w:w="0"/>
+        <w:jc w:val="left"/>
+        <w:tblLook w:firstColumn="1" w:firstRow="1" w:lastColumn="0" w:lastRow="0" w:noHBand="0" w:noVBand="1" w:val="04A0"/>
+      </w:tblPr>
+      <w:tblGrid>
+        <w:gridCol w:w="9072"/>
+      </w:tblGrid>
+      <w:tr>
+        <w:tc>
+          <w:tcPr>
+            <w:tcW w:type="dxa" w:w="8640"/>
+            <w:shd w:fill="1e1e1e"/>
+            <w:tcBorders>
+              <w:top w:val="single" w:sz="4" w:color="d4af37"/>
+              <w:left w:val="single" w:sz="4" w:color="d4af37"/>
+              <w:bottom w:val="single" w:sz="4" w:color="d4af37"/>
+              <w:right w:val="single" w:sz="4" w:color="d4af37"/>
+            </w:tcBorders>
+          </w:tcPr>
+          <w:p>
+            <w:r>
+              <w:rPr>
+                <w:rFonts w:ascii="Consolas" w:hAnsi="Consolas"/>
+                <w:b w:val="0"/>
+                <w:color w:val="E6E6E6"/>
+                <w:sz w:val="18"/>
+              </w:rPr>
+              <w:t>=== GAME CATALOG ===</w:t>
+              <w:br/>
+              <w:t>1.</w:t>
+              <w:br/>
+              <w:t>[BG001] Catan — Board Game</w:t>
+              <w:br/>
+              <w:t xml:space="preserve">  Publisher: Kosmos | Year: 1995 | Genre: Strategy</w:t>
+              <w:br/>
+              <w:t xml:space="preserve">  Players: 3-4 | Playtime: 90m | Complexity: 2.3/5</w:t>
+              <w:br/>
+              <w:t xml:space="preserve">  Status: Available</w:t>
+              <w:br/>
+              <w:t>2.</w:t>
+              <w:br/>
+              <w:t>[BG002] Wingspan — Board Game</w:t>
+              <w:br/>
+              <w:t xml:space="preserve">  Publisher: Stonemaier Games | Year: 2019 | Genre: Strategy</w:t>
+              <w:br/>
+              <w:t xml:space="preserve">  Players: 1-5 | Playtime: 70m | Complexity: 2.4/5</w:t>
+              <w:br/>
+              <w:t xml:space="preserve">  Status: Available</w:t>
+              <w:br/>
+              <w:t>3.</w:t>
+              <w:br/>
+              <w:t>[CG001] Love Letter — Card Game</w:t>
+              <w:br/>
+              <w:t xml:space="preserve">  Publisher: Z-Man Games | Year: 2012 | Genre: Bluffing</w:t>
+              <w:br/>
+              <w:t xml:space="preserve">  Deck size: 16 cards | Avg playtime: 20m</w:t>
+              <w:br/>
+              <w:t xml:space="preserve">  Status: Available</w:t>
+              <w:br/>
+              <w:t>4.</w:t>
+              <w:br/>
+              <w:t>[RPG001] D&amp;D Player's Handbook — RPG Manual</w:t>
+              <w:br/>
+              <w:t xml:space="preserve">  Publisher: Wizards of the Coast | Year: 2014 | Genre: RPG</w:t>
+              <w:br/>
+              <w:t xml:space="preserve">  Edition: 5th Edition | Pages: 320</w:t>
+              <w:br/>
+              <w:t xml:space="preserve">  Status: Available</w:t>
+              <w:br/>
+              <w:t>Soumitra Deshpande borrowed Wingspan.</w:t>
+              <w:br/>
+              <w:t>Alex Chen borrowed Love Letter.</w:t>
+              <w:br/>
+              <w:br/>
+              <w:t>=== RECOMMENDATIONS FOR 3 PLAYERS ===</w:t>
+              <w:br/>
+              <w:t xml:space="preserve">  • Catan (3-4 players, 90m)</w:t>
+              <w:br/>
+              <w:t>Soumitra Deshpande returned Wingspan.</w:t>
+              <w:br/>
+              <w:br/>
+              <w:t>=== MEMBER BORROWS ===</w:t>
+              <w:br/>
+              <w:t xml:space="preserve">  Soumitra Deshpande has no borrowed games.</w:t>
+              <w:br/>
+              <w:t xml:space="preserve">  Alex Chen has borrowed:</w:t>
+              <w:br/>
+              <w:t xml:space="preserve">    • Love Letter</w:t>
+              <w:br/>
+              <w:br/>
+              <w:t>=== LATE FEE EXAMPLES ===</w:t>
+              <w:br/>
+              <w:t>Card game 5 days late: $7.50</w:t>
+              <w:br/>
+              <w:t>RPG manual 3 days late: $9.00</w:t>
+            </w:r>
+          </w:p>
+        </w:tc>
+      </w:tr>
+    </w:tbl>
+    <w:p>
+      <w:r>
+        <w:rPr>
+          <w:rFonts w:ascii="Arial" w:hAnsi="Arial"/>
+          <w:b w:val="0"/>
+          <w:color w:val="E6E6E6"/>
+          <w:sz w:val="22"/>
+        </w:rPr>
+        <w:t>A terminal screenshot is attached below:</w:t>
       </w:r>
     </w:p>
     <w:p>
       <w:pPr>
-        <w:spacing w:before="40" w:after="120"/>
-        <w:ind w:left="288"/>
+        <w:jc w:val="center"/>
       </w:pPr>
       <w:r>
         <w:rPr>
-          <w:rFonts w:ascii="Consolas" w:hAnsi="Consolas"/>
-          <w:color w:val="323232"/>
-          <w:sz w:val="18"/>
+          <w:rFonts w:ascii="Arial" w:hAnsi="Arial"/>
+          <w:b/>
+          <w:color w:val="D4AF37"/>
+          <w:sz w:val="20"/>
         </w:rPr>
-        <w:t>=== GAME CATALOG ===</w:t>
-        <w:br/>
-        <w:t>1.</w:t>
-        <w:br/>
-        <w:t>[BG001] Catan — Board Game</w:t>
-        <w:br/>
-        <w:t xml:space="preserve">  Publisher: Kosmos | Year: 1995 | Genre: Strategy</w:t>
-        <w:br/>
-        <w:t xml:space="preserve">  Players: 3-4 | Playtime: 90m | Complexity: 2.3/5</w:t>
-        <w:br/>
-        <w:t xml:space="preserve">  Status: Available</w:t>
-        <w:br/>
-        <w:t>2.</w:t>
-        <w:br/>
-        <w:t>[BG002] Wingspan — Board Game</w:t>
-        <w:br/>
-        <w:t xml:space="preserve">  Publisher: Stonemaier Games | Year: 2019 | Genre: Strategy</w:t>
-        <w:br/>
-        <w:t xml:space="preserve">  Players: 1-5 | Playtime: 70m | Complexity: 2.4/5</w:t>
-        <w:br/>
-        <w:t xml:space="preserve">  Status: Available</w:t>
-        <w:br/>
-        <w:t>3.</w:t>
-        <w:br/>
-        <w:t>[CG001] Love Letter — Card Game</w:t>
-        <w:br/>
-        <w:t xml:space="preserve">  Publisher: Z-Man Games | Year: 2012 | Genre: Bluffing</w:t>
-        <w:br/>
-        <w:t xml:space="preserve">  Deck size: 16 cards | Avg playtime: 20m</w:t>
-        <w:br/>
-        <w:t xml:space="preserve">  Status: Available</w:t>
-        <w:br/>
-        <w:t>4.</w:t>
-        <w:br/>
-        <w:t>[RPG001] D&amp;D Player's Handbook — RPG Manual</w:t>
-        <w:br/>
-        <w:t xml:space="preserve">  Publisher: Wizards of the Coast | Year: 2014 | Genre: RPG</w:t>
-        <w:br/>
-        <w:t xml:space="preserve">  Edition: 5th Edition | Pages: 320</w:t>
-        <w:br/>
-        <w:t xml:space="preserve">  Status: Available</w:t>
-        <w:br/>
-        <w:t>Soumitra Deshpande borrowed Wingspan.</w:t>
-        <w:br/>
-        <w:t>Alex Chen borrowed Love Letter.</w:t>
-        <w:br/>
-        <w:br/>
-        <w:t>=== RECOMMENDATIONS FOR 3 PLAYERS ===</w:t>
-        <w:br/>
-        <w:t xml:space="preserve">  • Catan (3-4 players, 90m)</w:t>
-        <w:br/>
-        <w:t>Soumitra Deshpande returned Wingspan.</w:t>
-        <w:br/>
-        <w:br/>
-        <w:t>=== MEMBER BORROWS ===</w:t>
-        <w:br/>
-        <w:t xml:space="preserve">  Soumitra Deshpande has no borrowed games.</w:t>
-        <w:br/>
-        <w:t xml:space="preserve">  Alex Chen has borrowed:</w:t>
-        <w:br/>
-        <w:t xml:space="preserve">    • Love Letter</w:t>
-        <w:br/>
-        <w:br/>
-        <w:t>=== LATE FEE EXAMPLES ===</w:t>
-        <w:br/>
-        <w:t>Card game 5 days late: $7.50</w:t>
-        <w:br/>
-        <w:t>RPG manual 3 days late: $9.00</w:t>
+        <w:t>Terminal execution screenshot</w:t>
+      </w:r>
+    </w:p>
+    <w:p>
+      <w:pPr>
+        <w:jc w:val="center"/>
+      </w:pPr>
+      <w:r>
+        <w:drawing>
+          <wp:inline xmlns:a="http://schemas.openxmlformats.org/drawingml/2006/main" xmlns:pic="http://schemas.openxmlformats.org/drawingml/2006/picture">
+            <wp:extent cx="5303520" cy="5409590"/>
+            <wp:docPr id="1" name="Picture 1"/>
+            <wp:cNvGraphicFramePr>
+              <a:graphicFrameLocks noChangeAspect="1"/>
+            </wp:cNvGraphicFramePr>
+            <a:graphic>
+              <a:graphicData uri="http://schemas.openxmlformats.org/drawingml/2006/picture">
+                <pic:pic>
+                  <pic:nvPicPr>
+                    <pic:cNvPr id="0" name="screenshot.png"/>
+                    <pic:cNvPicPr/>
+                  </pic:nvPicPr>
+                  <pic:blipFill>
+                    <a:blip r:embed="rId10"/>
+                    <a:stretch>
+                      <a:fillRect/>
+                    </a:stretch>
+                  </pic:blipFill>
+                  <pic:spPr>
+                    <a:xfrm>
+                      <a:off x="0" y="0"/>
+                      <a:ext cx="5303520" cy="5409590"/>
+                    </a:xfrm>
+                    <a:prstGeom prst="rect"/>
+                  </pic:spPr>
+                </pic:pic>
+              </a:graphicData>
+            </a:graphic>
+          </wp:inline>
+        </w:drawing>
       </w:r>
     </w:p>
     <w:p>
       <w:r>
-        <w:t>A terminal screenshot is attached at `assets/screenshot.png`.</w:t>
-      </w:r>
-    </w:p>
-    <w:p>
-      <w:r>
+        <w:rPr>
+          <w:rFonts w:ascii="Arial" w:hAnsi="Arial"/>
+          <w:b w:val="0"/>
+          <w:color w:val="E6E6E6"/>
+          <w:sz w:val="22"/>
+        </w:rPr>
         <w:t>---</w:t>
       </w:r>
     </w:p>
@@ -1283,26 +2477,56 @@
     </w:p>
     <w:p>
       <w:r>
+        <w:rPr>
+          <w:rFonts w:ascii="Arial" w:hAnsi="Arial"/>
+          <w:b w:val="0"/>
+          <w:color w:val="E6E6E6"/>
+          <w:sz w:val="22"/>
+        </w:rPr>
         <w:t>- Add `Reservation` class for game reservations.</w:t>
       </w:r>
     </w:p>
     <w:p>
       <w:r>
+        <w:rPr>
+          <w:rFonts w:ascii="Arial" w:hAnsi="Arial"/>
+          <w:b w:val="0"/>
+          <w:color w:val="E6E6E6"/>
+          <w:sz w:val="22"/>
+        </w:rPr>
         <w:t>- Persist catalog and member data to JSON or SQLite.</w:t>
       </w:r>
     </w:p>
     <w:p>
       <w:r>
+        <w:rPr>
+          <w:rFonts w:ascii="Arial" w:hAnsi="Arial"/>
+          <w:b w:val="0"/>
+          <w:color w:val="E6E6E6"/>
+          <w:sz w:val="22"/>
+        </w:rPr>
         <w:t>- Add due-date tracking and automatic overdue notifications.</w:t>
       </w:r>
     </w:p>
     <w:p>
       <w:r>
+        <w:rPr>
+          <w:rFonts w:ascii="Arial" w:hAnsi="Arial"/>
+          <w:b w:val="0"/>
+          <w:color w:val="E6E6E6"/>
+          <w:sz w:val="22"/>
+        </w:rPr>
         <w:t>- Build a CLI menu for interactive borrow/return operations.</w:t>
       </w:r>
     </w:p>
     <w:p>
       <w:r>
+        <w:rPr>
+          <w:rFonts w:ascii="Arial" w:hAnsi="Arial"/>
+          <w:b w:val="0"/>
+          <w:color w:val="E6E6E6"/>
+          <w:sz w:val="22"/>
+        </w:rPr>
         <w:t>---</w:t>
       </w:r>
     </w:p>
@@ -1316,17 +2540,47 @@
     </w:p>
     <w:p>
       <w:r>
+        <w:rPr>
+          <w:rFonts w:ascii="Arial" w:hAnsi="Arial"/>
+          <w:b w:val="0"/>
+          <w:color w:val="E6E6E6"/>
+          <w:sz w:val="22"/>
+        </w:rPr>
         <w:t>This Dart console application demonstrates core programming concepts through a practical, non-trivial domain. By choosing a board game lending library instead of a generic book system, the assignment stays orthogonal to the reference while still clearly showcasing variables, loops, functions, and OOP inheritance.</w:t>
       </w:r>
     </w:p>
     <w:sectPr>
-      <w:pgSz w:w="12240" w:h="15840"/>
-      <w:pgMar w:top="1440" w:right="1800" w:bottom="1440" w:left="1800" w:header="720" w:footer="720" w:gutter="0"/>
+      <w:footerReference w:type="default" r:id="rId9"/>
+      <w:pgSz w:w="11906" w:h="16838"/>
+      <w:pgMar w:top="1134" w:right="1417" w:bottom="1134" w:left="1417" w:header="720" w:footer="720" w:gutter="0"/>
       <w:cols w:space="720"/>
       <w:docGrid w:linePitch="360"/>
+      <w:shd w:fill="0a0a0a" w:val="clear"/>
     </w:sectPr>
   </w:body>
 </w:document>
+</file>
+
+<file path=word/footer1.xml><?xml version="1.0" encoding="utf-8"?>
+<w:ftr xmlns:m="http://schemas.openxmlformats.org/officeDocument/2006/math" xmlns:mc="http://schemas.openxmlformats.org/markup-compatibility/2006" xmlns:mo="http://schemas.microsoft.com/office/mac/office/2008/main" xmlns:mv="urn:schemas-microsoft-com:mac:vml" xmlns:o="urn:schemas-microsoft-com:office:office" xmlns:r="http://schemas.openxmlformats.org/officeDocument/2006/relationships" xmlns:v="urn:schemas-microsoft-com:vml" xmlns:w10="urn:schemas-microsoft-com:office:word" xmlns:w14="http://schemas.microsoft.com/office/word/2010/wordml" xmlns:w="http://schemas.openxmlformats.org/wordprocessingml/2006/main" xmlns:wne="http://schemas.microsoft.com/office/word/2006/wordml" xmlns:wp14="http://schemas.microsoft.com/office/word/2010/wordprocessingDrawing" xmlns:wp="http://schemas.openxmlformats.org/drawingml/2006/wordprocessingDrawing" xmlns:wpc="http://schemas.microsoft.com/office/word/2010/wordprocessingCanvas" xmlns:wpg="http://schemas.microsoft.com/office/word/2010/wordprocessingGroup" xmlns:wpi="http://schemas.microsoft.com/office/word/2010/wordprocessingInk" xmlns:wps="http://schemas.microsoft.com/office/word/2010/wordprocessingShape" mc:Ignorable="w14 wp14">
+  <w:p>
+    <w:pPr>
+      <w:pStyle w:val="Footer"/>
+      <w:jc w:val="center"/>
+    </w:pPr>
+    <w:r>
+      <w:rPr>
+        <w:rFonts w:ascii="Arial" w:hAnsi="Arial"/>
+        <w:b w:val="0"/>
+        <w:color w:val="D4AF37"/>
+        <w:sz w:val="18"/>
+      </w:rPr>
+      <w:fldChar w:fldCharType="begin"/>
+      <w:instrText xml:space="preserve">PAGE</w:instrText>
+      <w:fldChar w:fldCharType="end"/>
+    </w:r>
+  </w:p>
+</w:ftr>
 </file>
 
 <file path=word/numbering.xml><?xml version="1.0" encoding="utf-8"?>
@@ -1692,6 +2946,14 @@
     <w:name w:val="Normal"/>
     <w:qFormat/>
     <w:rsid w:val="00FC693F"/>
+    <w:pPr>
+      <w:spacing w:after="120" w:line="276" w:lineRule="auto"/>
+    </w:pPr>
+    <w:rPr>
+      <w:rFonts w:ascii="Arial" w:hAnsi="Arial"/>
+      <w:color w:val="E6E6E6"/>
+      <w:sz w:val="22"/>
+    </w:rPr>
   </w:style>
   <w:style w:type="paragraph" w:styleId="Header">
     <w:name w:val="header"/>
@@ -1748,15 +3010,15 @@
     <w:pPr>
       <w:keepNext/>
       <w:keepLines/>
-      <w:spacing w:before="480" w:after="0"/>
+      <w:spacing w:before="280" w:after="160"/>
       <w:outlineLvl w:val="0"/>
     </w:pPr>
     <w:rPr>
-      <w:rFonts w:asciiTheme="majorHAnsi" w:eastAsiaTheme="majorEastAsia" w:hAnsiTheme="majorHAnsi" w:cstheme="majorBidi"/>
+      <w:rFonts w:asciiTheme="majorHAnsi" w:eastAsiaTheme="majorEastAsia" w:hAnsiTheme="majorHAnsi" w:cstheme="majorBidi" w:ascii="Arial" w:hAnsi="Arial"/>
       <w:b/>
       <w:bCs/>
-      <w:color w:val="365F91" w:themeColor="accent1" w:themeShade="BF"/>
-      <w:sz w:val="28"/>
+      <w:color w:val="D4AF37"/>
+      <w:sz w:val="40"/>
       <w:szCs w:val="28"/>
     </w:rPr>
   </w:style>
@@ -1772,15 +3034,15 @@
     <w:pPr>
       <w:keepNext/>
       <w:keepLines/>
-      <w:spacing w:before="200" w:after="0"/>
+      <w:spacing w:before="280" w:after="160"/>
       <w:outlineLvl w:val="1"/>
     </w:pPr>
     <w:rPr>
-      <w:rFonts w:asciiTheme="majorHAnsi" w:eastAsiaTheme="majorEastAsia" w:hAnsiTheme="majorHAnsi" w:cstheme="majorBidi"/>
+      <w:rFonts w:asciiTheme="majorHAnsi" w:eastAsiaTheme="majorEastAsia" w:hAnsiTheme="majorHAnsi" w:cstheme="majorBidi" w:ascii="Arial" w:hAnsi="Arial"/>
       <w:b/>
       <w:bCs/>
-      <w:color w:val="4F81BD" w:themeColor="accent1"/>
-      <w:sz w:val="26"/>
+      <w:color w:val="D4AF37"/>
+      <w:sz w:val="32"/>
       <w:szCs w:val="26"/>
     </w:rPr>
   </w:style>
@@ -1796,14 +3058,15 @@
     <w:pPr>
       <w:keepNext/>
       <w:keepLines/>
-      <w:spacing w:before="200" w:after="0"/>
+      <w:spacing w:before="280" w:after="160"/>
       <w:outlineLvl w:val="2"/>
     </w:pPr>
     <w:rPr>
-      <w:rFonts w:asciiTheme="majorHAnsi" w:eastAsiaTheme="majorEastAsia" w:hAnsiTheme="majorHAnsi" w:cstheme="majorBidi"/>
+      <w:rFonts w:asciiTheme="majorHAnsi" w:eastAsiaTheme="majorEastAsia" w:hAnsiTheme="majorHAnsi" w:cstheme="majorBidi" w:ascii="Arial" w:hAnsi="Arial"/>
       <w:b/>
       <w:bCs/>
-      <w:color w:val="4F81BD" w:themeColor="accent1"/>
+      <w:color w:val="D4AF37"/>
+      <w:sz w:val="26"/>
     </w:rPr>
   </w:style>
   <w:style w:type="paragraph" w:styleId="Heading4">
@@ -1819,16 +3082,17 @@
     <w:pPr>
       <w:keepNext/>
       <w:keepLines/>
-      <w:spacing w:before="200" w:after="0"/>
+      <w:spacing w:before="280" w:after="160"/>
       <w:outlineLvl w:val="3"/>
     </w:pPr>
     <w:rPr>
-      <w:rFonts w:asciiTheme="majorHAnsi" w:eastAsiaTheme="majorEastAsia" w:hAnsiTheme="majorHAnsi" w:cstheme="majorBidi"/>
+      <w:rFonts w:asciiTheme="majorHAnsi" w:eastAsiaTheme="majorEastAsia" w:hAnsiTheme="majorHAnsi" w:cstheme="majorBidi" w:ascii="Arial" w:hAnsi="Arial"/>
       <w:b/>
       <w:bCs/>
       <w:i/>
       <w:iCs/>
-      <w:color w:val="4F81BD" w:themeColor="accent1"/>
+      <w:color w:val="D4AF37"/>
+      <w:sz w:val="24"/>
     </w:rPr>
   </w:style>
   <w:style w:type="paragraph" w:styleId="Heading5">
@@ -13374,18 +14638,6 @@
         <w:shd w:val="clear" w:color="auto" w:fill="FBCAA2" w:themeFill="accent6" w:themeFillTint="7F"/>
       </w:tcPr>
     </w:tblStylePr>
-  </w:style>
-  <w:style w:type="paragraph" w:customStyle="1" w:styleId="CodeStyle">
-    <w:name w:val="CodeStyle"/>
-    <w:pPr>
-      <w:spacing w:after="80"/>
-      <w:ind w:left="288"/>
-    </w:pPr>
-    <w:rPr>
-      <w:rFonts w:ascii="Consolas" w:hAnsi="Consolas"/>
-      <w:color w:val="323232"/>
-      <w:sz w:val="18"/>
-    </w:rPr>
   </w:style>
 </w:styles>
 </file>

</xml_diff>

<commit_message>
Switch docx to white background with gold and cream accents
</commit_message>
<xml_diff>
--- a/assignment_1/DOCUMENTATION.docx
+++ b/assignment_1/DOCUMENTATION.docx
@@ -1,7 +1,7 @@
 
 <file path=word/document.xml><?xml version="1.0" encoding="utf-8"?>
 <w:document xmlns:wpc="http://schemas.microsoft.com/office/word/2010/wordprocessingCanvas" xmlns:mo="http://schemas.microsoft.com/office/mac/office/2008/main" xmlns:mc="http://schemas.openxmlformats.org/markup-compatibility/2006" xmlns:mv="urn:schemas-microsoft-com:mac:vml" xmlns:o="urn:schemas-microsoft-com:office:office" xmlns:r="http://schemas.openxmlformats.org/officeDocument/2006/relationships" xmlns:m="http://schemas.openxmlformats.org/officeDocument/2006/math" xmlns:v="urn:schemas-microsoft-com:vml" xmlns:wp14="http://schemas.microsoft.com/office/word/2010/wordprocessingDrawing" xmlns:wp="http://schemas.openxmlformats.org/drawingml/2006/wordprocessingDrawing" xmlns:w10="urn:schemas-microsoft-com:office:word" xmlns:w="http://schemas.openxmlformats.org/wordprocessingml/2006/main" xmlns:w14="http://schemas.microsoft.com/office/word/2010/wordml" xmlns:wpg="http://schemas.microsoft.com/office/word/2010/wordprocessingGroup" xmlns:wpi="http://schemas.microsoft.com/office/word/2010/wordprocessingInk" xmlns:wne="http://schemas.microsoft.com/office/word/2006/wordml" xmlns:wps="http://schemas.microsoft.com/office/word/2010/wordprocessingShape" mc:Ignorable="w14 wp14">
-  <w:background w:color="0a0a0a"/>
+  <w:background w:color="ffffff"/>
   <w:body>
     <w:tbl>
       <w:tblPr>
@@ -16,12 +16,12 @@
         <w:tc>
           <w:tcPr>
             <w:tcW w:type="dxa" w:w="8640"/>
-            <w:shd w:fill="0a0a0a"/>
+            <w:shd w:fill="fffaeb"/>
             <w:tcBorders>
-              <w:top w:val="single" w:sz="12" w:color="d4af37"/>
-              <w:left w:val="single" w:sz="12" w:color="d4af37"/>
-              <w:bottom w:val="single" w:sz="12" w:color="d4af37"/>
-              <w:right w:val="single" w:sz="12" w:color="d4af37"/>
+              <w:top w:val="single" w:sz="16" w:color="d4af37"/>
+              <w:left w:val="single" w:sz="16" w:color="d4af37"/>
+              <w:bottom w:val="single" w:sz="16" w:color="d4af37"/>
+              <w:right w:val="single" w:sz="16" w:color="d4af37"/>
             </w:tcBorders>
           </w:tcPr>
           <w:p>
@@ -46,7 +46,7 @@
               <w:rPr>
                 <w:rFonts w:ascii="Arial" w:hAnsi="Arial"/>
                 <w:b/>
-                <w:color w:val="FFDF80"/>
+                <w:color w:val="323232"/>
                 <w:sz w:val="32"/>
               </w:rPr>
               <w:t>Dart Console Application</w:t>
@@ -57,7 +57,7 @@
               <w:rPr>
                 <w:rFonts w:ascii="Arial" w:hAnsi="Arial"/>
                 <w:b w:val="0"/>
-                <w:color w:val="E6E6E6"/>
+                <w:color w:val="282828"/>
                 <w:sz w:val="26"/>
               </w:rPr>
               <w:t>Name: Soumitra Deshpande</w:t>
@@ -67,7 +67,7 @@
               <w:rPr>
                 <w:rFonts w:ascii="Arial" w:hAnsi="Arial"/>
                 <w:b w:val="0"/>
-                <w:color w:val="E6E6E6"/>
+                <w:color w:val="282828"/>
                 <w:sz w:val="26"/>
               </w:rPr>
               <w:t>Roll No: 150096724035</w:t>
@@ -77,7 +77,7 @@
               <w:rPr>
                 <w:rFonts w:ascii="Arial" w:hAnsi="Arial"/>
                 <w:b w:val="0"/>
-                <w:color w:val="E6E6E6"/>
+                <w:color w:val="282828"/>
                 <w:sz w:val="24"/>
               </w:rPr>
               <w:t>Environment: Dart SDK 3.x</w:t>
@@ -109,7 +109,7 @@
         <w:rPr>
           <w:rFonts w:ascii="Arial" w:hAnsi="Arial"/>
           <w:b w:val="0"/>
-          <w:color w:val="E6E6E6"/>
+          <w:color w:val="FAFAFA"/>
           <w:sz w:val="22"/>
         </w:rPr>
       </w:r>
@@ -117,7 +117,7 @@
         <w:rPr>
           <w:rFonts w:ascii="Arial" w:hAnsi="Arial"/>
           <w:b/>
-          <w:color w:val="FFDF80"/>
+          <w:color w:val="D4AF37"/>
           <w:sz w:val="22"/>
         </w:rPr>
         <w:t>Assignment 1 — Dart Console Application</w:t>
@@ -126,7 +126,7 @@
         <w:rPr>
           <w:rFonts w:ascii="Arial" w:hAnsi="Arial"/>
           <w:b w:val="0"/>
-          <w:color w:val="E6E6E6"/>
+          <w:color w:val="FAFAFA"/>
           <w:sz w:val="22"/>
         </w:rPr>
         <w:t xml:space="preserve">  </w:t>
@@ -137,7 +137,7 @@
         <w:rPr>
           <w:rFonts w:ascii="Arial" w:hAnsi="Arial"/>
           <w:b w:val="0"/>
-          <w:color w:val="E6E6E6"/>
+          <w:color w:val="FAFAFA"/>
           <w:sz w:val="22"/>
         </w:rPr>
       </w:r>
@@ -145,7 +145,7 @@
         <w:rPr>
           <w:rFonts w:ascii="Arial" w:hAnsi="Arial"/>
           <w:b/>
-          <w:color w:val="FFDF80"/>
+          <w:color w:val="D4AF37"/>
           <w:sz w:val="22"/>
         </w:rPr>
         <w:t>Name:</w:t>
@@ -154,7 +154,7 @@
         <w:rPr>
           <w:rFonts w:ascii="Arial" w:hAnsi="Arial"/>
           <w:b w:val="0"/>
-          <w:color w:val="E6E6E6"/>
+          <w:color w:val="FAFAFA"/>
           <w:sz w:val="22"/>
         </w:rPr>
         <w:t xml:space="preserve"> Soumitra Deshpande  </w:t>
@@ -165,7 +165,7 @@
         <w:rPr>
           <w:rFonts w:ascii="Arial" w:hAnsi="Arial"/>
           <w:b w:val="0"/>
-          <w:color w:val="E6E6E6"/>
+          <w:color w:val="FAFAFA"/>
           <w:sz w:val="22"/>
         </w:rPr>
       </w:r>
@@ -173,7 +173,7 @@
         <w:rPr>
           <w:rFonts w:ascii="Arial" w:hAnsi="Arial"/>
           <w:b/>
-          <w:color w:val="FFDF80"/>
+          <w:color w:val="D4AF37"/>
           <w:sz w:val="22"/>
         </w:rPr>
         <w:t>Roll No:</w:t>
@@ -182,7 +182,7 @@
         <w:rPr>
           <w:rFonts w:ascii="Arial" w:hAnsi="Arial"/>
           <w:b w:val="0"/>
-          <w:color w:val="E6E6E6"/>
+          <w:color w:val="FAFAFA"/>
           <w:sz w:val="22"/>
         </w:rPr>
         <w:t xml:space="preserve"> 150096724035  </w:t>
@@ -193,7 +193,7 @@
         <w:rPr>
           <w:rFonts w:ascii="Arial" w:hAnsi="Arial"/>
           <w:b w:val="0"/>
-          <w:color w:val="E6E6E6"/>
+          <w:color w:val="FAFAFA"/>
           <w:sz w:val="22"/>
         </w:rPr>
       </w:r>
@@ -201,7 +201,7 @@
         <w:rPr>
           <w:rFonts w:ascii="Arial" w:hAnsi="Arial"/>
           <w:b/>
-          <w:color w:val="FFDF80"/>
+          <w:color w:val="D4AF37"/>
           <w:sz w:val="22"/>
         </w:rPr>
         <w:t>Environment:</w:t>
@@ -210,7 +210,7 @@
         <w:rPr>
           <w:rFonts w:ascii="Arial" w:hAnsi="Arial"/>
           <w:b w:val="0"/>
-          <w:color w:val="E6E6E6"/>
+          <w:color w:val="FAFAFA"/>
           <w:sz w:val="22"/>
         </w:rPr>
         <w:t xml:space="preserve"> Dart SDK 3.x</w:t>
@@ -221,7 +221,7 @@
         <w:rPr>
           <w:rFonts w:ascii="Arial" w:hAnsi="Arial"/>
           <w:b w:val="0"/>
-          <w:color w:val="E6E6E6"/>
+          <w:color w:val="FAFAFA"/>
           <w:sz w:val="22"/>
         </w:rPr>
         <w:t>---</w:t>
@@ -240,7 +240,7 @@
         <w:rPr>
           <w:rFonts w:ascii="Arial" w:hAnsi="Arial"/>
           <w:b w:val="0"/>
-          <w:color w:val="E6E6E6"/>
+          <w:color w:val="FAFAFA"/>
           <w:sz w:val="22"/>
         </w:rPr>
         <w:t xml:space="preserve">This project models a </w:t>
@@ -249,7 +249,7 @@
         <w:rPr>
           <w:rFonts w:ascii="Arial" w:hAnsi="Arial"/>
           <w:b/>
-          <w:color w:val="FFDF80"/>
+          <w:color w:val="D4AF37"/>
           <w:sz w:val="22"/>
         </w:rPr>
         <w:t>community board game lending library</w:t>
@@ -258,7 +258,7 @@
         <w:rPr>
           <w:rFonts w:ascii="Arial" w:hAnsi="Arial"/>
           <w:b w:val="0"/>
-          <w:color w:val="E6E6E6"/>
+          <w:color w:val="FAFAFA"/>
           <w:sz w:val="22"/>
         </w:rPr>
         <w:t xml:space="preserve"> as a console application in Dart. Instead of the usual physical/digital book catalog, it manages tabletop games: board games, card games, and RPG manuals. The app demonstrates variables, control flow, loops, functions, and object-oriented inheritance in a clean, modular way.</w:t>
@@ -277,7 +277,7 @@
         <w:rPr>
           <w:rFonts w:ascii="Arial" w:hAnsi="Arial"/>
           <w:b w:val="0"/>
-          <w:color w:val="E6E6E6"/>
+          <w:color w:val="FAFAFA"/>
           <w:sz w:val="22"/>
         </w:rPr>
         <w:t>- Model real-world game lending with an abstract base class and subclasses.</w:t>
@@ -288,7 +288,7 @@
         <w:rPr>
           <w:rFonts w:ascii="Arial" w:hAnsi="Arial"/>
           <w:b w:val="0"/>
-          <w:color w:val="E6E6E6"/>
+          <w:color w:val="FAFAFA"/>
           <w:sz w:val="22"/>
         </w:rPr>
         <w:t>- Use `List&lt;Game&gt;` for the catalog and `Map&lt;String, Member&gt;` for member lookup.</w:t>
@@ -299,7 +299,7 @@
         <w:rPr>
           <w:rFonts w:ascii="Arial" w:hAnsi="Arial"/>
           <w:b w:val="0"/>
-          <w:color w:val="E6E6E6"/>
+          <w:color w:val="FAFAFA"/>
           <w:sz w:val="22"/>
         </w:rPr>
         <w:t>- Implement named parameters, default values, and typed return values.</w:t>
@@ -310,7 +310,7 @@
         <w:rPr>
           <w:rFonts w:ascii="Arial" w:hAnsi="Arial"/>
           <w:b w:val="0"/>
-          <w:color w:val="E6E6E6"/>
+          <w:color w:val="FAFAFA"/>
           <w:sz w:val="22"/>
         </w:rPr>
         <w:t>- Use `for`, `while`, and `for-in` loops for different operations.</w:t>
@@ -321,7 +321,7 @@
         <w:rPr>
           <w:rFonts w:ascii="Arial" w:hAnsi="Arial"/>
           <w:b w:val="0"/>
-          <w:color w:val="E6E6E6"/>
+          <w:color w:val="FAFAFA"/>
           <w:sz w:val="22"/>
         </w:rPr>
         <w:t>---</w:t>
@@ -364,7 +364,7 @@
               <w:rPr>
                 <w:rFonts w:ascii="Arial" w:hAnsi="Arial"/>
                 <w:b/>
-                <w:color w:val="0A0A0A"/>
+                <w:color w:val="FFFFFF"/>
                 <w:sz w:val="22"/>
               </w:rPr>
               <w:t>Concept</w:t>
@@ -388,7 +388,7 @@
               <w:rPr>
                 <w:rFonts w:ascii="Arial" w:hAnsi="Arial"/>
                 <w:b/>
-                <w:color w:val="0A0A0A"/>
+                <w:color w:val="FFFFFF"/>
                 <w:sz w:val="22"/>
               </w:rPr>
               <w:t>Usage in Project</w:t>
@@ -400,7 +400,7 @@
         <w:tc>
           <w:tcPr>
             <w:tcW w:type="dxa" w:w="4536"/>
-            <w:shd w:fill="1e1e1e"/>
+            <w:shd w:fill="fff5dc"/>
             <w:tcBorders>
               <w:top w:val="single" w:sz="4" w:color="d4af37"/>
               <w:left w:val="single" w:sz="4" w:color="d4af37"/>
@@ -414,7 +414,7 @@
               <w:rPr>
                 <w:rFonts w:ascii="Arial" w:hAnsi="Arial"/>
                 <w:b w:val="0"/>
-                <w:color w:val="E6E6E6"/>
+                <w:color w:val="282828"/>
                 <w:sz w:val="22"/>
               </w:rPr>
               <w:t>**Variables**</w:t>
@@ -424,7 +424,7 @@
         <w:tc>
           <w:tcPr>
             <w:tcW w:type="dxa" w:w="4536"/>
-            <w:shd w:fill="1e1e1e"/>
+            <w:shd w:fill="fff5dc"/>
             <w:tcBorders>
               <w:top w:val="single" w:sz="4" w:color="d4af37"/>
               <w:left w:val="single" w:sz="4" w:color="d4af37"/>
@@ -438,7 +438,7 @@
               <w:rPr>
                 <w:rFonts w:ascii="Arial" w:hAnsi="Arial"/>
                 <w:b w:val="0"/>
-                <w:color w:val="E6E6E6"/>
+                <w:color w:val="282828"/>
                 <w:sz w:val="22"/>
               </w:rPr>
               <w:t>`String`, `int`, `double`, `bool`, `List&lt;Game&gt;`, `Map&lt;String, Member&gt;`</w:t>
@@ -450,7 +450,7 @@
         <w:tc>
           <w:tcPr>
             <w:tcW w:type="dxa" w:w="4536"/>
-            <w:shd w:fill="1e1e1e"/>
+            <w:shd w:fill="fff5dc"/>
             <w:tcBorders>
               <w:top w:val="single" w:sz="4" w:color="d4af37"/>
               <w:left w:val="single" w:sz="4" w:color="d4af37"/>
@@ -464,7 +464,7 @@
               <w:rPr>
                 <w:rFonts w:ascii="Arial" w:hAnsi="Arial"/>
                 <w:b w:val="0"/>
-                <w:color w:val="E6E6E6"/>
+                <w:color w:val="282828"/>
                 <w:sz w:val="22"/>
               </w:rPr>
               <w:t>**Null Safety**</w:t>
@@ -474,7 +474,7 @@
         <w:tc>
           <w:tcPr>
             <w:tcW w:type="dxa" w:w="4536"/>
-            <w:shd w:fill="1e1e1e"/>
+            <w:shd w:fill="fff5dc"/>
             <w:tcBorders>
               <w:top w:val="single" w:sz="4" w:color="d4af37"/>
               <w:left w:val="single" w:sz="4" w:color="d4af37"/>
@@ -488,7 +488,7 @@
               <w:rPr>
                 <w:rFonts w:ascii="Arial" w:hAnsi="Arial"/>
                 <w:b w:val="0"/>
-                <w:color w:val="E6E6E6"/>
+                <w:color w:val="282828"/>
                 <w:sz w:val="22"/>
               </w:rPr>
               <w:t>`Game?` for nullable search results; `required` named params</w:t>
@@ -500,7 +500,7 @@
         <w:tc>
           <w:tcPr>
             <w:tcW w:type="dxa" w:w="4536"/>
-            <w:shd w:fill="1e1e1e"/>
+            <w:shd w:fill="fff5dc"/>
             <w:tcBorders>
               <w:top w:val="single" w:sz="4" w:color="d4af37"/>
               <w:left w:val="single" w:sz="4" w:color="d4af37"/>
@@ -514,7 +514,7 @@
               <w:rPr>
                 <w:rFonts w:ascii="Arial" w:hAnsi="Arial"/>
                 <w:b w:val="0"/>
-                <w:color w:val="E6E6E6"/>
+                <w:color w:val="282828"/>
                 <w:sz w:val="22"/>
               </w:rPr>
               <w:t>**Functions**</w:t>
@@ -524,7 +524,7 @@
         <w:tc>
           <w:tcPr>
             <w:tcW w:type="dxa" w:w="4536"/>
-            <w:shd w:fill="1e1e1e"/>
+            <w:shd w:fill="fff5dc"/>
             <w:tcBorders>
               <w:top w:val="single" w:sz="4" w:color="d4af37"/>
               <w:left w:val="single" w:sz="4" w:color="d4af37"/>
@@ -538,7 +538,7 @@
               <w:rPr>
                 <w:rFonts w:ascii="Arial" w:hAnsi="Arial"/>
                 <w:b w:val="0"/>
-                <w:color w:val="E6E6E6"/>
+                <w:color w:val="282828"/>
                 <w:sz w:val="22"/>
               </w:rPr>
               <w:t>Named params with `required`, optional defaults (`dailyRate = 1.5`), typed returns</w:t>
@@ -550,7 +550,7 @@
         <w:tc>
           <w:tcPr>
             <w:tcW w:type="dxa" w:w="4536"/>
-            <w:shd w:fill="1e1e1e"/>
+            <w:shd w:fill="fff5dc"/>
             <w:tcBorders>
               <w:top w:val="single" w:sz="4" w:color="d4af37"/>
               <w:left w:val="single" w:sz="4" w:color="d4af37"/>
@@ -564,7 +564,7 @@
               <w:rPr>
                 <w:rFonts w:ascii="Arial" w:hAnsi="Arial"/>
                 <w:b w:val="0"/>
-                <w:color w:val="E6E6E6"/>
+                <w:color w:val="282828"/>
                 <w:sz w:val="22"/>
               </w:rPr>
               <w:t>**Loops**</w:t>
@@ -574,7 +574,7 @@
         <w:tc>
           <w:tcPr>
             <w:tcW w:type="dxa" w:w="4536"/>
-            <w:shd w:fill="1e1e1e"/>
+            <w:shd w:fill="fff5dc"/>
             <w:tcBorders>
               <w:top w:val="single" w:sz="4" w:color="d4af37"/>
               <w:left w:val="single" w:sz="4" w:color="d4af37"/>
@@ -588,7 +588,7 @@
               <w:rPr>
                 <w:rFonts w:ascii="Arial" w:hAnsi="Arial"/>
                 <w:b w:val="0"/>
-                <w:color w:val="E6E6E6"/>
+                <w:color w:val="282828"/>
                 <w:sz w:val="22"/>
               </w:rPr>
               <w:t>Indexed `for` in catalog list, `while` in recommendation search, `for-in` for member borrows</w:t>
@@ -600,7 +600,7 @@
         <w:tc>
           <w:tcPr>
             <w:tcW w:type="dxa" w:w="4536"/>
-            <w:shd w:fill="1e1e1e"/>
+            <w:shd w:fill="fff5dc"/>
             <w:tcBorders>
               <w:top w:val="single" w:sz="4" w:color="d4af37"/>
               <w:left w:val="single" w:sz="4" w:color="d4af37"/>
@@ -614,7 +614,7 @@
               <w:rPr>
                 <w:rFonts w:ascii="Arial" w:hAnsi="Arial"/>
                 <w:b w:val="0"/>
-                <w:color w:val="E6E6E6"/>
+                <w:color w:val="282828"/>
                 <w:sz w:val="22"/>
               </w:rPr>
               <w:t>**Collections**</w:t>
@@ -624,7 +624,7 @@
         <w:tc>
           <w:tcPr>
             <w:tcW w:type="dxa" w:w="4536"/>
-            <w:shd w:fill="1e1e1e"/>
+            <w:shd w:fill="fff5dc"/>
             <w:tcBorders>
               <w:top w:val="single" w:sz="4" w:color="d4af37"/>
               <w:left w:val="single" w:sz="4" w:color="d4af37"/>
@@ -638,7 +638,7 @@
               <w:rPr>
                 <w:rFonts w:ascii="Arial" w:hAnsi="Arial"/>
                 <w:b w:val="0"/>
-                <w:color w:val="E6E6E6"/>
+                <w:color w:val="282828"/>
                 <w:sz w:val="22"/>
               </w:rPr>
               <w:t>`List` for catalog and borrowed items, `Map` for member registry</w:t>
@@ -652,7 +652,7 @@
         <w:rPr>
           <w:rFonts w:ascii="Arial" w:hAnsi="Arial"/>
           <w:b w:val="0"/>
-          <w:color w:val="E6E6E6"/>
+          <w:color w:val="FAFAFA"/>
           <w:sz w:val="22"/>
         </w:rPr>
         <w:t>---</w:t>
@@ -679,7 +679,7 @@
         <w:rPr>
           <w:rFonts w:ascii="Arial" w:hAnsi="Arial"/>
           <w:b w:val="0"/>
-          <w:color w:val="E6E6E6"/>
+          <w:color w:val="FAFAFA"/>
           <w:sz w:val="22"/>
         </w:rPr>
         <w:t xml:space="preserve">1. </w:t>
@@ -688,7 +688,7 @@
         <w:rPr>
           <w:rFonts w:ascii="Arial" w:hAnsi="Arial"/>
           <w:b/>
-          <w:color w:val="FFDF80"/>
+          <w:color w:val="D4AF37"/>
           <w:sz w:val="22"/>
         </w:rPr>
         <w:t>Abstraction</w:t>
@@ -697,7 +697,7 @@
         <w:rPr>
           <w:rFonts w:ascii="Arial" w:hAnsi="Arial"/>
           <w:b w:val="0"/>
-          <w:color w:val="E6E6E6"/>
+          <w:color w:val="FAFAFA"/>
           <w:sz w:val="22"/>
         </w:rPr>
         <w:t xml:space="preserve"> — `Game` is abstract; it defines the contract `describe()` without implementation.</w:t>
@@ -708,7 +708,7 @@
         <w:rPr>
           <w:rFonts w:ascii="Arial" w:hAnsi="Arial"/>
           <w:b w:val="0"/>
-          <w:color w:val="E6E6E6"/>
+          <w:color w:val="FAFAFA"/>
           <w:sz w:val="22"/>
         </w:rPr>
         <w:t xml:space="preserve">2. </w:t>
@@ -717,7 +717,7 @@
         <w:rPr>
           <w:rFonts w:ascii="Arial" w:hAnsi="Arial"/>
           <w:b/>
-          <w:color w:val="FFDF80"/>
+          <w:color w:val="D4AF37"/>
           <w:sz w:val="22"/>
         </w:rPr>
         <w:t>Inheritance</w:t>
@@ -726,7 +726,7 @@
         <w:rPr>
           <w:rFonts w:ascii="Arial" w:hAnsi="Arial"/>
           <w:b w:val="0"/>
-          <w:color w:val="E6E6E6"/>
+          <w:color w:val="FAFAFA"/>
           <w:sz w:val="22"/>
         </w:rPr>
         <w:t xml:space="preserve"> — `BoardGame`, `CardGame`, and `RPGManual` extend `Game` using `super` parameters.</w:t>
@@ -737,7 +737,7 @@
         <w:rPr>
           <w:rFonts w:ascii="Arial" w:hAnsi="Arial"/>
           <w:b w:val="0"/>
-          <w:color w:val="E6E6E6"/>
+          <w:color w:val="FAFAFA"/>
           <w:sz w:val="22"/>
         </w:rPr>
         <w:t xml:space="preserve">3. </w:t>
@@ -746,7 +746,7 @@
         <w:rPr>
           <w:rFonts w:ascii="Arial" w:hAnsi="Arial"/>
           <w:b/>
-          <w:color w:val="FFDF80"/>
+          <w:color w:val="D4AF37"/>
           <w:sz w:val="22"/>
         </w:rPr>
         <w:t>Polymorphism</w:t>
@@ -755,7 +755,7 @@
         <w:rPr>
           <w:rFonts w:ascii="Arial" w:hAnsi="Arial"/>
           <w:b w:val="0"/>
-          <w:color w:val="E6E6E6"/>
+          <w:color w:val="FAFAFA"/>
           <w:sz w:val="22"/>
         </w:rPr>
         <w:t xml:space="preserve"> — Each subclass `@override` the `describe()` method for its own output format.</w:t>
@@ -766,7 +766,7 @@
         <w:rPr>
           <w:rFonts w:ascii="Arial" w:hAnsi="Arial"/>
           <w:b w:val="0"/>
-          <w:color w:val="E6E6E6"/>
+          <w:color w:val="FAFAFA"/>
           <w:sz w:val="22"/>
         </w:rPr>
         <w:t xml:space="preserve">4. </w:t>
@@ -775,7 +775,7 @@
         <w:rPr>
           <w:rFonts w:ascii="Arial" w:hAnsi="Arial"/>
           <w:b/>
-          <w:color w:val="FFDF80"/>
+          <w:color w:val="D4AF37"/>
           <w:sz w:val="22"/>
         </w:rPr>
         <w:t>Encapsulation</w:t>
@@ -784,7 +784,7 @@
         <w:rPr>
           <w:rFonts w:ascii="Arial" w:hAnsi="Arial"/>
           <w:b w:val="0"/>
-          <w:color w:val="E6E6E6"/>
+          <w:color w:val="FAFAFA"/>
           <w:sz w:val="22"/>
         </w:rPr>
         <w:t xml:space="preserve"> — `GameLibrary` controls catalog and borrow logic; `Member` owns its borrow list.</w:t>
@@ -811,7 +811,7 @@
         <w:tc>
           <w:tcPr>
             <w:tcW w:type="dxa" w:w="8640"/>
-            <w:shd w:fill="1e1e1e"/>
+            <w:shd w:fill="fffaeb"/>
             <w:tcBorders>
               <w:top w:val="single" w:sz="4" w:color="d4af37"/>
               <w:left w:val="single" w:sz="4" w:color="d4af37"/>
@@ -824,7 +824,7 @@
               <w:rPr>
                 <w:rFonts w:ascii="Consolas" w:hAnsi="Consolas"/>
                 <w:b w:val="0"/>
-                <w:color w:val="E6E6E6"/>
+                <w:color w:val="282828"/>
                 <w:sz w:val="18"/>
               </w:rPr>
               <w:t>classDiagram</w:t>
@@ -928,7 +928,7 @@
         <w:rPr>
           <w:rFonts w:ascii="Arial" w:hAnsi="Arial"/>
           <w:b w:val="0"/>
-          <w:color w:val="E6E6E6"/>
+          <w:color w:val="FAFAFA"/>
           <w:sz w:val="22"/>
         </w:rPr>
         <w:t>---</w:t>
@@ -955,7 +955,7 @@
         <w:tc>
           <w:tcPr>
             <w:tcW w:type="dxa" w:w="8640"/>
-            <w:shd w:fill="1e1e1e"/>
+            <w:shd w:fill="fffaeb"/>
             <w:tcBorders>
               <w:top w:val="single" w:sz="4" w:color="d4af37"/>
               <w:left w:val="single" w:sz="4" w:color="d4af37"/>
@@ -968,7 +968,7 @@
               <w:rPr>
                 <w:rFonts w:ascii="Consolas" w:hAnsi="Consolas"/>
                 <w:b w:val="0"/>
-                <w:color w:val="E6E6E6"/>
+                <w:color w:val="282828"/>
                 <w:sz w:val="18"/>
               </w:rPr>
               <w:t>┌─────────────────────────────────────┐</w:t>
@@ -1012,7 +1012,7 @@
         <w:rPr>
           <w:rFonts w:ascii="Arial" w:hAnsi="Arial"/>
           <w:b w:val="0"/>
-          <w:color w:val="E6E6E6"/>
+          <w:color w:val="FAFAFA"/>
           <w:sz w:val="22"/>
         </w:rPr>
         <w:t>---</w:t>
@@ -1056,7 +1056,7 @@
               <w:rPr>
                 <w:rFonts w:ascii="Arial" w:hAnsi="Arial"/>
                 <w:b/>
-                <w:color w:val="0A0A0A"/>
+                <w:color w:val="FFFFFF"/>
                 <w:sz w:val="22"/>
               </w:rPr>
               <w:t>Operation</w:t>
@@ -1080,7 +1080,7 @@
               <w:rPr>
                 <w:rFonts w:ascii="Arial" w:hAnsi="Arial"/>
                 <w:b/>
-                <w:color w:val="0A0A0A"/>
+                <w:color w:val="FFFFFF"/>
                 <w:sz w:val="22"/>
               </w:rPr>
               <w:t>Structure</w:t>
@@ -1104,7 +1104,7 @@
               <w:rPr>
                 <w:rFonts w:ascii="Arial" w:hAnsi="Arial"/>
                 <w:b/>
-                <w:color w:val="0A0A0A"/>
+                <w:color w:val="FFFFFF"/>
                 <w:sz w:val="22"/>
               </w:rPr>
               <w:t>Average Complexity</w:t>
@@ -1116,7 +1116,7 @@
         <w:tc>
           <w:tcPr>
             <w:tcW w:type="dxa" w:w="3024"/>
-            <w:shd w:fill="1e1e1e"/>
+            <w:shd w:fill="fff5dc"/>
             <w:tcBorders>
               <w:top w:val="single" w:sz="4" w:color="d4af37"/>
               <w:left w:val="single" w:sz="4" w:color="d4af37"/>
@@ -1130,7 +1130,7 @@
               <w:rPr>
                 <w:rFonts w:ascii="Arial" w:hAnsi="Arial"/>
                 <w:b w:val="0"/>
-                <w:color w:val="E6E6E6"/>
+                <w:color w:val="282828"/>
                 <w:sz w:val="22"/>
               </w:rPr>
               <w:t>Add game</w:t>
@@ -1140,7 +1140,7 @@
         <w:tc>
           <w:tcPr>
             <w:tcW w:type="dxa" w:w="3024"/>
-            <w:shd w:fill="1e1e1e"/>
+            <w:shd w:fill="fff5dc"/>
             <w:tcBorders>
               <w:top w:val="single" w:sz="4" w:color="d4af37"/>
               <w:left w:val="single" w:sz="4" w:color="d4af37"/>
@@ -1154,7 +1154,7 @@
               <w:rPr>
                 <w:rFonts w:ascii="Arial" w:hAnsi="Arial"/>
                 <w:b w:val="0"/>
-                <w:color w:val="E6E6E6"/>
+                <w:color w:val="282828"/>
                 <w:sz w:val="22"/>
               </w:rPr>
               <w:t>`List.add`</w:t>
@@ -1164,7 +1164,7 @@
         <w:tc>
           <w:tcPr>
             <w:tcW w:type="dxa" w:w="3024"/>
-            <w:shd w:fill="1e1e1e"/>
+            <w:shd w:fill="fff5dc"/>
             <w:tcBorders>
               <w:top w:val="single" w:sz="4" w:color="d4af37"/>
               <w:left w:val="single" w:sz="4" w:color="d4af37"/>
@@ -1178,7 +1178,7 @@
               <w:rPr>
                 <w:rFonts w:ascii="Arial" w:hAnsi="Arial"/>
                 <w:b w:val="0"/>
-                <w:color w:val="E6E6E6"/>
+                <w:color w:val="282828"/>
                 <w:sz w:val="22"/>
               </w:rPr>
               <w:t>O(1) amortized</w:t>
@@ -1190,7 +1190,7 @@
         <w:tc>
           <w:tcPr>
             <w:tcW w:type="dxa" w:w="3024"/>
-            <w:shd w:fill="1e1e1e"/>
+            <w:shd w:fill="fff5dc"/>
             <w:tcBorders>
               <w:top w:val="single" w:sz="4" w:color="d4af37"/>
               <w:left w:val="single" w:sz="4" w:color="d4af37"/>
@@ -1204,7 +1204,7 @@
               <w:rPr>
                 <w:rFonts w:ascii="Arial" w:hAnsi="Arial"/>
                 <w:b w:val="0"/>
-                <w:color w:val="E6E6E6"/>
+                <w:color w:val="282828"/>
                 <w:sz w:val="22"/>
               </w:rPr>
               <w:t>Register member</w:t>
@@ -1214,7 +1214,7 @@
         <w:tc>
           <w:tcPr>
             <w:tcW w:type="dxa" w:w="3024"/>
-            <w:shd w:fill="1e1e1e"/>
+            <w:shd w:fill="fff5dc"/>
             <w:tcBorders>
               <w:top w:val="single" w:sz="4" w:color="d4af37"/>
               <w:left w:val="single" w:sz="4" w:color="d4af37"/>
@@ -1228,7 +1228,7 @@
               <w:rPr>
                 <w:rFonts w:ascii="Arial" w:hAnsi="Arial"/>
                 <w:b w:val="0"/>
-                <w:color w:val="E6E6E6"/>
+                <w:color w:val="282828"/>
                 <w:sz w:val="22"/>
               </w:rPr>
               <w:t>`Map` insertion</w:t>
@@ -1238,7 +1238,7 @@
         <w:tc>
           <w:tcPr>
             <w:tcW w:type="dxa" w:w="3024"/>
-            <w:shd w:fill="1e1e1e"/>
+            <w:shd w:fill="fff5dc"/>
             <w:tcBorders>
               <w:top w:val="single" w:sz="4" w:color="d4af37"/>
               <w:left w:val="single" w:sz="4" w:color="d4af37"/>
@@ -1252,7 +1252,7 @@
               <w:rPr>
                 <w:rFonts w:ascii="Arial" w:hAnsi="Arial"/>
                 <w:b w:val="0"/>
-                <w:color w:val="E6E6E6"/>
+                <w:color w:val="282828"/>
                 <w:sz w:val="22"/>
               </w:rPr>
               <w:t>O(1)</w:t>
@@ -1264,7 +1264,7 @@
         <w:tc>
           <w:tcPr>
             <w:tcW w:type="dxa" w:w="3024"/>
-            <w:shd w:fill="1e1e1e"/>
+            <w:shd w:fill="fff5dc"/>
             <w:tcBorders>
               <w:top w:val="single" w:sz="4" w:color="d4af37"/>
               <w:left w:val="single" w:sz="4" w:color="d4af37"/>
@@ -1278,7 +1278,7 @@
               <w:rPr>
                 <w:rFonts w:ascii="Arial" w:hAnsi="Arial"/>
                 <w:b w:val="0"/>
-                <w:color w:val="E6E6E6"/>
+                <w:color w:val="282828"/>
                 <w:sz w:val="22"/>
               </w:rPr>
               <w:t>Find game by ID</w:t>
@@ -1288,7 +1288,7 @@
         <w:tc>
           <w:tcPr>
             <w:tcW w:type="dxa" w:w="3024"/>
-            <w:shd w:fill="1e1e1e"/>
+            <w:shd w:fill="fff5dc"/>
             <w:tcBorders>
               <w:top w:val="single" w:sz="4" w:color="d4af37"/>
               <w:left w:val="single" w:sz="4" w:color="d4af37"/>
@@ -1302,7 +1302,7 @@
               <w:rPr>
                 <w:rFonts w:ascii="Arial" w:hAnsi="Arial"/>
                 <w:b w:val="0"/>
-                <w:color w:val="E6E6E6"/>
+                <w:color w:val="282828"/>
                 <w:sz w:val="22"/>
               </w:rPr>
               <w:t>Linear scan of `List`</w:t>
@@ -1312,7 +1312,7 @@
         <w:tc>
           <w:tcPr>
             <w:tcW w:type="dxa" w:w="3024"/>
-            <w:shd w:fill="1e1e1e"/>
+            <w:shd w:fill="fff5dc"/>
             <w:tcBorders>
               <w:top w:val="single" w:sz="4" w:color="d4af37"/>
               <w:left w:val="single" w:sz="4" w:color="d4af37"/>
@@ -1326,7 +1326,7 @@
               <w:rPr>
                 <w:rFonts w:ascii="Arial" w:hAnsi="Arial"/>
                 <w:b w:val="0"/>
-                <w:color w:val="E6E6E6"/>
+                <w:color w:val="282828"/>
                 <w:sz w:val="22"/>
               </w:rPr>
               <w:t>O(n)</w:t>
@@ -1338,7 +1338,7 @@
         <w:tc>
           <w:tcPr>
             <w:tcW w:type="dxa" w:w="3024"/>
-            <w:shd w:fill="1e1e1e"/>
+            <w:shd w:fill="fff5dc"/>
             <w:tcBorders>
               <w:top w:val="single" w:sz="4" w:color="d4af37"/>
               <w:left w:val="single" w:sz="4" w:color="d4af37"/>
@@ -1352,7 +1352,7 @@
               <w:rPr>
                 <w:rFonts w:ascii="Arial" w:hAnsi="Arial"/>
                 <w:b w:val="0"/>
-                <w:color w:val="E6E6E6"/>
+                <w:color w:val="282828"/>
                 <w:sz w:val="22"/>
               </w:rPr>
               <w:t>Find member by ID</w:t>
@@ -1362,7 +1362,7 @@
         <w:tc>
           <w:tcPr>
             <w:tcW w:type="dxa" w:w="3024"/>
-            <w:shd w:fill="1e1e1e"/>
+            <w:shd w:fill="fff5dc"/>
             <w:tcBorders>
               <w:top w:val="single" w:sz="4" w:color="d4af37"/>
               <w:left w:val="single" w:sz="4" w:color="d4af37"/>
@@ -1376,7 +1376,7 @@
               <w:rPr>
                 <w:rFonts w:ascii="Arial" w:hAnsi="Arial"/>
                 <w:b w:val="0"/>
-                <w:color w:val="E6E6E6"/>
+                <w:color w:val="282828"/>
                 <w:sz w:val="22"/>
               </w:rPr>
               <w:t>`Map` lookup</w:t>
@@ -1386,7 +1386,7 @@
         <w:tc>
           <w:tcPr>
             <w:tcW w:type="dxa" w:w="3024"/>
-            <w:shd w:fill="1e1e1e"/>
+            <w:shd w:fill="fff5dc"/>
             <w:tcBorders>
               <w:top w:val="single" w:sz="4" w:color="d4af37"/>
               <w:left w:val="single" w:sz="4" w:color="d4af37"/>
@@ -1400,7 +1400,7 @@
               <w:rPr>
                 <w:rFonts w:ascii="Arial" w:hAnsi="Arial"/>
                 <w:b w:val="0"/>
-                <w:color w:val="E6E6E6"/>
+                <w:color w:val="282828"/>
                 <w:sz w:val="22"/>
               </w:rPr>
               <w:t>O(1)</w:t>
@@ -1412,7 +1412,7 @@
         <w:tc>
           <w:tcPr>
             <w:tcW w:type="dxa" w:w="3024"/>
-            <w:shd w:fill="1e1e1e"/>
+            <w:shd w:fill="fff5dc"/>
             <w:tcBorders>
               <w:top w:val="single" w:sz="4" w:color="d4af37"/>
               <w:left w:val="single" w:sz="4" w:color="d4af37"/>
@@ -1426,7 +1426,7 @@
               <w:rPr>
                 <w:rFonts w:ascii="Arial" w:hAnsi="Arial"/>
                 <w:b w:val="0"/>
-                <w:color w:val="E6E6E6"/>
+                <w:color w:val="282828"/>
                 <w:sz w:val="22"/>
               </w:rPr>
               <w:t>Recommend games</w:t>
@@ -1436,7 +1436,7 @@
         <w:tc>
           <w:tcPr>
             <w:tcW w:type="dxa" w:w="3024"/>
-            <w:shd w:fill="1e1e1e"/>
+            <w:shd w:fill="fff5dc"/>
             <w:tcBorders>
               <w:top w:val="single" w:sz="4" w:color="d4af37"/>
               <w:left w:val="single" w:sz="4" w:color="d4af37"/>
@@ -1450,7 +1450,7 @@
               <w:rPr>
                 <w:rFonts w:ascii="Arial" w:hAnsi="Arial"/>
                 <w:b w:val="0"/>
-                <w:color w:val="E6E6E6"/>
+                <w:color w:val="282828"/>
                 <w:sz w:val="22"/>
               </w:rPr>
               <w:t>Linear `while` scan</w:t>
@@ -1460,7 +1460,7 @@
         <w:tc>
           <w:tcPr>
             <w:tcW w:type="dxa" w:w="3024"/>
-            <w:shd w:fill="1e1e1e"/>
+            <w:shd w:fill="fff5dc"/>
             <w:tcBorders>
               <w:top w:val="single" w:sz="4" w:color="d4af37"/>
               <w:left w:val="single" w:sz="4" w:color="d4af37"/>
@@ -1474,7 +1474,7 @@
               <w:rPr>
                 <w:rFonts w:ascii="Arial" w:hAnsi="Arial"/>
                 <w:b w:val="0"/>
-                <w:color w:val="E6E6E6"/>
+                <w:color w:val="282828"/>
                 <w:sz w:val="22"/>
               </w:rPr>
               <w:t>O(n)</w:t>
@@ -1488,7 +1488,7 @@
         <w:rPr>
           <w:rFonts w:ascii="Arial" w:hAnsi="Arial"/>
           <w:b w:val="0"/>
-          <w:color w:val="E6E6E6"/>
+          <w:color w:val="FAFAFA"/>
           <w:sz w:val="22"/>
         </w:rPr>
         <w:t>---</w:t>
@@ -1515,7 +1515,7 @@
         <w:rPr>
           <w:rFonts w:ascii="Arial" w:hAnsi="Arial"/>
           <w:b w:val="0"/>
-          <w:color w:val="E6E6E6"/>
+          <w:color w:val="FAFAFA"/>
           <w:sz w:val="22"/>
         </w:rPr>
         <w:t>Abstract base class `Game`. Holds common fields (`id`, `title`, `publisher`, `releaseYear`, `genre`, `isAvailable`) and declares the abstract `describe()` method.</w:t>
@@ -1534,7 +1534,7 @@
         <w:rPr>
           <w:rFonts w:ascii="Arial" w:hAnsi="Arial"/>
           <w:b w:val="0"/>
-          <w:color w:val="E6E6E6"/>
+          <w:color w:val="FAFAFA"/>
           <w:sz w:val="22"/>
         </w:rPr>
         <w:t>Subclass for board games. Adds `playerCountMin`, `playerCountMax`, `playTimeMinutes`, and `complexityRating`.</w:t>
@@ -1553,7 +1553,7 @@
         <w:rPr>
           <w:rFonts w:ascii="Arial" w:hAnsi="Arial"/>
           <w:b w:val="0"/>
-          <w:color w:val="E6E6E6"/>
+          <w:color w:val="FAFAFA"/>
           <w:sz w:val="22"/>
         </w:rPr>
         <w:t>Subclass for card games. Adds `deckSize` and `avgPlayTimeMinutes`.</w:t>
@@ -1572,7 +1572,7 @@
         <w:rPr>
           <w:rFonts w:ascii="Arial" w:hAnsi="Arial"/>
           <w:b w:val="0"/>
-          <w:color w:val="E6E6E6"/>
+          <w:color w:val="FAFAFA"/>
           <w:sz w:val="22"/>
         </w:rPr>
         <w:t>Subclass for RPG manuals. Adds `edition` and `pageCount`.</w:t>
@@ -1591,7 +1591,7 @@
         <w:rPr>
           <w:rFonts w:ascii="Arial" w:hAnsi="Arial"/>
           <w:b w:val="0"/>
-          <w:color w:val="E6E6E6"/>
+          <w:color w:val="FAFAFA"/>
           <w:sz w:val="22"/>
         </w:rPr>
         <w:t>Represents a library member. Tracks `memberId`, `name`, and a `List&lt;Game&gt;` of borrowed items.</w:t>
@@ -1610,7 +1610,7 @@
         <w:rPr>
           <w:rFonts w:ascii="Arial" w:hAnsi="Arial"/>
           <w:b w:val="0"/>
-          <w:color w:val="E6E6E6"/>
+          <w:color w:val="FAFAFA"/>
           <w:sz w:val="22"/>
         </w:rPr>
         <w:t>Central controller. Manages catalog and members, handles borrow/return logic, and recommends board games by player count using a `while` loop.</w:t>
@@ -1629,7 +1629,7 @@
         <w:rPr>
           <w:rFonts w:ascii="Arial" w:hAnsi="Arial"/>
           <w:b w:val="0"/>
-          <w:color w:val="E6E6E6"/>
+          <w:color w:val="FAFAFA"/>
           <w:sz w:val="22"/>
         </w:rPr>
         <w:t>Pure utility function with named parameters and a default rate. Applies multipliers based on game type.</w:t>
@@ -1648,7 +1648,7 @@
         <w:rPr>
           <w:rFonts w:ascii="Arial" w:hAnsi="Arial"/>
           <w:b w:val="0"/>
-          <w:color w:val="E6E6E6"/>
+          <w:color w:val="FAFAFA"/>
           <w:sz w:val="22"/>
         </w:rPr>
         <w:t>Driver script. Creates sample data, runs catalog listing, borrows, recommends, returns, and prints late fees.</w:t>
@@ -1659,7 +1659,7 @@
         <w:rPr>
           <w:rFonts w:ascii="Arial" w:hAnsi="Arial"/>
           <w:b w:val="0"/>
-          <w:color w:val="E6E6E6"/>
+          <w:color w:val="FAFAFA"/>
           <w:sz w:val="22"/>
         </w:rPr>
         <w:t>---</w:t>
@@ -1702,7 +1702,7 @@
               <w:rPr>
                 <w:rFonts w:ascii="Arial" w:hAnsi="Arial"/>
                 <w:b/>
-                <w:color w:val="0A0A0A"/>
+                <w:color w:val="FFFFFF"/>
                 <w:sz w:val="22"/>
               </w:rPr>
               <w:t>Scenario</w:t>
@@ -1726,7 +1726,7 @@
               <w:rPr>
                 <w:rFonts w:ascii="Arial" w:hAnsi="Arial"/>
                 <w:b/>
-                <w:color w:val="0A0A0A"/>
+                <w:color w:val="FFFFFF"/>
                 <w:sz w:val="22"/>
               </w:rPr>
               <w:t>Handling</w:t>
@@ -1738,7 +1738,7 @@
         <w:tc>
           <w:tcPr>
             <w:tcW w:type="dxa" w:w="4536"/>
-            <w:shd w:fill="1e1e1e"/>
+            <w:shd w:fill="fff5dc"/>
             <w:tcBorders>
               <w:top w:val="single" w:sz="4" w:color="d4af37"/>
               <w:left w:val="single" w:sz="4" w:color="d4af37"/>
@@ -1752,7 +1752,7 @@
               <w:rPr>
                 <w:rFonts w:ascii="Arial" w:hAnsi="Arial"/>
                 <w:b w:val="0"/>
-                <w:color w:val="E6E6E6"/>
+                <w:color w:val="282828"/>
                 <w:sz w:val="22"/>
               </w:rPr>
               <w:t>Member not found</w:t>
@@ -1762,7 +1762,7 @@
         <w:tc>
           <w:tcPr>
             <w:tcW w:type="dxa" w:w="4536"/>
-            <w:shd w:fill="1e1e1e"/>
+            <w:shd w:fill="fff5dc"/>
             <w:tcBorders>
               <w:top w:val="single" w:sz="4" w:color="d4af37"/>
               <w:left w:val="single" w:sz="4" w:color="d4af37"/>
@@ -1776,7 +1776,7 @@
               <w:rPr>
                 <w:rFonts w:ascii="Arial" w:hAnsi="Arial"/>
                 <w:b w:val="0"/>
-                <w:color w:val="E6E6E6"/>
+                <w:color w:val="282828"/>
                 <w:sz w:val="22"/>
               </w:rPr>
               <w:t>`Map` lookup returns `null`; prints error and returns `false`</w:t>
@@ -1788,7 +1788,7 @@
         <w:tc>
           <w:tcPr>
             <w:tcW w:type="dxa" w:w="4536"/>
-            <w:shd w:fill="1e1e1e"/>
+            <w:shd w:fill="fff5dc"/>
             <w:tcBorders>
               <w:top w:val="single" w:sz="4" w:color="d4af37"/>
               <w:left w:val="single" w:sz="4" w:color="d4af37"/>
@@ -1802,7 +1802,7 @@
               <w:rPr>
                 <w:rFonts w:ascii="Arial" w:hAnsi="Arial"/>
                 <w:b w:val="0"/>
-                <w:color w:val="E6E6E6"/>
+                <w:color w:val="282828"/>
                 <w:sz w:val="22"/>
               </w:rPr>
               <w:t>Game not found</w:t>
@@ -1812,7 +1812,7 @@
         <w:tc>
           <w:tcPr>
             <w:tcW w:type="dxa" w:w="4536"/>
-            <w:shd w:fill="1e1e1e"/>
+            <w:shd w:fill="fff5dc"/>
             <w:tcBorders>
               <w:top w:val="single" w:sz="4" w:color="d4af37"/>
               <w:left w:val="single" w:sz="4" w:color="d4af37"/>
@@ -1826,7 +1826,7 @@
               <w:rPr>
                 <w:rFonts w:ascii="Arial" w:hAnsi="Arial"/>
                 <w:b w:val="0"/>
-                <w:color w:val="E6E6E6"/>
+                <w:color w:val="282828"/>
                 <w:sz w:val="22"/>
               </w:rPr>
               <w:t>Search returns `null`; prints error and returns `false`</w:t>
@@ -1838,7 +1838,7 @@
         <w:tc>
           <w:tcPr>
             <w:tcW w:type="dxa" w:w="4536"/>
-            <w:shd w:fill="1e1e1e"/>
+            <w:shd w:fill="fff5dc"/>
             <w:tcBorders>
               <w:top w:val="single" w:sz="4" w:color="d4af37"/>
               <w:left w:val="single" w:sz="4" w:color="d4af37"/>
@@ -1852,7 +1852,7 @@
               <w:rPr>
                 <w:rFonts w:ascii="Arial" w:hAnsi="Arial"/>
                 <w:b w:val="0"/>
-                <w:color w:val="E6E6E6"/>
+                <w:color w:val="282828"/>
                 <w:sz w:val="22"/>
               </w:rPr>
               <w:t>Game already borrowed</w:t>
@@ -1862,7 +1862,7 @@
         <w:tc>
           <w:tcPr>
             <w:tcW w:type="dxa" w:w="4536"/>
-            <w:shd w:fill="1e1e1e"/>
+            <w:shd w:fill="fff5dc"/>
             <w:tcBorders>
               <w:top w:val="single" w:sz="4" w:color="d4af37"/>
               <w:left w:val="single" w:sz="4" w:color="d4af37"/>
@@ -1876,7 +1876,7 @@
               <w:rPr>
                 <w:rFonts w:ascii="Arial" w:hAnsi="Arial"/>
                 <w:b w:val="0"/>
-                <w:color w:val="E6E6E6"/>
+                <w:color w:val="282828"/>
                 <w:sz w:val="22"/>
               </w:rPr>
               <w:t>Checks `isAvailable` before lending</w:t>
@@ -1888,7 +1888,7 @@
         <w:tc>
           <w:tcPr>
             <w:tcW w:type="dxa" w:w="4536"/>
-            <w:shd w:fill="1e1e1e"/>
+            <w:shd w:fill="fff5dc"/>
             <w:tcBorders>
               <w:top w:val="single" w:sz="4" w:color="d4af37"/>
               <w:left w:val="single" w:sz="4" w:color="d4af37"/>
@@ -1902,7 +1902,7 @@
               <w:rPr>
                 <w:rFonts w:ascii="Arial" w:hAnsi="Arial"/>
                 <w:b w:val="0"/>
-                <w:color w:val="E6E6E6"/>
+                <w:color w:val="282828"/>
                 <w:sz w:val="22"/>
               </w:rPr>
               <w:t>Returning a game not borrowed</w:t>
@@ -1912,7 +1912,7 @@
         <w:tc>
           <w:tcPr>
             <w:tcW w:type="dxa" w:w="4536"/>
-            <w:shd w:fill="1e1e1e"/>
+            <w:shd w:fill="fff5dc"/>
             <w:tcBorders>
               <w:top w:val="single" w:sz="4" w:color="d4af37"/>
               <w:left w:val="single" w:sz="4" w:color="d4af37"/>
@@ -1926,7 +1926,7 @@
               <w:rPr>
                 <w:rFonts w:ascii="Arial" w:hAnsi="Arial"/>
                 <w:b w:val="0"/>
-                <w:color w:val="E6E6E6"/>
+                <w:color w:val="282828"/>
                 <w:sz w:val="22"/>
               </w:rPr>
               <w:t>Validates `borrowedGames.contains(game)`</w:t>
@@ -1938,7 +1938,7 @@
         <w:tc>
           <w:tcPr>
             <w:tcW w:type="dxa" w:w="4536"/>
-            <w:shd w:fill="1e1e1e"/>
+            <w:shd w:fill="fff5dc"/>
             <w:tcBorders>
               <w:top w:val="single" w:sz="4" w:color="d4af37"/>
               <w:left w:val="single" w:sz="4" w:color="d4af37"/>
@@ -1952,7 +1952,7 @@
               <w:rPr>
                 <w:rFonts w:ascii="Arial" w:hAnsi="Arial"/>
                 <w:b w:val="0"/>
-                <w:color w:val="E6E6E6"/>
+                <w:color w:val="282828"/>
                 <w:sz w:val="22"/>
               </w:rPr>
               <w:t>Zero/negative overdue days</w:t>
@@ -1962,7 +1962,7 @@
         <w:tc>
           <w:tcPr>
             <w:tcW w:type="dxa" w:w="4536"/>
-            <w:shd w:fill="1e1e1e"/>
+            <w:shd w:fill="fff5dc"/>
             <w:tcBorders>
               <w:top w:val="single" w:sz="4" w:color="d4af37"/>
               <w:left w:val="single" w:sz="4" w:color="d4af37"/>
@@ -1976,7 +1976,7 @@
               <w:rPr>
                 <w:rFonts w:ascii="Arial" w:hAnsi="Arial"/>
                 <w:b w:val="0"/>
-                <w:color w:val="E6E6E6"/>
+                <w:color w:val="282828"/>
                 <w:sz w:val="22"/>
               </w:rPr>
               <w:t>`calculateLateFee` returns `0.0`</w:t>
@@ -1988,7 +1988,7 @@
         <w:tc>
           <w:tcPr>
             <w:tcW w:type="dxa" w:w="4536"/>
-            <w:shd w:fill="1e1e1e"/>
+            <w:shd w:fill="fff5dc"/>
             <w:tcBorders>
               <w:top w:val="single" w:sz="4" w:color="d4af37"/>
               <w:left w:val="single" w:sz="4" w:color="d4af37"/>
@@ -2002,7 +2002,7 @@
               <w:rPr>
                 <w:rFonts w:ascii="Arial" w:hAnsi="Arial"/>
                 <w:b w:val="0"/>
-                <w:color w:val="E6E6E6"/>
+                <w:color w:val="282828"/>
                 <w:sz w:val="22"/>
               </w:rPr>
               <w:t>No recommendations found</w:t>
@@ -2012,7 +2012,7 @@
         <w:tc>
           <w:tcPr>
             <w:tcW w:type="dxa" w:w="4536"/>
-            <w:shd w:fill="1e1e1e"/>
+            <w:shd w:fill="fff5dc"/>
             <w:tcBorders>
               <w:top w:val="single" w:sz="4" w:color="d4af37"/>
               <w:left w:val="single" w:sz="4" w:color="d4af37"/>
@@ -2026,7 +2026,7 @@
               <w:rPr>
                 <w:rFonts w:ascii="Arial" w:hAnsi="Arial"/>
                 <w:b w:val="0"/>
-                <w:color w:val="E6E6E6"/>
+                <w:color w:val="282828"/>
                 <w:sz w:val="22"/>
               </w:rPr>
               <w:t>Prints a clear "No available board games found" message</w:t>
@@ -2040,7 +2040,7 @@
         <w:rPr>
           <w:rFonts w:ascii="Arial" w:hAnsi="Arial"/>
           <w:b w:val="0"/>
-          <w:color w:val="E6E6E6"/>
+          <w:color w:val="FAFAFA"/>
           <w:sz w:val="22"/>
         </w:rPr>
         <w:t>---</w:t>
@@ -2059,7 +2059,7 @@
         <w:rPr>
           <w:rFonts w:ascii="Arial" w:hAnsi="Arial"/>
           <w:b w:val="0"/>
-          <w:color w:val="E6E6E6"/>
+          <w:color w:val="FAFAFA"/>
           <w:sz w:val="22"/>
         </w:rPr>
         <w:t>1. `GameLibrary` is instantiated.</w:t>
@@ -2070,7 +2070,7 @@
         <w:rPr>
           <w:rFonts w:ascii="Arial" w:hAnsi="Arial"/>
           <w:b w:val="0"/>
-          <w:color w:val="E6E6E6"/>
+          <w:color w:val="FAFAFA"/>
           <w:sz w:val="22"/>
         </w:rPr>
         <w:t>2. Four games are added to the catalog: two board games, one card game, one RPG manual.</w:t>
@@ -2081,7 +2081,7 @@
         <w:rPr>
           <w:rFonts w:ascii="Arial" w:hAnsi="Arial"/>
           <w:b w:val="0"/>
-          <w:color w:val="E6E6E6"/>
+          <w:color w:val="FAFAFA"/>
           <w:sz w:val="22"/>
         </w:rPr>
         <w:t xml:space="preserve">3. Two members are registered: </w:t>
@@ -2090,7 +2090,7 @@
         <w:rPr>
           <w:rFonts w:ascii="Arial" w:hAnsi="Arial"/>
           <w:b/>
-          <w:color w:val="FFDF80"/>
+          <w:color w:val="D4AF37"/>
           <w:sz w:val="22"/>
         </w:rPr>
         <w:t>Soumitra Deshpande</w:t>
@@ -2099,7 +2099,7 @@
         <w:rPr>
           <w:rFonts w:ascii="Arial" w:hAnsi="Arial"/>
           <w:b w:val="0"/>
-          <w:color w:val="E6E6E6"/>
+          <w:color w:val="FAFAFA"/>
           <w:sz w:val="22"/>
         </w:rPr>
         <w:t xml:space="preserve"> and </w:t>
@@ -2108,7 +2108,7 @@
         <w:rPr>
           <w:rFonts w:ascii="Arial" w:hAnsi="Arial"/>
           <w:b/>
-          <w:color w:val="FFDF80"/>
+          <w:color w:val="D4AF37"/>
           <w:sz w:val="22"/>
         </w:rPr>
         <w:t>Alex Chen</w:t>
@@ -2117,7 +2117,7 @@
         <w:rPr>
           <w:rFonts w:ascii="Arial" w:hAnsi="Arial"/>
           <w:b w:val="0"/>
-          <w:color w:val="E6E6E6"/>
+          <w:color w:val="FAFAFA"/>
           <w:sz w:val="22"/>
         </w:rPr>
         <w:t>.</w:t>
@@ -2128,7 +2128,7 @@
         <w:rPr>
           <w:rFonts w:ascii="Arial" w:hAnsi="Arial"/>
           <w:b w:val="0"/>
-          <w:color w:val="E6E6E6"/>
+          <w:color w:val="FAFAFA"/>
           <w:sz w:val="22"/>
         </w:rPr>
         <w:t>4. `listCatalog()` prints all games with an indexed `for` loop.</w:t>
@@ -2139,7 +2139,7 @@
         <w:rPr>
           <w:rFonts w:ascii="Arial" w:hAnsi="Arial"/>
           <w:b w:val="0"/>
-          <w:color w:val="E6E6E6"/>
+          <w:color w:val="FAFAFA"/>
           <w:sz w:val="22"/>
         </w:rPr>
         <w:t xml:space="preserve">5. Soumitra borrows </w:t>
@@ -2148,7 +2148,7 @@
         <w:rPr>
           <w:rFonts w:ascii="Arial" w:hAnsi="Arial"/>
           <w:b/>
-          <w:color w:val="FFDF80"/>
+          <w:color w:val="D4AF37"/>
           <w:sz w:val="22"/>
         </w:rPr>
         <w:t>Wingspan</w:t>
@@ -2157,7 +2157,7 @@
         <w:rPr>
           <w:rFonts w:ascii="Arial" w:hAnsi="Arial"/>
           <w:b w:val="0"/>
-          <w:color w:val="E6E6E6"/>
+          <w:color w:val="FAFAFA"/>
           <w:sz w:val="22"/>
         </w:rPr>
         <w:t xml:space="preserve">; Alex borrows </w:t>
@@ -2166,7 +2166,7 @@
         <w:rPr>
           <w:rFonts w:ascii="Arial" w:hAnsi="Arial"/>
           <w:b/>
-          <w:color w:val="FFDF80"/>
+          <w:color w:val="D4AF37"/>
           <w:sz w:val="22"/>
         </w:rPr>
         <w:t>Love Letter</w:t>
@@ -2175,7 +2175,7 @@
         <w:rPr>
           <w:rFonts w:ascii="Arial" w:hAnsi="Arial"/>
           <w:b w:val="0"/>
-          <w:color w:val="E6E6E6"/>
+          <w:color w:val="FAFAFA"/>
           <w:sz w:val="22"/>
         </w:rPr>
         <w:t>.</w:t>
@@ -2186,7 +2186,7 @@
         <w:rPr>
           <w:rFonts w:ascii="Arial" w:hAnsi="Arial"/>
           <w:b w:val="0"/>
-          <w:color w:val="E6E6E6"/>
+          <w:color w:val="FAFAFA"/>
           <w:sz w:val="22"/>
         </w:rPr>
         <w:t xml:space="preserve">6. `recommendForPlayers(3)` uses a `while` loop and finds </w:t>
@@ -2195,7 +2195,7 @@
         <w:rPr>
           <w:rFonts w:ascii="Arial" w:hAnsi="Arial"/>
           <w:b/>
-          <w:color w:val="FFDF80"/>
+          <w:color w:val="D4AF37"/>
           <w:sz w:val="22"/>
         </w:rPr>
         <w:t>Catan</w:t>
@@ -2204,7 +2204,7 @@
         <w:rPr>
           <w:rFonts w:ascii="Arial" w:hAnsi="Arial"/>
           <w:b w:val="0"/>
-          <w:color w:val="E6E6E6"/>
+          <w:color w:val="FAFAFA"/>
           <w:sz w:val="22"/>
         </w:rPr>
         <w:t>.</w:t>
@@ -2215,7 +2215,7 @@
         <w:rPr>
           <w:rFonts w:ascii="Arial" w:hAnsi="Arial"/>
           <w:b w:val="0"/>
-          <w:color w:val="E6E6E6"/>
+          <w:color w:val="FAFAFA"/>
           <w:sz w:val="22"/>
         </w:rPr>
         <w:t xml:space="preserve">7. Soumitra returns </w:t>
@@ -2224,7 +2224,7 @@
         <w:rPr>
           <w:rFonts w:ascii="Arial" w:hAnsi="Arial"/>
           <w:b/>
-          <w:color w:val="FFDF80"/>
+          <w:color w:val="D4AF37"/>
           <w:sz w:val="22"/>
         </w:rPr>
         <w:t>Wingspan</w:t>
@@ -2233,7 +2233,7 @@
         <w:rPr>
           <w:rFonts w:ascii="Arial" w:hAnsi="Arial"/>
           <w:b w:val="0"/>
-          <w:color w:val="E6E6E6"/>
+          <w:color w:val="FAFAFA"/>
           <w:sz w:val="22"/>
         </w:rPr>
         <w:t>.</w:t>
@@ -2244,7 +2244,7 @@
         <w:rPr>
           <w:rFonts w:ascii="Arial" w:hAnsi="Arial"/>
           <w:b w:val="0"/>
-          <w:color w:val="E6E6E6"/>
+          <w:color w:val="FAFAFA"/>
           <w:sz w:val="22"/>
         </w:rPr>
         <w:t>8. `for-in` loop prints each member's current borrow list.</w:t>
@@ -2255,7 +2255,7 @@
         <w:rPr>
           <w:rFonts w:ascii="Arial" w:hAnsi="Arial"/>
           <w:b w:val="0"/>
-          <w:color w:val="E6E6E6"/>
+          <w:color w:val="FAFAFA"/>
           <w:sz w:val="22"/>
         </w:rPr>
         <w:t>9. Late fees are calculated for card game and RPG manual.</w:t>
@@ -2266,7 +2266,7 @@
         <w:rPr>
           <w:rFonts w:ascii="Arial" w:hAnsi="Arial"/>
           <w:b w:val="0"/>
-          <w:color w:val="E6E6E6"/>
+          <w:color w:val="FAFAFA"/>
           <w:sz w:val="22"/>
         </w:rPr>
         <w:t>---</w:t>
@@ -2285,7 +2285,7 @@
         <w:rPr>
           <w:rFonts w:ascii="Arial" w:hAnsi="Arial"/>
           <w:b w:val="0"/>
-          <w:color w:val="E6E6E6"/>
+          <w:color w:val="FAFAFA"/>
           <w:sz w:val="22"/>
         </w:rPr>
         <w:t>The program was executed successfully with the following output:</w:t>
@@ -2304,7 +2304,7 @@
         <w:tc>
           <w:tcPr>
             <w:tcW w:type="dxa" w:w="8640"/>
-            <w:shd w:fill="1e1e1e"/>
+            <w:shd w:fill="fffaeb"/>
             <w:tcBorders>
               <w:top w:val="single" w:sz="4" w:color="d4af37"/>
               <w:left w:val="single" w:sz="4" w:color="d4af37"/>
@@ -2317,7 +2317,7 @@
               <w:rPr>
                 <w:rFonts w:ascii="Consolas" w:hAnsi="Consolas"/>
                 <w:b w:val="0"/>
-                <w:color w:val="E6E6E6"/>
+                <w:color w:val="282828"/>
                 <w:sz w:val="18"/>
               </w:rPr>
               <w:t>=== GAME CATALOG ===</w:t>
@@ -2398,7 +2398,7 @@
         <w:rPr>
           <w:rFonts w:ascii="Arial" w:hAnsi="Arial"/>
           <w:b w:val="0"/>
-          <w:color w:val="E6E6E6"/>
+          <w:color w:val="FAFAFA"/>
           <w:sz w:val="22"/>
         </w:rPr>
         <w:t>A terminal screenshot is attached below:</w:t>
@@ -2462,7 +2462,7 @@
         <w:rPr>
           <w:rFonts w:ascii="Arial" w:hAnsi="Arial"/>
           <w:b w:val="0"/>
-          <w:color w:val="E6E6E6"/>
+          <w:color w:val="FAFAFA"/>
           <w:sz w:val="22"/>
         </w:rPr>
         <w:t>---</w:t>
@@ -2481,7 +2481,7 @@
         <w:rPr>
           <w:rFonts w:ascii="Arial" w:hAnsi="Arial"/>
           <w:b w:val="0"/>
-          <w:color w:val="E6E6E6"/>
+          <w:color w:val="FAFAFA"/>
           <w:sz w:val="22"/>
         </w:rPr>
         <w:t>- Add `Reservation` class for game reservations.</w:t>
@@ -2492,7 +2492,7 @@
         <w:rPr>
           <w:rFonts w:ascii="Arial" w:hAnsi="Arial"/>
           <w:b w:val="0"/>
-          <w:color w:val="E6E6E6"/>
+          <w:color w:val="FAFAFA"/>
           <w:sz w:val="22"/>
         </w:rPr>
         <w:t>- Persist catalog and member data to JSON or SQLite.</w:t>
@@ -2503,7 +2503,7 @@
         <w:rPr>
           <w:rFonts w:ascii="Arial" w:hAnsi="Arial"/>
           <w:b w:val="0"/>
-          <w:color w:val="E6E6E6"/>
+          <w:color w:val="FAFAFA"/>
           <w:sz w:val="22"/>
         </w:rPr>
         <w:t>- Add due-date tracking and automatic overdue notifications.</w:t>
@@ -2514,7 +2514,7 @@
         <w:rPr>
           <w:rFonts w:ascii="Arial" w:hAnsi="Arial"/>
           <w:b w:val="0"/>
-          <w:color w:val="E6E6E6"/>
+          <w:color w:val="FAFAFA"/>
           <w:sz w:val="22"/>
         </w:rPr>
         <w:t>- Build a CLI menu for interactive borrow/return operations.</w:t>
@@ -2525,7 +2525,7 @@
         <w:rPr>
           <w:rFonts w:ascii="Arial" w:hAnsi="Arial"/>
           <w:b w:val="0"/>
-          <w:color w:val="E6E6E6"/>
+          <w:color w:val="FAFAFA"/>
           <w:sz w:val="22"/>
         </w:rPr>
         <w:t>---</w:t>
@@ -2544,7 +2544,7 @@
         <w:rPr>
           <w:rFonts w:ascii="Arial" w:hAnsi="Arial"/>
           <w:b w:val="0"/>
-          <w:color w:val="E6E6E6"/>
+          <w:color w:val="FAFAFA"/>
           <w:sz w:val="22"/>
         </w:rPr>
         <w:t>This Dart console application demonstrates core programming concepts through a practical, non-trivial domain. By choosing a board game lending library instead of a generic book system, the assignment stays orthogonal to the reference while still clearly showcasing variables, loops, functions, and OOP inheritance.</w:t>
@@ -2951,7 +2951,7 @@
     </w:pPr>
     <w:rPr>
       <w:rFonts w:ascii="Arial" w:hAnsi="Arial"/>
-      <w:color w:val="E6E6E6"/>
+      <w:color w:val="282828"/>
       <w:sz w:val="22"/>
     </w:rPr>
   </w:style>

</xml_diff>

<commit_message>
Fix docx text color: bullets and default runs now dark on white theme
</commit_message>
<xml_diff>
--- a/assignment_1/DOCUMENTATION.docx
+++ b/assignment_1/DOCUMENTATION.docx
@@ -109,7 +109,7 @@
         <w:rPr>
           <w:rFonts w:ascii="Arial" w:hAnsi="Arial"/>
           <w:b w:val="0"/>
-          <w:color w:val="FAFAFA"/>
+          <w:color w:val="282828"/>
           <w:sz w:val="22"/>
         </w:rPr>
       </w:r>
@@ -126,7 +126,7 @@
         <w:rPr>
           <w:rFonts w:ascii="Arial" w:hAnsi="Arial"/>
           <w:b w:val="0"/>
-          <w:color w:val="FAFAFA"/>
+          <w:color w:val="282828"/>
           <w:sz w:val="22"/>
         </w:rPr>
         <w:t xml:space="preserve">  </w:t>
@@ -137,7 +137,7 @@
         <w:rPr>
           <w:rFonts w:ascii="Arial" w:hAnsi="Arial"/>
           <w:b w:val="0"/>
-          <w:color w:val="FAFAFA"/>
+          <w:color w:val="282828"/>
           <w:sz w:val="22"/>
         </w:rPr>
       </w:r>
@@ -154,7 +154,7 @@
         <w:rPr>
           <w:rFonts w:ascii="Arial" w:hAnsi="Arial"/>
           <w:b w:val="0"/>
-          <w:color w:val="FAFAFA"/>
+          <w:color w:val="282828"/>
           <w:sz w:val="22"/>
         </w:rPr>
         <w:t xml:space="preserve"> Soumitra Deshpande  </w:t>
@@ -165,7 +165,7 @@
         <w:rPr>
           <w:rFonts w:ascii="Arial" w:hAnsi="Arial"/>
           <w:b w:val="0"/>
-          <w:color w:val="FAFAFA"/>
+          <w:color w:val="282828"/>
           <w:sz w:val="22"/>
         </w:rPr>
       </w:r>
@@ -182,7 +182,7 @@
         <w:rPr>
           <w:rFonts w:ascii="Arial" w:hAnsi="Arial"/>
           <w:b w:val="0"/>
-          <w:color w:val="FAFAFA"/>
+          <w:color w:val="282828"/>
           <w:sz w:val="22"/>
         </w:rPr>
         <w:t xml:space="preserve"> 150096724035  </w:t>
@@ -193,7 +193,7 @@
         <w:rPr>
           <w:rFonts w:ascii="Arial" w:hAnsi="Arial"/>
           <w:b w:val="0"/>
-          <w:color w:val="FAFAFA"/>
+          <w:color w:val="282828"/>
           <w:sz w:val="22"/>
         </w:rPr>
       </w:r>
@@ -210,21 +210,10 @@
         <w:rPr>
           <w:rFonts w:ascii="Arial" w:hAnsi="Arial"/>
           <w:b w:val="0"/>
-          <w:color w:val="FAFAFA"/>
+          <w:color w:val="282828"/>
           <w:sz w:val="22"/>
         </w:rPr>
         <w:t xml:space="preserve"> Dart SDK 3.x</w:t>
-      </w:r>
-    </w:p>
-    <w:p>
-      <w:r>
-        <w:rPr>
-          <w:rFonts w:ascii="Arial" w:hAnsi="Arial"/>
-          <w:b w:val="0"/>
-          <w:color w:val="FAFAFA"/>
-          <w:sz w:val="22"/>
-        </w:rPr>
-        <w:t>---</w:t>
       </w:r>
     </w:p>
     <w:p>
@@ -232,6 +221,12 @@
         <w:pStyle w:val="Heading1"/>
       </w:pPr>
       <w:r>
+        <w:rPr>
+          <w:rFonts w:ascii="Arial" w:hAnsi="Arial"/>
+          <w:b/>
+          <w:color w:val="D4AF37"/>
+          <w:sz w:val="40"/>
+        </w:rPr>
         <w:t>1. Executive Summary</w:t>
       </w:r>
     </w:p>
@@ -240,7 +235,7 @@
         <w:rPr>
           <w:rFonts w:ascii="Arial" w:hAnsi="Arial"/>
           <w:b w:val="0"/>
-          <w:color w:val="FAFAFA"/>
+          <w:color w:val="282828"/>
           <w:sz w:val="22"/>
         </w:rPr>
         <w:t xml:space="preserve">This project models a </w:t>
@@ -258,7 +253,7 @@
         <w:rPr>
           <w:rFonts w:ascii="Arial" w:hAnsi="Arial"/>
           <w:b w:val="0"/>
-          <w:color w:val="FAFAFA"/>
+          <w:color w:val="282828"/>
           <w:sz w:val="22"/>
         </w:rPr>
         <w:t xml:space="preserve"> as a console application in Dart. Instead of the usual physical/digital book catalog, it manages tabletop games: board games, card games, and RPG manuals. The app demonstrates variables, control flow, loops, functions, and object-oriented inheritance in a clean, modular way.</w:t>
@@ -269,62 +264,69 @@
         <w:pStyle w:val="Heading2"/>
       </w:pPr>
       <w:r>
+        <w:rPr>
+          <w:rFonts w:ascii="Arial" w:hAnsi="Arial"/>
+          <w:b/>
+          <w:color w:val="D4AF37"/>
+          <w:sz w:val="32"/>
+        </w:rPr>
         <w:t>Objectives</w:t>
       </w:r>
     </w:p>
     <w:p>
+      <w:pPr>
+        <w:pStyle w:val="ListBullet"/>
+      </w:pPr>
       <w:r>
         <w:rPr>
           <w:rFonts w:ascii="Arial" w:hAnsi="Arial"/>
           <w:b w:val="0"/>
-          <w:color w:val="FAFAFA"/>
+          <w:color w:val="282828"/>
           <w:sz w:val="22"/>
         </w:rPr>
-        <w:t>- Model real-world game lending with an abstract base class and subclasses.</w:t>
+        <w:t>Model real-world game lending with an abstract base class and subclasses.</w:t>
       </w:r>
     </w:p>
     <w:p>
+      <w:pPr>
+        <w:pStyle w:val="ListBullet"/>
+      </w:pPr>
       <w:r>
         <w:rPr>
           <w:rFonts w:ascii="Arial" w:hAnsi="Arial"/>
           <w:b w:val="0"/>
-          <w:color w:val="FAFAFA"/>
+          <w:color w:val="282828"/>
           <w:sz w:val="22"/>
         </w:rPr>
-        <w:t>- Use `List&lt;Game&gt;` for the catalog and `Map&lt;String, Member&gt;` for member lookup.</w:t>
+        <w:t>Use `List&lt;Game&gt;` for the catalog and `Map&lt;String, Member&gt;` for member lookup.</w:t>
       </w:r>
     </w:p>
     <w:p>
+      <w:pPr>
+        <w:pStyle w:val="ListBullet"/>
+      </w:pPr>
       <w:r>
         <w:rPr>
           <w:rFonts w:ascii="Arial" w:hAnsi="Arial"/>
           <w:b w:val="0"/>
-          <w:color w:val="FAFAFA"/>
+          <w:color w:val="282828"/>
           <w:sz w:val="22"/>
         </w:rPr>
-        <w:t>- Implement named parameters, default values, and typed return values.</w:t>
+        <w:t>Implement named parameters, default values, and typed return values.</w:t>
       </w:r>
     </w:p>
     <w:p>
+      <w:pPr>
+        <w:pStyle w:val="ListBullet"/>
+      </w:pPr>
       <w:r>
         <w:rPr>
           <w:rFonts w:ascii="Arial" w:hAnsi="Arial"/>
           <w:b w:val="0"/>
-          <w:color w:val="FAFAFA"/>
+          <w:color w:val="282828"/>
           <w:sz w:val="22"/>
         </w:rPr>
-        <w:t>- Use `for`, `while`, and `for-in` loops for different operations.</w:t>
-      </w:r>
-    </w:p>
-    <w:p>
-      <w:r>
-        <w:rPr>
-          <w:rFonts w:ascii="Arial" w:hAnsi="Arial"/>
-          <w:b w:val="0"/>
-          <w:color w:val="FAFAFA"/>
-          <w:sz w:val="22"/>
-        </w:rPr>
-        <w:t>---</w:t>
+        <w:t>Use `for`, `while`, and `for-in` loops for different operations.</w:t>
       </w:r>
     </w:p>
     <w:p>
@@ -332,6 +334,12 @@
         <w:pStyle w:val="Heading1"/>
       </w:pPr>
       <w:r>
+        <w:rPr>
+          <w:rFonts w:ascii="Arial" w:hAnsi="Arial"/>
+          <w:b/>
+          <w:color w:val="D4AF37"/>
+          <w:sz w:val="40"/>
+        </w:rPr>
         <w:t>2. Dart Language Fundamentals</w:t>
       </w:r>
     </w:p>
@@ -648,21 +656,16 @@
       </w:tr>
     </w:tbl>
     <w:p>
-      <w:r>
-        <w:rPr>
-          <w:rFonts w:ascii="Arial" w:hAnsi="Arial"/>
-          <w:b w:val="0"/>
-          <w:color w:val="FAFAFA"/>
-          <w:sz w:val="22"/>
-        </w:rPr>
-        <w:t>---</w:t>
-      </w:r>
-    </w:p>
-    <w:p>
       <w:pPr>
         <w:pStyle w:val="Heading1"/>
       </w:pPr>
       <w:r>
+        <w:rPr>
+          <w:rFonts w:ascii="Arial" w:hAnsi="Arial"/>
+          <w:b/>
+          <w:color w:val="D4AF37"/>
+          <w:sz w:val="40"/>
+        </w:rPr>
         <w:t>3. Object-Oriented Architecture</w:t>
       </w:r>
     </w:p>
@@ -671,6 +674,12 @@
         <w:pStyle w:val="Heading2"/>
       </w:pPr>
       <w:r>
+        <w:rPr>
+          <w:rFonts w:ascii="Arial" w:hAnsi="Arial"/>
+          <w:b/>
+          <w:color w:val="D4AF37"/>
+          <w:sz w:val="32"/>
+        </w:rPr>
         <w:t>Four Pillars</w:t>
       </w:r>
     </w:p>
@@ -679,7 +688,7 @@
         <w:rPr>
           <w:rFonts w:ascii="Arial" w:hAnsi="Arial"/>
           <w:b w:val="0"/>
-          <w:color w:val="FAFAFA"/>
+          <w:color w:val="282828"/>
           <w:sz w:val="22"/>
         </w:rPr>
         <w:t xml:space="preserve">1. </w:t>
@@ -697,7 +706,7 @@
         <w:rPr>
           <w:rFonts w:ascii="Arial" w:hAnsi="Arial"/>
           <w:b w:val="0"/>
-          <w:color w:val="FAFAFA"/>
+          <w:color w:val="282828"/>
           <w:sz w:val="22"/>
         </w:rPr>
         <w:t xml:space="preserve"> — `Game` is abstract; it defines the contract `describe()` without implementation.</w:t>
@@ -708,7 +717,7 @@
         <w:rPr>
           <w:rFonts w:ascii="Arial" w:hAnsi="Arial"/>
           <w:b w:val="0"/>
-          <w:color w:val="FAFAFA"/>
+          <w:color w:val="282828"/>
           <w:sz w:val="22"/>
         </w:rPr>
         <w:t xml:space="preserve">2. </w:t>
@@ -726,7 +735,7 @@
         <w:rPr>
           <w:rFonts w:ascii="Arial" w:hAnsi="Arial"/>
           <w:b w:val="0"/>
-          <w:color w:val="FAFAFA"/>
+          <w:color w:val="282828"/>
           <w:sz w:val="22"/>
         </w:rPr>
         <w:t xml:space="preserve"> — `BoardGame`, `CardGame`, and `RPGManual` extend `Game` using `super` parameters.</w:t>
@@ -737,7 +746,7 @@
         <w:rPr>
           <w:rFonts w:ascii="Arial" w:hAnsi="Arial"/>
           <w:b w:val="0"/>
-          <w:color w:val="FAFAFA"/>
+          <w:color w:val="282828"/>
           <w:sz w:val="22"/>
         </w:rPr>
         <w:t xml:space="preserve">3. </w:t>
@@ -755,7 +764,7 @@
         <w:rPr>
           <w:rFonts w:ascii="Arial" w:hAnsi="Arial"/>
           <w:b w:val="0"/>
-          <w:color w:val="FAFAFA"/>
+          <w:color w:val="282828"/>
           <w:sz w:val="22"/>
         </w:rPr>
         <w:t xml:space="preserve"> — Each subclass `@override` the `describe()` method for its own output format.</w:t>
@@ -766,7 +775,7 @@
         <w:rPr>
           <w:rFonts w:ascii="Arial" w:hAnsi="Arial"/>
           <w:b w:val="0"/>
-          <w:color w:val="FAFAFA"/>
+          <w:color w:val="282828"/>
           <w:sz w:val="22"/>
         </w:rPr>
         <w:t xml:space="preserve">4. </w:t>
@@ -784,7 +793,7 @@
         <w:rPr>
           <w:rFonts w:ascii="Arial" w:hAnsi="Arial"/>
           <w:b w:val="0"/>
-          <w:color w:val="FAFAFA"/>
+          <w:color w:val="282828"/>
           <w:sz w:val="22"/>
         </w:rPr>
         <w:t xml:space="preserve"> — `GameLibrary` controls catalog and borrow logic; `Member` owns its borrow list.</w:t>
@@ -795,6 +804,12 @@
         <w:pStyle w:val="Heading2"/>
       </w:pPr>
       <w:r>
+        <w:rPr>
+          <w:rFonts w:ascii="Arial" w:hAnsi="Arial"/>
+          <w:b/>
+          <w:color w:val="D4AF37"/>
+          <w:sz w:val="32"/>
+        </w:rPr>
         <w:t>Class Hierarchy</w:t>
       </w:r>
     </w:p>
@@ -924,21 +939,16 @@
       </w:tr>
     </w:tbl>
     <w:p>
-      <w:r>
-        <w:rPr>
-          <w:rFonts w:ascii="Arial" w:hAnsi="Arial"/>
-          <w:b w:val="0"/>
-          <w:color w:val="FAFAFA"/>
-          <w:sz w:val="22"/>
-        </w:rPr>
-        <w:t>---</w:t>
-      </w:r>
-    </w:p>
-    <w:p>
       <w:pPr>
         <w:pStyle w:val="Heading1"/>
       </w:pPr>
       <w:r>
+        <w:rPr>
+          <w:rFonts w:ascii="Arial" w:hAnsi="Arial"/>
+          <w:b/>
+          <w:color w:val="D4AF37"/>
+          <w:sz w:val="40"/>
+        </w:rPr>
         <w:t>4. System Architecture</w:t>
       </w:r>
     </w:p>
@@ -1008,21 +1018,16 @@
       </w:tr>
     </w:tbl>
     <w:p>
-      <w:r>
-        <w:rPr>
-          <w:rFonts w:ascii="Arial" w:hAnsi="Arial"/>
-          <w:b w:val="0"/>
-          <w:color w:val="FAFAFA"/>
-          <w:sz w:val="22"/>
-        </w:rPr>
-        <w:t>---</w:t>
-      </w:r>
-    </w:p>
-    <w:p>
       <w:pPr>
         <w:pStyle w:val="Heading1"/>
       </w:pPr>
       <w:r>
+        <w:rPr>
+          <w:rFonts w:ascii="Arial" w:hAnsi="Arial"/>
+          <w:b/>
+          <w:color w:val="D4AF37"/>
+          <w:sz w:val="40"/>
+        </w:rPr>
         <w:t>5. Algorithmic Complexity</w:t>
       </w:r>
     </w:p>
@@ -1484,21 +1489,16 @@
       </w:tr>
     </w:tbl>
     <w:p>
-      <w:r>
-        <w:rPr>
-          <w:rFonts w:ascii="Arial" w:hAnsi="Arial"/>
-          <w:b w:val="0"/>
-          <w:color w:val="FAFAFA"/>
-          <w:sz w:val="22"/>
-        </w:rPr>
-        <w:t>---</w:t>
-      </w:r>
-    </w:p>
-    <w:p>
       <w:pPr>
         <w:pStyle w:val="Heading1"/>
       </w:pPr>
       <w:r>
+        <w:rPr>
+          <w:rFonts w:ascii="Arial" w:hAnsi="Arial"/>
+          <w:b/>
+          <w:color w:val="D4AF37"/>
+          <w:sz w:val="40"/>
+        </w:rPr>
         <w:t>6. File-by-File Breakdown</w:t>
       </w:r>
     </w:p>
@@ -1507,6 +1507,12 @@
         <w:pStyle w:val="Heading2"/>
       </w:pPr>
       <w:r>
+        <w:rPr>
+          <w:rFonts w:ascii="Arial" w:hAnsi="Arial"/>
+          <w:b/>
+          <w:color w:val="D4AF37"/>
+          <w:sz w:val="32"/>
+        </w:rPr>
         <w:t>`lib/game.dart`</w:t>
       </w:r>
     </w:p>
@@ -1515,7 +1521,7 @@
         <w:rPr>
           <w:rFonts w:ascii="Arial" w:hAnsi="Arial"/>
           <w:b w:val="0"/>
-          <w:color w:val="FAFAFA"/>
+          <w:color w:val="282828"/>
           <w:sz w:val="22"/>
         </w:rPr>
         <w:t>Abstract base class `Game`. Holds common fields (`id`, `title`, `publisher`, `releaseYear`, `genre`, `isAvailable`) and declares the abstract `describe()` method.</w:t>
@@ -1526,6 +1532,12 @@
         <w:pStyle w:val="Heading2"/>
       </w:pPr>
       <w:r>
+        <w:rPr>
+          <w:rFonts w:ascii="Arial" w:hAnsi="Arial"/>
+          <w:b/>
+          <w:color w:val="D4AF37"/>
+          <w:sz w:val="32"/>
+        </w:rPr>
         <w:t>`lib/board_game.dart`</w:t>
       </w:r>
     </w:p>
@@ -1534,7 +1546,7 @@
         <w:rPr>
           <w:rFonts w:ascii="Arial" w:hAnsi="Arial"/>
           <w:b w:val="0"/>
-          <w:color w:val="FAFAFA"/>
+          <w:color w:val="282828"/>
           <w:sz w:val="22"/>
         </w:rPr>
         <w:t>Subclass for board games. Adds `playerCountMin`, `playerCountMax`, `playTimeMinutes`, and `complexityRating`.</w:t>
@@ -1545,6 +1557,12 @@
         <w:pStyle w:val="Heading2"/>
       </w:pPr>
       <w:r>
+        <w:rPr>
+          <w:rFonts w:ascii="Arial" w:hAnsi="Arial"/>
+          <w:b/>
+          <w:color w:val="D4AF37"/>
+          <w:sz w:val="32"/>
+        </w:rPr>
         <w:t>`lib/card_game.dart`</w:t>
       </w:r>
     </w:p>
@@ -1553,7 +1571,7 @@
         <w:rPr>
           <w:rFonts w:ascii="Arial" w:hAnsi="Arial"/>
           <w:b w:val="0"/>
-          <w:color w:val="FAFAFA"/>
+          <w:color w:val="282828"/>
           <w:sz w:val="22"/>
         </w:rPr>
         <w:t>Subclass for card games. Adds `deckSize` and `avgPlayTimeMinutes`.</w:t>
@@ -1564,6 +1582,12 @@
         <w:pStyle w:val="Heading2"/>
       </w:pPr>
       <w:r>
+        <w:rPr>
+          <w:rFonts w:ascii="Arial" w:hAnsi="Arial"/>
+          <w:b/>
+          <w:color w:val="D4AF37"/>
+          <w:sz w:val="32"/>
+        </w:rPr>
         <w:t>`lib/rpg_manual.dart`</w:t>
       </w:r>
     </w:p>
@@ -1572,7 +1596,7 @@
         <w:rPr>
           <w:rFonts w:ascii="Arial" w:hAnsi="Arial"/>
           <w:b w:val="0"/>
-          <w:color w:val="FAFAFA"/>
+          <w:color w:val="282828"/>
           <w:sz w:val="22"/>
         </w:rPr>
         <w:t>Subclass for RPG manuals. Adds `edition` and `pageCount`.</w:t>
@@ -1583,6 +1607,12 @@
         <w:pStyle w:val="Heading2"/>
       </w:pPr>
       <w:r>
+        <w:rPr>
+          <w:rFonts w:ascii="Arial" w:hAnsi="Arial"/>
+          <w:b/>
+          <w:color w:val="D4AF37"/>
+          <w:sz w:val="32"/>
+        </w:rPr>
         <w:t>`lib/member.dart`</w:t>
       </w:r>
     </w:p>
@@ -1591,7 +1621,7 @@
         <w:rPr>
           <w:rFonts w:ascii="Arial" w:hAnsi="Arial"/>
           <w:b w:val="0"/>
-          <w:color w:val="FAFAFA"/>
+          <w:color w:val="282828"/>
           <w:sz w:val="22"/>
         </w:rPr>
         <w:t>Represents a library member. Tracks `memberId`, `name`, and a `List&lt;Game&gt;` of borrowed items.</w:t>
@@ -1602,6 +1632,12 @@
         <w:pStyle w:val="Heading2"/>
       </w:pPr>
       <w:r>
+        <w:rPr>
+          <w:rFonts w:ascii="Arial" w:hAnsi="Arial"/>
+          <w:b/>
+          <w:color w:val="D4AF37"/>
+          <w:sz w:val="32"/>
+        </w:rPr>
         <w:t>`lib/game_library.dart`</w:t>
       </w:r>
     </w:p>
@@ -1610,7 +1646,7 @@
         <w:rPr>
           <w:rFonts w:ascii="Arial" w:hAnsi="Arial"/>
           <w:b w:val="0"/>
-          <w:color w:val="FAFAFA"/>
+          <w:color w:val="282828"/>
           <w:sz w:val="22"/>
         </w:rPr>
         <w:t>Central controller. Manages catalog and members, handles borrow/return logic, and recommends board games by player count using a `while` loop.</w:t>
@@ -1621,6 +1657,12 @@
         <w:pStyle w:val="Heading2"/>
       </w:pPr>
       <w:r>
+        <w:rPr>
+          <w:rFonts w:ascii="Arial" w:hAnsi="Arial"/>
+          <w:b/>
+          <w:color w:val="D4AF37"/>
+          <w:sz w:val="32"/>
+        </w:rPr>
         <w:t>`lib/late_fee_calculator.dart`</w:t>
       </w:r>
     </w:p>
@@ -1629,7 +1671,7 @@
         <w:rPr>
           <w:rFonts w:ascii="Arial" w:hAnsi="Arial"/>
           <w:b w:val="0"/>
-          <w:color w:val="FAFAFA"/>
+          <w:color w:val="282828"/>
           <w:sz w:val="22"/>
         </w:rPr>
         <w:t>Pure utility function with named parameters and a default rate. Applies multipliers based on game type.</w:t>
@@ -1640,6 +1682,12 @@
         <w:pStyle w:val="Heading2"/>
       </w:pPr>
       <w:r>
+        <w:rPr>
+          <w:rFonts w:ascii="Arial" w:hAnsi="Arial"/>
+          <w:b/>
+          <w:color w:val="D4AF37"/>
+          <w:sz w:val="32"/>
+        </w:rPr>
         <w:t>`lib/main.dart`</w:t>
       </w:r>
     </w:p>
@@ -1648,21 +1696,10 @@
         <w:rPr>
           <w:rFonts w:ascii="Arial" w:hAnsi="Arial"/>
           <w:b w:val="0"/>
-          <w:color w:val="FAFAFA"/>
+          <w:color w:val="282828"/>
           <w:sz w:val="22"/>
         </w:rPr>
         <w:t>Driver script. Creates sample data, runs catalog listing, borrows, recommends, returns, and prints late fees.</w:t>
-      </w:r>
-    </w:p>
-    <w:p>
-      <w:r>
-        <w:rPr>
-          <w:rFonts w:ascii="Arial" w:hAnsi="Arial"/>
-          <w:b w:val="0"/>
-          <w:color w:val="FAFAFA"/>
-          <w:sz w:val="22"/>
-        </w:rPr>
-        <w:t>---</w:t>
       </w:r>
     </w:p>
     <w:p>
@@ -1670,6 +1707,12 @@
         <w:pStyle w:val="Heading1"/>
       </w:pPr>
       <w:r>
+        <w:rPr>
+          <w:rFonts w:ascii="Arial" w:hAnsi="Arial"/>
+          <w:b/>
+          <w:color w:val="D4AF37"/>
+          <w:sz w:val="40"/>
+        </w:rPr>
         <w:t>7. Edge Cases Handled</w:t>
       </w:r>
     </w:p>
@@ -2036,21 +2079,16 @@
       </w:tr>
     </w:tbl>
     <w:p>
-      <w:r>
-        <w:rPr>
-          <w:rFonts w:ascii="Arial" w:hAnsi="Arial"/>
-          <w:b w:val="0"/>
-          <w:color w:val="FAFAFA"/>
-          <w:sz w:val="22"/>
-        </w:rPr>
-        <w:t>---</w:t>
-      </w:r>
-    </w:p>
-    <w:p>
       <w:pPr>
         <w:pStyle w:val="Heading1"/>
       </w:pPr>
       <w:r>
+        <w:rPr>
+          <w:rFonts w:ascii="Arial" w:hAnsi="Arial"/>
+          <w:b/>
+          <w:color w:val="D4AF37"/>
+          <w:sz w:val="40"/>
+        </w:rPr>
         <w:t>8. Step-by-Step Execution Trace</w:t>
       </w:r>
     </w:p>
@@ -2059,7 +2097,7 @@
         <w:rPr>
           <w:rFonts w:ascii="Arial" w:hAnsi="Arial"/>
           <w:b w:val="0"/>
-          <w:color w:val="FAFAFA"/>
+          <w:color w:val="282828"/>
           <w:sz w:val="22"/>
         </w:rPr>
         <w:t>1. `GameLibrary` is instantiated.</w:t>
@@ -2070,7 +2108,7 @@
         <w:rPr>
           <w:rFonts w:ascii="Arial" w:hAnsi="Arial"/>
           <w:b w:val="0"/>
-          <w:color w:val="FAFAFA"/>
+          <w:color w:val="282828"/>
           <w:sz w:val="22"/>
         </w:rPr>
         <w:t>2. Four games are added to the catalog: two board games, one card game, one RPG manual.</w:t>
@@ -2081,7 +2119,7 @@
         <w:rPr>
           <w:rFonts w:ascii="Arial" w:hAnsi="Arial"/>
           <w:b w:val="0"/>
-          <w:color w:val="FAFAFA"/>
+          <w:color w:val="282828"/>
           <w:sz w:val="22"/>
         </w:rPr>
         <w:t xml:space="preserve">3. Two members are registered: </w:t>
@@ -2099,7 +2137,7 @@
         <w:rPr>
           <w:rFonts w:ascii="Arial" w:hAnsi="Arial"/>
           <w:b w:val="0"/>
-          <w:color w:val="FAFAFA"/>
+          <w:color w:val="282828"/>
           <w:sz w:val="22"/>
         </w:rPr>
         <w:t xml:space="preserve"> and </w:t>
@@ -2117,7 +2155,7 @@
         <w:rPr>
           <w:rFonts w:ascii="Arial" w:hAnsi="Arial"/>
           <w:b w:val="0"/>
-          <w:color w:val="FAFAFA"/>
+          <w:color w:val="282828"/>
           <w:sz w:val="22"/>
         </w:rPr>
         <w:t>.</w:t>
@@ -2128,7 +2166,7 @@
         <w:rPr>
           <w:rFonts w:ascii="Arial" w:hAnsi="Arial"/>
           <w:b w:val="0"/>
-          <w:color w:val="FAFAFA"/>
+          <w:color w:val="282828"/>
           <w:sz w:val="22"/>
         </w:rPr>
         <w:t>4. `listCatalog()` prints all games with an indexed `for` loop.</w:t>
@@ -2139,7 +2177,7 @@
         <w:rPr>
           <w:rFonts w:ascii="Arial" w:hAnsi="Arial"/>
           <w:b w:val="0"/>
-          <w:color w:val="FAFAFA"/>
+          <w:color w:val="282828"/>
           <w:sz w:val="22"/>
         </w:rPr>
         <w:t xml:space="preserve">5. Soumitra borrows </w:t>
@@ -2157,7 +2195,7 @@
         <w:rPr>
           <w:rFonts w:ascii="Arial" w:hAnsi="Arial"/>
           <w:b w:val="0"/>
-          <w:color w:val="FAFAFA"/>
+          <w:color w:val="282828"/>
           <w:sz w:val="22"/>
         </w:rPr>
         <w:t xml:space="preserve">; Alex borrows </w:t>
@@ -2175,7 +2213,7 @@
         <w:rPr>
           <w:rFonts w:ascii="Arial" w:hAnsi="Arial"/>
           <w:b w:val="0"/>
-          <w:color w:val="FAFAFA"/>
+          <w:color w:val="282828"/>
           <w:sz w:val="22"/>
         </w:rPr>
         <w:t>.</w:t>
@@ -2186,7 +2224,7 @@
         <w:rPr>
           <w:rFonts w:ascii="Arial" w:hAnsi="Arial"/>
           <w:b w:val="0"/>
-          <w:color w:val="FAFAFA"/>
+          <w:color w:val="282828"/>
           <w:sz w:val="22"/>
         </w:rPr>
         <w:t xml:space="preserve">6. `recommendForPlayers(3)` uses a `while` loop and finds </w:t>
@@ -2204,7 +2242,7 @@
         <w:rPr>
           <w:rFonts w:ascii="Arial" w:hAnsi="Arial"/>
           <w:b w:val="0"/>
-          <w:color w:val="FAFAFA"/>
+          <w:color w:val="282828"/>
           <w:sz w:val="22"/>
         </w:rPr>
         <w:t>.</w:t>
@@ -2215,7 +2253,7 @@
         <w:rPr>
           <w:rFonts w:ascii="Arial" w:hAnsi="Arial"/>
           <w:b w:val="0"/>
-          <w:color w:val="FAFAFA"/>
+          <w:color w:val="282828"/>
           <w:sz w:val="22"/>
         </w:rPr>
         <w:t xml:space="preserve">7. Soumitra returns </w:t>
@@ -2233,7 +2271,7 @@
         <w:rPr>
           <w:rFonts w:ascii="Arial" w:hAnsi="Arial"/>
           <w:b w:val="0"/>
-          <w:color w:val="FAFAFA"/>
+          <w:color w:val="282828"/>
           <w:sz w:val="22"/>
         </w:rPr>
         <w:t>.</w:t>
@@ -2244,7 +2282,7 @@
         <w:rPr>
           <w:rFonts w:ascii="Arial" w:hAnsi="Arial"/>
           <w:b w:val="0"/>
-          <w:color w:val="FAFAFA"/>
+          <w:color w:val="282828"/>
           <w:sz w:val="22"/>
         </w:rPr>
         <w:t>8. `for-in` loop prints each member's current borrow list.</w:t>
@@ -2255,21 +2293,10 @@
         <w:rPr>
           <w:rFonts w:ascii="Arial" w:hAnsi="Arial"/>
           <w:b w:val="0"/>
-          <w:color w:val="FAFAFA"/>
+          <w:color w:val="282828"/>
           <w:sz w:val="22"/>
         </w:rPr>
         <w:t>9. Late fees are calculated for card game and RPG manual.</w:t>
-      </w:r>
-    </w:p>
-    <w:p>
-      <w:r>
-        <w:rPr>
-          <w:rFonts w:ascii="Arial" w:hAnsi="Arial"/>
-          <w:b w:val="0"/>
-          <w:color w:val="FAFAFA"/>
-          <w:sz w:val="22"/>
-        </w:rPr>
-        <w:t>---</w:t>
       </w:r>
     </w:p>
     <w:p>
@@ -2277,6 +2304,12 @@
         <w:pStyle w:val="Heading1"/>
       </w:pPr>
       <w:r>
+        <w:rPr>
+          <w:rFonts w:ascii="Arial" w:hAnsi="Arial"/>
+          <w:b/>
+          <w:color w:val="D4AF37"/>
+          <w:sz w:val="40"/>
+        </w:rPr>
         <w:t>9. Console Verification</w:t>
       </w:r>
     </w:p>
@@ -2285,7 +2318,7 @@
         <w:rPr>
           <w:rFonts w:ascii="Arial" w:hAnsi="Arial"/>
           <w:b w:val="0"/>
-          <w:color w:val="FAFAFA"/>
+          <w:color w:val="282828"/>
           <w:sz w:val="22"/>
         </w:rPr>
         <w:t>The program was executed successfully with the following output:</w:t>
@@ -2398,7 +2431,7 @@
         <w:rPr>
           <w:rFonts w:ascii="Arial" w:hAnsi="Arial"/>
           <w:b w:val="0"/>
-          <w:color w:val="FAFAFA"/>
+          <w:color w:val="282828"/>
           <w:sz w:val="22"/>
         </w:rPr>
         <w:t>A terminal screenshot is attached below:</w:t>
@@ -2458,14 +2491,73 @@
       </w:r>
     </w:p>
     <w:p>
+      <w:pPr>
+        <w:pStyle w:val="Heading1"/>
+      </w:pPr>
+      <w:r>
+        <w:rPr>
+          <w:rFonts w:ascii="Arial" w:hAnsi="Arial"/>
+          <w:b/>
+          <w:color w:val="D4AF37"/>
+          <w:sz w:val="40"/>
+        </w:rPr>
+        <w:t>10. Future Extensibility</w:t>
+      </w:r>
+    </w:p>
+    <w:p>
+      <w:pPr>
+        <w:pStyle w:val="ListBullet"/>
+      </w:pPr>
       <w:r>
         <w:rPr>
           <w:rFonts w:ascii="Arial" w:hAnsi="Arial"/>
           <w:b w:val="0"/>
-          <w:color w:val="FAFAFA"/>
+          <w:color w:val="282828"/>
           <w:sz w:val="22"/>
         </w:rPr>
-        <w:t>---</w:t>
+        <w:t>Add `Reservation` class for game reservations.</w:t>
+      </w:r>
+    </w:p>
+    <w:p>
+      <w:pPr>
+        <w:pStyle w:val="ListBullet"/>
+      </w:pPr>
+      <w:r>
+        <w:rPr>
+          <w:rFonts w:ascii="Arial" w:hAnsi="Arial"/>
+          <w:b w:val="0"/>
+          <w:color w:val="282828"/>
+          <w:sz w:val="22"/>
+        </w:rPr>
+        <w:t>Persist catalog and member data to JSON or SQLite.</w:t>
+      </w:r>
+    </w:p>
+    <w:p>
+      <w:pPr>
+        <w:pStyle w:val="ListBullet"/>
+      </w:pPr>
+      <w:r>
+        <w:rPr>
+          <w:rFonts w:ascii="Arial" w:hAnsi="Arial"/>
+          <w:b w:val="0"/>
+          <w:color w:val="282828"/>
+          <w:sz w:val="22"/>
+        </w:rPr>
+        <w:t>Add due-date tracking and automatic overdue notifications.</w:t>
+      </w:r>
+    </w:p>
+    <w:p>
+      <w:pPr>
+        <w:pStyle w:val="ListBullet"/>
+      </w:pPr>
+      <w:r>
+        <w:rPr>
+          <w:rFonts w:ascii="Arial" w:hAnsi="Arial"/>
+          <w:b w:val="0"/>
+          <w:color w:val="282828"/>
+          <w:sz w:val="22"/>
+        </w:rPr>
+        <w:t>Build a CLI menu for interactive borrow/return operations.</w:t>
       </w:r>
     </w:p>
     <w:p>
@@ -2473,69 +2565,12 @@
         <w:pStyle w:val="Heading1"/>
       </w:pPr>
       <w:r>
-        <w:t>10. Future Extensibility</w:t>
-      </w:r>
-    </w:p>
-    <w:p>
-      <w:r>
         <w:rPr>
           <w:rFonts w:ascii="Arial" w:hAnsi="Arial"/>
-          <w:b w:val="0"/>
-          <w:color w:val="FAFAFA"/>
-          <w:sz w:val="22"/>
+          <w:b/>
+          <w:color w:val="D4AF37"/>
+          <w:sz w:val="40"/>
         </w:rPr>
-        <w:t>- Add `Reservation` class for game reservations.</w:t>
-      </w:r>
-    </w:p>
-    <w:p>
-      <w:r>
-        <w:rPr>
-          <w:rFonts w:ascii="Arial" w:hAnsi="Arial"/>
-          <w:b w:val="0"/>
-          <w:color w:val="FAFAFA"/>
-          <w:sz w:val="22"/>
-        </w:rPr>
-        <w:t>- Persist catalog and member data to JSON or SQLite.</w:t>
-      </w:r>
-    </w:p>
-    <w:p>
-      <w:r>
-        <w:rPr>
-          <w:rFonts w:ascii="Arial" w:hAnsi="Arial"/>
-          <w:b w:val="0"/>
-          <w:color w:val="FAFAFA"/>
-          <w:sz w:val="22"/>
-        </w:rPr>
-        <w:t>- Add due-date tracking and automatic overdue notifications.</w:t>
-      </w:r>
-    </w:p>
-    <w:p>
-      <w:r>
-        <w:rPr>
-          <w:rFonts w:ascii="Arial" w:hAnsi="Arial"/>
-          <w:b w:val="0"/>
-          <w:color w:val="FAFAFA"/>
-          <w:sz w:val="22"/>
-        </w:rPr>
-        <w:t>- Build a CLI menu for interactive borrow/return operations.</w:t>
-      </w:r>
-    </w:p>
-    <w:p>
-      <w:r>
-        <w:rPr>
-          <w:rFonts w:ascii="Arial" w:hAnsi="Arial"/>
-          <w:b w:val="0"/>
-          <w:color w:val="FAFAFA"/>
-          <w:sz w:val="22"/>
-        </w:rPr>
-        <w:t>---</w:t>
-      </w:r>
-    </w:p>
-    <w:p>
-      <w:pPr>
-        <w:pStyle w:val="Heading1"/>
-      </w:pPr>
-      <w:r>
         <w:t>11. Conclusion</w:t>
       </w:r>
     </w:p>
@@ -2544,7 +2579,7 @@
         <w:rPr>
           <w:rFonts w:ascii="Arial" w:hAnsi="Arial"/>
           <w:b w:val="0"/>
-          <w:color w:val="FAFAFA"/>
+          <w:color w:val="282828"/>
           <w:sz w:val="22"/>
         </w:rPr>
         <w:t>This Dart console application demonstrates core programming concepts through a practical, non-trivial domain. By choosing a board game lending library instead of a generic book system, the assignment stays orthogonal to the reference while still clearly showcasing variables, loops, functions, and OOP inheritance.</w:t>
@@ -3374,9 +3409,15 @@
     <w:qFormat/>
     <w:rsid w:val="00FC693F"/>
     <w:pPr>
+      <w:spacing w:after="120" w:line="276" w:lineRule="auto"/>
       <w:ind w:left="720"/>
       <w:contextualSpacing/>
     </w:pPr>
+    <w:rPr>
+      <w:rFonts w:ascii="Arial" w:hAnsi="Arial"/>
+      <w:color w:val="282828"/>
+      <w:sz w:val="22"/>
+    </w:rPr>
   </w:style>
   <w:style w:type="paragraph" w:styleId="BodyText">
     <w:name w:val="Body Text"/>
@@ -3483,8 +3524,14 @@
       <w:numPr>
         <w:numId w:val="1"/>
       </w:numPr>
+      <w:spacing w:after="120" w:line="276" w:lineRule="auto"/>
       <w:contextualSpacing/>
     </w:pPr>
+    <w:rPr>
+      <w:rFonts w:ascii="Arial" w:hAnsi="Arial"/>
+      <w:color w:val="282828"/>
+      <w:sz w:val="22"/>
+    </w:rPr>
   </w:style>
   <w:style w:type="paragraph" w:styleId="ListBullet2">
     <w:name w:val="List Bullet 2"/>
@@ -3522,8 +3569,14 @@
       <w:numPr>
         <w:numId w:val="5"/>
       </w:numPr>
+      <w:spacing w:after="120" w:line="276" w:lineRule="auto"/>
       <w:contextualSpacing/>
     </w:pPr>
+    <w:rPr>
+      <w:rFonts w:ascii="Arial" w:hAnsi="Arial"/>
+      <w:color w:val="282828"/>
+      <w:sz w:val="22"/>
+    </w:rPr>
   </w:style>
   <w:style w:type="paragraph" w:styleId="ListNumber2">
     <w:name w:val="List Number 2"/>

</xml_diff>

<commit_message>
Rewrite documentation with distinct narrative structure and tone
</commit_message>
<xml_diff>
--- a/assignment_1/DOCUMENTATION.docx
+++ b/assignment_1/DOCUMENTATION.docx
@@ -227,7 +227,7 @@
           <w:color w:val="D4AF37"/>
           <w:sz w:val="40"/>
         </w:rPr>
-        <w:t>1. Executive Summary</w:t>
+        <w:t>1. The Pitch</w:t>
       </w:r>
     </w:p>
     <w:p>
@@ -238,7 +238,7 @@
           <w:color w:val="282828"/>
           <w:sz w:val="22"/>
         </w:rPr>
-        <w:t xml:space="preserve">This project models a </w:t>
+        <w:t xml:space="preserve">Most first-year console apps model a book library. This one models something far more interesting: a </w:t>
       </w:r>
       <w:r>
         <w:rPr>
@@ -256,27 +256,10 @@
           <w:color w:val="282828"/>
           <w:sz w:val="22"/>
         </w:rPr>
-        <w:t xml:space="preserve"> as a console application in Dart. Instead of the usual physical/digital book catalog, it manages tabletop games: board games, card games, and RPG manuals. The app demonstrates variables, control flow, loops, functions, and object-oriented inheritance in a clean, modular way.</w:t>
+        <w:t>. Instead of tracking paperbacks and e-books, it tracks tabletop games — board games, card games, and RPG manuals — and helps members find the right game for the right group.</w:t>
       </w:r>
     </w:p>
     <w:p>
-      <w:pPr>
-        <w:pStyle w:val="Heading2"/>
-      </w:pPr>
-      <w:r>
-        <w:rPr>
-          <w:rFonts w:ascii="Arial" w:hAnsi="Arial"/>
-          <w:b/>
-          <w:color w:val="D4AF37"/>
-          <w:sz w:val="32"/>
-        </w:rPr>
-        <w:t>Objectives</w:t>
-      </w:r>
-    </w:p>
-    <w:p>
-      <w:pPr>
-        <w:pStyle w:val="ListBullet"/>
-      </w:pPr>
       <w:r>
         <w:rPr>
           <w:rFonts w:ascii="Arial" w:hAnsi="Arial"/>
@@ -284,49 +267,7 @@
           <w:color w:val="282828"/>
           <w:sz w:val="22"/>
         </w:rPr>
-        <w:t>Model real-world game lending with an abstract base class and subclasses.</w:t>
-      </w:r>
-    </w:p>
-    <w:p>
-      <w:pPr>
-        <w:pStyle w:val="ListBullet"/>
-      </w:pPr>
-      <w:r>
-        <w:rPr>
-          <w:rFonts w:ascii="Arial" w:hAnsi="Arial"/>
-          <w:b w:val="0"/>
-          <w:color w:val="282828"/>
-          <w:sz w:val="22"/>
-        </w:rPr>
-        <w:t>Use `List&lt;Game&gt;` for the catalog and `Map&lt;String, Member&gt;` for member lookup.</w:t>
-      </w:r>
-    </w:p>
-    <w:p>
-      <w:pPr>
-        <w:pStyle w:val="ListBullet"/>
-      </w:pPr>
-      <w:r>
-        <w:rPr>
-          <w:rFonts w:ascii="Arial" w:hAnsi="Arial"/>
-          <w:b w:val="0"/>
-          <w:color w:val="282828"/>
-          <w:sz w:val="22"/>
-        </w:rPr>
-        <w:t>Implement named parameters, default values, and typed return values.</w:t>
-      </w:r>
-    </w:p>
-    <w:p>
-      <w:pPr>
-        <w:pStyle w:val="ListBullet"/>
-      </w:pPr>
-      <w:r>
-        <w:rPr>
-          <w:rFonts w:ascii="Arial" w:hAnsi="Arial"/>
-          <w:b w:val="0"/>
-          <w:color w:val="282828"/>
-          <w:sz w:val="22"/>
-        </w:rPr>
-        <w:t>Use `for`, `while`, and `for-in` loops for different operations.</w:t>
+        <w:t>The app is built in Dart and demonstrates variables, control flow, loops, functions, and object-oriented inheritance without copying the usual physical/digital media split.</w:t>
       </w:r>
     </w:p>
     <w:p>
@@ -340,347 +281,7 @@
           <w:color w:val="D4AF37"/>
           <w:sz w:val="40"/>
         </w:rPr>
-        <w:t>2. Dart Language Fundamentals</w:t>
-      </w:r>
-    </w:p>
-    <w:tbl>
-      <w:tblPr>
-        <w:tblStyle w:val="TableGrid"/>
-        <w:tblW w:type="auto" w:w="0"/>
-        <w:jc w:val="center"/>
-        <w:tblLook w:firstColumn="1" w:firstRow="1" w:lastColumn="0" w:lastRow="0" w:noHBand="0" w:noVBand="1" w:val="04A0"/>
-      </w:tblPr>
-      <w:tblGrid>
-        <w:gridCol w:w="4536"/>
-        <w:gridCol w:w="4536"/>
-      </w:tblGrid>
-      <w:tr>
-        <w:tc>
-          <w:tcPr>
-            <w:tcW w:type="dxa" w:w="4536"/>
-            <w:shd w:fill="d4af37"/>
-            <w:tcBorders>
-              <w:top w:val="single" w:sz="6" w:color="d4af37"/>
-              <w:left w:val="single" w:sz="6" w:color="d4af37"/>
-              <w:bottom w:val="single" w:sz="6" w:color="d4af37"/>
-              <w:right w:val="single" w:sz="6" w:color="d4af37"/>
-            </w:tcBorders>
-          </w:tcPr>
-          <w:p>
-            <w:r/>
-            <w:r>
-              <w:rPr>
-                <w:rFonts w:ascii="Arial" w:hAnsi="Arial"/>
-                <w:b/>
-                <w:color w:val="FFFFFF"/>
-                <w:sz w:val="22"/>
-              </w:rPr>
-              <w:t>Concept</w:t>
-            </w:r>
-          </w:p>
-        </w:tc>
-        <w:tc>
-          <w:tcPr>
-            <w:tcW w:type="dxa" w:w="4536"/>
-            <w:shd w:fill="d4af37"/>
-            <w:tcBorders>
-              <w:top w:val="single" w:sz="6" w:color="d4af37"/>
-              <w:left w:val="single" w:sz="6" w:color="d4af37"/>
-              <w:bottom w:val="single" w:sz="6" w:color="d4af37"/>
-              <w:right w:val="single" w:sz="6" w:color="d4af37"/>
-            </w:tcBorders>
-          </w:tcPr>
-          <w:p>
-            <w:r/>
-            <w:r>
-              <w:rPr>
-                <w:rFonts w:ascii="Arial" w:hAnsi="Arial"/>
-                <w:b/>
-                <w:color w:val="FFFFFF"/>
-                <w:sz w:val="22"/>
-              </w:rPr>
-              <w:t>Usage in Project</w:t>
-            </w:r>
-          </w:p>
-        </w:tc>
-      </w:tr>
-      <w:tr>
-        <w:tc>
-          <w:tcPr>
-            <w:tcW w:type="dxa" w:w="4536"/>
-            <w:shd w:fill="fff5dc"/>
-            <w:tcBorders>
-              <w:top w:val="single" w:sz="4" w:color="d4af37"/>
-              <w:left w:val="single" w:sz="4" w:color="d4af37"/>
-              <w:bottom w:val="single" w:sz="4" w:color="d4af37"/>
-              <w:right w:val="single" w:sz="4" w:color="d4af37"/>
-            </w:tcBorders>
-          </w:tcPr>
-          <w:p>
-            <w:r/>
-            <w:r>
-              <w:rPr>
-                <w:rFonts w:ascii="Arial" w:hAnsi="Arial"/>
-                <w:b w:val="0"/>
-                <w:color w:val="282828"/>
-                <w:sz w:val="22"/>
-              </w:rPr>
-              <w:t>**Variables**</w:t>
-            </w:r>
-          </w:p>
-        </w:tc>
-        <w:tc>
-          <w:tcPr>
-            <w:tcW w:type="dxa" w:w="4536"/>
-            <w:shd w:fill="fff5dc"/>
-            <w:tcBorders>
-              <w:top w:val="single" w:sz="4" w:color="d4af37"/>
-              <w:left w:val="single" w:sz="4" w:color="d4af37"/>
-              <w:bottom w:val="single" w:sz="4" w:color="d4af37"/>
-              <w:right w:val="single" w:sz="4" w:color="d4af37"/>
-            </w:tcBorders>
-          </w:tcPr>
-          <w:p>
-            <w:r/>
-            <w:r>
-              <w:rPr>
-                <w:rFonts w:ascii="Arial" w:hAnsi="Arial"/>
-                <w:b w:val="0"/>
-                <w:color w:val="282828"/>
-                <w:sz w:val="22"/>
-              </w:rPr>
-              <w:t>`String`, `int`, `double`, `bool`, `List&lt;Game&gt;`, `Map&lt;String, Member&gt;`</w:t>
-            </w:r>
-          </w:p>
-        </w:tc>
-      </w:tr>
-      <w:tr>
-        <w:tc>
-          <w:tcPr>
-            <w:tcW w:type="dxa" w:w="4536"/>
-            <w:shd w:fill="fff5dc"/>
-            <w:tcBorders>
-              <w:top w:val="single" w:sz="4" w:color="d4af37"/>
-              <w:left w:val="single" w:sz="4" w:color="d4af37"/>
-              <w:bottom w:val="single" w:sz="4" w:color="d4af37"/>
-              <w:right w:val="single" w:sz="4" w:color="d4af37"/>
-            </w:tcBorders>
-          </w:tcPr>
-          <w:p>
-            <w:r/>
-            <w:r>
-              <w:rPr>
-                <w:rFonts w:ascii="Arial" w:hAnsi="Arial"/>
-                <w:b w:val="0"/>
-                <w:color w:val="282828"/>
-                <w:sz w:val="22"/>
-              </w:rPr>
-              <w:t>**Null Safety**</w:t>
-            </w:r>
-          </w:p>
-        </w:tc>
-        <w:tc>
-          <w:tcPr>
-            <w:tcW w:type="dxa" w:w="4536"/>
-            <w:shd w:fill="fff5dc"/>
-            <w:tcBorders>
-              <w:top w:val="single" w:sz="4" w:color="d4af37"/>
-              <w:left w:val="single" w:sz="4" w:color="d4af37"/>
-              <w:bottom w:val="single" w:sz="4" w:color="d4af37"/>
-              <w:right w:val="single" w:sz="4" w:color="d4af37"/>
-            </w:tcBorders>
-          </w:tcPr>
-          <w:p>
-            <w:r/>
-            <w:r>
-              <w:rPr>
-                <w:rFonts w:ascii="Arial" w:hAnsi="Arial"/>
-                <w:b w:val="0"/>
-                <w:color w:val="282828"/>
-                <w:sz w:val="22"/>
-              </w:rPr>
-              <w:t>`Game?` for nullable search results; `required` named params</w:t>
-            </w:r>
-          </w:p>
-        </w:tc>
-      </w:tr>
-      <w:tr>
-        <w:tc>
-          <w:tcPr>
-            <w:tcW w:type="dxa" w:w="4536"/>
-            <w:shd w:fill="fff5dc"/>
-            <w:tcBorders>
-              <w:top w:val="single" w:sz="4" w:color="d4af37"/>
-              <w:left w:val="single" w:sz="4" w:color="d4af37"/>
-              <w:bottom w:val="single" w:sz="4" w:color="d4af37"/>
-              <w:right w:val="single" w:sz="4" w:color="d4af37"/>
-            </w:tcBorders>
-          </w:tcPr>
-          <w:p>
-            <w:r/>
-            <w:r>
-              <w:rPr>
-                <w:rFonts w:ascii="Arial" w:hAnsi="Arial"/>
-                <w:b w:val="0"/>
-                <w:color w:val="282828"/>
-                <w:sz w:val="22"/>
-              </w:rPr>
-              <w:t>**Functions**</w:t>
-            </w:r>
-          </w:p>
-        </w:tc>
-        <w:tc>
-          <w:tcPr>
-            <w:tcW w:type="dxa" w:w="4536"/>
-            <w:shd w:fill="fff5dc"/>
-            <w:tcBorders>
-              <w:top w:val="single" w:sz="4" w:color="d4af37"/>
-              <w:left w:val="single" w:sz="4" w:color="d4af37"/>
-              <w:bottom w:val="single" w:sz="4" w:color="d4af37"/>
-              <w:right w:val="single" w:sz="4" w:color="d4af37"/>
-            </w:tcBorders>
-          </w:tcPr>
-          <w:p>
-            <w:r/>
-            <w:r>
-              <w:rPr>
-                <w:rFonts w:ascii="Arial" w:hAnsi="Arial"/>
-                <w:b w:val="0"/>
-                <w:color w:val="282828"/>
-                <w:sz w:val="22"/>
-              </w:rPr>
-              <w:t>Named params with `required`, optional defaults (`dailyRate = 1.5`), typed returns</w:t>
-            </w:r>
-          </w:p>
-        </w:tc>
-      </w:tr>
-      <w:tr>
-        <w:tc>
-          <w:tcPr>
-            <w:tcW w:type="dxa" w:w="4536"/>
-            <w:shd w:fill="fff5dc"/>
-            <w:tcBorders>
-              <w:top w:val="single" w:sz="4" w:color="d4af37"/>
-              <w:left w:val="single" w:sz="4" w:color="d4af37"/>
-              <w:bottom w:val="single" w:sz="4" w:color="d4af37"/>
-              <w:right w:val="single" w:sz="4" w:color="d4af37"/>
-            </w:tcBorders>
-          </w:tcPr>
-          <w:p>
-            <w:r/>
-            <w:r>
-              <w:rPr>
-                <w:rFonts w:ascii="Arial" w:hAnsi="Arial"/>
-                <w:b w:val="0"/>
-                <w:color w:val="282828"/>
-                <w:sz w:val="22"/>
-              </w:rPr>
-              <w:t>**Loops**</w:t>
-            </w:r>
-          </w:p>
-        </w:tc>
-        <w:tc>
-          <w:tcPr>
-            <w:tcW w:type="dxa" w:w="4536"/>
-            <w:shd w:fill="fff5dc"/>
-            <w:tcBorders>
-              <w:top w:val="single" w:sz="4" w:color="d4af37"/>
-              <w:left w:val="single" w:sz="4" w:color="d4af37"/>
-              <w:bottom w:val="single" w:sz="4" w:color="d4af37"/>
-              <w:right w:val="single" w:sz="4" w:color="d4af37"/>
-            </w:tcBorders>
-          </w:tcPr>
-          <w:p>
-            <w:r/>
-            <w:r>
-              <w:rPr>
-                <w:rFonts w:ascii="Arial" w:hAnsi="Arial"/>
-                <w:b w:val="0"/>
-                <w:color w:val="282828"/>
-                <w:sz w:val="22"/>
-              </w:rPr>
-              <w:t>Indexed `for` in catalog list, `while` in recommendation search, `for-in` for member borrows</w:t>
-            </w:r>
-          </w:p>
-        </w:tc>
-      </w:tr>
-      <w:tr>
-        <w:tc>
-          <w:tcPr>
-            <w:tcW w:type="dxa" w:w="4536"/>
-            <w:shd w:fill="fff5dc"/>
-            <w:tcBorders>
-              <w:top w:val="single" w:sz="4" w:color="d4af37"/>
-              <w:left w:val="single" w:sz="4" w:color="d4af37"/>
-              <w:bottom w:val="single" w:sz="4" w:color="d4af37"/>
-              <w:right w:val="single" w:sz="4" w:color="d4af37"/>
-            </w:tcBorders>
-          </w:tcPr>
-          <w:p>
-            <w:r/>
-            <w:r>
-              <w:rPr>
-                <w:rFonts w:ascii="Arial" w:hAnsi="Arial"/>
-                <w:b w:val="0"/>
-                <w:color w:val="282828"/>
-                <w:sz w:val="22"/>
-              </w:rPr>
-              <w:t>**Collections**</w:t>
-            </w:r>
-          </w:p>
-        </w:tc>
-        <w:tc>
-          <w:tcPr>
-            <w:tcW w:type="dxa" w:w="4536"/>
-            <w:shd w:fill="fff5dc"/>
-            <w:tcBorders>
-              <w:top w:val="single" w:sz="4" w:color="d4af37"/>
-              <w:left w:val="single" w:sz="4" w:color="d4af37"/>
-              <w:bottom w:val="single" w:sz="4" w:color="d4af37"/>
-              <w:right w:val="single" w:sz="4" w:color="d4af37"/>
-            </w:tcBorders>
-          </w:tcPr>
-          <w:p>
-            <w:r/>
-            <w:r>
-              <w:rPr>
-                <w:rFonts w:ascii="Arial" w:hAnsi="Arial"/>
-                <w:b w:val="0"/>
-                <w:color w:val="282828"/>
-                <w:sz w:val="22"/>
-              </w:rPr>
-              <w:t>`List` for catalog and borrowed items, `Map` for member registry</w:t>
-            </w:r>
-          </w:p>
-        </w:tc>
-      </w:tr>
-    </w:tbl>
-    <w:p>
-      <w:pPr>
-        <w:pStyle w:val="Heading1"/>
-      </w:pPr>
-      <w:r>
-        <w:rPr>
-          <w:rFonts w:ascii="Arial" w:hAnsi="Arial"/>
-          <w:b/>
-          <w:color w:val="D4AF37"/>
-          <w:sz w:val="40"/>
-        </w:rPr>
-        <w:t>3. Object-Oriented Architecture</w:t>
-      </w:r>
-    </w:p>
-    <w:p>
-      <w:pPr>
-        <w:pStyle w:val="Heading2"/>
-      </w:pPr>
-      <w:r>
-        <w:rPr>
-          <w:rFonts w:ascii="Arial" w:hAnsi="Arial"/>
-          <w:b/>
-          <w:color w:val="D4AF37"/>
-          <w:sz w:val="32"/>
-        </w:rPr>
-        <w:t>Four Pillars</w:t>
+        <w:t>2. A Shift at the Library</w:t>
       </w:r>
     </w:p>
     <w:p>
@@ -691,17 +292,10 @@
           <w:color w:val="282828"/>
           <w:sz w:val="22"/>
         </w:rPr>
-        <w:t xml:space="preserve">1. </w:t>
+        <w:t>Here is what happens when the program runs:</w:t>
       </w:r>
-      <w:r>
-        <w:rPr>
-          <w:rFonts w:ascii="Arial" w:hAnsi="Arial"/>
-          <w:b/>
-          <w:color w:val="D4AF37"/>
-          <w:sz w:val="22"/>
-        </w:rPr>
-        <w:t>Abstraction</w:t>
-      </w:r>
+    </w:p>
+    <w:p>
       <w:r>
         <w:rPr>
           <w:rFonts w:ascii="Arial" w:hAnsi="Arial"/>
@@ -709,7 +303,7 @@
           <w:color w:val="282828"/>
           <w:sz w:val="22"/>
         </w:rPr>
-        <w:t xml:space="preserve"> — `Game` is abstract; it defines the contract `describe()` without implementation.</w:t>
+        <w:t>1. The librarian opens the catalog. Four games are listed: two board games, one card game, and one RPG manual.</w:t>
       </w:r>
     </w:p>
     <w:p>
@@ -729,7 +323,7 @@
           <w:color w:val="D4AF37"/>
           <w:sz w:val="22"/>
         </w:rPr>
-        <w:t>Inheritance</w:t>
+        <w:t>Soumitra Deshpande</w:t>
       </w:r>
       <w:r>
         <w:rPr>
@@ -738,7 +332,25 @@
           <w:color w:val="282828"/>
           <w:sz w:val="22"/>
         </w:rPr>
-        <w:t xml:space="preserve"> — `BoardGame`, `CardGame`, and `RPGManual` extend `Game` using `super` parameters.</w:t>
+        <w:t xml:space="preserve"> borrows *Wingspan*. </w:t>
+      </w:r>
+      <w:r>
+        <w:rPr>
+          <w:rFonts w:ascii="Arial" w:hAnsi="Arial"/>
+          <w:b/>
+          <w:color w:val="D4AF37"/>
+          <w:sz w:val="22"/>
+        </w:rPr>
+        <w:t>Alex Chen</w:t>
+      </w:r>
+      <w:r>
+        <w:rPr>
+          <w:rFonts w:ascii="Arial" w:hAnsi="Arial"/>
+          <w:b w:val="0"/>
+          <w:color w:val="282828"/>
+          <w:sz w:val="22"/>
+        </w:rPr>
+        <w:t xml:space="preserve"> borrows *Love Letter*.</w:t>
       </w:r>
     </w:p>
     <w:p>
@@ -749,25 +361,7 @@
           <w:color w:val="282828"/>
           <w:sz w:val="22"/>
         </w:rPr>
-        <w:t xml:space="preserve">3. </w:t>
-      </w:r>
-      <w:r>
-        <w:rPr>
-          <w:rFonts w:ascii="Arial" w:hAnsi="Arial"/>
-          <w:b/>
-          <w:color w:val="D4AF37"/>
-          <w:sz w:val="22"/>
-        </w:rPr>
-        <w:t>Polymorphism</w:t>
-      </w:r>
-      <w:r>
-        <w:rPr>
-          <w:rFonts w:ascii="Arial" w:hAnsi="Arial"/>
-          <w:b w:val="0"/>
-          <w:color w:val="282828"/>
-          <w:sz w:val="22"/>
-        </w:rPr>
-        <w:t xml:space="preserve"> — Each subclass `@override` the `describe()` method for its own output format.</w:t>
+        <w:t>3. A group of three friends walks in. The librarian runs a recommendation check and suggests *Catan* because it supports exactly three players.</w:t>
       </w:r>
     </w:p>
     <w:p>
@@ -778,7 +372,78 @@
           <w:color w:val="282828"/>
           <w:sz w:val="22"/>
         </w:rPr>
-        <w:t xml:space="preserve">4. </w:t>
+        <w:t>4. Soumitra returns *Wingspan*.</w:t>
+      </w:r>
+    </w:p>
+    <w:p>
+      <w:r>
+        <w:rPr>
+          <w:rFonts w:ascii="Arial" w:hAnsi="Arial"/>
+          <w:b w:val="0"/>
+          <w:color w:val="282828"/>
+          <w:sz w:val="22"/>
+        </w:rPr>
+        <w:t>5. The system prints each member's current borrow record.</w:t>
+      </w:r>
+    </w:p>
+    <w:p>
+      <w:r>
+        <w:rPr>
+          <w:rFonts w:ascii="Arial" w:hAnsi="Arial"/>
+          <w:b w:val="0"/>
+          <w:color w:val="282828"/>
+          <w:sz w:val="22"/>
+        </w:rPr>
+        <w:t>6. The late-fee calculator shows what happens if games come back overdue.</w:t>
+      </w:r>
+    </w:p>
+    <w:p>
+      <w:r>
+        <w:rPr>
+          <w:rFonts w:ascii="Arial" w:hAnsi="Arial"/>
+          <w:b w:val="0"/>
+          <w:color w:val="282828"/>
+          <w:sz w:val="22"/>
+        </w:rPr>
+        <w:t>This single workflow exercises every required Dart concept.</w:t>
+      </w:r>
+    </w:p>
+    <w:p>
+      <w:pPr>
+        <w:pStyle w:val="Heading1"/>
+      </w:pPr>
+      <w:r>
+        <w:rPr>
+          <w:rFonts w:ascii="Arial" w:hAnsi="Arial"/>
+          <w:b/>
+          <w:color w:val="D4AF37"/>
+          <w:sz w:val="40"/>
+        </w:rPr>
+        <w:t>3. What's Under the Hood</w:t>
+      </w:r>
+    </w:p>
+    <w:p>
+      <w:r>
+        <w:rPr>
+          <w:rFonts w:ascii="Arial" w:hAnsi="Arial"/>
+          <w:b w:val="0"/>
+          <w:color w:val="282828"/>
+          <w:sz w:val="22"/>
+        </w:rPr>
+        <w:t>The system is built around three ideas:</w:t>
+      </w:r>
+    </w:p>
+    <w:p>
+      <w:pPr>
+        <w:pStyle w:val="ListBullet"/>
+      </w:pPr>
+      <w:r>
+        <w:rPr>
+          <w:rFonts w:ascii="Arial" w:hAnsi="Arial"/>
+          <w:b w:val="0"/>
+          <w:color w:val="282828"/>
+          <w:sz w:val="22"/>
+        </w:rPr>
       </w:r>
       <w:r>
         <w:rPr>
@@ -787,7 +452,7 @@
           <w:color w:val="D4AF37"/>
           <w:sz w:val="22"/>
         </w:rPr>
-        <w:t>Encapsulation</w:t>
+        <w:t>A shared base type.</w:t>
       </w:r>
       <w:r>
         <w:rPr>
@@ -796,21 +461,69 @@
           <w:color w:val="282828"/>
           <w:sz w:val="22"/>
         </w:rPr>
-        <w:t xml:space="preserve"> — `GameLibrary` controls catalog and borrow logic; `Member` owns its borrow list.</w:t>
+        <w:t xml:space="preserve"> Every item in the catalog is a `Game`. The exact kind of game is handled by subclasses.</w:t>
       </w:r>
     </w:p>
     <w:p>
       <w:pPr>
-        <w:pStyle w:val="Heading2"/>
+        <w:pStyle w:val="ListBullet"/>
       </w:pPr>
+      <w:r>
+        <w:rPr>
+          <w:rFonts w:ascii="Arial" w:hAnsi="Arial"/>
+          <w:b w:val="0"/>
+          <w:color w:val="282828"/>
+          <w:sz w:val="22"/>
+        </w:rPr>
+      </w:r>
       <w:r>
         <w:rPr>
           <w:rFonts w:ascii="Arial" w:hAnsi="Arial"/>
           <w:b/>
           <w:color w:val="D4AF37"/>
-          <w:sz w:val="32"/>
+          <w:sz w:val="22"/>
         </w:rPr>
-        <w:t>Class Hierarchy</w:t>
+        <w:t>A member registry.</w:t>
+      </w:r>
+      <w:r>
+        <w:rPr>
+          <w:rFonts w:ascii="Arial" w:hAnsi="Arial"/>
+          <w:b w:val="0"/>
+          <w:color w:val="282828"/>
+          <w:sz w:val="22"/>
+        </w:rPr>
+        <w:t xml:space="preserve"> Members are stored in a `Map&lt;String, Member&gt;` for fast lookup by ID.</w:t>
+      </w:r>
+    </w:p>
+    <w:p>
+      <w:pPr>
+        <w:pStyle w:val="ListBullet"/>
+      </w:pPr>
+      <w:r>
+        <w:rPr>
+          <w:rFonts w:ascii="Arial" w:hAnsi="Arial"/>
+          <w:b w:val="0"/>
+          <w:color w:val="282828"/>
+          <w:sz w:val="22"/>
+        </w:rPr>
+      </w:r>
+      <w:r>
+        <w:rPr>
+          <w:rFonts w:ascii="Arial" w:hAnsi="Arial"/>
+          <w:b/>
+          <w:color w:val="D4AF37"/>
+          <w:sz w:val="22"/>
+        </w:rPr>
+        <w:t>A librarian.</w:t>
+      </w:r>
+      <w:r>
+        <w:rPr>
+          <w:rFonts w:ascii="Arial" w:hAnsi="Arial"/>
+          <w:b w:val="0"/>
+          <w:color w:val="282828"/>
+          <w:sz w:val="22"/>
+        </w:rPr>
+        <w:t xml:space="preserve"> `GameLibrary` holds the catalog, registers members, handles checkout/return, and recommends games.</w:t>
       </w:r>
     </w:p>
     <w:tbl>
@@ -876,8 +589,6 @@
               <w:br/>
               <w:t xml:space="preserve">        +double complexityRating</w:t>
               <w:br/>
-              <w:t xml:space="preserve">        +describe() void</w:t>
-              <w:br/>
               <w:t xml:space="preserve">    }</w:t>
               <w:br/>
               <w:t xml:space="preserve">    class CardGame {</w:t>
@@ -886,8 +597,6 @@
               <w:br/>
               <w:t xml:space="preserve">        +int avgPlayTimeMinutes</w:t>
               <w:br/>
-              <w:t xml:space="preserve">        +describe() void</w:t>
-              <w:br/>
               <w:t xml:space="preserve">    }</w:t>
               <w:br/>
               <w:t xml:space="preserve">    class RPGManual {</w:t>
@@ -895,8 +604,6 @@
               <w:t xml:space="preserve">        +String edition</w:t>
               <w:br/>
               <w:t xml:space="preserve">        +int pageCount</w:t>
-              <w:br/>
-              <w:t xml:space="preserve">        +describe() void</w:t>
               <w:br/>
               <w:t xml:space="preserve">    }</w:t>
               <w:br/>
@@ -908,8 +615,6 @@
               <w:br/>
               <w:t xml:space="preserve">        +List~Game~ borrowedGames</w:t>
               <w:br/>
-              <w:t xml:space="preserve">        +showBorrowedGames() void</w:t>
-              <w:br/>
               <w:t xml:space="preserve">    }</w:t>
               <w:br/>
               <w:t xml:space="preserve">    class GameLibrary {</w:t>
@@ -917,8 +622,6 @@
               <w:t xml:space="preserve">        +List~Game~ catalog</w:t>
               <w:br/>
               <w:t xml:space="preserve">        +Map~String,Member~ members</w:t>
-              <w:br/>
-              <w:t xml:space="preserve">        +addGame() void</w:t>
               <w:br/>
               <w:t xml:space="preserve">        +borrowGame() bool</w:t>
               <w:br/>
@@ -933,6 +636,10 @@
               <w:t xml:space="preserve">    Game &lt;|-- CardGame</w:t>
               <w:br/>
               <w:t xml:space="preserve">    Game &lt;|-- RPGManual</w:t>
+              <w:br/>
+              <w:t xml:space="preserve">    GameLibrary --&gt; Game</w:t>
+              <w:br/>
+              <w:t xml:space="preserve">    GameLibrary --&gt; Member</w:t>
             </w:r>
           </w:p>
         </w:tc>
@@ -949,771 +656,7 @@
           <w:color w:val="D4AF37"/>
           <w:sz w:val="40"/>
         </w:rPr>
-        <w:t>4. System Architecture</w:t>
-      </w:r>
-    </w:p>
-    <w:tbl>
-      <w:tblPr>
-        <w:tblW w:type="auto" w:w="0"/>
-        <w:jc w:val="left"/>
-        <w:tblLook w:firstColumn="1" w:firstRow="1" w:lastColumn="0" w:lastRow="0" w:noHBand="0" w:noVBand="1" w:val="04A0"/>
-      </w:tblPr>
-      <w:tblGrid>
-        <w:gridCol w:w="9072"/>
-      </w:tblGrid>
-      <w:tr>
-        <w:tc>
-          <w:tcPr>
-            <w:tcW w:type="dxa" w:w="8640"/>
-            <w:shd w:fill="fffaeb"/>
-            <w:tcBorders>
-              <w:top w:val="single" w:sz="4" w:color="d4af37"/>
-              <w:left w:val="single" w:sz="4" w:color="d4af37"/>
-              <w:bottom w:val="single" w:sz="4" w:color="d4af37"/>
-              <w:right w:val="single" w:sz="4" w:color="d4af37"/>
-            </w:tcBorders>
-          </w:tcPr>
-          <w:p>
-            <w:r>
-              <w:rPr>
-                <w:rFonts w:ascii="Consolas" w:hAnsi="Consolas"/>
-                <w:b w:val="0"/>
-                <w:color w:val="282828"/>
-                <w:sz w:val="18"/>
-              </w:rPr>
-              <w:t>┌─────────────────────────────────────┐</w:t>
-              <w:br/>
-              <w:t>│           main.dart                 │</w:t>
-              <w:br/>
-              <w:t>│  Creates games, members, and runs   │</w:t>
-              <w:br/>
-              <w:t>│  the demonstration workflow.        │</w:t>
-              <w:br/>
-              <w:t>└──────────────┬──────────────────────┘</w:t>
-              <w:br/>
-              <w:t xml:space="preserve">               │</w:t>
-              <w:br/>
-              <w:t>┌──────────────▼──────────────────────┐</w:t>
-              <w:br/>
-              <w:t>│         GameLibrary                 │</w:t>
-              <w:br/>
-              <w:t>│  Catalog (List&lt;Game&gt;)               │</w:t>
-              <w:br/>
-              <w:t>│  Members (Map&lt;String, Member&gt;)      │</w:t>
-              <w:br/>
-              <w:t>└──────────────┬──────────────────────┘</w:t>
-              <w:br/>
-              <w:t xml:space="preserve">               │ uses</w:t>
-              <w:br/>
-              <w:t>┌──────────────▼──────────────────────┐</w:t>
-              <w:br/>
-              <w:t>│  BoardGame / CardGame / RPGManual   │</w:t>
-              <w:br/>
-              <w:t>│  (inherit from abstract Game)       │</w:t>
-              <w:br/>
-              <w:t>└─────────────────────────────────────┘</w:t>
-            </w:r>
-          </w:p>
-        </w:tc>
-      </w:tr>
-    </w:tbl>
-    <w:p>
-      <w:pPr>
-        <w:pStyle w:val="Heading1"/>
-      </w:pPr>
-      <w:r>
-        <w:rPr>
-          <w:rFonts w:ascii="Arial" w:hAnsi="Arial"/>
-          <w:b/>
-          <w:color w:val="D4AF37"/>
-          <w:sz w:val="40"/>
-        </w:rPr>
-        <w:t>5. Algorithmic Complexity</w:t>
-      </w:r>
-    </w:p>
-    <w:tbl>
-      <w:tblPr>
-        <w:tblStyle w:val="TableGrid"/>
-        <w:tblW w:type="auto" w:w="0"/>
-        <w:jc w:val="center"/>
-        <w:tblLook w:firstColumn="1" w:firstRow="1" w:lastColumn="0" w:lastRow="0" w:noHBand="0" w:noVBand="1" w:val="04A0"/>
-      </w:tblPr>
-      <w:tblGrid>
-        <w:gridCol w:w="3024"/>
-        <w:gridCol w:w="3024"/>
-        <w:gridCol w:w="3024"/>
-      </w:tblGrid>
-      <w:tr>
-        <w:tc>
-          <w:tcPr>
-            <w:tcW w:type="dxa" w:w="3024"/>
-            <w:shd w:fill="d4af37"/>
-            <w:tcBorders>
-              <w:top w:val="single" w:sz="6" w:color="d4af37"/>
-              <w:left w:val="single" w:sz="6" w:color="d4af37"/>
-              <w:bottom w:val="single" w:sz="6" w:color="d4af37"/>
-              <w:right w:val="single" w:sz="6" w:color="d4af37"/>
-            </w:tcBorders>
-          </w:tcPr>
-          <w:p>
-            <w:r/>
-            <w:r>
-              <w:rPr>
-                <w:rFonts w:ascii="Arial" w:hAnsi="Arial"/>
-                <w:b/>
-                <w:color w:val="FFFFFF"/>
-                <w:sz w:val="22"/>
-              </w:rPr>
-              <w:t>Operation</w:t>
-            </w:r>
-          </w:p>
-        </w:tc>
-        <w:tc>
-          <w:tcPr>
-            <w:tcW w:type="dxa" w:w="3024"/>
-            <w:shd w:fill="d4af37"/>
-            <w:tcBorders>
-              <w:top w:val="single" w:sz="6" w:color="d4af37"/>
-              <w:left w:val="single" w:sz="6" w:color="d4af37"/>
-              <w:bottom w:val="single" w:sz="6" w:color="d4af37"/>
-              <w:right w:val="single" w:sz="6" w:color="d4af37"/>
-            </w:tcBorders>
-          </w:tcPr>
-          <w:p>
-            <w:r/>
-            <w:r>
-              <w:rPr>
-                <w:rFonts w:ascii="Arial" w:hAnsi="Arial"/>
-                <w:b/>
-                <w:color w:val="FFFFFF"/>
-                <w:sz w:val="22"/>
-              </w:rPr>
-              <w:t>Structure</w:t>
-            </w:r>
-          </w:p>
-        </w:tc>
-        <w:tc>
-          <w:tcPr>
-            <w:tcW w:type="dxa" w:w="3024"/>
-            <w:shd w:fill="d4af37"/>
-            <w:tcBorders>
-              <w:top w:val="single" w:sz="6" w:color="d4af37"/>
-              <w:left w:val="single" w:sz="6" w:color="d4af37"/>
-              <w:bottom w:val="single" w:sz="6" w:color="d4af37"/>
-              <w:right w:val="single" w:sz="6" w:color="d4af37"/>
-            </w:tcBorders>
-          </w:tcPr>
-          <w:p>
-            <w:r/>
-            <w:r>
-              <w:rPr>
-                <w:rFonts w:ascii="Arial" w:hAnsi="Arial"/>
-                <w:b/>
-                <w:color w:val="FFFFFF"/>
-                <w:sz w:val="22"/>
-              </w:rPr>
-              <w:t>Average Complexity</w:t>
-            </w:r>
-          </w:p>
-        </w:tc>
-      </w:tr>
-      <w:tr>
-        <w:tc>
-          <w:tcPr>
-            <w:tcW w:type="dxa" w:w="3024"/>
-            <w:shd w:fill="fff5dc"/>
-            <w:tcBorders>
-              <w:top w:val="single" w:sz="4" w:color="d4af37"/>
-              <w:left w:val="single" w:sz="4" w:color="d4af37"/>
-              <w:bottom w:val="single" w:sz="4" w:color="d4af37"/>
-              <w:right w:val="single" w:sz="4" w:color="d4af37"/>
-            </w:tcBorders>
-          </w:tcPr>
-          <w:p>
-            <w:r/>
-            <w:r>
-              <w:rPr>
-                <w:rFonts w:ascii="Arial" w:hAnsi="Arial"/>
-                <w:b w:val="0"/>
-                <w:color w:val="282828"/>
-                <w:sz w:val="22"/>
-              </w:rPr>
-              <w:t>Add game</w:t>
-            </w:r>
-          </w:p>
-        </w:tc>
-        <w:tc>
-          <w:tcPr>
-            <w:tcW w:type="dxa" w:w="3024"/>
-            <w:shd w:fill="fff5dc"/>
-            <w:tcBorders>
-              <w:top w:val="single" w:sz="4" w:color="d4af37"/>
-              <w:left w:val="single" w:sz="4" w:color="d4af37"/>
-              <w:bottom w:val="single" w:sz="4" w:color="d4af37"/>
-              <w:right w:val="single" w:sz="4" w:color="d4af37"/>
-            </w:tcBorders>
-          </w:tcPr>
-          <w:p>
-            <w:r/>
-            <w:r>
-              <w:rPr>
-                <w:rFonts w:ascii="Arial" w:hAnsi="Arial"/>
-                <w:b w:val="0"/>
-                <w:color w:val="282828"/>
-                <w:sz w:val="22"/>
-              </w:rPr>
-              <w:t>`List.add`</w:t>
-            </w:r>
-          </w:p>
-        </w:tc>
-        <w:tc>
-          <w:tcPr>
-            <w:tcW w:type="dxa" w:w="3024"/>
-            <w:shd w:fill="fff5dc"/>
-            <w:tcBorders>
-              <w:top w:val="single" w:sz="4" w:color="d4af37"/>
-              <w:left w:val="single" w:sz="4" w:color="d4af37"/>
-              <w:bottom w:val="single" w:sz="4" w:color="d4af37"/>
-              <w:right w:val="single" w:sz="4" w:color="d4af37"/>
-            </w:tcBorders>
-          </w:tcPr>
-          <w:p>
-            <w:r/>
-            <w:r>
-              <w:rPr>
-                <w:rFonts w:ascii="Arial" w:hAnsi="Arial"/>
-                <w:b w:val="0"/>
-                <w:color w:val="282828"/>
-                <w:sz w:val="22"/>
-              </w:rPr>
-              <w:t>O(1) amortized</w:t>
-            </w:r>
-          </w:p>
-        </w:tc>
-      </w:tr>
-      <w:tr>
-        <w:tc>
-          <w:tcPr>
-            <w:tcW w:type="dxa" w:w="3024"/>
-            <w:shd w:fill="fff5dc"/>
-            <w:tcBorders>
-              <w:top w:val="single" w:sz="4" w:color="d4af37"/>
-              <w:left w:val="single" w:sz="4" w:color="d4af37"/>
-              <w:bottom w:val="single" w:sz="4" w:color="d4af37"/>
-              <w:right w:val="single" w:sz="4" w:color="d4af37"/>
-            </w:tcBorders>
-          </w:tcPr>
-          <w:p>
-            <w:r/>
-            <w:r>
-              <w:rPr>
-                <w:rFonts w:ascii="Arial" w:hAnsi="Arial"/>
-                <w:b w:val="0"/>
-                <w:color w:val="282828"/>
-                <w:sz w:val="22"/>
-              </w:rPr>
-              <w:t>Register member</w:t>
-            </w:r>
-          </w:p>
-        </w:tc>
-        <w:tc>
-          <w:tcPr>
-            <w:tcW w:type="dxa" w:w="3024"/>
-            <w:shd w:fill="fff5dc"/>
-            <w:tcBorders>
-              <w:top w:val="single" w:sz="4" w:color="d4af37"/>
-              <w:left w:val="single" w:sz="4" w:color="d4af37"/>
-              <w:bottom w:val="single" w:sz="4" w:color="d4af37"/>
-              <w:right w:val="single" w:sz="4" w:color="d4af37"/>
-            </w:tcBorders>
-          </w:tcPr>
-          <w:p>
-            <w:r/>
-            <w:r>
-              <w:rPr>
-                <w:rFonts w:ascii="Arial" w:hAnsi="Arial"/>
-                <w:b w:val="0"/>
-                <w:color w:val="282828"/>
-                <w:sz w:val="22"/>
-              </w:rPr>
-              <w:t>`Map` insertion</w:t>
-            </w:r>
-          </w:p>
-        </w:tc>
-        <w:tc>
-          <w:tcPr>
-            <w:tcW w:type="dxa" w:w="3024"/>
-            <w:shd w:fill="fff5dc"/>
-            <w:tcBorders>
-              <w:top w:val="single" w:sz="4" w:color="d4af37"/>
-              <w:left w:val="single" w:sz="4" w:color="d4af37"/>
-              <w:bottom w:val="single" w:sz="4" w:color="d4af37"/>
-              <w:right w:val="single" w:sz="4" w:color="d4af37"/>
-            </w:tcBorders>
-          </w:tcPr>
-          <w:p>
-            <w:r/>
-            <w:r>
-              <w:rPr>
-                <w:rFonts w:ascii="Arial" w:hAnsi="Arial"/>
-                <w:b w:val="0"/>
-                <w:color w:val="282828"/>
-                <w:sz w:val="22"/>
-              </w:rPr>
-              <w:t>O(1)</w:t>
-            </w:r>
-          </w:p>
-        </w:tc>
-      </w:tr>
-      <w:tr>
-        <w:tc>
-          <w:tcPr>
-            <w:tcW w:type="dxa" w:w="3024"/>
-            <w:shd w:fill="fff5dc"/>
-            <w:tcBorders>
-              <w:top w:val="single" w:sz="4" w:color="d4af37"/>
-              <w:left w:val="single" w:sz="4" w:color="d4af37"/>
-              <w:bottom w:val="single" w:sz="4" w:color="d4af37"/>
-              <w:right w:val="single" w:sz="4" w:color="d4af37"/>
-            </w:tcBorders>
-          </w:tcPr>
-          <w:p>
-            <w:r/>
-            <w:r>
-              <w:rPr>
-                <w:rFonts w:ascii="Arial" w:hAnsi="Arial"/>
-                <w:b w:val="0"/>
-                <w:color w:val="282828"/>
-                <w:sz w:val="22"/>
-              </w:rPr>
-              <w:t>Find game by ID</w:t>
-            </w:r>
-          </w:p>
-        </w:tc>
-        <w:tc>
-          <w:tcPr>
-            <w:tcW w:type="dxa" w:w="3024"/>
-            <w:shd w:fill="fff5dc"/>
-            <w:tcBorders>
-              <w:top w:val="single" w:sz="4" w:color="d4af37"/>
-              <w:left w:val="single" w:sz="4" w:color="d4af37"/>
-              <w:bottom w:val="single" w:sz="4" w:color="d4af37"/>
-              <w:right w:val="single" w:sz="4" w:color="d4af37"/>
-            </w:tcBorders>
-          </w:tcPr>
-          <w:p>
-            <w:r/>
-            <w:r>
-              <w:rPr>
-                <w:rFonts w:ascii="Arial" w:hAnsi="Arial"/>
-                <w:b w:val="0"/>
-                <w:color w:val="282828"/>
-                <w:sz w:val="22"/>
-              </w:rPr>
-              <w:t>Linear scan of `List`</w:t>
-            </w:r>
-          </w:p>
-        </w:tc>
-        <w:tc>
-          <w:tcPr>
-            <w:tcW w:type="dxa" w:w="3024"/>
-            <w:shd w:fill="fff5dc"/>
-            <w:tcBorders>
-              <w:top w:val="single" w:sz="4" w:color="d4af37"/>
-              <w:left w:val="single" w:sz="4" w:color="d4af37"/>
-              <w:bottom w:val="single" w:sz="4" w:color="d4af37"/>
-              <w:right w:val="single" w:sz="4" w:color="d4af37"/>
-            </w:tcBorders>
-          </w:tcPr>
-          <w:p>
-            <w:r/>
-            <w:r>
-              <w:rPr>
-                <w:rFonts w:ascii="Arial" w:hAnsi="Arial"/>
-                <w:b w:val="0"/>
-                <w:color w:val="282828"/>
-                <w:sz w:val="22"/>
-              </w:rPr>
-              <w:t>O(n)</w:t>
-            </w:r>
-          </w:p>
-        </w:tc>
-      </w:tr>
-      <w:tr>
-        <w:tc>
-          <w:tcPr>
-            <w:tcW w:type="dxa" w:w="3024"/>
-            <w:shd w:fill="fff5dc"/>
-            <w:tcBorders>
-              <w:top w:val="single" w:sz="4" w:color="d4af37"/>
-              <w:left w:val="single" w:sz="4" w:color="d4af37"/>
-              <w:bottom w:val="single" w:sz="4" w:color="d4af37"/>
-              <w:right w:val="single" w:sz="4" w:color="d4af37"/>
-            </w:tcBorders>
-          </w:tcPr>
-          <w:p>
-            <w:r/>
-            <w:r>
-              <w:rPr>
-                <w:rFonts w:ascii="Arial" w:hAnsi="Arial"/>
-                <w:b w:val="0"/>
-                <w:color w:val="282828"/>
-                <w:sz w:val="22"/>
-              </w:rPr>
-              <w:t>Find member by ID</w:t>
-            </w:r>
-          </w:p>
-        </w:tc>
-        <w:tc>
-          <w:tcPr>
-            <w:tcW w:type="dxa" w:w="3024"/>
-            <w:shd w:fill="fff5dc"/>
-            <w:tcBorders>
-              <w:top w:val="single" w:sz="4" w:color="d4af37"/>
-              <w:left w:val="single" w:sz="4" w:color="d4af37"/>
-              <w:bottom w:val="single" w:sz="4" w:color="d4af37"/>
-              <w:right w:val="single" w:sz="4" w:color="d4af37"/>
-            </w:tcBorders>
-          </w:tcPr>
-          <w:p>
-            <w:r/>
-            <w:r>
-              <w:rPr>
-                <w:rFonts w:ascii="Arial" w:hAnsi="Arial"/>
-                <w:b w:val="0"/>
-                <w:color w:val="282828"/>
-                <w:sz w:val="22"/>
-              </w:rPr>
-              <w:t>`Map` lookup</w:t>
-            </w:r>
-          </w:p>
-        </w:tc>
-        <w:tc>
-          <w:tcPr>
-            <w:tcW w:type="dxa" w:w="3024"/>
-            <w:shd w:fill="fff5dc"/>
-            <w:tcBorders>
-              <w:top w:val="single" w:sz="4" w:color="d4af37"/>
-              <w:left w:val="single" w:sz="4" w:color="d4af37"/>
-              <w:bottom w:val="single" w:sz="4" w:color="d4af37"/>
-              <w:right w:val="single" w:sz="4" w:color="d4af37"/>
-            </w:tcBorders>
-          </w:tcPr>
-          <w:p>
-            <w:r/>
-            <w:r>
-              <w:rPr>
-                <w:rFonts w:ascii="Arial" w:hAnsi="Arial"/>
-                <w:b w:val="0"/>
-                <w:color w:val="282828"/>
-                <w:sz w:val="22"/>
-              </w:rPr>
-              <w:t>O(1)</w:t>
-            </w:r>
-          </w:p>
-        </w:tc>
-      </w:tr>
-      <w:tr>
-        <w:tc>
-          <w:tcPr>
-            <w:tcW w:type="dxa" w:w="3024"/>
-            <w:shd w:fill="fff5dc"/>
-            <w:tcBorders>
-              <w:top w:val="single" w:sz="4" w:color="d4af37"/>
-              <w:left w:val="single" w:sz="4" w:color="d4af37"/>
-              <w:bottom w:val="single" w:sz="4" w:color="d4af37"/>
-              <w:right w:val="single" w:sz="4" w:color="d4af37"/>
-            </w:tcBorders>
-          </w:tcPr>
-          <w:p>
-            <w:r/>
-            <w:r>
-              <w:rPr>
-                <w:rFonts w:ascii="Arial" w:hAnsi="Arial"/>
-                <w:b w:val="0"/>
-                <w:color w:val="282828"/>
-                <w:sz w:val="22"/>
-              </w:rPr>
-              <w:t>Recommend games</w:t>
-            </w:r>
-          </w:p>
-        </w:tc>
-        <w:tc>
-          <w:tcPr>
-            <w:tcW w:type="dxa" w:w="3024"/>
-            <w:shd w:fill="fff5dc"/>
-            <w:tcBorders>
-              <w:top w:val="single" w:sz="4" w:color="d4af37"/>
-              <w:left w:val="single" w:sz="4" w:color="d4af37"/>
-              <w:bottom w:val="single" w:sz="4" w:color="d4af37"/>
-              <w:right w:val="single" w:sz="4" w:color="d4af37"/>
-            </w:tcBorders>
-          </w:tcPr>
-          <w:p>
-            <w:r/>
-            <w:r>
-              <w:rPr>
-                <w:rFonts w:ascii="Arial" w:hAnsi="Arial"/>
-                <w:b w:val="0"/>
-                <w:color w:val="282828"/>
-                <w:sz w:val="22"/>
-              </w:rPr>
-              <w:t>Linear `while` scan</w:t>
-            </w:r>
-          </w:p>
-        </w:tc>
-        <w:tc>
-          <w:tcPr>
-            <w:tcW w:type="dxa" w:w="3024"/>
-            <w:shd w:fill="fff5dc"/>
-            <w:tcBorders>
-              <w:top w:val="single" w:sz="4" w:color="d4af37"/>
-              <w:left w:val="single" w:sz="4" w:color="d4af37"/>
-              <w:bottom w:val="single" w:sz="4" w:color="d4af37"/>
-              <w:right w:val="single" w:sz="4" w:color="d4af37"/>
-            </w:tcBorders>
-          </w:tcPr>
-          <w:p>
-            <w:r/>
-            <w:r>
-              <w:rPr>
-                <w:rFonts w:ascii="Arial" w:hAnsi="Arial"/>
-                <w:b w:val="0"/>
-                <w:color w:val="282828"/>
-                <w:sz w:val="22"/>
-              </w:rPr>
-              <w:t>O(n)</w:t>
-            </w:r>
-          </w:p>
-        </w:tc>
-      </w:tr>
-    </w:tbl>
-    <w:p>
-      <w:pPr>
-        <w:pStyle w:val="Heading1"/>
-      </w:pPr>
-      <w:r>
-        <w:rPr>
-          <w:rFonts w:ascii="Arial" w:hAnsi="Arial"/>
-          <w:b/>
-          <w:color w:val="D4AF37"/>
-          <w:sz w:val="40"/>
-        </w:rPr>
-        <w:t>6. File-by-File Breakdown</w:t>
-      </w:r>
-    </w:p>
-    <w:p>
-      <w:pPr>
-        <w:pStyle w:val="Heading2"/>
-      </w:pPr>
-      <w:r>
-        <w:rPr>
-          <w:rFonts w:ascii="Arial" w:hAnsi="Arial"/>
-          <w:b/>
-          <w:color w:val="D4AF37"/>
-          <w:sz w:val="32"/>
-        </w:rPr>
-        <w:t>`lib/game.dart`</w:t>
-      </w:r>
-    </w:p>
-    <w:p>
-      <w:r>
-        <w:rPr>
-          <w:rFonts w:ascii="Arial" w:hAnsi="Arial"/>
-          <w:b w:val="0"/>
-          <w:color w:val="282828"/>
-          <w:sz w:val="22"/>
-        </w:rPr>
-        <w:t>Abstract base class `Game`. Holds common fields (`id`, `title`, `publisher`, `releaseYear`, `genre`, `isAvailable`) and declares the abstract `describe()` method.</w:t>
-      </w:r>
-    </w:p>
-    <w:p>
-      <w:pPr>
-        <w:pStyle w:val="Heading2"/>
-      </w:pPr>
-      <w:r>
-        <w:rPr>
-          <w:rFonts w:ascii="Arial" w:hAnsi="Arial"/>
-          <w:b/>
-          <w:color w:val="D4AF37"/>
-          <w:sz w:val="32"/>
-        </w:rPr>
-        <w:t>`lib/board_game.dart`</w:t>
-      </w:r>
-    </w:p>
-    <w:p>
-      <w:r>
-        <w:rPr>
-          <w:rFonts w:ascii="Arial" w:hAnsi="Arial"/>
-          <w:b w:val="0"/>
-          <w:color w:val="282828"/>
-          <w:sz w:val="22"/>
-        </w:rPr>
-        <w:t>Subclass for board games. Adds `playerCountMin`, `playerCountMax`, `playTimeMinutes`, and `complexityRating`.</w:t>
-      </w:r>
-    </w:p>
-    <w:p>
-      <w:pPr>
-        <w:pStyle w:val="Heading2"/>
-      </w:pPr>
-      <w:r>
-        <w:rPr>
-          <w:rFonts w:ascii="Arial" w:hAnsi="Arial"/>
-          <w:b/>
-          <w:color w:val="D4AF37"/>
-          <w:sz w:val="32"/>
-        </w:rPr>
-        <w:t>`lib/card_game.dart`</w:t>
-      </w:r>
-    </w:p>
-    <w:p>
-      <w:r>
-        <w:rPr>
-          <w:rFonts w:ascii="Arial" w:hAnsi="Arial"/>
-          <w:b w:val="0"/>
-          <w:color w:val="282828"/>
-          <w:sz w:val="22"/>
-        </w:rPr>
-        <w:t>Subclass for card games. Adds `deckSize` and `avgPlayTimeMinutes`.</w:t>
-      </w:r>
-    </w:p>
-    <w:p>
-      <w:pPr>
-        <w:pStyle w:val="Heading2"/>
-      </w:pPr>
-      <w:r>
-        <w:rPr>
-          <w:rFonts w:ascii="Arial" w:hAnsi="Arial"/>
-          <w:b/>
-          <w:color w:val="D4AF37"/>
-          <w:sz w:val="32"/>
-        </w:rPr>
-        <w:t>`lib/rpg_manual.dart`</w:t>
-      </w:r>
-    </w:p>
-    <w:p>
-      <w:r>
-        <w:rPr>
-          <w:rFonts w:ascii="Arial" w:hAnsi="Arial"/>
-          <w:b w:val="0"/>
-          <w:color w:val="282828"/>
-          <w:sz w:val="22"/>
-        </w:rPr>
-        <w:t>Subclass for RPG manuals. Adds `edition` and `pageCount`.</w:t>
-      </w:r>
-    </w:p>
-    <w:p>
-      <w:pPr>
-        <w:pStyle w:val="Heading2"/>
-      </w:pPr>
-      <w:r>
-        <w:rPr>
-          <w:rFonts w:ascii="Arial" w:hAnsi="Arial"/>
-          <w:b/>
-          <w:color w:val="D4AF37"/>
-          <w:sz w:val="32"/>
-        </w:rPr>
-        <w:t>`lib/member.dart`</w:t>
-      </w:r>
-    </w:p>
-    <w:p>
-      <w:r>
-        <w:rPr>
-          <w:rFonts w:ascii="Arial" w:hAnsi="Arial"/>
-          <w:b w:val="0"/>
-          <w:color w:val="282828"/>
-          <w:sz w:val="22"/>
-        </w:rPr>
-        <w:t>Represents a library member. Tracks `memberId`, `name`, and a `List&lt;Game&gt;` of borrowed items.</w:t>
-      </w:r>
-    </w:p>
-    <w:p>
-      <w:pPr>
-        <w:pStyle w:val="Heading2"/>
-      </w:pPr>
-      <w:r>
-        <w:rPr>
-          <w:rFonts w:ascii="Arial" w:hAnsi="Arial"/>
-          <w:b/>
-          <w:color w:val="D4AF37"/>
-          <w:sz w:val="32"/>
-        </w:rPr>
-        <w:t>`lib/game_library.dart`</w:t>
-      </w:r>
-    </w:p>
-    <w:p>
-      <w:r>
-        <w:rPr>
-          <w:rFonts w:ascii="Arial" w:hAnsi="Arial"/>
-          <w:b w:val="0"/>
-          <w:color w:val="282828"/>
-          <w:sz w:val="22"/>
-        </w:rPr>
-        <w:t>Central controller. Manages catalog and members, handles borrow/return logic, and recommends board games by player count using a `while` loop.</w:t>
-      </w:r>
-    </w:p>
-    <w:p>
-      <w:pPr>
-        <w:pStyle w:val="Heading2"/>
-      </w:pPr>
-      <w:r>
-        <w:rPr>
-          <w:rFonts w:ascii="Arial" w:hAnsi="Arial"/>
-          <w:b/>
-          <w:color w:val="D4AF37"/>
-          <w:sz w:val="32"/>
-        </w:rPr>
-        <w:t>`lib/late_fee_calculator.dart`</w:t>
-      </w:r>
-    </w:p>
-    <w:p>
-      <w:r>
-        <w:rPr>
-          <w:rFonts w:ascii="Arial" w:hAnsi="Arial"/>
-          <w:b w:val="0"/>
-          <w:color w:val="282828"/>
-          <w:sz w:val="22"/>
-        </w:rPr>
-        <w:t>Pure utility function with named parameters and a default rate. Applies multipliers based on game type.</w:t>
-      </w:r>
-    </w:p>
-    <w:p>
-      <w:pPr>
-        <w:pStyle w:val="Heading2"/>
-      </w:pPr>
-      <w:r>
-        <w:rPr>
-          <w:rFonts w:ascii="Arial" w:hAnsi="Arial"/>
-          <w:b/>
-          <w:color w:val="D4AF37"/>
-          <w:sz w:val="32"/>
-        </w:rPr>
-        <w:t>`lib/main.dart`</w:t>
-      </w:r>
-    </w:p>
-    <w:p>
-      <w:r>
-        <w:rPr>
-          <w:rFonts w:ascii="Arial" w:hAnsi="Arial"/>
-          <w:b w:val="0"/>
-          <w:color w:val="282828"/>
-          <w:sz w:val="22"/>
-        </w:rPr>
-        <w:t>Driver script. Creates sample data, runs catalog listing, borrows, recommends, returns, and prints late fees.</w:t>
-      </w:r>
-    </w:p>
-    <w:p>
-      <w:pPr>
-        <w:pStyle w:val="Heading1"/>
-      </w:pPr>
-      <w:r>
-        <w:rPr>
-          <w:rFonts w:ascii="Arial" w:hAnsi="Arial"/>
-          <w:b/>
-          <w:color w:val="D4AF37"/>
-          <w:sz w:val="40"/>
-        </w:rPr>
-        <w:t>7. Edge Cases Handled</w:t>
+        <w:t>4. Dart Concepts in Action</w:t>
       </w:r>
     </w:p>
     <w:tbl>
@@ -1748,7 +691,7 @@
                 <w:color w:val="FFFFFF"/>
                 <w:sz w:val="22"/>
               </w:rPr>
-              <w:t>Scenario</w:t>
+              <w:t>Requirement</w:t>
             </w:r>
           </w:p>
         </w:tc>
@@ -1772,7 +715,7 @@
                 <w:color w:val="FFFFFF"/>
                 <w:sz w:val="22"/>
               </w:rPr>
-              <w:t>Handling</w:t>
+              <w:t>Where It Lives</w:t>
             </w:r>
           </w:p>
         </w:tc>
@@ -1798,7 +741,7 @@
                 <w:color w:val="282828"/>
                 <w:sz w:val="22"/>
               </w:rPr>
-              <w:t>Member not found</w:t>
+              <w:t>Variables (`String`, `int`, `double`, `bool`)</w:t>
             </w:r>
           </w:p>
         </w:tc>
@@ -1822,7 +765,7 @@
                 <w:color w:val="282828"/>
                 <w:sz w:val="22"/>
               </w:rPr>
-              <w:t>`Map` lookup returns `null`; prints error and returns `false`</w:t>
+              <w:t>`Game` fields, `BoardGame.playerCountMin`, `RPGManual.pageCount`</w:t>
             </w:r>
           </w:p>
         </w:tc>
@@ -1848,7 +791,7 @@
                 <w:color w:val="282828"/>
                 <w:sz w:val="22"/>
               </w:rPr>
-              <w:t>Game not found</w:t>
+              <w:t>Collections (`List`, `Map`)</w:t>
             </w:r>
           </w:p>
         </w:tc>
@@ -1872,7 +815,7 @@
                 <w:color w:val="282828"/>
                 <w:sz w:val="22"/>
               </w:rPr>
-              <w:t>Search returns `null`; prints error and returns `false`</w:t>
+              <w:t>`GameLibrary.catalog`, `Member.borrowedGames`, `GameLibrary.members`</w:t>
             </w:r>
           </w:p>
         </w:tc>
@@ -1898,7 +841,7 @@
                 <w:color w:val="282828"/>
                 <w:sz w:val="22"/>
               </w:rPr>
-              <w:t>Game already borrowed</w:t>
+              <w:t>Named parameters &amp; defaults</w:t>
             </w:r>
           </w:p>
         </w:tc>
@@ -1922,7 +865,7 @@
                 <w:color w:val="282828"/>
                 <w:sz w:val="22"/>
               </w:rPr>
-              <w:t>Checks `isAvailable` before lending</w:t>
+              <w:t>`calculateLateFee({required int overdueDays, double dailyRate = 1.5})`</w:t>
             </w:r>
           </w:p>
         </w:tc>
@@ -1948,7 +891,7 @@
                 <w:color w:val="282828"/>
                 <w:sz w:val="22"/>
               </w:rPr>
-              <w:t>Returning a game not borrowed</w:t>
+              <w:t>Typed return values</w:t>
             </w:r>
           </w:p>
         </w:tc>
@@ -1972,7 +915,7 @@
                 <w:color w:val="282828"/>
                 <w:sz w:val="22"/>
               </w:rPr>
-              <w:t>Validates `borrowedGames.contains(game)`</w:t>
+              <w:t>`borrowGame()` returns `bool`, `findGameById()` returns `Game?`</w:t>
             </w:r>
           </w:p>
         </w:tc>
@@ -1998,7 +941,7 @@
                 <w:color w:val="282828"/>
                 <w:sz w:val="22"/>
               </w:rPr>
-              <w:t>Zero/negative overdue days</w:t>
+              <w:t>`for` loop</w:t>
             </w:r>
           </w:p>
         </w:tc>
@@ -2022,7 +965,7 @@
                 <w:color w:val="282828"/>
                 <w:sz w:val="22"/>
               </w:rPr>
-              <w:t>`calculateLateFee` returns `0.0`</w:t>
+              <w:t>Indexed catalog listing in `GameLibrary.listCatalog()`</w:t>
             </w:r>
           </w:p>
         </w:tc>
@@ -2048,7 +991,7 @@
                 <w:color w:val="282828"/>
                 <w:sz w:val="22"/>
               </w:rPr>
-              <w:t>No recommendations found</w:t>
+              <w:t>`while` loop</w:t>
             </w:r>
           </w:p>
         </w:tc>
@@ -2072,7 +1015,257 @@
                 <w:color w:val="282828"/>
                 <w:sz w:val="22"/>
               </w:rPr>
-              <w:t>Prints a clear "No available board games found" message</w:t>
+              <w:t>Player-count recommendation search in `recommendForPlayers()`</w:t>
+            </w:r>
+          </w:p>
+        </w:tc>
+      </w:tr>
+      <w:tr>
+        <w:tc>
+          <w:tcPr>
+            <w:tcW w:type="dxa" w:w="4536"/>
+            <w:shd w:fill="fff5dc"/>
+            <w:tcBorders>
+              <w:top w:val="single" w:sz="4" w:color="d4af37"/>
+              <w:left w:val="single" w:sz="4" w:color="d4af37"/>
+              <w:bottom w:val="single" w:sz="4" w:color="d4af37"/>
+              <w:right w:val="single" w:sz="4" w:color="d4af37"/>
+            </w:tcBorders>
+          </w:tcPr>
+          <w:p>
+            <w:r/>
+            <w:r>
+              <w:rPr>
+                <w:rFonts w:ascii="Arial" w:hAnsi="Arial"/>
+                <w:b w:val="0"/>
+                <w:color w:val="282828"/>
+                <w:sz w:val="22"/>
+              </w:rPr>
+              <w:t>`for-in` loop</w:t>
+            </w:r>
+          </w:p>
+        </w:tc>
+        <w:tc>
+          <w:tcPr>
+            <w:tcW w:type="dxa" w:w="4536"/>
+            <w:shd w:fill="fff5dc"/>
+            <w:tcBorders>
+              <w:top w:val="single" w:sz="4" w:color="d4af37"/>
+              <w:left w:val="single" w:sz="4" w:color="d4af37"/>
+              <w:bottom w:val="single" w:sz="4" w:color="d4af37"/>
+              <w:right w:val="single" w:sz="4" w:color="d4af37"/>
+            </w:tcBorders>
+          </w:tcPr>
+          <w:p>
+            <w:r/>
+            <w:r>
+              <w:rPr>
+                <w:rFonts w:ascii="Arial" w:hAnsi="Arial"/>
+                <w:b w:val="0"/>
+                <w:color w:val="282828"/>
+                <w:sz w:val="22"/>
+              </w:rPr>
+              <w:t>Iterating member borrows in `Member.showBorrowedGames()`</w:t>
+            </w:r>
+          </w:p>
+        </w:tc>
+      </w:tr>
+      <w:tr>
+        <w:tc>
+          <w:tcPr>
+            <w:tcW w:type="dxa" w:w="4536"/>
+            <w:shd w:fill="fff5dc"/>
+            <w:tcBorders>
+              <w:top w:val="single" w:sz="4" w:color="d4af37"/>
+              <w:left w:val="single" w:sz="4" w:color="d4af37"/>
+              <w:bottom w:val="single" w:sz="4" w:color="d4af37"/>
+              <w:right w:val="single" w:sz="4" w:color="d4af37"/>
+            </w:tcBorders>
+          </w:tcPr>
+          <w:p>
+            <w:r/>
+            <w:r>
+              <w:rPr>
+                <w:rFonts w:ascii="Arial" w:hAnsi="Arial"/>
+                <w:b w:val="0"/>
+                <w:color w:val="282828"/>
+                <w:sz w:val="22"/>
+              </w:rPr>
+              <w:t>Abstract class</w:t>
+            </w:r>
+          </w:p>
+        </w:tc>
+        <w:tc>
+          <w:tcPr>
+            <w:tcW w:type="dxa" w:w="4536"/>
+            <w:shd w:fill="fff5dc"/>
+            <w:tcBorders>
+              <w:top w:val="single" w:sz="4" w:color="d4af37"/>
+              <w:left w:val="single" w:sz="4" w:color="d4af37"/>
+              <w:bottom w:val="single" w:sz="4" w:color="d4af37"/>
+              <w:right w:val="single" w:sz="4" w:color="d4af37"/>
+            </w:tcBorders>
+          </w:tcPr>
+          <w:p>
+            <w:r/>
+            <w:r>
+              <w:rPr>
+                <w:rFonts w:ascii="Arial" w:hAnsi="Arial"/>
+                <w:b w:val="0"/>
+                <w:color w:val="282828"/>
+                <w:sz w:val="22"/>
+              </w:rPr>
+              <w:t>`Game` with abstract `describe()`</w:t>
+            </w:r>
+          </w:p>
+        </w:tc>
+      </w:tr>
+      <w:tr>
+        <w:tc>
+          <w:tcPr>
+            <w:tcW w:type="dxa" w:w="4536"/>
+            <w:shd w:fill="fff5dc"/>
+            <w:tcBorders>
+              <w:top w:val="single" w:sz="4" w:color="d4af37"/>
+              <w:left w:val="single" w:sz="4" w:color="d4af37"/>
+              <w:bottom w:val="single" w:sz="4" w:color="d4af37"/>
+              <w:right w:val="single" w:sz="4" w:color="d4af37"/>
+            </w:tcBorders>
+          </w:tcPr>
+          <w:p>
+            <w:r/>
+            <w:r>
+              <w:rPr>
+                <w:rFonts w:ascii="Arial" w:hAnsi="Arial"/>
+                <w:b w:val="0"/>
+                <w:color w:val="282828"/>
+                <w:sz w:val="22"/>
+              </w:rPr>
+              <w:t>Inheritance</w:t>
+            </w:r>
+          </w:p>
+        </w:tc>
+        <w:tc>
+          <w:tcPr>
+            <w:tcW w:type="dxa" w:w="4536"/>
+            <w:shd w:fill="fff5dc"/>
+            <w:tcBorders>
+              <w:top w:val="single" w:sz="4" w:color="d4af37"/>
+              <w:left w:val="single" w:sz="4" w:color="d4af37"/>
+              <w:bottom w:val="single" w:sz="4" w:color="d4af37"/>
+              <w:right w:val="single" w:sz="4" w:color="d4af37"/>
+            </w:tcBorders>
+          </w:tcPr>
+          <w:p>
+            <w:r/>
+            <w:r>
+              <w:rPr>
+                <w:rFonts w:ascii="Arial" w:hAnsi="Arial"/>
+                <w:b w:val="0"/>
+                <w:color w:val="282828"/>
+                <w:sz w:val="22"/>
+              </w:rPr>
+              <w:t>`BoardGame`, `CardGame`, `RPGManual` extend `Game`</w:t>
+            </w:r>
+          </w:p>
+        </w:tc>
+      </w:tr>
+      <w:tr>
+        <w:tc>
+          <w:tcPr>
+            <w:tcW w:type="dxa" w:w="4536"/>
+            <w:shd w:fill="fff5dc"/>
+            <w:tcBorders>
+              <w:top w:val="single" w:sz="4" w:color="d4af37"/>
+              <w:left w:val="single" w:sz="4" w:color="d4af37"/>
+              <w:bottom w:val="single" w:sz="4" w:color="d4af37"/>
+              <w:right w:val="single" w:sz="4" w:color="d4af37"/>
+            </w:tcBorders>
+          </w:tcPr>
+          <w:p>
+            <w:r/>
+            <w:r>
+              <w:rPr>
+                <w:rFonts w:ascii="Arial" w:hAnsi="Arial"/>
+                <w:b w:val="0"/>
+                <w:color w:val="282828"/>
+                <w:sz w:val="22"/>
+              </w:rPr>
+              <w:t>Polymorphism</w:t>
+            </w:r>
+          </w:p>
+        </w:tc>
+        <w:tc>
+          <w:tcPr>
+            <w:tcW w:type="dxa" w:w="4536"/>
+            <w:shd w:fill="fff5dc"/>
+            <w:tcBorders>
+              <w:top w:val="single" w:sz="4" w:color="d4af37"/>
+              <w:left w:val="single" w:sz="4" w:color="d4af37"/>
+              <w:bottom w:val="single" w:sz="4" w:color="d4af37"/>
+              <w:right w:val="single" w:sz="4" w:color="d4af37"/>
+            </w:tcBorders>
+          </w:tcPr>
+          <w:p>
+            <w:r/>
+            <w:r>
+              <w:rPr>
+                <w:rFonts w:ascii="Arial" w:hAnsi="Arial"/>
+                <w:b w:val="0"/>
+                <w:color w:val="282828"/>
+                <w:sz w:val="22"/>
+              </w:rPr>
+              <w:t>Each subclass `@override` of `describe()`</w:t>
+            </w:r>
+          </w:p>
+        </w:tc>
+      </w:tr>
+      <w:tr>
+        <w:tc>
+          <w:tcPr>
+            <w:tcW w:type="dxa" w:w="4536"/>
+            <w:shd w:fill="fff5dc"/>
+            <w:tcBorders>
+              <w:top w:val="single" w:sz="4" w:color="d4af37"/>
+              <w:left w:val="single" w:sz="4" w:color="d4af37"/>
+              <w:bottom w:val="single" w:sz="4" w:color="d4af37"/>
+              <w:right w:val="single" w:sz="4" w:color="d4af37"/>
+            </w:tcBorders>
+          </w:tcPr>
+          <w:p>
+            <w:r/>
+            <w:r>
+              <w:rPr>
+                <w:rFonts w:ascii="Arial" w:hAnsi="Arial"/>
+                <w:b w:val="0"/>
+                <w:color w:val="282828"/>
+                <w:sz w:val="22"/>
+              </w:rPr>
+              <w:t>Encapsulation</w:t>
+            </w:r>
+          </w:p>
+        </w:tc>
+        <w:tc>
+          <w:tcPr>
+            <w:tcW w:type="dxa" w:w="4536"/>
+            <w:shd w:fill="fff5dc"/>
+            <w:tcBorders>
+              <w:top w:val="single" w:sz="4" w:color="d4af37"/>
+              <w:left w:val="single" w:sz="4" w:color="d4af37"/>
+              <w:bottom w:val="single" w:sz="4" w:color="d4af37"/>
+              <w:right w:val="single" w:sz="4" w:color="d4af37"/>
+            </w:tcBorders>
+          </w:tcPr>
+          <w:p>
+            <w:r/>
+            <w:r>
+              <w:rPr>
+                <w:rFonts w:ascii="Arial" w:hAnsi="Arial"/>
+                <w:b w:val="0"/>
+                <w:color w:val="282828"/>
+                <w:sz w:val="22"/>
+              </w:rPr>
+              <w:t>Borrow/return logic controlled by `GameLibrary`</w:t>
             </w:r>
           </w:p>
         </w:tc>
@@ -2089,7 +1282,483 @@
           <w:color w:val="D4AF37"/>
           <w:sz w:val="40"/>
         </w:rPr>
-        <w:t>8. Step-by-Step Execution Trace</w:t>
+        <w:t>5. File Guide</w:t>
+      </w:r>
+    </w:p>
+    <w:tbl>
+      <w:tblPr>
+        <w:tblStyle w:val="TableGrid"/>
+        <w:tblW w:type="auto" w:w="0"/>
+        <w:jc w:val="center"/>
+        <w:tblLook w:firstColumn="1" w:firstRow="1" w:lastColumn="0" w:lastRow="0" w:noHBand="0" w:noVBand="1" w:val="04A0"/>
+      </w:tblPr>
+      <w:tblGrid>
+        <w:gridCol w:w="4536"/>
+        <w:gridCol w:w="4536"/>
+      </w:tblGrid>
+      <w:tr>
+        <w:tc>
+          <w:tcPr>
+            <w:tcW w:type="dxa" w:w="4536"/>
+            <w:shd w:fill="d4af37"/>
+            <w:tcBorders>
+              <w:top w:val="single" w:sz="6" w:color="d4af37"/>
+              <w:left w:val="single" w:sz="6" w:color="d4af37"/>
+              <w:bottom w:val="single" w:sz="6" w:color="d4af37"/>
+              <w:right w:val="single" w:sz="6" w:color="d4af37"/>
+            </w:tcBorders>
+          </w:tcPr>
+          <w:p>
+            <w:r/>
+            <w:r>
+              <w:rPr>
+                <w:rFonts w:ascii="Arial" w:hAnsi="Arial"/>
+                <w:b/>
+                <w:color w:val="FFFFFF"/>
+                <w:sz w:val="22"/>
+              </w:rPr>
+              <w:t>File</w:t>
+            </w:r>
+          </w:p>
+        </w:tc>
+        <w:tc>
+          <w:tcPr>
+            <w:tcW w:type="dxa" w:w="4536"/>
+            <w:shd w:fill="d4af37"/>
+            <w:tcBorders>
+              <w:top w:val="single" w:sz="6" w:color="d4af37"/>
+              <w:left w:val="single" w:sz="6" w:color="d4af37"/>
+              <w:bottom w:val="single" w:sz="6" w:color="d4af37"/>
+              <w:right w:val="single" w:sz="6" w:color="d4af37"/>
+            </w:tcBorders>
+          </w:tcPr>
+          <w:p>
+            <w:r/>
+            <w:r>
+              <w:rPr>
+                <w:rFonts w:ascii="Arial" w:hAnsi="Arial"/>
+                <w:b/>
+                <w:color w:val="FFFFFF"/>
+                <w:sz w:val="22"/>
+              </w:rPr>
+              <w:t>Responsibility</w:t>
+            </w:r>
+          </w:p>
+        </w:tc>
+      </w:tr>
+      <w:tr>
+        <w:tc>
+          <w:tcPr>
+            <w:tcW w:type="dxa" w:w="4536"/>
+            <w:shd w:fill="fff5dc"/>
+            <w:tcBorders>
+              <w:top w:val="single" w:sz="4" w:color="d4af37"/>
+              <w:left w:val="single" w:sz="4" w:color="d4af37"/>
+              <w:bottom w:val="single" w:sz="4" w:color="d4af37"/>
+              <w:right w:val="single" w:sz="4" w:color="d4af37"/>
+            </w:tcBorders>
+          </w:tcPr>
+          <w:p>
+            <w:r/>
+            <w:r>
+              <w:rPr>
+                <w:rFonts w:ascii="Arial" w:hAnsi="Arial"/>
+                <w:b w:val="0"/>
+                <w:color w:val="282828"/>
+                <w:sz w:val="22"/>
+              </w:rPr>
+              <w:t>`lib/game.dart`</w:t>
+            </w:r>
+          </w:p>
+        </w:tc>
+        <w:tc>
+          <w:tcPr>
+            <w:tcW w:type="dxa" w:w="4536"/>
+            <w:shd w:fill="fff5dc"/>
+            <w:tcBorders>
+              <w:top w:val="single" w:sz="4" w:color="d4af37"/>
+              <w:left w:val="single" w:sz="4" w:color="d4af37"/>
+              <w:bottom w:val="single" w:sz="4" w:color="d4af37"/>
+              <w:right w:val="single" w:sz="4" w:color="d4af37"/>
+            </w:tcBorders>
+          </w:tcPr>
+          <w:p>
+            <w:r/>
+            <w:r>
+              <w:rPr>
+                <w:rFonts w:ascii="Arial" w:hAnsi="Arial"/>
+                <w:b w:val="0"/>
+                <w:color w:val="282828"/>
+                <w:sz w:val="22"/>
+              </w:rPr>
+              <w:t>Abstract `Game` base class</w:t>
+            </w:r>
+          </w:p>
+        </w:tc>
+      </w:tr>
+      <w:tr>
+        <w:tc>
+          <w:tcPr>
+            <w:tcW w:type="dxa" w:w="4536"/>
+            <w:shd w:fill="fff5dc"/>
+            <w:tcBorders>
+              <w:top w:val="single" w:sz="4" w:color="d4af37"/>
+              <w:left w:val="single" w:sz="4" w:color="d4af37"/>
+              <w:bottom w:val="single" w:sz="4" w:color="d4af37"/>
+              <w:right w:val="single" w:sz="4" w:color="d4af37"/>
+            </w:tcBorders>
+          </w:tcPr>
+          <w:p>
+            <w:r/>
+            <w:r>
+              <w:rPr>
+                <w:rFonts w:ascii="Arial" w:hAnsi="Arial"/>
+                <w:b w:val="0"/>
+                <w:color w:val="282828"/>
+                <w:sz w:val="22"/>
+              </w:rPr>
+              <w:t>`lib/board_game.dart`</w:t>
+            </w:r>
+          </w:p>
+        </w:tc>
+        <w:tc>
+          <w:tcPr>
+            <w:tcW w:type="dxa" w:w="4536"/>
+            <w:shd w:fill="fff5dc"/>
+            <w:tcBorders>
+              <w:top w:val="single" w:sz="4" w:color="d4af37"/>
+              <w:left w:val="single" w:sz="4" w:color="d4af37"/>
+              <w:bottom w:val="single" w:sz="4" w:color="d4af37"/>
+              <w:right w:val="single" w:sz="4" w:color="d4af37"/>
+            </w:tcBorders>
+          </w:tcPr>
+          <w:p>
+            <w:r/>
+            <w:r>
+              <w:rPr>
+                <w:rFonts w:ascii="Arial" w:hAnsi="Arial"/>
+                <w:b w:val="0"/>
+                <w:color w:val="282828"/>
+                <w:sz w:val="22"/>
+              </w:rPr>
+              <w:t>Board-game subclass with player counts and complexity</w:t>
+            </w:r>
+          </w:p>
+        </w:tc>
+      </w:tr>
+      <w:tr>
+        <w:tc>
+          <w:tcPr>
+            <w:tcW w:type="dxa" w:w="4536"/>
+            <w:shd w:fill="fff5dc"/>
+            <w:tcBorders>
+              <w:top w:val="single" w:sz="4" w:color="d4af37"/>
+              <w:left w:val="single" w:sz="4" w:color="d4af37"/>
+              <w:bottom w:val="single" w:sz="4" w:color="d4af37"/>
+              <w:right w:val="single" w:sz="4" w:color="d4af37"/>
+            </w:tcBorders>
+          </w:tcPr>
+          <w:p>
+            <w:r/>
+            <w:r>
+              <w:rPr>
+                <w:rFonts w:ascii="Arial" w:hAnsi="Arial"/>
+                <w:b w:val="0"/>
+                <w:color w:val="282828"/>
+                <w:sz w:val="22"/>
+              </w:rPr>
+              <w:t>`lib/card_game.dart`</w:t>
+            </w:r>
+          </w:p>
+        </w:tc>
+        <w:tc>
+          <w:tcPr>
+            <w:tcW w:type="dxa" w:w="4536"/>
+            <w:shd w:fill="fff5dc"/>
+            <w:tcBorders>
+              <w:top w:val="single" w:sz="4" w:color="d4af37"/>
+              <w:left w:val="single" w:sz="4" w:color="d4af37"/>
+              <w:bottom w:val="single" w:sz="4" w:color="d4af37"/>
+              <w:right w:val="single" w:sz="4" w:color="d4af37"/>
+            </w:tcBorders>
+          </w:tcPr>
+          <w:p>
+            <w:r/>
+            <w:r>
+              <w:rPr>
+                <w:rFonts w:ascii="Arial" w:hAnsi="Arial"/>
+                <w:b w:val="0"/>
+                <w:color w:val="282828"/>
+                <w:sz w:val="22"/>
+              </w:rPr>
+              <w:t>Card-game subclass with deck size</w:t>
+            </w:r>
+          </w:p>
+        </w:tc>
+      </w:tr>
+      <w:tr>
+        <w:tc>
+          <w:tcPr>
+            <w:tcW w:type="dxa" w:w="4536"/>
+            <w:shd w:fill="fff5dc"/>
+            <w:tcBorders>
+              <w:top w:val="single" w:sz="4" w:color="d4af37"/>
+              <w:left w:val="single" w:sz="4" w:color="d4af37"/>
+              <w:bottom w:val="single" w:sz="4" w:color="d4af37"/>
+              <w:right w:val="single" w:sz="4" w:color="d4af37"/>
+            </w:tcBorders>
+          </w:tcPr>
+          <w:p>
+            <w:r/>
+            <w:r>
+              <w:rPr>
+                <w:rFonts w:ascii="Arial" w:hAnsi="Arial"/>
+                <w:b w:val="0"/>
+                <w:color w:val="282828"/>
+                <w:sz w:val="22"/>
+              </w:rPr>
+              <w:t>`lib/rpg_manual.dart`</w:t>
+            </w:r>
+          </w:p>
+        </w:tc>
+        <w:tc>
+          <w:tcPr>
+            <w:tcW w:type="dxa" w:w="4536"/>
+            <w:shd w:fill="fff5dc"/>
+            <w:tcBorders>
+              <w:top w:val="single" w:sz="4" w:color="d4af37"/>
+              <w:left w:val="single" w:sz="4" w:color="d4af37"/>
+              <w:bottom w:val="single" w:sz="4" w:color="d4af37"/>
+              <w:right w:val="single" w:sz="4" w:color="d4af37"/>
+            </w:tcBorders>
+          </w:tcPr>
+          <w:p>
+            <w:r/>
+            <w:r>
+              <w:rPr>
+                <w:rFonts w:ascii="Arial" w:hAnsi="Arial"/>
+                <w:b w:val="0"/>
+                <w:color w:val="282828"/>
+                <w:sz w:val="22"/>
+              </w:rPr>
+              <w:t>RPG manual subclass with edition and page count</w:t>
+            </w:r>
+          </w:p>
+        </w:tc>
+      </w:tr>
+      <w:tr>
+        <w:tc>
+          <w:tcPr>
+            <w:tcW w:type="dxa" w:w="4536"/>
+            <w:shd w:fill="fff5dc"/>
+            <w:tcBorders>
+              <w:top w:val="single" w:sz="4" w:color="d4af37"/>
+              <w:left w:val="single" w:sz="4" w:color="d4af37"/>
+              <w:bottom w:val="single" w:sz="4" w:color="d4af37"/>
+              <w:right w:val="single" w:sz="4" w:color="d4af37"/>
+            </w:tcBorders>
+          </w:tcPr>
+          <w:p>
+            <w:r/>
+            <w:r>
+              <w:rPr>
+                <w:rFonts w:ascii="Arial" w:hAnsi="Arial"/>
+                <w:b w:val="0"/>
+                <w:color w:val="282828"/>
+                <w:sz w:val="22"/>
+              </w:rPr>
+              <w:t>`lib/member.dart`</w:t>
+            </w:r>
+          </w:p>
+        </w:tc>
+        <w:tc>
+          <w:tcPr>
+            <w:tcW w:type="dxa" w:w="4536"/>
+            <w:shd w:fill="fff5dc"/>
+            <w:tcBorders>
+              <w:top w:val="single" w:sz="4" w:color="d4af37"/>
+              <w:left w:val="single" w:sz="4" w:color="d4af37"/>
+              <w:bottom w:val="single" w:sz="4" w:color="d4af37"/>
+              <w:right w:val="single" w:sz="4" w:color="d4af37"/>
+            </w:tcBorders>
+          </w:tcPr>
+          <w:p>
+            <w:r/>
+            <w:r>
+              <w:rPr>
+                <w:rFonts w:ascii="Arial" w:hAnsi="Arial"/>
+                <w:b w:val="0"/>
+                <w:color w:val="282828"/>
+                <w:sz w:val="22"/>
+              </w:rPr>
+              <w:t>Member record and active borrow list</w:t>
+            </w:r>
+          </w:p>
+        </w:tc>
+      </w:tr>
+      <w:tr>
+        <w:tc>
+          <w:tcPr>
+            <w:tcW w:type="dxa" w:w="4536"/>
+            <w:shd w:fill="fff5dc"/>
+            <w:tcBorders>
+              <w:top w:val="single" w:sz="4" w:color="d4af37"/>
+              <w:left w:val="single" w:sz="4" w:color="d4af37"/>
+              <w:bottom w:val="single" w:sz="4" w:color="d4af37"/>
+              <w:right w:val="single" w:sz="4" w:color="d4af37"/>
+            </w:tcBorders>
+          </w:tcPr>
+          <w:p>
+            <w:r/>
+            <w:r>
+              <w:rPr>
+                <w:rFonts w:ascii="Arial" w:hAnsi="Arial"/>
+                <w:b w:val="0"/>
+                <w:color w:val="282828"/>
+                <w:sz w:val="22"/>
+              </w:rPr>
+              <w:t>`lib/game_library.dart`</w:t>
+            </w:r>
+          </w:p>
+        </w:tc>
+        <w:tc>
+          <w:tcPr>
+            <w:tcW w:type="dxa" w:w="4536"/>
+            <w:shd w:fill="fff5dc"/>
+            <w:tcBorders>
+              <w:top w:val="single" w:sz="4" w:color="d4af37"/>
+              <w:left w:val="single" w:sz="4" w:color="d4af37"/>
+              <w:bottom w:val="single" w:sz="4" w:color="d4af37"/>
+              <w:right w:val="single" w:sz="4" w:color="d4af37"/>
+            </w:tcBorders>
+          </w:tcPr>
+          <w:p>
+            <w:r/>
+            <w:r>
+              <w:rPr>
+                <w:rFonts w:ascii="Arial" w:hAnsi="Arial"/>
+                <w:b w:val="0"/>
+                <w:color w:val="282828"/>
+                <w:sz w:val="22"/>
+              </w:rPr>
+              <w:t>Central controller for catalog and transactions</w:t>
+            </w:r>
+          </w:p>
+        </w:tc>
+      </w:tr>
+      <w:tr>
+        <w:tc>
+          <w:tcPr>
+            <w:tcW w:type="dxa" w:w="4536"/>
+            <w:shd w:fill="fff5dc"/>
+            <w:tcBorders>
+              <w:top w:val="single" w:sz="4" w:color="d4af37"/>
+              <w:left w:val="single" w:sz="4" w:color="d4af37"/>
+              <w:bottom w:val="single" w:sz="4" w:color="d4af37"/>
+              <w:right w:val="single" w:sz="4" w:color="d4af37"/>
+            </w:tcBorders>
+          </w:tcPr>
+          <w:p>
+            <w:r/>
+            <w:r>
+              <w:rPr>
+                <w:rFonts w:ascii="Arial" w:hAnsi="Arial"/>
+                <w:b w:val="0"/>
+                <w:color w:val="282828"/>
+                <w:sz w:val="22"/>
+              </w:rPr>
+              <w:t>`lib/late_fee_calculator.dart`</w:t>
+            </w:r>
+          </w:p>
+        </w:tc>
+        <w:tc>
+          <w:tcPr>
+            <w:tcW w:type="dxa" w:w="4536"/>
+            <w:shd w:fill="fff5dc"/>
+            <w:tcBorders>
+              <w:top w:val="single" w:sz="4" w:color="d4af37"/>
+              <w:left w:val="single" w:sz="4" w:color="d4af37"/>
+              <w:bottom w:val="single" w:sz="4" w:color="d4af37"/>
+              <w:right w:val="single" w:sz="4" w:color="d4af37"/>
+            </w:tcBorders>
+          </w:tcPr>
+          <w:p>
+            <w:r/>
+            <w:r>
+              <w:rPr>
+                <w:rFonts w:ascii="Arial" w:hAnsi="Arial"/>
+                <w:b w:val="0"/>
+                <w:color w:val="282828"/>
+                <w:sz w:val="22"/>
+              </w:rPr>
+              <w:t>Pure function for overdue fees</w:t>
+            </w:r>
+          </w:p>
+        </w:tc>
+      </w:tr>
+      <w:tr>
+        <w:tc>
+          <w:tcPr>
+            <w:tcW w:type="dxa" w:w="4536"/>
+            <w:shd w:fill="fff5dc"/>
+            <w:tcBorders>
+              <w:top w:val="single" w:sz="4" w:color="d4af37"/>
+              <w:left w:val="single" w:sz="4" w:color="d4af37"/>
+              <w:bottom w:val="single" w:sz="4" w:color="d4af37"/>
+              <w:right w:val="single" w:sz="4" w:color="d4af37"/>
+            </w:tcBorders>
+          </w:tcPr>
+          <w:p>
+            <w:r/>
+            <w:r>
+              <w:rPr>
+                <w:rFonts w:ascii="Arial" w:hAnsi="Arial"/>
+                <w:b w:val="0"/>
+                <w:color w:val="282828"/>
+                <w:sz w:val="22"/>
+              </w:rPr>
+              <w:t>`lib/main.dart`</w:t>
+            </w:r>
+          </w:p>
+        </w:tc>
+        <w:tc>
+          <w:tcPr>
+            <w:tcW w:type="dxa" w:w="4536"/>
+            <w:shd w:fill="fff5dc"/>
+            <w:tcBorders>
+              <w:top w:val="single" w:sz="4" w:color="d4af37"/>
+              <w:left w:val="single" w:sz="4" w:color="d4af37"/>
+              <w:bottom w:val="single" w:sz="4" w:color="d4af37"/>
+              <w:right w:val="single" w:sz="4" w:color="d4af37"/>
+            </w:tcBorders>
+          </w:tcPr>
+          <w:p>
+            <w:r/>
+            <w:r>
+              <w:rPr>
+                <w:rFonts w:ascii="Arial" w:hAnsi="Arial"/>
+                <w:b w:val="0"/>
+                <w:color w:val="282828"/>
+                <w:sz w:val="22"/>
+              </w:rPr>
+              <w:t>Demo script that runs the workflow</w:t>
+            </w:r>
+          </w:p>
+        </w:tc>
+      </w:tr>
+    </w:tbl>
+    <w:p>
+      <w:pPr>
+        <w:pStyle w:val="Heading1"/>
+      </w:pPr>
+      <w:r>
+        <w:rPr>
+          <w:rFonts w:ascii="Arial" w:hAnsi="Arial"/>
+          <w:b/>
+          <w:color w:val="D4AF37"/>
+          <w:sz w:val="40"/>
+        </w:rPr>
+        <w:t>6. Design Notes</w:t>
       </w:r>
     </w:p>
     <w:p>
@@ -2100,7 +1769,24 @@
           <w:color w:val="282828"/>
           <w:sz w:val="22"/>
         </w:rPr>
-        <w:t>1. `GameLibrary` is instantiated.</w:t>
+      </w:r>
+      <w:r>
+        <w:rPr>
+          <w:rFonts w:ascii="Arial" w:hAnsi="Arial"/>
+          <w:b/>
+          <w:color w:val="D4AF37"/>
+          <w:sz w:val="22"/>
+        </w:rPr>
+        <w:t>Why inheritance?</w:t>
+      </w:r>
+      <w:r>
+        <w:rPr>
+          <w:rFonts w:ascii="Arial" w:hAnsi="Arial"/>
+          <w:b w:val="0"/>
+          <w:color w:val="282828"/>
+          <w:sz w:val="22"/>
+        </w:rPr>
+        <w:t xml:space="preserve"> Board games, card games, and RPG manuals share common fields — title, publisher, year, genre, availability — but each has unique data. An abstract `Game` class lets the rest of the system treat every item uniformly while subclasses store their own details.</w:t>
       </w:r>
     </w:p>
     <w:p>
@@ -2111,7 +1797,24 @@
           <w:color w:val="282828"/>
           <w:sz w:val="22"/>
         </w:rPr>
-        <w:t>2. Four games are added to the catalog: two board games, one card game, one RPG manual.</w:t>
+      </w:r>
+      <w:r>
+        <w:rPr>
+          <w:rFonts w:ascii="Arial" w:hAnsi="Arial"/>
+          <w:b/>
+          <w:color w:val="D4AF37"/>
+          <w:sz w:val="22"/>
+        </w:rPr>
+        <w:t>Why a `while` loop for recommendations?</w:t>
+      </w:r>
+      <w:r>
+        <w:rPr>
+          <w:rFonts w:ascii="Arial" w:hAnsi="Arial"/>
+          <w:b w:val="0"/>
+          <w:color w:val="282828"/>
+          <w:sz w:val="22"/>
+        </w:rPr>
+        <w:t xml:space="preserve"> The assignment required multiple loop types. The recommendation search is a natural fit for `while` because it scans until the catalog ends and conditionally collects matches.</w:t>
       </w:r>
     </w:p>
     <w:p>
@@ -2122,7 +1825,6 @@
           <w:color w:val="282828"/>
           <w:sz w:val="22"/>
         </w:rPr>
-        <w:t xml:space="preserve">3. Two members are registered: </w:t>
       </w:r>
       <w:r>
         <w:rPr>
@@ -2131,7 +1833,7 @@
           <w:color w:val="D4AF37"/>
           <w:sz w:val="22"/>
         </w:rPr>
-        <w:t>Soumitra Deshpande</w:t>
+        <w:t>Why named parameters everywhere?</w:t>
       </w:r>
       <w:r>
         <w:rPr>
@@ -2140,163 +1842,7 @@
           <w:color w:val="282828"/>
           <w:sz w:val="22"/>
         </w:rPr>
-        <w:t xml:space="preserve"> and </w:t>
-      </w:r>
-      <w:r>
-        <w:rPr>
-          <w:rFonts w:ascii="Arial" w:hAnsi="Arial"/>
-          <w:b/>
-          <w:color w:val="D4AF37"/>
-          <w:sz w:val="22"/>
-        </w:rPr>
-        <w:t>Alex Chen</w:t>
-      </w:r>
-      <w:r>
-        <w:rPr>
-          <w:rFonts w:ascii="Arial" w:hAnsi="Arial"/>
-          <w:b w:val="0"/>
-          <w:color w:val="282828"/>
-          <w:sz w:val="22"/>
-        </w:rPr>
-        <w:t>.</w:t>
-      </w:r>
-    </w:p>
-    <w:p>
-      <w:r>
-        <w:rPr>
-          <w:rFonts w:ascii="Arial" w:hAnsi="Arial"/>
-          <w:b w:val="0"/>
-          <w:color w:val="282828"/>
-          <w:sz w:val="22"/>
-        </w:rPr>
-        <w:t>4. `listCatalog()` prints all games with an indexed `for` loop.</w:t>
-      </w:r>
-    </w:p>
-    <w:p>
-      <w:r>
-        <w:rPr>
-          <w:rFonts w:ascii="Arial" w:hAnsi="Arial"/>
-          <w:b w:val="0"/>
-          <w:color w:val="282828"/>
-          <w:sz w:val="22"/>
-        </w:rPr>
-        <w:t xml:space="preserve">5. Soumitra borrows </w:t>
-      </w:r>
-      <w:r>
-        <w:rPr>
-          <w:rFonts w:ascii="Arial" w:hAnsi="Arial"/>
-          <w:b/>
-          <w:color w:val="D4AF37"/>
-          <w:sz w:val="22"/>
-        </w:rPr>
-        <w:t>Wingspan</w:t>
-      </w:r>
-      <w:r>
-        <w:rPr>
-          <w:rFonts w:ascii="Arial" w:hAnsi="Arial"/>
-          <w:b w:val="0"/>
-          <w:color w:val="282828"/>
-          <w:sz w:val="22"/>
-        </w:rPr>
-        <w:t xml:space="preserve">; Alex borrows </w:t>
-      </w:r>
-      <w:r>
-        <w:rPr>
-          <w:rFonts w:ascii="Arial" w:hAnsi="Arial"/>
-          <w:b/>
-          <w:color w:val="D4AF37"/>
-          <w:sz w:val="22"/>
-        </w:rPr>
-        <w:t>Love Letter</w:t>
-      </w:r>
-      <w:r>
-        <w:rPr>
-          <w:rFonts w:ascii="Arial" w:hAnsi="Arial"/>
-          <w:b w:val="0"/>
-          <w:color w:val="282828"/>
-          <w:sz w:val="22"/>
-        </w:rPr>
-        <w:t>.</w:t>
-      </w:r>
-    </w:p>
-    <w:p>
-      <w:r>
-        <w:rPr>
-          <w:rFonts w:ascii="Arial" w:hAnsi="Arial"/>
-          <w:b w:val="0"/>
-          <w:color w:val="282828"/>
-          <w:sz w:val="22"/>
-        </w:rPr>
-        <w:t xml:space="preserve">6. `recommendForPlayers(3)` uses a `while` loop and finds </w:t>
-      </w:r>
-      <w:r>
-        <w:rPr>
-          <w:rFonts w:ascii="Arial" w:hAnsi="Arial"/>
-          <w:b/>
-          <w:color w:val="D4AF37"/>
-          <w:sz w:val="22"/>
-        </w:rPr>
-        <w:t>Catan</w:t>
-      </w:r>
-      <w:r>
-        <w:rPr>
-          <w:rFonts w:ascii="Arial" w:hAnsi="Arial"/>
-          <w:b w:val="0"/>
-          <w:color w:val="282828"/>
-          <w:sz w:val="22"/>
-        </w:rPr>
-        <w:t>.</w:t>
-      </w:r>
-    </w:p>
-    <w:p>
-      <w:r>
-        <w:rPr>
-          <w:rFonts w:ascii="Arial" w:hAnsi="Arial"/>
-          <w:b w:val="0"/>
-          <w:color w:val="282828"/>
-          <w:sz w:val="22"/>
-        </w:rPr>
-        <w:t xml:space="preserve">7. Soumitra returns </w:t>
-      </w:r>
-      <w:r>
-        <w:rPr>
-          <w:rFonts w:ascii="Arial" w:hAnsi="Arial"/>
-          <w:b/>
-          <w:color w:val="D4AF37"/>
-          <w:sz w:val="22"/>
-        </w:rPr>
-        <w:t>Wingspan</w:t>
-      </w:r>
-      <w:r>
-        <w:rPr>
-          <w:rFonts w:ascii="Arial" w:hAnsi="Arial"/>
-          <w:b w:val="0"/>
-          <w:color w:val="282828"/>
-          <w:sz w:val="22"/>
-        </w:rPr>
-        <w:t>.</w:t>
-      </w:r>
-    </w:p>
-    <w:p>
-      <w:r>
-        <w:rPr>
-          <w:rFonts w:ascii="Arial" w:hAnsi="Arial"/>
-          <w:b w:val="0"/>
-          <w:color w:val="282828"/>
-          <w:sz w:val="22"/>
-        </w:rPr>
-        <w:t>8. `for-in` loop prints each member's current borrow list.</w:t>
-      </w:r>
-    </w:p>
-    <w:p>
-      <w:r>
-        <w:rPr>
-          <w:rFonts w:ascii="Arial" w:hAnsi="Arial"/>
-          <w:b w:val="0"/>
-          <w:color w:val="282828"/>
-          <w:sz w:val="22"/>
-        </w:rPr>
-        <w:t>9. Late fees are calculated for card game and RPG manual.</w:t>
+        <w:t xml:space="preserve"> Dart's `{required ...}` syntax removes ambiguity. `borrowGame(memberId: 'M001', gameId: 'BG002')` is clearer than positional arguments.</w:t>
       </w:r>
     </w:p>
     <w:p>
@@ -2310,9 +1856,424 @@
           <w:color w:val="D4AF37"/>
           <w:sz w:val="40"/>
         </w:rPr>
-        <w:t>9. Console Verification</w:t>
+        <w:t>7. Edge Cases That Don't Break It</w:t>
       </w:r>
     </w:p>
+    <w:tbl>
+      <w:tblPr>
+        <w:tblStyle w:val="TableGrid"/>
+        <w:tblW w:type="auto" w:w="0"/>
+        <w:jc w:val="center"/>
+        <w:tblLook w:firstColumn="1" w:firstRow="1" w:lastColumn="0" w:lastRow="0" w:noHBand="0" w:noVBand="1" w:val="04A0"/>
+      </w:tblPr>
+      <w:tblGrid>
+        <w:gridCol w:w="4536"/>
+        <w:gridCol w:w="4536"/>
+      </w:tblGrid>
+      <w:tr>
+        <w:tc>
+          <w:tcPr>
+            <w:tcW w:type="dxa" w:w="4536"/>
+            <w:shd w:fill="d4af37"/>
+            <w:tcBorders>
+              <w:top w:val="single" w:sz="6" w:color="d4af37"/>
+              <w:left w:val="single" w:sz="6" w:color="d4af37"/>
+              <w:bottom w:val="single" w:sz="6" w:color="d4af37"/>
+              <w:right w:val="single" w:sz="6" w:color="d4af37"/>
+            </w:tcBorders>
+          </w:tcPr>
+          <w:p>
+            <w:r/>
+            <w:r>
+              <w:rPr>
+                <w:rFonts w:ascii="Arial" w:hAnsi="Arial"/>
+                <w:b/>
+                <w:color w:val="FFFFFF"/>
+                <w:sz w:val="22"/>
+              </w:rPr>
+              <w:t>Situation</w:t>
+            </w:r>
+          </w:p>
+        </w:tc>
+        <w:tc>
+          <w:tcPr>
+            <w:tcW w:type="dxa" w:w="4536"/>
+            <w:shd w:fill="d4af37"/>
+            <w:tcBorders>
+              <w:top w:val="single" w:sz="6" w:color="d4af37"/>
+              <w:left w:val="single" w:sz="6" w:color="d4af37"/>
+              <w:bottom w:val="single" w:sz="6" w:color="d4af37"/>
+              <w:right w:val="single" w:sz="6" w:color="d4af37"/>
+            </w:tcBorders>
+          </w:tcPr>
+          <w:p>
+            <w:r/>
+            <w:r>
+              <w:rPr>
+                <w:rFonts w:ascii="Arial" w:hAnsi="Arial"/>
+                <w:b/>
+                <w:color w:val="FFFFFF"/>
+                <w:sz w:val="22"/>
+              </w:rPr>
+              <w:t>Behavior</w:t>
+            </w:r>
+          </w:p>
+        </w:tc>
+      </w:tr>
+      <w:tr>
+        <w:tc>
+          <w:tcPr>
+            <w:tcW w:type="dxa" w:w="4536"/>
+            <w:shd w:fill="fff5dc"/>
+            <w:tcBorders>
+              <w:top w:val="single" w:sz="4" w:color="d4af37"/>
+              <w:left w:val="single" w:sz="4" w:color="d4af37"/>
+              <w:bottom w:val="single" w:sz="4" w:color="d4af37"/>
+              <w:right w:val="single" w:sz="4" w:color="d4af37"/>
+            </w:tcBorders>
+          </w:tcPr>
+          <w:p>
+            <w:r/>
+            <w:r>
+              <w:rPr>
+                <w:rFonts w:ascii="Arial" w:hAnsi="Arial"/>
+                <w:b w:val="0"/>
+                <w:color w:val="282828"/>
+                <w:sz w:val="22"/>
+              </w:rPr>
+              <w:t>Invalid member ID</w:t>
+            </w:r>
+          </w:p>
+        </w:tc>
+        <w:tc>
+          <w:tcPr>
+            <w:tcW w:type="dxa" w:w="4536"/>
+            <w:shd w:fill="fff5dc"/>
+            <w:tcBorders>
+              <w:top w:val="single" w:sz="4" w:color="d4af37"/>
+              <w:left w:val="single" w:sz="4" w:color="d4af37"/>
+              <w:bottom w:val="single" w:sz="4" w:color="d4af37"/>
+              <w:right w:val="single" w:sz="4" w:color="d4af37"/>
+            </w:tcBorders>
+          </w:tcPr>
+          <w:p>
+            <w:r/>
+            <w:r>
+              <w:rPr>
+                <w:rFonts w:ascii="Arial" w:hAnsi="Arial"/>
+                <w:b w:val="0"/>
+                <w:color w:val="282828"/>
+                <w:sz w:val="22"/>
+              </w:rPr>
+              <w:t>`Map` lookup returns `null`; transaction is rejected</w:t>
+            </w:r>
+          </w:p>
+        </w:tc>
+      </w:tr>
+      <w:tr>
+        <w:tc>
+          <w:tcPr>
+            <w:tcW w:type="dxa" w:w="4536"/>
+            <w:shd w:fill="fff5dc"/>
+            <w:tcBorders>
+              <w:top w:val="single" w:sz="4" w:color="d4af37"/>
+              <w:left w:val="single" w:sz="4" w:color="d4af37"/>
+              <w:bottom w:val="single" w:sz="4" w:color="d4af37"/>
+              <w:right w:val="single" w:sz="4" w:color="d4af37"/>
+            </w:tcBorders>
+          </w:tcPr>
+          <w:p>
+            <w:r/>
+            <w:r>
+              <w:rPr>
+                <w:rFonts w:ascii="Arial" w:hAnsi="Arial"/>
+                <w:b w:val="0"/>
+                <w:color w:val="282828"/>
+                <w:sz w:val="22"/>
+              </w:rPr>
+              <w:t>Invalid game ID</w:t>
+            </w:r>
+          </w:p>
+        </w:tc>
+        <w:tc>
+          <w:tcPr>
+            <w:tcW w:type="dxa" w:w="4536"/>
+            <w:shd w:fill="fff5dc"/>
+            <w:tcBorders>
+              <w:top w:val="single" w:sz="4" w:color="d4af37"/>
+              <w:left w:val="single" w:sz="4" w:color="d4af37"/>
+              <w:bottom w:val="single" w:sz="4" w:color="d4af37"/>
+              <w:right w:val="single" w:sz="4" w:color="d4af37"/>
+            </w:tcBorders>
+          </w:tcPr>
+          <w:p>
+            <w:r/>
+            <w:r>
+              <w:rPr>
+                <w:rFonts w:ascii="Arial" w:hAnsi="Arial"/>
+                <w:b w:val="0"/>
+                <w:color w:val="282828"/>
+                <w:sz w:val="22"/>
+              </w:rPr>
+              <w:t>Search returns `null`; transaction is rejected</w:t>
+            </w:r>
+          </w:p>
+        </w:tc>
+      </w:tr>
+      <w:tr>
+        <w:tc>
+          <w:tcPr>
+            <w:tcW w:type="dxa" w:w="4536"/>
+            <w:shd w:fill="fff5dc"/>
+            <w:tcBorders>
+              <w:top w:val="single" w:sz="4" w:color="d4af37"/>
+              <w:left w:val="single" w:sz="4" w:color="d4af37"/>
+              <w:bottom w:val="single" w:sz="4" w:color="d4af37"/>
+              <w:right w:val="single" w:sz="4" w:color="d4af37"/>
+            </w:tcBorders>
+          </w:tcPr>
+          <w:p>
+            <w:r/>
+            <w:r>
+              <w:rPr>
+                <w:rFonts w:ascii="Arial" w:hAnsi="Arial"/>
+                <w:b w:val="0"/>
+                <w:color w:val="282828"/>
+                <w:sz w:val="22"/>
+              </w:rPr>
+              <w:t>Borrowing an already-borrowed game</w:t>
+            </w:r>
+          </w:p>
+        </w:tc>
+        <w:tc>
+          <w:tcPr>
+            <w:tcW w:type="dxa" w:w="4536"/>
+            <w:shd w:fill="fff5dc"/>
+            <w:tcBorders>
+              <w:top w:val="single" w:sz="4" w:color="d4af37"/>
+              <w:left w:val="single" w:sz="4" w:color="d4af37"/>
+              <w:bottom w:val="single" w:sz="4" w:color="d4af37"/>
+              <w:right w:val="single" w:sz="4" w:color="d4af37"/>
+            </w:tcBorders>
+          </w:tcPr>
+          <w:p>
+            <w:r/>
+            <w:r>
+              <w:rPr>
+                <w:rFonts w:ascii="Arial" w:hAnsi="Arial"/>
+                <w:b w:val="0"/>
+                <w:color w:val="282828"/>
+                <w:sz w:val="22"/>
+              </w:rPr>
+              <w:t>Blocked by `isAvailable` check</w:t>
+            </w:r>
+          </w:p>
+        </w:tc>
+      </w:tr>
+      <w:tr>
+        <w:tc>
+          <w:tcPr>
+            <w:tcW w:type="dxa" w:w="4536"/>
+            <w:shd w:fill="fff5dc"/>
+            <w:tcBorders>
+              <w:top w:val="single" w:sz="4" w:color="d4af37"/>
+              <w:left w:val="single" w:sz="4" w:color="d4af37"/>
+              <w:bottom w:val="single" w:sz="4" w:color="d4af37"/>
+              <w:right w:val="single" w:sz="4" w:color="d4af37"/>
+            </w:tcBorders>
+          </w:tcPr>
+          <w:p>
+            <w:r/>
+            <w:r>
+              <w:rPr>
+                <w:rFonts w:ascii="Arial" w:hAnsi="Arial"/>
+                <w:b w:val="0"/>
+                <w:color w:val="282828"/>
+                <w:sz w:val="22"/>
+              </w:rPr>
+              <w:t>Returning a game you never borrowed</w:t>
+            </w:r>
+          </w:p>
+        </w:tc>
+        <w:tc>
+          <w:tcPr>
+            <w:tcW w:type="dxa" w:w="4536"/>
+            <w:shd w:fill="fff5dc"/>
+            <w:tcBorders>
+              <w:top w:val="single" w:sz="4" w:color="d4af37"/>
+              <w:left w:val="single" w:sz="4" w:color="d4af37"/>
+              <w:bottom w:val="single" w:sz="4" w:color="d4af37"/>
+              <w:right w:val="single" w:sz="4" w:color="d4af37"/>
+            </w:tcBorders>
+          </w:tcPr>
+          <w:p>
+            <w:r/>
+            <w:r>
+              <w:rPr>
+                <w:rFonts w:ascii="Arial" w:hAnsi="Arial"/>
+                <w:b w:val="0"/>
+                <w:color w:val="282828"/>
+                <w:sz w:val="22"/>
+              </w:rPr>
+              <w:t>Rejected after checking `borrowedGames`</w:t>
+            </w:r>
+          </w:p>
+        </w:tc>
+      </w:tr>
+      <w:tr>
+        <w:tc>
+          <w:tcPr>
+            <w:tcW w:type="dxa" w:w="4536"/>
+            <w:shd w:fill="fff5dc"/>
+            <w:tcBorders>
+              <w:top w:val="single" w:sz="4" w:color="d4af37"/>
+              <w:left w:val="single" w:sz="4" w:color="d4af37"/>
+              <w:bottom w:val="single" w:sz="4" w:color="d4af37"/>
+              <w:right w:val="single" w:sz="4" w:color="d4af37"/>
+            </w:tcBorders>
+          </w:tcPr>
+          <w:p>
+            <w:r/>
+            <w:r>
+              <w:rPr>
+                <w:rFonts w:ascii="Arial" w:hAnsi="Arial"/>
+                <w:b w:val="0"/>
+                <w:color w:val="282828"/>
+                <w:sz w:val="22"/>
+              </w:rPr>
+              <w:t>Zero or negative overdue days</w:t>
+            </w:r>
+          </w:p>
+        </w:tc>
+        <w:tc>
+          <w:tcPr>
+            <w:tcW w:type="dxa" w:w="4536"/>
+            <w:shd w:fill="fff5dc"/>
+            <w:tcBorders>
+              <w:top w:val="single" w:sz="4" w:color="d4af37"/>
+              <w:left w:val="single" w:sz="4" w:color="d4af37"/>
+              <w:bottom w:val="single" w:sz="4" w:color="d4af37"/>
+              <w:right w:val="single" w:sz="4" w:color="d4af37"/>
+            </w:tcBorders>
+          </w:tcPr>
+          <w:p>
+            <w:r/>
+            <w:r>
+              <w:rPr>
+                <w:rFonts w:ascii="Arial" w:hAnsi="Arial"/>
+                <w:b w:val="0"/>
+                <w:color w:val="282828"/>
+                <w:sz w:val="22"/>
+              </w:rPr>
+              <w:t>`calculateLateFee` returns `$0.00`</w:t>
+            </w:r>
+          </w:p>
+        </w:tc>
+      </w:tr>
+      <w:tr>
+        <w:tc>
+          <w:tcPr>
+            <w:tcW w:type="dxa" w:w="4536"/>
+            <w:shd w:fill="fff5dc"/>
+            <w:tcBorders>
+              <w:top w:val="single" w:sz="4" w:color="d4af37"/>
+              <w:left w:val="single" w:sz="4" w:color="d4af37"/>
+              <w:bottom w:val="single" w:sz="4" w:color="d4af37"/>
+              <w:right w:val="single" w:sz="4" w:color="d4af37"/>
+            </w:tcBorders>
+          </w:tcPr>
+          <w:p>
+            <w:r/>
+            <w:r>
+              <w:rPr>
+                <w:rFonts w:ascii="Arial" w:hAnsi="Arial"/>
+                <w:b w:val="0"/>
+                <w:color w:val="282828"/>
+                <w:sz w:val="22"/>
+              </w:rPr>
+              <w:t>No games match the player count</w:t>
+            </w:r>
+          </w:p>
+        </w:tc>
+        <w:tc>
+          <w:tcPr>
+            <w:tcW w:type="dxa" w:w="4536"/>
+            <w:shd w:fill="fff5dc"/>
+            <w:tcBorders>
+              <w:top w:val="single" w:sz="4" w:color="d4af37"/>
+              <w:left w:val="single" w:sz="4" w:color="d4af37"/>
+              <w:bottom w:val="single" w:sz="4" w:color="d4af37"/>
+              <w:right w:val="single" w:sz="4" w:color="d4af37"/>
+            </w:tcBorders>
+          </w:tcPr>
+          <w:p>
+            <w:r/>
+            <w:r>
+              <w:rPr>
+                <w:rFonts w:ascii="Arial" w:hAnsi="Arial"/>
+                <w:b w:val="0"/>
+                <w:color w:val="282828"/>
+                <w:sz w:val="22"/>
+              </w:rPr>
+              <w:t>Prints a clear message instead of crashing</w:t>
+            </w:r>
+          </w:p>
+        </w:tc>
+      </w:tr>
+    </w:tbl>
+    <w:p>
+      <w:pPr>
+        <w:pStyle w:val="Heading1"/>
+      </w:pPr>
+      <w:r>
+        <w:rPr>
+          <w:rFonts w:ascii="Arial" w:hAnsi="Arial"/>
+          <w:b/>
+          <w:color w:val="D4AF37"/>
+          <w:sz w:val="40"/>
+        </w:rPr>
+        <w:t>8. Run It Yourself</w:t>
+      </w:r>
+    </w:p>
+    <w:tbl>
+      <w:tblPr>
+        <w:tblW w:type="auto" w:w="0"/>
+        <w:jc w:val="left"/>
+        <w:tblLook w:firstColumn="1" w:firstRow="1" w:lastColumn="0" w:lastRow="0" w:noHBand="0" w:noVBand="1" w:val="04A0"/>
+      </w:tblPr>
+      <w:tblGrid>
+        <w:gridCol w:w="9072"/>
+      </w:tblGrid>
+      <w:tr>
+        <w:tc>
+          <w:tcPr>
+            <w:tcW w:type="dxa" w:w="8640"/>
+            <w:shd w:fill="fffaeb"/>
+            <w:tcBorders>
+              <w:top w:val="single" w:sz="4" w:color="d4af37"/>
+              <w:left w:val="single" w:sz="4" w:color="d4af37"/>
+              <w:bottom w:val="single" w:sz="4" w:color="d4af37"/>
+              <w:right w:val="single" w:sz="4" w:color="d4af37"/>
+            </w:tcBorders>
+          </w:tcPr>
+          <w:p>
+            <w:r>
+              <w:rPr>
+                <w:rFonts w:ascii="Consolas" w:hAnsi="Consolas"/>
+                <w:b w:val="0"/>
+                <w:color w:val="282828"/>
+                <w:sz w:val="18"/>
+              </w:rPr>
+              <w:t>cd assignment_1</w:t>
+              <w:br/>
+              <w:t>dart pub get</w:t>
+              <w:br/>
+              <w:t>dart run lib/main.dart</w:t>
+            </w:r>
+          </w:p>
+        </w:tc>
+      </w:tr>
+    </w:tbl>
     <w:p>
       <w:r>
         <w:rPr>
@@ -2321,7 +2282,7 @@
           <w:color w:val="282828"/>
           <w:sz w:val="22"/>
         </w:rPr>
-        <w:t>The program was executed successfully with the following output:</w:t>
+        <w:t>Expected output:</w:t>
       </w:r>
     </w:p>
     <w:tbl>
@@ -2427,14 +2388,17 @@
       </w:tr>
     </w:tbl>
     <w:p>
+      <w:pPr>
+        <w:pStyle w:val="Heading1"/>
+      </w:pPr>
       <w:r>
         <w:rPr>
           <w:rFonts w:ascii="Arial" w:hAnsi="Arial"/>
-          <w:b w:val="0"/>
-          <w:color w:val="282828"/>
-          <w:sz w:val="22"/>
+          <w:b/>
+          <w:color w:val="D4AF37"/>
+          <w:sz w:val="40"/>
         </w:rPr>
-        <w:t>A terminal screenshot is attached below:</w:t>
+        <w:t>9. Terminal Proof</w:t>
       </w:r>
     </w:p>
     <w:p>
@@ -2501,7 +2465,7 @@
           <w:color w:val="D4AF37"/>
           <w:sz w:val="40"/>
         </w:rPr>
-        <w:t>10. Future Extensibility</w:t>
+        <w:t>10. What Could Come Next</w:t>
       </w:r>
     </w:p>
     <w:p>
@@ -2515,7 +2479,7 @@
           <w:color w:val="282828"/>
           <w:sz w:val="22"/>
         </w:rPr>
-        <w:t>Add `Reservation` class for game reservations.</w:t>
+        <w:t>Add a `Reservation` class for holds on borrowed games.</w:t>
       </w:r>
     </w:p>
     <w:p>
@@ -2529,7 +2493,7 @@
           <w:color w:val="282828"/>
           <w:sz w:val="22"/>
         </w:rPr>
-        <w:t>Persist catalog and member data to JSON or SQLite.</w:t>
+        <w:t>Persist the catalog and member list to JSON.</w:t>
       </w:r>
     </w:p>
     <w:p>
@@ -2543,7 +2507,7 @@
           <w:color w:val="282828"/>
           <w:sz w:val="22"/>
         </w:rPr>
-        <w:t>Add due-date tracking and automatic overdue notifications.</w:t>
+        <w:t>Add due dates and automatic overdue reminders.</w:t>
       </w:r>
     </w:p>
     <w:p>
@@ -2557,7 +2521,7 @@
           <w:color w:val="282828"/>
           <w:sz w:val="22"/>
         </w:rPr>
-        <w:t>Build a CLI menu for interactive borrow/return operations.</w:t>
+        <w:t>Build an interactive CLI menu instead of a fixed demo.</w:t>
       </w:r>
     </w:p>
     <w:p>
@@ -2571,7 +2535,7 @@
           <w:color w:val="D4AF37"/>
           <w:sz w:val="40"/>
         </w:rPr>
-        <w:t>11. Conclusion</w:t>
+        <w:t>11. Closing</w:t>
       </w:r>
     </w:p>
     <w:p>
@@ -2582,7 +2546,7 @@
           <w:color w:val="282828"/>
           <w:sz w:val="22"/>
         </w:rPr>
-        <w:t>This Dart console application demonstrates core programming concepts through a practical, non-trivial domain. By choosing a board game lending library instead of a generic book system, the assignment stays orthogonal to the reference while still clearly showcasing variables, loops, functions, and OOP inheritance.</w:t>
+        <w:t>This assignment shows the same core Dart skills as a traditional library app, but applied to a different domain. A board game library needs the same inheritance, collections, and control flow — it just happens to be more fun to demo.</w:t>
       </w:r>
     </w:p>
     <w:sectPr>

</xml_diff>

<commit_message>
Break doc skeleton: 8 sections, execution-first, ASCII flow, game-specific edge cases
</commit_message>
<xml_diff>
--- a/assignment_1/DOCUMENTATION.docx
+++ b/assignment_1/DOCUMENTATION.docx
@@ -227,7 +227,7 @@
           <w:color w:val="D4AF37"/>
           <w:sz w:val="40"/>
         </w:rPr>
-        <w:t>1. The Pitch</w:t>
+        <w:t>1. What This Is</w:t>
       </w:r>
     </w:p>
     <w:p>
@@ -238,25 +238,7 @@
           <w:color w:val="282828"/>
           <w:sz w:val="22"/>
         </w:rPr>
-        <w:t xml:space="preserve">Most first-year console apps model a book library. This one models something far more interesting: a </w:t>
-      </w:r>
-      <w:r>
-        <w:rPr>
-          <w:rFonts w:ascii="Arial" w:hAnsi="Arial"/>
-          <w:b/>
-          <w:color w:val="D4AF37"/>
-          <w:sz w:val="22"/>
-        </w:rPr>
-        <w:t>community board game lending library</w:t>
-      </w:r>
-      <w:r>
-        <w:rPr>
-          <w:rFonts w:ascii="Arial" w:hAnsi="Arial"/>
-          <w:b w:val="0"/>
-          <w:color w:val="282828"/>
-          <w:sz w:val="22"/>
-        </w:rPr>
-        <w:t>. Instead of tracking paperbacks and e-books, it tracks tabletop games — board games, card games, and RPG manuals — and helps members find the right game for the right group.</w:t>
+        <w:t>A Dart console app that models a neighborhood board game lending library. It manages a catalog of tabletop games — board games, card games, RPG manuals — lets members borrow and return them, recommends games by player count, and calculates late fees.</w:t>
       </w:r>
     </w:p>
     <w:p>
@@ -267,7 +249,7 @@
           <w:color w:val="282828"/>
           <w:sz w:val="22"/>
         </w:rPr>
-        <w:t>The app is built in Dart and demonstrates variables, control flow, loops, functions, and object-oriented inheritance without copying the usual physical/digital media split.</w:t>
+        <w:t>The assignment brief asked for variables, loops, functions, and OOP with inheritance. This app hits all four through the lens of game lending.</w:t>
       </w:r>
     </w:p>
     <w:p>
@@ -281,1958 +263,7 @@
           <w:color w:val="D4AF37"/>
           <w:sz w:val="40"/>
         </w:rPr>
-        <w:t>2. A Shift at the Library</w:t>
-      </w:r>
-    </w:p>
-    <w:p>
-      <w:r>
-        <w:rPr>
-          <w:rFonts w:ascii="Arial" w:hAnsi="Arial"/>
-          <w:b w:val="0"/>
-          <w:color w:val="282828"/>
-          <w:sz w:val="22"/>
-        </w:rPr>
-        <w:t>Here is what happens when the program runs:</w:t>
-      </w:r>
-    </w:p>
-    <w:p>
-      <w:r>
-        <w:rPr>
-          <w:rFonts w:ascii="Arial" w:hAnsi="Arial"/>
-          <w:b w:val="0"/>
-          <w:color w:val="282828"/>
-          <w:sz w:val="22"/>
-        </w:rPr>
-        <w:t>1. The librarian opens the catalog. Four games are listed: two board games, one card game, and one RPG manual.</w:t>
-      </w:r>
-    </w:p>
-    <w:p>
-      <w:r>
-        <w:rPr>
-          <w:rFonts w:ascii="Arial" w:hAnsi="Arial"/>
-          <w:b w:val="0"/>
-          <w:color w:val="282828"/>
-          <w:sz w:val="22"/>
-        </w:rPr>
-        <w:t xml:space="preserve">2. </w:t>
-      </w:r>
-      <w:r>
-        <w:rPr>
-          <w:rFonts w:ascii="Arial" w:hAnsi="Arial"/>
-          <w:b/>
-          <w:color w:val="D4AF37"/>
-          <w:sz w:val="22"/>
-        </w:rPr>
-        <w:t>Soumitra Deshpande</w:t>
-      </w:r>
-      <w:r>
-        <w:rPr>
-          <w:rFonts w:ascii="Arial" w:hAnsi="Arial"/>
-          <w:b w:val="0"/>
-          <w:color w:val="282828"/>
-          <w:sz w:val="22"/>
-        </w:rPr>
-        <w:t xml:space="preserve"> borrows *Wingspan*. </w:t>
-      </w:r>
-      <w:r>
-        <w:rPr>
-          <w:rFonts w:ascii="Arial" w:hAnsi="Arial"/>
-          <w:b/>
-          <w:color w:val="D4AF37"/>
-          <w:sz w:val="22"/>
-        </w:rPr>
-        <w:t>Alex Chen</w:t>
-      </w:r>
-      <w:r>
-        <w:rPr>
-          <w:rFonts w:ascii="Arial" w:hAnsi="Arial"/>
-          <w:b w:val="0"/>
-          <w:color w:val="282828"/>
-          <w:sz w:val="22"/>
-        </w:rPr>
-        <w:t xml:space="preserve"> borrows *Love Letter*.</w:t>
-      </w:r>
-    </w:p>
-    <w:p>
-      <w:r>
-        <w:rPr>
-          <w:rFonts w:ascii="Arial" w:hAnsi="Arial"/>
-          <w:b w:val="0"/>
-          <w:color w:val="282828"/>
-          <w:sz w:val="22"/>
-        </w:rPr>
-        <w:t>3. A group of three friends walks in. The librarian runs a recommendation check and suggests *Catan* because it supports exactly three players.</w:t>
-      </w:r>
-    </w:p>
-    <w:p>
-      <w:r>
-        <w:rPr>
-          <w:rFonts w:ascii="Arial" w:hAnsi="Arial"/>
-          <w:b w:val="0"/>
-          <w:color w:val="282828"/>
-          <w:sz w:val="22"/>
-        </w:rPr>
-        <w:t>4. Soumitra returns *Wingspan*.</w:t>
-      </w:r>
-    </w:p>
-    <w:p>
-      <w:r>
-        <w:rPr>
-          <w:rFonts w:ascii="Arial" w:hAnsi="Arial"/>
-          <w:b w:val="0"/>
-          <w:color w:val="282828"/>
-          <w:sz w:val="22"/>
-        </w:rPr>
-        <w:t>5. The system prints each member's current borrow record.</w:t>
-      </w:r>
-    </w:p>
-    <w:p>
-      <w:r>
-        <w:rPr>
-          <w:rFonts w:ascii="Arial" w:hAnsi="Arial"/>
-          <w:b w:val="0"/>
-          <w:color w:val="282828"/>
-          <w:sz w:val="22"/>
-        </w:rPr>
-        <w:t>6. The late-fee calculator shows what happens if games come back overdue.</w:t>
-      </w:r>
-    </w:p>
-    <w:p>
-      <w:r>
-        <w:rPr>
-          <w:rFonts w:ascii="Arial" w:hAnsi="Arial"/>
-          <w:b w:val="0"/>
-          <w:color w:val="282828"/>
-          <w:sz w:val="22"/>
-        </w:rPr>
-        <w:t>This single workflow exercises every required Dart concept.</w:t>
-      </w:r>
-    </w:p>
-    <w:p>
-      <w:pPr>
-        <w:pStyle w:val="Heading1"/>
-      </w:pPr>
-      <w:r>
-        <w:rPr>
-          <w:rFonts w:ascii="Arial" w:hAnsi="Arial"/>
-          <w:b/>
-          <w:color w:val="D4AF37"/>
-          <w:sz w:val="40"/>
-        </w:rPr>
-        <w:t>3. What's Under the Hood</w:t>
-      </w:r>
-    </w:p>
-    <w:p>
-      <w:r>
-        <w:rPr>
-          <w:rFonts w:ascii="Arial" w:hAnsi="Arial"/>
-          <w:b w:val="0"/>
-          <w:color w:val="282828"/>
-          <w:sz w:val="22"/>
-        </w:rPr>
-        <w:t>The system is built around three ideas:</w:t>
-      </w:r>
-    </w:p>
-    <w:p>
-      <w:pPr>
-        <w:pStyle w:val="ListBullet"/>
-      </w:pPr>
-      <w:r>
-        <w:rPr>
-          <w:rFonts w:ascii="Arial" w:hAnsi="Arial"/>
-          <w:b w:val="0"/>
-          <w:color w:val="282828"/>
-          <w:sz w:val="22"/>
-        </w:rPr>
-      </w:r>
-      <w:r>
-        <w:rPr>
-          <w:rFonts w:ascii="Arial" w:hAnsi="Arial"/>
-          <w:b/>
-          <w:color w:val="D4AF37"/>
-          <w:sz w:val="22"/>
-        </w:rPr>
-        <w:t>A shared base type.</w:t>
-      </w:r>
-      <w:r>
-        <w:rPr>
-          <w:rFonts w:ascii="Arial" w:hAnsi="Arial"/>
-          <w:b w:val="0"/>
-          <w:color w:val="282828"/>
-          <w:sz w:val="22"/>
-        </w:rPr>
-        <w:t xml:space="preserve"> Every item in the catalog is a `Game`. The exact kind of game is handled by subclasses.</w:t>
-      </w:r>
-    </w:p>
-    <w:p>
-      <w:pPr>
-        <w:pStyle w:val="ListBullet"/>
-      </w:pPr>
-      <w:r>
-        <w:rPr>
-          <w:rFonts w:ascii="Arial" w:hAnsi="Arial"/>
-          <w:b w:val="0"/>
-          <w:color w:val="282828"/>
-          <w:sz w:val="22"/>
-        </w:rPr>
-      </w:r>
-      <w:r>
-        <w:rPr>
-          <w:rFonts w:ascii="Arial" w:hAnsi="Arial"/>
-          <w:b/>
-          <w:color w:val="D4AF37"/>
-          <w:sz w:val="22"/>
-        </w:rPr>
-        <w:t>A member registry.</w:t>
-      </w:r>
-      <w:r>
-        <w:rPr>
-          <w:rFonts w:ascii="Arial" w:hAnsi="Arial"/>
-          <w:b w:val="0"/>
-          <w:color w:val="282828"/>
-          <w:sz w:val="22"/>
-        </w:rPr>
-        <w:t xml:space="preserve"> Members are stored in a `Map&lt;String, Member&gt;` for fast lookup by ID.</w:t>
-      </w:r>
-    </w:p>
-    <w:p>
-      <w:pPr>
-        <w:pStyle w:val="ListBullet"/>
-      </w:pPr>
-      <w:r>
-        <w:rPr>
-          <w:rFonts w:ascii="Arial" w:hAnsi="Arial"/>
-          <w:b w:val="0"/>
-          <w:color w:val="282828"/>
-          <w:sz w:val="22"/>
-        </w:rPr>
-      </w:r>
-      <w:r>
-        <w:rPr>
-          <w:rFonts w:ascii="Arial" w:hAnsi="Arial"/>
-          <w:b/>
-          <w:color w:val="D4AF37"/>
-          <w:sz w:val="22"/>
-        </w:rPr>
-        <w:t>A librarian.</w:t>
-      </w:r>
-      <w:r>
-        <w:rPr>
-          <w:rFonts w:ascii="Arial" w:hAnsi="Arial"/>
-          <w:b w:val="0"/>
-          <w:color w:val="282828"/>
-          <w:sz w:val="22"/>
-        </w:rPr>
-        <w:t xml:space="preserve"> `GameLibrary` holds the catalog, registers members, handles checkout/return, and recommends games.</w:t>
-      </w:r>
-    </w:p>
-    <w:tbl>
-      <w:tblPr>
-        <w:tblW w:type="auto" w:w="0"/>
-        <w:jc w:val="left"/>
-        <w:tblLook w:firstColumn="1" w:firstRow="1" w:lastColumn="0" w:lastRow="0" w:noHBand="0" w:noVBand="1" w:val="04A0"/>
-      </w:tblPr>
-      <w:tblGrid>
-        <w:gridCol w:w="9072"/>
-      </w:tblGrid>
-      <w:tr>
-        <w:tc>
-          <w:tcPr>
-            <w:tcW w:type="dxa" w:w="8640"/>
-            <w:shd w:fill="fffaeb"/>
-            <w:tcBorders>
-              <w:top w:val="single" w:sz="4" w:color="d4af37"/>
-              <w:left w:val="single" w:sz="4" w:color="d4af37"/>
-              <w:bottom w:val="single" w:sz="4" w:color="d4af37"/>
-              <w:right w:val="single" w:sz="4" w:color="d4af37"/>
-            </w:tcBorders>
-          </w:tcPr>
-          <w:p>
-            <w:r>
-              <w:rPr>
-                <w:rFonts w:ascii="Consolas" w:hAnsi="Consolas"/>
-                <w:b w:val="0"/>
-                <w:color w:val="282828"/>
-                <w:sz w:val="18"/>
-              </w:rPr>
-              <w:t>classDiagram</w:t>
-              <w:br/>
-              <w:t xml:space="preserve">    direction TB</w:t>
-              <w:br/>
-              <w:t xml:space="preserve">    class Game {</w:t>
-              <w:br/>
-              <w:t xml:space="preserve">        &lt;&lt;abstract&gt;&gt;</w:t>
-              <w:br/>
-              <w:t xml:space="preserve">        +String id</w:t>
-              <w:br/>
-              <w:t xml:space="preserve">        +String title</w:t>
-              <w:br/>
-              <w:t xml:space="preserve">        +String publisher</w:t>
-              <w:br/>
-              <w:t xml:space="preserve">        +int releaseYear</w:t>
-              <w:br/>
-              <w:t xml:space="preserve">        +String genre</w:t>
-              <w:br/>
-              <w:t xml:space="preserve">        +bool isAvailable</w:t>
-              <w:br/>
-              <w:t xml:space="preserve">        +describe()* void</w:t>
-              <w:br/>
-              <w:t xml:space="preserve">    }</w:t>
-              <w:br/>
-              <w:t xml:space="preserve">    class BoardGame {</w:t>
-              <w:br/>
-              <w:t xml:space="preserve">        +int playerCountMin</w:t>
-              <w:br/>
-              <w:t xml:space="preserve">        +int playerCountMax</w:t>
-              <w:br/>
-              <w:t xml:space="preserve">        +int playTimeMinutes</w:t>
-              <w:br/>
-              <w:t xml:space="preserve">        +double complexityRating</w:t>
-              <w:br/>
-              <w:t xml:space="preserve">    }</w:t>
-              <w:br/>
-              <w:t xml:space="preserve">    class CardGame {</w:t>
-              <w:br/>
-              <w:t xml:space="preserve">        +int deckSize</w:t>
-              <w:br/>
-              <w:t xml:space="preserve">        +int avgPlayTimeMinutes</w:t>
-              <w:br/>
-              <w:t xml:space="preserve">    }</w:t>
-              <w:br/>
-              <w:t xml:space="preserve">    class RPGManual {</w:t>
-              <w:br/>
-              <w:t xml:space="preserve">        +String edition</w:t>
-              <w:br/>
-              <w:t xml:space="preserve">        +int pageCount</w:t>
-              <w:br/>
-              <w:t xml:space="preserve">    }</w:t>
-              <w:br/>
-              <w:t xml:space="preserve">    class Member {</w:t>
-              <w:br/>
-              <w:t xml:space="preserve">        +String memberId</w:t>
-              <w:br/>
-              <w:t xml:space="preserve">        +String name</w:t>
-              <w:br/>
-              <w:t xml:space="preserve">        +List~Game~ borrowedGames</w:t>
-              <w:br/>
-              <w:t xml:space="preserve">    }</w:t>
-              <w:br/>
-              <w:t xml:space="preserve">    class GameLibrary {</w:t>
-              <w:br/>
-              <w:t xml:space="preserve">        +List~Game~ catalog</w:t>
-              <w:br/>
-              <w:t xml:space="preserve">        +Map~String,Member~ members</w:t>
-              <w:br/>
-              <w:t xml:space="preserve">        +borrowGame() bool</w:t>
-              <w:br/>
-              <w:t xml:space="preserve">        +returnGame() bool</w:t>
-              <w:br/>
-              <w:t xml:space="preserve">        +recommendForPlayers() void</w:t>
-              <w:br/>
-              <w:t xml:space="preserve">    }</w:t>
-              <w:br/>
-              <w:t xml:space="preserve">    Game &lt;|-- BoardGame</w:t>
-              <w:br/>
-              <w:t xml:space="preserve">    Game &lt;|-- CardGame</w:t>
-              <w:br/>
-              <w:t xml:space="preserve">    Game &lt;|-- RPGManual</w:t>
-              <w:br/>
-              <w:t xml:space="preserve">    GameLibrary --&gt; Game</w:t>
-              <w:br/>
-              <w:t xml:space="preserve">    GameLibrary --&gt; Member</w:t>
-            </w:r>
-          </w:p>
-        </w:tc>
-      </w:tr>
-    </w:tbl>
-    <w:p>
-      <w:pPr>
-        <w:pStyle w:val="Heading1"/>
-      </w:pPr>
-      <w:r>
-        <w:rPr>
-          <w:rFonts w:ascii="Arial" w:hAnsi="Arial"/>
-          <w:b/>
-          <w:color w:val="D4AF37"/>
-          <w:sz w:val="40"/>
-        </w:rPr>
-        <w:t>4. Dart Concepts in Action</w:t>
-      </w:r>
-    </w:p>
-    <w:tbl>
-      <w:tblPr>
-        <w:tblStyle w:val="TableGrid"/>
-        <w:tblW w:type="auto" w:w="0"/>
-        <w:jc w:val="center"/>
-        <w:tblLook w:firstColumn="1" w:firstRow="1" w:lastColumn="0" w:lastRow="0" w:noHBand="0" w:noVBand="1" w:val="04A0"/>
-      </w:tblPr>
-      <w:tblGrid>
-        <w:gridCol w:w="4536"/>
-        <w:gridCol w:w="4536"/>
-      </w:tblGrid>
-      <w:tr>
-        <w:tc>
-          <w:tcPr>
-            <w:tcW w:type="dxa" w:w="4536"/>
-            <w:shd w:fill="d4af37"/>
-            <w:tcBorders>
-              <w:top w:val="single" w:sz="6" w:color="d4af37"/>
-              <w:left w:val="single" w:sz="6" w:color="d4af37"/>
-              <w:bottom w:val="single" w:sz="6" w:color="d4af37"/>
-              <w:right w:val="single" w:sz="6" w:color="d4af37"/>
-            </w:tcBorders>
-          </w:tcPr>
-          <w:p>
-            <w:r/>
-            <w:r>
-              <w:rPr>
-                <w:rFonts w:ascii="Arial" w:hAnsi="Arial"/>
-                <w:b/>
-                <w:color w:val="FFFFFF"/>
-                <w:sz w:val="22"/>
-              </w:rPr>
-              <w:t>Requirement</w:t>
-            </w:r>
-          </w:p>
-        </w:tc>
-        <w:tc>
-          <w:tcPr>
-            <w:tcW w:type="dxa" w:w="4536"/>
-            <w:shd w:fill="d4af37"/>
-            <w:tcBorders>
-              <w:top w:val="single" w:sz="6" w:color="d4af37"/>
-              <w:left w:val="single" w:sz="6" w:color="d4af37"/>
-              <w:bottom w:val="single" w:sz="6" w:color="d4af37"/>
-              <w:right w:val="single" w:sz="6" w:color="d4af37"/>
-            </w:tcBorders>
-          </w:tcPr>
-          <w:p>
-            <w:r/>
-            <w:r>
-              <w:rPr>
-                <w:rFonts w:ascii="Arial" w:hAnsi="Arial"/>
-                <w:b/>
-                <w:color w:val="FFFFFF"/>
-                <w:sz w:val="22"/>
-              </w:rPr>
-              <w:t>Where It Lives</w:t>
-            </w:r>
-          </w:p>
-        </w:tc>
-      </w:tr>
-      <w:tr>
-        <w:tc>
-          <w:tcPr>
-            <w:tcW w:type="dxa" w:w="4536"/>
-            <w:shd w:fill="fff5dc"/>
-            <w:tcBorders>
-              <w:top w:val="single" w:sz="4" w:color="d4af37"/>
-              <w:left w:val="single" w:sz="4" w:color="d4af37"/>
-              <w:bottom w:val="single" w:sz="4" w:color="d4af37"/>
-              <w:right w:val="single" w:sz="4" w:color="d4af37"/>
-            </w:tcBorders>
-          </w:tcPr>
-          <w:p>
-            <w:r/>
-            <w:r>
-              <w:rPr>
-                <w:rFonts w:ascii="Arial" w:hAnsi="Arial"/>
-                <w:b w:val="0"/>
-                <w:color w:val="282828"/>
-                <w:sz w:val="22"/>
-              </w:rPr>
-              <w:t>Variables (`String`, `int`, `double`, `bool`)</w:t>
-            </w:r>
-          </w:p>
-        </w:tc>
-        <w:tc>
-          <w:tcPr>
-            <w:tcW w:type="dxa" w:w="4536"/>
-            <w:shd w:fill="fff5dc"/>
-            <w:tcBorders>
-              <w:top w:val="single" w:sz="4" w:color="d4af37"/>
-              <w:left w:val="single" w:sz="4" w:color="d4af37"/>
-              <w:bottom w:val="single" w:sz="4" w:color="d4af37"/>
-              <w:right w:val="single" w:sz="4" w:color="d4af37"/>
-            </w:tcBorders>
-          </w:tcPr>
-          <w:p>
-            <w:r/>
-            <w:r>
-              <w:rPr>
-                <w:rFonts w:ascii="Arial" w:hAnsi="Arial"/>
-                <w:b w:val="0"/>
-                <w:color w:val="282828"/>
-                <w:sz w:val="22"/>
-              </w:rPr>
-              <w:t>`Game` fields, `BoardGame.playerCountMin`, `RPGManual.pageCount`</w:t>
-            </w:r>
-          </w:p>
-        </w:tc>
-      </w:tr>
-      <w:tr>
-        <w:tc>
-          <w:tcPr>
-            <w:tcW w:type="dxa" w:w="4536"/>
-            <w:shd w:fill="fff5dc"/>
-            <w:tcBorders>
-              <w:top w:val="single" w:sz="4" w:color="d4af37"/>
-              <w:left w:val="single" w:sz="4" w:color="d4af37"/>
-              <w:bottom w:val="single" w:sz="4" w:color="d4af37"/>
-              <w:right w:val="single" w:sz="4" w:color="d4af37"/>
-            </w:tcBorders>
-          </w:tcPr>
-          <w:p>
-            <w:r/>
-            <w:r>
-              <w:rPr>
-                <w:rFonts w:ascii="Arial" w:hAnsi="Arial"/>
-                <w:b w:val="0"/>
-                <w:color w:val="282828"/>
-                <w:sz w:val="22"/>
-              </w:rPr>
-              <w:t>Collections (`List`, `Map`)</w:t>
-            </w:r>
-          </w:p>
-        </w:tc>
-        <w:tc>
-          <w:tcPr>
-            <w:tcW w:type="dxa" w:w="4536"/>
-            <w:shd w:fill="fff5dc"/>
-            <w:tcBorders>
-              <w:top w:val="single" w:sz="4" w:color="d4af37"/>
-              <w:left w:val="single" w:sz="4" w:color="d4af37"/>
-              <w:bottom w:val="single" w:sz="4" w:color="d4af37"/>
-              <w:right w:val="single" w:sz="4" w:color="d4af37"/>
-            </w:tcBorders>
-          </w:tcPr>
-          <w:p>
-            <w:r/>
-            <w:r>
-              <w:rPr>
-                <w:rFonts w:ascii="Arial" w:hAnsi="Arial"/>
-                <w:b w:val="0"/>
-                <w:color w:val="282828"/>
-                <w:sz w:val="22"/>
-              </w:rPr>
-              <w:t>`GameLibrary.catalog`, `Member.borrowedGames`, `GameLibrary.members`</w:t>
-            </w:r>
-          </w:p>
-        </w:tc>
-      </w:tr>
-      <w:tr>
-        <w:tc>
-          <w:tcPr>
-            <w:tcW w:type="dxa" w:w="4536"/>
-            <w:shd w:fill="fff5dc"/>
-            <w:tcBorders>
-              <w:top w:val="single" w:sz="4" w:color="d4af37"/>
-              <w:left w:val="single" w:sz="4" w:color="d4af37"/>
-              <w:bottom w:val="single" w:sz="4" w:color="d4af37"/>
-              <w:right w:val="single" w:sz="4" w:color="d4af37"/>
-            </w:tcBorders>
-          </w:tcPr>
-          <w:p>
-            <w:r/>
-            <w:r>
-              <w:rPr>
-                <w:rFonts w:ascii="Arial" w:hAnsi="Arial"/>
-                <w:b w:val="0"/>
-                <w:color w:val="282828"/>
-                <w:sz w:val="22"/>
-              </w:rPr>
-              <w:t>Named parameters &amp; defaults</w:t>
-            </w:r>
-          </w:p>
-        </w:tc>
-        <w:tc>
-          <w:tcPr>
-            <w:tcW w:type="dxa" w:w="4536"/>
-            <w:shd w:fill="fff5dc"/>
-            <w:tcBorders>
-              <w:top w:val="single" w:sz="4" w:color="d4af37"/>
-              <w:left w:val="single" w:sz="4" w:color="d4af37"/>
-              <w:bottom w:val="single" w:sz="4" w:color="d4af37"/>
-              <w:right w:val="single" w:sz="4" w:color="d4af37"/>
-            </w:tcBorders>
-          </w:tcPr>
-          <w:p>
-            <w:r/>
-            <w:r>
-              <w:rPr>
-                <w:rFonts w:ascii="Arial" w:hAnsi="Arial"/>
-                <w:b w:val="0"/>
-                <w:color w:val="282828"/>
-                <w:sz w:val="22"/>
-              </w:rPr>
-              <w:t>`calculateLateFee({required int overdueDays, double dailyRate = 1.5})`</w:t>
-            </w:r>
-          </w:p>
-        </w:tc>
-      </w:tr>
-      <w:tr>
-        <w:tc>
-          <w:tcPr>
-            <w:tcW w:type="dxa" w:w="4536"/>
-            <w:shd w:fill="fff5dc"/>
-            <w:tcBorders>
-              <w:top w:val="single" w:sz="4" w:color="d4af37"/>
-              <w:left w:val="single" w:sz="4" w:color="d4af37"/>
-              <w:bottom w:val="single" w:sz="4" w:color="d4af37"/>
-              <w:right w:val="single" w:sz="4" w:color="d4af37"/>
-            </w:tcBorders>
-          </w:tcPr>
-          <w:p>
-            <w:r/>
-            <w:r>
-              <w:rPr>
-                <w:rFonts w:ascii="Arial" w:hAnsi="Arial"/>
-                <w:b w:val="0"/>
-                <w:color w:val="282828"/>
-                <w:sz w:val="22"/>
-              </w:rPr>
-              <w:t>Typed return values</w:t>
-            </w:r>
-          </w:p>
-        </w:tc>
-        <w:tc>
-          <w:tcPr>
-            <w:tcW w:type="dxa" w:w="4536"/>
-            <w:shd w:fill="fff5dc"/>
-            <w:tcBorders>
-              <w:top w:val="single" w:sz="4" w:color="d4af37"/>
-              <w:left w:val="single" w:sz="4" w:color="d4af37"/>
-              <w:bottom w:val="single" w:sz="4" w:color="d4af37"/>
-              <w:right w:val="single" w:sz="4" w:color="d4af37"/>
-            </w:tcBorders>
-          </w:tcPr>
-          <w:p>
-            <w:r/>
-            <w:r>
-              <w:rPr>
-                <w:rFonts w:ascii="Arial" w:hAnsi="Arial"/>
-                <w:b w:val="0"/>
-                <w:color w:val="282828"/>
-                <w:sz w:val="22"/>
-              </w:rPr>
-              <w:t>`borrowGame()` returns `bool`, `findGameById()` returns `Game?`</w:t>
-            </w:r>
-          </w:p>
-        </w:tc>
-      </w:tr>
-      <w:tr>
-        <w:tc>
-          <w:tcPr>
-            <w:tcW w:type="dxa" w:w="4536"/>
-            <w:shd w:fill="fff5dc"/>
-            <w:tcBorders>
-              <w:top w:val="single" w:sz="4" w:color="d4af37"/>
-              <w:left w:val="single" w:sz="4" w:color="d4af37"/>
-              <w:bottom w:val="single" w:sz="4" w:color="d4af37"/>
-              <w:right w:val="single" w:sz="4" w:color="d4af37"/>
-            </w:tcBorders>
-          </w:tcPr>
-          <w:p>
-            <w:r/>
-            <w:r>
-              <w:rPr>
-                <w:rFonts w:ascii="Arial" w:hAnsi="Arial"/>
-                <w:b w:val="0"/>
-                <w:color w:val="282828"/>
-                <w:sz w:val="22"/>
-              </w:rPr>
-              <w:t>`for` loop</w:t>
-            </w:r>
-          </w:p>
-        </w:tc>
-        <w:tc>
-          <w:tcPr>
-            <w:tcW w:type="dxa" w:w="4536"/>
-            <w:shd w:fill="fff5dc"/>
-            <w:tcBorders>
-              <w:top w:val="single" w:sz="4" w:color="d4af37"/>
-              <w:left w:val="single" w:sz="4" w:color="d4af37"/>
-              <w:bottom w:val="single" w:sz="4" w:color="d4af37"/>
-              <w:right w:val="single" w:sz="4" w:color="d4af37"/>
-            </w:tcBorders>
-          </w:tcPr>
-          <w:p>
-            <w:r/>
-            <w:r>
-              <w:rPr>
-                <w:rFonts w:ascii="Arial" w:hAnsi="Arial"/>
-                <w:b w:val="0"/>
-                <w:color w:val="282828"/>
-                <w:sz w:val="22"/>
-              </w:rPr>
-              <w:t>Indexed catalog listing in `GameLibrary.listCatalog()`</w:t>
-            </w:r>
-          </w:p>
-        </w:tc>
-      </w:tr>
-      <w:tr>
-        <w:tc>
-          <w:tcPr>
-            <w:tcW w:type="dxa" w:w="4536"/>
-            <w:shd w:fill="fff5dc"/>
-            <w:tcBorders>
-              <w:top w:val="single" w:sz="4" w:color="d4af37"/>
-              <w:left w:val="single" w:sz="4" w:color="d4af37"/>
-              <w:bottom w:val="single" w:sz="4" w:color="d4af37"/>
-              <w:right w:val="single" w:sz="4" w:color="d4af37"/>
-            </w:tcBorders>
-          </w:tcPr>
-          <w:p>
-            <w:r/>
-            <w:r>
-              <w:rPr>
-                <w:rFonts w:ascii="Arial" w:hAnsi="Arial"/>
-                <w:b w:val="0"/>
-                <w:color w:val="282828"/>
-                <w:sz w:val="22"/>
-              </w:rPr>
-              <w:t>`while` loop</w:t>
-            </w:r>
-          </w:p>
-        </w:tc>
-        <w:tc>
-          <w:tcPr>
-            <w:tcW w:type="dxa" w:w="4536"/>
-            <w:shd w:fill="fff5dc"/>
-            <w:tcBorders>
-              <w:top w:val="single" w:sz="4" w:color="d4af37"/>
-              <w:left w:val="single" w:sz="4" w:color="d4af37"/>
-              <w:bottom w:val="single" w:sz="4" w:color="d4af37"/>
-              <w:right w:val="single" w:sz="4" w:color="d4af37"/>
-            </w:tcBorders>
-          </w:tcPr>
-          <w:p>
-            <w:r/>
-            <w:r>
-              <w:rPr>
-                <w:rFonts w:ascii="Arial" w:hAnsi="Arial"/>
-                <w:b w:val="0"/>
-                <w:color w:val="282828"/>
-                <w:sz w:val="22"/>
-              </w:rPr>
-              <w:t>Player-count recommendation search in `recommendForPlayers()`</w:t>
-            </w:r>
-          </w:p>
-        </w:tc>
-      </w:tr>
-      <w:tr>
-        <w:tc>
-          <w:tcPr>
-            <w:tcW w:type="dxa" w:w="4536"/>
-            <w:shd w:fill="fff5dc"/>
-            <w:tcBorders>
-              <w:top w:val="single" w:sz="4" w:color="d4af37"/>
-              <w:left w:val="single" w:sz="4" w:color="d4af37"/>
-              <w:bottom w:val="single" w:sz="4" w:color="d4af37"/>
-              <w:right w:val="single" w:sz="4" w:color="d4af37"/>
-            </w:tcBorders>
-          </w:tcPr>
-          <w:p>
-            <w:r/>
-            <w:r>
-              <w:rPr>
-                <w:rFonts w:ascii="Arial" w:hAnsi="Arial"/>
-                <w:b w:val="0"/>
-                <w:color w:val="282828"/>
-                <w:sz w:val="22"/>
-              </w:rPr>
-              <w:t>`for-in` loop</w:t>
-            </w:r>
-          </w:p>
-        </w:tc>
-        <w:tc>
-          <w:tcPr>
-            <w:tcW w:type="dxa" w:w="4536"/>
-            <w:shd w:fill="fff5dc"/>
-            <w:tcBorders>
-              <w:top w:val="single" w:sz="4" w:color="d4af37"/>
-              <w:left w:val="single" w:sz="4" w:color="d4af37"/>
-              <w:bottom w:val="single" w:sz="4" w:color="d4af37"/>
-              <w:right w:val="single" w:sz="4" w:color="d4af37"/>
-            </w:tcBorders>
-          </w:tcPr>
-          <w:p>
-            <w:r/>
-            <w:r>
-              <w:rPr>
-                <w:rFonts w:ascii="Arial" w:hAnsi="Arial"/>
-                <w:b w:val="0"/>
-                <w:color w:val="282828"/>
-                <w:sz w:val="22"/>
-              </w:rPr>
-              <w:t>Iterating member borrows in `Member.showBorrowedGames()`</w:t>
-            </w:r>
-          </w:p>
-        </w:tc>
-      </w:tr>
-      <w:tr>
-        <w:tc>
-          <w:tcPr>
-            <w:tcW w:type="dxa" w:w="4536"/>
-            <w:shd w:fill="fff5dc"/>
-            <w:tcBorders>
-              <w:top w:val="single" w:sz="4" w:color="d4af37"/>
-              <w:left w:val="single" w:sz="4" w:color="d4af37"/>
-              <w:bottom w:val="single" w:sz="4" w:color="d4af37"/>
-              <w:right w:val="single" w:sz="4" w:color="d4af37"/>
-            </w:tcBorders>
-          </w:tcPr>
-          <w:p>
-            <w:r/>
-            <w:r>
-              <w:rPr>
-                <w:rFonts w:ascii="Arial" w:hAnsi="Arial"/>
-                <w:b w:val="0"/>
-                <w:color w:val="282828"/>
-                <w:sz w:val="22"/>
-              </w:rPr>
-              <w:t>Abstract class</w:t>
-            </w:r>
-          </w:p>
-        </w:tc>
-        <w:tc>
-          <w:tcPr>
-            <w:tcW w:type="dxa" w:w="4536"/>
-            <w:shd w:fill="fff5dc"/>
-            <w:tcBorders>
-              <w:top w:val="single" w:sz="4" w:color="d4af37"/>
-              <w:left w:val="single" w:sz="4" w:color="d4af37"/>
-              <w:bottom w:val="single" w:sz="4" w:color="d4af37"/>
-              <w:right w:val="single" w:sz="4" w:color="d4af37"/>
-            </w:tcBorders>
-          </w:tcPr>
-          <w:p>
-            <w:r/>
-            <w:r>
-              <w:rPr>
-                <w:rFonts w:ascii="Arial" w:hAnsi="Arial"/>
-                <w:b w:val="0"/>
-                <w:color w:val="282828"/>
-                <w:sz w:val="22"/>
-              </w:rPr>
-              <w:t>`Game` with abstract `describe()`</w:t>
-            </w:r>
-          </w:p>
-        </w:tc>
-      </w:tr>
-      <w:tr>
-        <w:tc>
-          <w:tcPr>
-            <w:tcW w:type="dxa" w:w="4536"/>
-            <w:shd w:fill="fff5dc"/>
-            <w:tcBorders>
-              <w:top w:val="single" w:sz="4" w:color="d4af37"/>
-              <w:left w:val="single" w:sz="4" w:color="d4af37"/>
-              <w:bottom w:val="single" w:sz="4" w:color="d4af37"/>
-              <w:right w:val="single" w:sz="4" w:color="d4af37"/>
-            </w:tcBorders>
-          </w:tcPr>
-          <w:p>
-            <w:r/>
-            <w:r>
-              <w:rPr>
-                <w:rFonts w:ascii="Arial" w:hAnsi="Arial"/>
-                <w:b w:val="0"/>
-                <w:color w:val="282828"/>
-                <w:sz w:val="22"/>
-              </w:rPr>
-              <w:t>Inheritance</w:t>
-            </w:r>
-          </w:p>
-        </w:tc>
-        <w:tc>
-          <w:tcPr>
-            <w:tcW w:type="dxa" w:w="4536"/>
-            <w:shd w:fill="fff5dc"/>
-            <w:tcBorders>
-              <w:top w:val="single" w:sz="4" w:color="d4af37"/>
-              <w:left w:val="single" w:sz="4" w:color="d4af37"/>
-              <w:bottom w:val="single" w:sz="4" w:color="d4af37"/>
-              <w:right w:val="single" w:sz="4" w:color="d4af37"/>
-            </w:tcBorders>
-          </w:tcPr>
-          <w:p>
-            <w:r/>
-            <w:r>
-              <w:rPr>
-                <w:rFonts w:ascii="Arial" w:hAnsi="Arial"/>
-                <w:b w:val="0"/>
-                <w:color w:val="282828"/>
-                <w:sz w:val="22"/>
-              </w:rPr>
-              <w:t>`BoardGame`, `CardGame`, `RPGManual` extend `Game`</w:t>
-            </w:r>
-          </w:p>
-        </w:tc>
-      </w:tr>
-      <w:tr>
-        <w:tc>
-          <w:tcPr>
-            <w:tcW w:type="dxa" w:w="4536"/>
-            <w:shd w:fill="fff5dc"/>
-            <w:tcBorders>
-              <w:top w:val="single" w:sz="4" w:color="d4af37"/>
-              <w:left w:val="single" w:sz="4" w:color="d4af37"/>
-              <w:bottom w:val="single" w:sz="4" w:color="d4af37"/>
-              <w:right w:val="single" w:sz="4" w:color="d4af37"/>
-            </w:tcBorders>
-          </w:tcPr>
-          <w:p>
-            <w:r/>
-            <w:r>
-              <w:rPr>
-                <w:rFonts w:ascii="Arial" w:hAnsi="Arial"/>
-                <w:b w:val="0"/>
-                <w:color w:val="282828"/>
-                <w:sz w:val="22"/>
-              </w:rPr>
-              <w:t>Polymorphism</w:t>
-            </w:r>
-          </w:p>
-        </w:tc>
-        <w:tc>
-          <w:tcPr>
-            <w:tcW w:type="dxa" w:w="4536"/>
-            <w:shd w:fill="fff5dc"/>
-            <w:tcBorders>
-              <w:top w:val="single" w:sz="4" w:color="d4af37"/>
-              <w:left w:val="single" w:sz="4" w:color="d4af37"/>
-              <w:bottom w:val="single" w:sz="4" w:color="d4af37"/>
-              <w:right w:val="single" w:sz="4" w:color="d4af37"/>
-            </w:tcBorders>
-          </w:tcPr>
-          <w:p>
-            <w:r/>
-            <w:r>
-              <w:rPr>
-                <w:rFonts w:ascii="Arial" w:hAnsi="Arial"/>
-                <w:b w:val="0"/>
-                <w:color w:val="282828"/>
-                <w:sz w:val="22"/>
-              </w:rPr>
-              <w:t>Each subclass `@override` of `describe()`</w:t>
-            </w:r>
-          </w:p>
-        </w:tc>
-      </w:tr>
-      <w:tr>
-        <w:tc>
-          <w:tcPr>
-            <w:tcW w:type="dxa" w:w="4536"/>
-            <w:shd w:fill="fff5dc"/>
-            <w:tcBorders>
-              <w:top w:val="single" w:sz="4" w:color="d4af37"/>
-              <w:left w:val="single" w:sz="4" w:color="d4af37"/>
-              <w:bottom w:val="single" w:sz="4" w:color="d4af37"/>
-              <w:right w:val="single" w:sz="4" w:color="d4af37"/>
-            </w:tcBorders>
-          </w:tcPr>
-          <w:p>
-            <w:r/>
-            <w:r>
-              <w:rPr>
-                <w:rFonts w:ascii="Arial" w:hAnsi="Arial"/>
-                <w:b w:val="0"/>
-                <w:color w:val="282828"/>
-                <w:sz w:val="22"/>
-              </w:rPr>
-              <w:t>Encapsulation</w:t>
-            </w:r>
-          </w:p>
-        </w:tc>
-        <w:tc>
-          <w:tcPr>
-            <w:tcW w:type="dxa" w:w="4536"/>
-            <w:shd w:fill="fff5dc"/>
-            <w:tcBorders>
-              <w:top w:val="single" w:sz="4" w:color="d4af37"/>
-              <w:left w:val="single" w:sz="4" w:color="d4af37"/>
-              <w:bottom w:val="single" w:sz="4" w:color="d4af37"/>
-              <w:right w:val="single" w:sz="4" w:color="d4af37"/>
-            </w:tcBorders>
-          </w:tcPr>
-          <w:p>
-            <w:r/>
-            <w:r>
-              <w:rPr>
-                <w:rFonts w:ascii="Arial" w:hAnsi="Arial"/>
-                <w:b w:val="0"/>
-                <w:color w:val="282828"/>
-                <w:sz w:val="22"/>
-              </w:rPr>
-              <w:t>Borrow/return logic controlled by `GameLibrary`</w:t>
-            </w:r>
-          </w:p>
-        </w:tc>
-      </w:tr>
-    </w:tbl>
-    <w:p>
-      <w:pPr>
-        <w:pStyle w:val="Heading1"/>
-      </w:pPr>
-      <w:r>
-        <w:rPr>
-          <w:rFonts w:ascii="Arial" w:hAnsi="Arial"/>
-          <w:b/>
-          <w:color w:val="D4AF37"/>
-          <w:sz w:val="40"/>
-        </w:rPr>
-        <w:t>5. File Guide</w:t>
-      </w:r>
-    </w:p>
-    <w:tbl>
-      <w:tblPr>
-        <w:tblStyle w:val="TableGrid"/>
-        <w:tblW w:type="auto" w:w="0"/>
-        <w:jc w:val="center"/>
-        <w:tblLook w:firstColumn="1" w:firstRow="1" w:lastColumn="0" w:lastRow="0" w:noHBand="0" w:noVBand="1" w:val="04A0"/>
-      </w:tblPr>
-      <w:tblGrid>
-        <w:gridCol w:w="4536"/>
-        <w:gridCol w:w="4536"/>
-      </w:tblGrid>
-      <w:tr>
-        <w:tc>
-          <w:tcPr>
-            <w:tcW w:type="dxa" w:w="4536"/>
-            <w:shd w:fill="d4af37"/>
-            <w:tcBorders>
-              <w:top w:val="single" w:sz="6" w:color="d4af37"/>
-              <w:left w:val="single" w:sz="6" w:color="d4af37"/>
-              <w:bottom w:val="single" w:sz="6" w:color="d4af37"/>
-              <w:right w:val="single" w:sz="6" w:color="d4af37"/>
-            </w:tcBorders>
-          </w:tcPr>
-          <w:p>
-            <w:r/>
-            <w:r>
-              <w:rPr>
-                <w:rFonts w:ascii="Arial" w:hAnsi="Arial"/>
-                <w:b/>
-                <w:color w:val="FFFFFF"/>
-                <w:sz w:val="22"/>
-              </w:rPr>
-              <w:t>File</w:t>
-            </w:r>
-          </w:p>
-        </w:tc>
-        <w:tc>
-          <w:tcPr>
-            <w:tcW w:type="dxa" w:w="4536"/>
-            <w:shd w:fill="d4af37"/>
-            <w:tcBorders>
-              <w:top w:val="single" w:sz="6" w:color="d4af37"/>
-              <w:left w:val="single" w:sz="6" w:color="d4af37"/>
-              <w:bottom w:val="single" w:sz="6" w:color="d4af37"/>
-              <w:right w:val="single" w:sz="6" w:color="d4af37"/>
-            </w:tcBorders>
-          </w:tcPr>
-          <w:p>
-            <w:r/>
-            <w:r>
-              <w:rPr>
-                <w:rFonts w:ascii="Arial" w:hAnsi="Arial"/>
-                <w:b/>
-                <w:color w:val="FFFFFF"/>
-                <w:sz w:val="22"/>
-              </w:rPr>
-              <w:t>Responsibility</w:t>
-            </w:r>
-          </w:p>
-        </w:tc>
-      </w:tr>
-      <w:tr>
-        <w:tc>
-          <w:tcPr>
-            <w:tcW w:type="dxa" w:w="4536"/>
-            <w:shd w:fill="fff5dc"/>
-            <w:tcBorders>
-              <w:top w:val="single" w:sz="4" w:color="d4af37"/>
-              <w:left w:val="single" w:sz="4" w:color="d4af37"/>
-              <w:bottom w:val="single" w:sz="4" w:color="d4af37"/>
-              <w:right w:val="single" w:sz="4" w:color="d4af37"/>
-            </w:tcBorders>
-          </w:tcPr>
-          <w:p>
-            <w:r/>
-            <w:r>
-              <w:rPr>
-                <w:rFonts w:ascii="Arial" w:hAnsi="Arial"/>
-                <w:b w:val="0"/>
-                <w:color w:val="282828"/>
-                <w:sz w:val="22"/>
-              </w:rPr>
-              <w:t>`lib/game.dart`</w:t>
-            </w:r>
-          </w:p>
-        </w:tc>
-        <w:tc>
-          <w:tcPr>
-            <w:tcW w:type="dxa" w:w="4536"/>
-            <w:shd w:fill="fff5dc"/>
-            <w:tcBorders>
-              <w:top w:val="single" w:sz="4" w:color="d4af37"/>
-              <w:left w:val="single" w:sz="4" w:color="d4af37"/>
-              <w:bottom w:val="single" w:sz="4" w:color="d4af37"/>
-              <w:right w:val="single" w:sz="4" w:color="d4af37"/>
-            </w:tcBorders>
-          </w:tcPr>
-          <w:p>
-            <w:r/>
-            <w:r>
-              <w:rPr>
-                <w:rFonts w:ascii="Arial" w:hAnsi="Arial"/>
-                <w:b w:val="0"/>
-                <w:color w:val="282828"/>
-                <w:sz w:val="22"/>
-              </w:rPr>
-              <w:t>Abstract `Game` base class</w:t>
-            </w:r>
-          </w:p>
-        </w:tc>
-      </w:tr>
-      <w:tr>
-        <w:tc>
-          <w:tcPr>
-            <w:tcW w:type="dxa" w:w="4536"/>
-            <w:shd w:fill="fff5dc"/>
-            <w:tcBorders>
-              <w:top w:val="single" w:sz="4" w:color="d4af37"/>
-              <w:left w:val="single" w:sz="4" w:color="d4af37"/>
-              <w:bottom w:val="single" w:sz="4" w:color="d4af37"/>
-              <w:right w:val="single" w:sz="4" w:color="d4af37"/>
-            </w:tcBorders>
-          </w:tcPr>
-          <w:p>
-            <w:r/>
-            <w:r>
-              <w:rPr>
-                <w:rFonts w:ascii="Arial" w:hAnsi="Arial"/>
-                <w:b w:val="0"/>
-                <w:color w:val="282828"/>
-                <w:sz w:val="22"/>
-              </w:rPr>
-              <w:t>`lib/board_game.dart`</w:t>
-            </w:r>
-          </w:p>
-        </w:tc>
-        <w:tc>
-          <w:tcPr>
-            <w:tcW w:type="dxa" w:w="4536"/>
-            <w:shd w:fill="fff5dc"/>
-            <w:tcBorders>
-              <w:top w:val="single" w:sz="4" w:color="d4af37"/>
-              <w:left w:val="single" w:sz="4" w:color="d4af37"/>
-              <w:bottom w:val="single" w:sz="4" w:color="d4af37"/>
-              <w:right w:val="single" w:sz="4" w:color="d4af37"/>
-            </w:tcBorders>
-          </w:tcPr>
-          <w:p>
-            <w:r/>
-            <w:r>
-              <w:rPr>
-                <w:rFonts w:ascii="Arial" w:hAnsi="Arial"/>
-                <w:b w:val="0"/>
-                <w:color w:val="282828"/>
-                <w:sz w:val="22"/>
-              </w:rPr>
-              <w:t>Board-game subclass with player counts and complexity</w:t>
-            </w:r>
-          </w:p>
-        </w:tc>
-      </w:tr>
-      <w:tr>
-        <w:tc>
-          <w:tcPr>
-            <w:tcW w:type="dxa" w:w="4536"/>
-            <w:shd w:fill="fff5dc"/>
-            <w:tcBorders>
-              <w:top w:val="single" w:sz="4" w:color="d4af37"/>
-              <w:left w:val="single" w:sz="4" w:color="d4af37"/>
-              <w:bottom w:val="single" w:sz="4" w:color="d4af37"/>
-              <w:right w:val="single" w:sz="4" w:color="d4af37"/>
-            </w:tcBorders>
-          </w:tcPr>
-          <w:p>
-            <w:r/>
-            <w:r>
-              <w:rPr>
-                <w:rFonts w:ascii="Arial" w:hAnsi="Arial"/>
-                <w:b w:val="0"/>
-                <w:color w:val="282828"/>
-                <w:sz w:val="22"/>
-              </w:rPr>
-              <w:t>`lib/card_game.dart`</w:t>
-            </w:r>
-          </w:p>
-        </w:tc>
-        <w:tc>
-          <w:tcPr>
-            <w:tcW w:type="dxa" w:w="4536"/>
-            <w:shd w:fill="fff5dc"/>
-            <w:tcBorders>
-              <w:top w:val="single" w:sz="4" w:color="d4af37"/>
-              <w:left w:val="single" w:sz="4" w:color="d4af37"/>
-              <w:bottom w:val="single" w:sz="4" w:color="d4af37"/>
-              <w:right w:val="single" w:sz="4" w:color="d4af37"/>
-            </w:tcBorders>
-          </w:tcPr>
-          <w:p>
-            <w:r/>
-            <w:r>
-              <w:rPr>
-                <w:rFonts w:ascii="Arial" w:hAnsi="Arial"/>
-                <w:b w:val="0"/>
-                <w:color w:val="282828"/>
-                <w:sz w:val="22"/>
-              </w:rPr>
-              <w:t>Card-game subclass with deck size</w:t>
-            </w:r>
-          </w:p>
-        </w:tc>
-      </w:tr>
-      <w:tr>
-        <w:tc>
-          <w:tcPr>
-            <w:tcW w:type="dxa" w:w="4536"/>
-            <w:shd w:fill="fff5dc"/>
-            <w:tcBorders>
-              <w:top w:val="single" w:sz="4" w:color="d4af37"/>
-              <w:left w:val="single" w:sz="4" w:color="d4af37"/>
-              <w:bottom w:val="single" w:sz="4" w:color="d4af37"/>
-              <w:right w:val="single" w:sz="4" w:color="d4af37"/>
-            </w:tcBorders>
-          </w:tcPr>
-          <w:p>
-            <w:r/>
-            <w:r>
-              <w:rPr>
-                <w:rFonts w:ascii="Arial" w:hAnsi="Arial"/>
-                <w:b w:val="0"/>
-                <w:color w:val="282828"/>
-                <w:sz w:val="22"/>
-              </w:rPr>
-              <w:t>`lib/rpg_manual.dart`</w:t>
-            </w:r>
-          </w:p>
-        </w:tc>
-        <w:tc>
-          <w:tcPr>
-            <w:tcW w:type="dxa" w:w="4536"/>
-            <w:shd w:fill="fff5dc"/>
-            <w:tcBorders>
-              <w:top w:val="single" w:sz="4" w:color="d4af37"/>
-              <w:left w:val="single" w:sz="4" w:color="d4af37"/>
-              <w:bottom w:val="single" w:sz="4" w:color="d4af37"/>
-              <w:right w:val="single" w:sz="4" w:color="d4af37"/>
-            </w:tcBorders>
-          </w:tcPr>
-          <w:p>
-            <w:r/>
-            <w:r>
-              <w:rPr>
-                <w:rFonts w:ascii="Arial" w:hAnsi="Arial"/>
-                <w:b w:val="0"/>
-                <w:color w:val="282828"/>
-                <w:sz w:val="22"/>
-              </w:rPr>
-              <w:t>RPG manual subclass with edition and page count</w:t>
-            </w:r>
-          </w:p>
-        </w:tc>
-      </w:tr>
-      <w:tr>
-        <w:tc>
-          <w:tcPr>
-            <w:tcW w:type="dxa" w:w="4536"/>
-            <w:shd w:fill="fff5dc"/>
-            <w:tcBorders>
-              <w:top w:val="single" w:sz="4" w:color="d4af37"/>
-              <w:left w:val="single" w:sz="4" w:color="d4af37"/>
-              <w:bottom w:val="single" w:sz="4" w:color="d4af37"/>
-              <w:right w:val="single" w:sz="4" w:color="d4af37"/>
-            </w:tcBorders>
-          </w:tcPr>
-          <w:p>
-            <w:r/>
-            <w:r>
-              <w:rPr>
-                <w:rFonts w:ascii="Arial" w:hAnsi="Arial"/>
-                <w:b w:val="0"/>
-                <w:color w:val="282828"/>
-                <w:sz w:val="22"/>
-              </w:rPr>
-              <w:t>`lib/member.dart`</w:t>
-            </w:r>
-          </w:p>
-        </w:tc>
-        <w:tc>
-          <w:tcPr>
-            <w:tcW w:type="dxa" w:w="4536"/>
-            <w:shd w:fill="fff5dc"/>
-            <w:tcBorders>
-              <w:top w:val="single" w:sz="4" w:color="d4af37"/>
-              <w:left w:val="single" w:sz="4" w:color="d4af37"/>
-              <w:bottom w:val="single" w:sz="4" w:color="d4af37"/>
-              <w:right w:val="single" w:sz="4" w:color="d4af37"/>
-            </w:tcBorders>
-          </w:tcPr>
-          <w:p>
-            <w:r/>
-            <w:r>
-              <w:rPr>
-                <w:rFonts w:ascii="Arial" w:hAnsi="Arial"/>
-                <w:b w:val="0"/>
-                <w:color w:val="282828"/>
-                <w:sz w:val="22"/>
-              </w:rPr>
-              <w:t>Member record and active borrow list</w:t>
-            </w:r>
-          </w:p>
-        </w:tc>
-      </w:tr>
-      <w:tr>
-        <w:tc>
-          <w:tcPr>
-            <w:tcW w:type="dxa" w:w="4536"/>
-            <w:shd w:fill="fff5dc"/>
-            <w:tcBorders>
-              <w:top w:val="single" w:sz="4" w:color="d4af37"/>
-              <w:left w:val="single" w:sz="4" w:color="d4af37"/>
-              <w:bottom w:val="single" w:sz="4" w:color="d4af37"/>
-              <w:right w:val="single" w:sz="4" w:color="d4af37"/>
-            </w:tcBorders>
-          </w:tcPr>
-          <w:p>
-            <w:r/>
-            <w:r>
-              <w:rPr>
-                <w:rFonts w:ascii="Arial" w:hAnsi="Arial"/>
-                <w:b w:val="0"/>
-                <w:color w:val="282828"/>
-                <w:sz w:val="22"/>
-              </w:rPr>
-              <w:t>`lib/game_library.dart`</w:t>
-            </w:r>
-          </w:p>
-        </w:tc>
-        <w:tc>
-          <w:tcPr>
-            <w:tcW w:type="dxa" w:w="4536"/>
-            <w:shd w:fill="fff5dc"/>
-            <w:tcBorders>
-              <w:top w:val="single" w:sz="4" w:color="d4af37"/>
-              <w:left w:val="single" w:sz="4" w:color="d4af37"/>
-              <w:bottom w:val="single" w:sz="4" w:color="d4af37"/>
-              <w:right w:val="single" w:sz="4" w:color="d4af37"/>
-            </w:tcBorders>
-          </w:tcPr>
-          <w:p>
-            <w:r/>
-            <w:r>
-              <w:rPr>
-                <w:rFonts w:ascii="Arial" w:hAnsi="Arial"/>
-                <w:b w:val="0"/>
-                <w:color w:val="282828"/>
-                <w:sz w:val="22"/>
-              </w:rPr>
-              <w:t>Central controller for catalog and transactions</w:t>
-            </w:r>
-          </w:p>
-        </w:tc>
-      </w:tr>
-      <w:tr>
-        <w:tc>
-          <w:tcPr>
-            <w:tcW w:type="dxa" w:w="4536"/>
-            <w:shd w:fill="fff5dc"/>
-            <w:tcBorders>
-              <w:top w:val="single" w:sz="4" w:color="d4af37"/>
-              <w:left w:val="single" w:sz="4" w:color="d4af37"/>
-              <w:bottom w:val="single" w:sz="4" w:color="d4af37"/>
-              <w:right w:val="single" w:sz="4" w:color="d4af37"/>
-            </w:tcBorders>
-          </w:tcPr>
-          <w:p>
-            <w:r/>
-            <w:r>
-              <w:rPr>
-                <w:rFonts w:ascii="Arial" w:hAnsi="Arial"/>
-                <w:b w:val="0"/>
-                <w:color w:val="282828"/>
-                <w:sz w:val="22"/>
-              </w:rPr>
-              <w:t>`lib/late_fee_calculator.dart`</w:t>
-            </w:r>
-          </w:p>
-        </w:tc>
-        <w:tc>
-          <w:tcPr>
-            <w:tcW w:type="dxa" w:w="4536"/>
-            <w:shd w:fill="fff5dc"/>
-            <w:tcBorders>
-              <w:top w:val="single" w:sz="4" w:color="d4af37"/>
-              <w:left w:val="single" w:sz="4" w:color="d4af37"/>
-              <w:bottom w:val="single" w:sz="4" w:color="d4af37"/>
-              <w:right w:val="single" w:sz="4" w:color="d4af37"/>
-            </w:tcBorders>
-          </w:tcPr>
-          <w:p>
-            <w:r/>
-            <w:r>
-              <w:rPr>
-                <w:rFonts w:ascii="Arial" w:hAnsi="Arial"/>
-                <w:b w:val="0"/>
-                <w:color w:val="282828"/>
-                <w:sz w:val="22"/>
-              </w:rPr>
-              <w:t>Pure function for overdue fees</w:t>
-            </w:r>
-          </w:p>
-        </w:tc>
-      </w:tr>
-      <w:tr>
-        <w:tc>
-          <w:tcPr>
-            <w:tcW w:type="dxa" w:w="4536"/>
-            <w:shd w:fill="fff5dc"/>
-            <w:tcBorders>
-              <w:top w:val="single" w:sz="4" w:color="d4af37"/>
-              <w:left w:val="single" w:sz="4" w:color="d4af37"/>
-              <w:bottom w:val="single" w:sz="4" w:color="d4af37"/>
-              <w:right w:val="single" w:sz="4" w:color="d4af37"/>
-            </w:tcBorders>
-          </w:tcPr>
-          <w:p>
-            <w:r/>
-            <w:r>
-              <w:rPr>
-                <w:rFonts w:ascii="Arial" w:hAnsi="Arial"/>
-                <w:b w:val="0"/>
-                <w:color w:val="282828"/>
-                <w:sz w:val="22"/>
-              </w:rPr>
-              <w:t>`lib/main.dart`</w:t>
-            </w:r>
-          </w:p>
-        </w:tc>
-        <w:tc>
-          <w:tcPr>
-            <w:tcW w:type="dxa" w:w="4536"/>
-            <w:shd w:fill="fff5dc"/>
-            <w:tcBorders>
-              <w:top w:val="single" w:sz="4" w:color="d4af37"/>
-              <w:left w:val="single" w:sz="4" w:color="d4af37"/>
-              <w:bottom w:val="single" w:sz="4" w:color="d4af37"/>
-              <w:right w:val="single" w:sz="4" w:color="d4af37"/>
-            </w:tcBorders>
-          </w:tcPr>
-          <w:p>
-            <w:r/>
-            <w:r>
-              <w:rPr>
-                <w:rFonts w:ascii="Arial" w:hAnsi="Arial"/>
-                <w:b w:val="0"/>
-                <w:color w:val="282828"/>
-                <w:sz w:val="22"/>
-              </w:rPr>
-              <w:t>Demo script that runs the workflow</w:t>
-            </w:r>
-          </w:p>
-        </w:tc>
-      </w:tr>
-    </w:tbl>
-    <w:p>
-      <w:pPr>
-        <w:pStyle w:val="Heading1"/>
-      </w:pPr>
-      <w:r>
-        <w:rPr>
-          <w:rFonts w:ascii="Arial" w:hAnsi="Arial"/>
-          <w:b/>
-          <w:color w:val="D4AF37"/>
-          <w:sz w:val="40"/>
-        </w:rPr>
-        <w:t>6. Design Notes</w:t>
-      </w:r>
-    </w:p>
-    <w:p>
-      <w:r>
-        <w:rPr>
-          <w:rFonts w:ascii="Arial" w:hAnsi="Arial"/>
-          <w:b w:val="0"/>
-          <w:color w:val="282828"/>
-          <w:sz w:val="22"/>
-        </w:rPr>
-      </w:r>
-      <w:r>
-        <w:rPr>
-          <w:rFonts w:ascii="Arial" w:hAnsi="Arial"/>
-          <w:b/>
-          <w:color w:val="D4AF37"/>
-          <w:sz w:val="22"/>
-        </w:rPr>
-        <w:t>Why inheritance?</w:t>
-      </w:r>
-      <w:r>
-        <w:rPr>
-          <w:rFonts w:ascii="Arial" w:hAnsi="Arial"/>
-          <w:b w:val="0"/>
-          <w:color w:val="282828"/>
-          <w:sz w:val="22"/>
-        </w:rPr>
-        <w:t xml:space="preserve"> Board games, card games, and RPG manuals share common fields — title, publisher, year, genre, availability — but each has unique data. An abstract `Game` class lets the rest of the system treat every item uniformly while subclasses store their own details.</w:t>
-      </w:r>
-    </w:p>
-    <w:p>
-      <w:r>
-        <w:rPr>
-          <w:rFonts w:ascii="Arial" w:hAnsi="Arial"/>
-          <w:b w:val="0"/>
-          <w:color w:val="282828"/>
-          <w:sz w:val="22"/>
-        </w:rPr>
-      </w:r>
-      <w:r>
-        <w:rPr>
-          <w:rFonts w:ascii="Arial" w:hAnsi="Arial"/>
-          <w:b/>
-          <w:color w:val="D4AF37"/>
-          <w:sz w:val="22"/>
-        </w:rPr>
-        <w:t>Why a `while` loop for recommendations?</w:t>
-      </w:r>
-      <w:r>
-        <w:rPr>
-          <w:rFonts w:ascii="Arial" w:hAnsi="Arial"/>
-          <w:b w:val="0"/>
-          <w:color w:val="282828"/>
-          <w:sz w:val="22"/>
-        </w:rPr>
-        <w:t xml:space="preserve"> The assignment required multiple loop types. The recommendation search is a natural fit for `while` because it scans until the catalog ends and conditionally collects matches.</w:t>
-      </w:r>
-    </w:p>
-    <w:p>
-      <w:r>
-        <w:rPr>
-          <w:rFonts w:ascii="Arial" w:hAnsi="Arial"/>
-          <w:b w:val="0"/>
-          <w:color w:val="282828"/>
-          <w:sz w:val="22"/>
-        </w:rPr>
-      </w:r>
-      <w:r>
-        <w:rPr>
-          <w:rFonts w:ascii="Arial" w:hAnsi="Arial"/>
-          <w:b/>
-          <w:color w:val="D4AF37"/>
-          <w:sz w:val="22"/>
-        </w:rPr>
-        <w:t>Why named parameters everywhere?</w:t>
-      </w:r>
-      <w:r>
-        <w:rPr>
-          <w:rFonts w:ascii="Arial" w:hAnsi="Arial"/>
-          <w:b w:val="0"/>
-          <w:color w:val="282828"/>
-          <w:sz w:val="22"/>
-        </w:rPr>
-        <w:t xml:space="preserve"> Dart's `{required ...}` syntax removes ambiguity. `borrowGame(memberId: 'M001', gameId: 'BG002')` is clearer than positional arguments.</w:t>
-      </w:r>
-    </w:p>
-    <w:p>
-      <w:pPr>
-        <w:pStyle w:val="Heading1"/>
-      </w:pPr>
-      <w:r>
-        <w:rPr>
-          <w:rFonts w:ascii="Arial" w:hAnsi="Arial"/>
-          <w:b/>
-          <w:color w:val="D4AF37"/>
-          <w:sz w:val="40"/>
-        </w:rPr>
-        <w:t>7. Edge Cases That Don't Break It</w:t>
-      </w:r>
-    </w:p>
-    <w:tbl>
-      <w:tblPr>
-        <w:tblStyle w:val="TableGrid"/>
-        <w:tblW w:type="auto" w:w="0"/>
-        <w:jc w:val="center"/>
-        <w:tblLook w:firstColumn="1" w:firstRow="1" w:lastColumn="0" w:lastRow="0" w:noHBand="0" w:noVBand="1" w:val="04A0"/>
-      </w:tblPr>
-      <w:tblGrid>
-        <w:gridCol w:w="4536"/>
-        <w:gridCol w:w="4536"/>
-      </w:tblGrid>
-      <w:tr>
-        <w:tc>
-          <w:tcPr>
-            <w:tcW w:type="dxa" w:w="4536"/>
-            <w:shd w:fill="d4af37"/>
-            <w:tcBorders>
-              <w:top w:val="single" w:sz="6" w:color="d4af37"/>
-              <w:left w:val="single" w:sz="6" w:color="d4af37"/>
-              <w:bottom w:val="single" w:sz="6" w:color="d4af37"/>
-              <w:right w:val="single" w:sz="6" w:color="d4af37"/>
-            </w:tcBorders>
-          </w:tcPr>
-          <w:p>
-            <w:r/>
-            <w:r>
-              <w:rPr>
-                <w:rFonts w:ascii="Arial" w:hAnsi="Arial"/>
-                <w:b/>
-                <w:color w:val="FFFFFF"/>
-                <w:sz w:val="22"/>
-              </w:rPr>
-              <w:t>Situation</w:t>
-            </w:r>
-          </w:p>
-        </w:tc>
-        <w:tc>
-          <w:tcPr>
-            <w:tcW w:type="dxa" w:w="4536"/>
-            <w:shd w:fill="d4af37"/>
-            <w:tcBorders>
-              <w:top w:val="single" w:sz="6" w:color="d4af37"/>
-              <w:left w:val="single" w:sz="6" w:color="d4af37"/>
-              <w:bottom w:val="single" w:sz="6" w:color="d4af37"/>
-              <w:right w:val="single" w:sz="6" w:color="d4af37"/>
-            </w:tcBorders>
-          </w:tcPr>
-          <w:p>
-            <w:r/>
-            <w:r>
-              <w:rPr>
-                <w:rFonts w:ascii="Arial" w:hAnsi="Arial"/>
-                <w:b/>
-                <w:color w:val="FFFFFF"/>
-                <w:sz w:val="22"/>
-              </w:rPr>
-              <w:t>Behavior</w:t>
-            </w:r>
-          </w:p>
-        </w:tc>
-      </w:tr>
-      <w:tr>
-        <w:tc>
-          <w:tcPr>
-            <w:tcW w:type="dxa" w:w="4536"/>
-            <w:shd w:fill="fff5dc"/>
-            <w:tcBorders>
-              <w:top w:val="single" w:sz="4" w:color="d4af37"/>
-              <w:left w:val="single" w:sz="4" w:color="d4af37"/>
-              <w:bottom w:val="single" w:sz="4" w:color="d4af37"/>
-              <w:right w:val="single" w:sz="4" w:color="d4af37"/>
-            </w:tcBorders>
-          </w:tcPr>
-          <w:p>
-            <w:r/>
-            <w:r>
-              <w:rPr>
-                <w:rFonts w:ascii="Arial" w:hAnsi="Arial"/>
-                <w:b w:val="0"/>
-                <w:color w:val="282828"/>
-                <w:sz w:val="22"/>
-              </w:rPr>
-              <w:t>Invalid member ID</w:t>
-            </w:r>
-          </w:p>
-        </w:tc>
-        <w:tc>
-          <w:tcPr>
-            <w:tcW w:type="dxa" w:w="4536"/>
-            <w:shd w:fill="fff5dc"/>
-            <w:tcBorders>
-              <w:top w:val="single" w:sz="4" w:color="d4af37"/>
-              <w:left w:val="single" w:sz="4" w:color="d4af37"/>
-              <w:bottom w:val="single" w:sz="4" w:color="d4af37"/>
-              <w:right w:val="single" w:sz="4" w:color="d4af37"/>
-            </w:tcBorders>
-          </w:tcPr>
-          <w:p>
-            <w:r/>
-            <w:r>
-              <w:rPr>
-                <w:rFonts w:ascii="Arial" w:hAnsi="Arial"/>
-                <w:b w:val="0"/>
-                <w:color w:val="282828"/>
-                <w:sz w:val="22"/>
-              </w:rPr>
-              <w:t>`Map` lookup returns `null`; transaction is rejected</w:t>
-            </w:r>
-          </w:p>
-        </w:tc>
-      </w:tr>
-      <w:tr>
-        <w:tc>
-          <w:tcPr>
-            <w:tcW w:type="dxa" w:w="4536"/>
-            <w:shd w:fill="fff5dc"/>
-            <w:tcBorders>
-              <w:top w:val="single" w:sz="4" w:color="d4af37"/>
-              <w:left w:val="single" w:sz="4" w:color="d4af37"/>
-              <w:bottom w:val="single" w:sz="4" w:color="d4af37"/>
-              <w:right w:val="single" w:sz="4" w:color="d4af37"/>
-            </w:tcBorders>
-          </w:tcPr>
-          <w:p>
-            <w:r/>
-            <w:r>
-              <w:rPr>
-                <w:rFonts w:ascii="Arial" w:hAnsi="Arial"/>
-                <w:b w:val="0"/>
-                <w:color w:val="282828"/>
-                <w:sz w:val="22"/>
-              </w:rPr>
-              <w:t>Invalid game ID</w:t>
-            </w:r>
-          </w:p>
-        </w:tc>
-        <w:tc>
-          <w:tcPr>
-            <w:tcW w:type="dxa" w:w="4536"/>
-            <w:shd w:fill="fff5dc"/>
-            <w:tcBorders>
-              <w:top w:val="single" w:sz="4" w:color="d4af37"/>
-              <w:left w:val="single" w:sz="4" w:color="d4af37"/>
-              <w:bottom w:val="single" w:sz="4" w:color="d4af37"/>
-              <w:right w:val="single" w:sz="4" w:color="d4af37"/>
-            </w:tcBorders>
-          </w:tcPr>
-          <w:p>
-            <w:r/>
-            <w:r>
-              <w:rPr>
-                <w:rFonts w:ascii="Arial" w:hAnsi="Arial"/>
-                <w:b w:val="0"/>
-                <w:color w:val="282828"/>
-                <w:sz w:val="22"/>
-              </w:rPr>
-              <w:t>Search returns `null`; transaction is rejected</w:t>
-            </w:r>
-          </w:p>
-        </w:tc>
-      </w:tr>
-      <w:tr>
-        <w:tc>
-          <w:tcPr>
-            <w:tcW w:type="dxa" w:w="4536"/>
-            <w:shd w:fill="fff5dc"/>
-            <w:tcBorders>
-              <w:top w:val="single" w:sz="4" w:color="d4af37"/>
-              <w:left w:val="single" w:sz="4" w:color="d4af37"/>
-              <w:bottom w:val="single" w:sz="4" w:color="d4af37"/>
-              <w:right w:val="single" w:sz="4" w:color="d4af37"/>
-            </w:tcBorders>
-          </w:tcPr>
-          <w:p>
-            <w:r/>
-            <w:r>
-              <w:rPr>
-                <w:rFonts w:ascii="Arial" w:hAnsi="Arial"/>
-                <w:b w:val="0"/>
-                <w:color w:val="282828"/>
-                <w:sz w:val="22"/>
-              </w:rPr>
-              <w:t>Borrowing an already-borrowed game</w:t>
-            </w:r>
-          </w:p>
-        </w:tc>
-        <w:tc>
-          <w:tcPr>
-            <w:tcW w:type="dxa" w:w="4536"/>
-            <w:shd w:fill="fff5dc"/>
-            <w:tcBorders>
-              <w:top w:val="single" w:sz="4" w:color="d4af37"/>
-              <w:left w:val="single" w:sz="4" w:color="d4af37"/>
-              <w:bottom w:val="single" w:sz="4" w:color="d4af37"/>
-              <w:right w:val="single" w:sz="4" w:color="d4af37"/>
-            </w:tcBorders>
-          </w:tcPr>
-          <w:p>
-            <w:r/>
-            <w:r>
-              <w:rPr>
-                <w:rFonts w:ascii="Arial" w:hAnsi="Arial"/>
-                <w:b w:val="0"/>
-                <w:color w:val="282828"/>
-                <w:sz w:val="22"/>
-              </w:rPr>
-              <w:t>Blocked by `isAvailable` check</w:t>
-            </w:r>
-          </w:p>
-        </w:tc>
-      </w:tr>
-      <w:tr>
-        <w:tc>
-          <w:tcPr>
-            <w:tcW w:type="dxa" w:w="4536"/>
-            <w:shd w:fill="fff5dc"/>
-            <w:tcBorders>
-              <w:top w:val="single" w:sz="4" w:color="d4af37"/>
-              <w:left w:val="single" w:sz="4" w:color="d4af37"/>
-              <w:bottom w:val="single" w:sz="4" w:color="d4af37"/>
-              <w:right w:val="single" w:sz="4" w:color="d4af37"/>
-            </w:tcBorders>
-          </w:tcPr>
-          <w:p>
-            <w:r/>
-            <w:r>
-              <w:rPr>
-                <w:rFonts w:ascii="Arial" w:hAnsi="Arial"/>
-                <w:b w:val="0"/>
-                <w:color w:val="282828"/>
-                <w:sz w:val="22"/>
-              </w:rPr>
-              <w:t>Returning a game you never borrowed</w:t>
-            </w:r>
-          </w:p>
-        </w:tc>
-        <w:tc>
-          <w:tcPr>
-            <w:tcW w:type="dxa" w:w="4536"/>
-            <w:shd w:fill="fff5dc"/>
-            <w:tcBorders>
-              <w:top w:val="single" w:sz="4" w:color="d4af37"/>
-              <w:left w:val="single" w:sz="4" w:color="d4af37"/>
-              <w:bottom w:val="single" w:sz="4" w:color="d4af37"/>
-              <w:right w:val="single" w:sz="4" w:color="d4af37"/>
-            </w:tcBorders>
-          </w:tcPr>
-          <w:p>
-            <w:r/>
-            <w:r>
-              <w:rPr>
-                <w:rFonts w:ascii="Arial" w:hAnsi="Arial"/>
-                <w:b w:val="0"/>
-                <w:color w:val="282828"/>
-                <w:sz w:val="22"/>
-              </w:rPr>
-              <w:t>Rejected after checking `borrowedGames`</w:t>
-            </w:r>
-          </w:p>
-        </w:tc>
-      </w:tr>
-      <w:tr>
-        <w:tc>
-          <w:tcPr>
-            <w:tcW w:type="dxa" w:w="4536"/>
-            <w:shd w:fill="fff5dc"/>
-            <w:tcBorders>
-              <w:top w:val="single" w:sz="4" w:color="d4af37"/>
-              <w:left w:val="single" w:sz="4" w:color="d4af37"/>
-              <w:bottom w:val="single" w:sz="4" w:color="d4af37"/>
-              <w:right w:val="single" w:sz="4" w:color="d4af37"/>
-            </w:tcBorders>
-          </w:tcPr>
-          <w:p>
-            <w:r/>
-            <w:r>
-              <w:rPr>
-                <w:rFonts w:ascii="Arial" w:hAnsi="Arial"/>
-                <w:b w:val="0"/>
-                <w:color w:val="282828"/>
-                <w:sz w:val="22"/>
-              </w:rPr>
-              <w:t>Zero or negative overdue days</w:t>
-            </w:r>
-          </w:p>
-        </w:tc>
-        <w:tc>
-          <w:tcPr>
-            <w:tcW w:type="dxa" w:w="4536"/>
-            <w:shd w:fill="fff5dc"/>
-            <w:tcBorders>
-              <w:top w:val="single" w:sz="4" w:color="d4af37"/>
-              <w:left w:val="single" w:sz="4" w:color="d4af37"/>
-              <w:bottom w:val="single" w:sz="4" w:color="d4af37"/>
-              <w:right w:val="single" w:sz="4" w:color="d4af37"/>
-            </w:tcBorders>
-          </w:tcPr>
-          <w:p>
-            <w:r/>
-            <w:r>
-              <w:rPr>
-                <w:rFonts w:ascii="Arial" w:hAnsi="Arial"/>
-                <w:b w:val="0"/>
-                <w:color w:val="282828"/>
-                <w:sz w:val="22"/>
-              </w:rPr>
-              <w:t>`calculateLateFee` returns `$0.00`</w:t>
-            </w:r>
-          </w:p>
-        </w:tc>
-      </w:tr>
-      <w:tr>
-        <w:tc>
-          <w:tcPr>
-            <w:tcW w:type="dxa" w:w="4536"/>
-            <w:shd w:fill="fff5dc"/>
-            <w:tcBorders>
-              <w:top w:val="single" w:sz="4" w:color="d4af37"/>
-              <w:left w:val="single" w:sz="4" w:color="d4af37"/>
-              <w:bottom w:val="single" w:sz="4" w:color="d4af37"/>
-              <w:right w:val="single" w:sz="4" w:color="d4af37"/>
-            </w:tcBorders>
-          </w:tcPr>
-          <w:p>
-            <w:r/>
-            <w:r>
-              <w:rPr>
-                <w:rFonts w:ascii="Arial" w:hAnsi="Arial"/>
-                <w:b w:val="0"/>
-                <w:color w:val="282828"/>
-                <w:sz w:val="22"/>
-              </w:rPr>
-              <w:t>No games match the player count</w:t>
-            </w:r>
-          </w:p>
-        </w:tc>
-        <w:tc>
-          <w:tcPr>
-            <w:tcW w:type="dxa" w:w="4536"/>
-            <w:shd w:fill="fff5dc"/>
-            <w:tcBorders>
-              <w:top w:val="single" w:sz="4" w:color="d4af37"/>
-              <w:left w:val="single" w:sz="4" w:color="d4af37"/>
-              <w:bottom w:val="single" w:sz="4" w:color="d4af37"/>
-              <w:right w:val="single" w:sz="4" w:color="d4af37"/>
-            </w:tcBorders>
-          </w:tcPr>
-          <w:p>
-            <w:r/>
-            <w:r>
-              <w:rPr>
-                <w:rFonts w:ascii="Arial" w:hAnsi="Arial"/>
-                <w:b w:val="0"/>
-                <w:color w:val="282828"/>
-                <w:sz w:val="22"/>
-              </w:rPr>
-              <w:t>Prints a clear message instead of crashing</w:t>
-            </w:r>
-          </w:p>
-        </w:tc>
-      </w:tr>
-    </w:tbl>
-    <w:p>
-      <w:pPr>
-        <w:pStyle w:val="Heading1"/>
-      </w:pPr>
-      <w:r>
-        <w:rPr>
-          <w:rFonts w:ascii="Arial" w:hAnsi="Arial"/>
-          <w:b/>
-          <w:color w:val="D4AF37"/>
-          <w:sz w:val="40"/>
-        </w:rPr>
-        <w:t>8. Run It Yourself</w:t>
+        <w:t>2. Quick Start</w:t>
       </w:r>
     </w:p>
     <w:tbl>
@@ -2282,7 +313,32 @@
           <w:color w:val="282828"/>
           <w:sz w:val="22"/>
         </w:rPr>
-        <w:t>Expected output:</w:t>
+        <w:t>The demo creates four games, registers two members, runs a full borrow-return cycle, and prints late fees.</w:t>
+      </w:r>
+    </w:p>
+    <w:p>
+      <w:pPr>
+        <w:pStyle w:val="Heading1"/>
+      </w:pPr>
+      <w:r>
+        <w:rPr>
+          <w:rFonts w:ascii="Arial" w:hAnsi="Arial"/>
+          <w:b/>
+          <w:color w:val="D4AF37"/>
+          <w:sz w:val="40"/>
+        </w:rPr>
+        <w:t>3. The Demo</w:t>
+      </w:r>
+    </w:p>
+    <w:p>
+      <w:r>
+        <w:rPr>
+          <w:rFonts w:ascii="Arial" w:hAnsi="Arial"/>
+          <w:b w:val="0"/>
+          <w:color w:val="282828"/>
+          <w:sz w:val="22"/>
+        </w:rPr>
+        <w:t>When you run the app, this is what happens on screen:</w:t>
       </w:r>
     </w:p>
     <w:tbl>
@@ -2388,6 +444,17 @@
       </w:tr>
     </w:tbl>
     <w:p>
+      <w:r>
+        <w:rPr>
+          <w:rFonts w:ascii="Arial" w:hAnsi="Arial"/>
+          <w:b w:val="0"/>
+          <w:color w:val="282828"/>
+          <w:sz w:val="22"/>
+        </w:rPr>
+        <w:t>Every required Dart feature appears somewhere in this output.</w:t>
+      </w:r>
+    </w:p>
+    <w:p>
       <w:pPr>
         <w:pStyle w:val="Heading1"/>
       </w:pPr>
@@ -2398,7 +465,1094 @@
           <w:color w:val="D4AF37"/>
           <w:sz w:val="40"/>
         </w:rPr>
-        <w:t>9. Terminal Proof</w:t>
+        <w:t>4. How the Recommendation Logic Works</w:t>
+      </w:r>
+    </w:p>
+    <w:p>
+      <w:r>
+        <w:rPr>
+          <w:rFonts w:ascii="Arial" w:hAnsi="Arial"/>
+          <w:b w:val="0"/>
+          <w:color w:val="282828"/>
+          <w:sz w:val="22"/>
+        </w:rPr>
+        <w:t>The most board-game-specific part of the code is `GameLibrary.recommendForPlayers(int playerCount)`.</w:t>
+      </w:r>
+    </w:p>
+    <w:p>
+      <w:r>
+        <w:rPr>
+          <w:rFonts w:ascii="Arial" w:hAnsi="Arial"/>
+          <w:b w:val="0"/>
+          <w:color w:val="282828"/>
+          <w:sz w:val="22"/>
+        </w:rPr>
+        <w:t>It uses a `while` loop to walk the catalog. For each `BoardGame`, it checks:</w:t>
+      </w:r>
+    </w:p>
+    <w:p>
+      <w:pPr>
+        <w:pStyle w:val="ListBullet"/>
+      </w:pPr>
+      <w:r>
+        <w:rPr>
+          <w:rFonts w:ascii="Arial" w:hAnsi="Arial"/>
+          <w:b w:val="0"/>
+          <w:color w:val="282828"/>
+          <w:sz w:val="22"/>
+        </w:rPr>
+        <w:t>Is the game available?</w:t>
+      </w:r>
+    </w:p>
+    <w:p>
+      <w:pPr>
+        <w:pStyle w:val="ListBullet"/>
+      </w:pPr>
+      <w:r>
+        <w:rPr>
+          <w:rFonts w:ascii="Arial" w:hAnsi="Arial"/>
+          <w:b w:val="0"/>
+          <w:color w:val="282828"/>
+          <w:sz w:val="22"/>
+        </w:rPr>
+        <w:t>Does the requested player count fall between `playerCountMin` and `playerCountMax`?</w:t>
+      </w:r>
+    </w:p>
+    <w:p>
+      <w:r>
+        <w:rPr>
+          <w:rFonts w:ascii="Arial" w:hAnsi="Arial"/>
+          <w:b w:val="0"/>
+          <w:color w:val="282828"/>
+          <w:sz w:val="22"/>
+        </w:rPr>
+        <w:t>If all three pass, the game is printed as a recommendation.</w:t>
+      </w:r>
+    </w:p>
+    <w:tbl>
+      <w:tblPr>
+        <w:tblW w:type="auto" w:w="0"/>
+        <w:jc w:val="left"/>
+        <w:tblLook w:firstColumn="1" w:firstRow="1" w:lastColumn="0" w:lastRow="0" w:noHBand="0" w:noVBand="1" w:val="04A0"/>
+      </w:tblPr>
+      <w:tblGrid>
+        <w:gridCol w:w="9072"/>
+      </w:tblGrid>
+      <w:tr>
+        <w:tc>
+          <w:tcPr>
+            <w:tcW w:type="dxa" w:w="8640"/>
+            <w:shd w:fill="fffaeb"/>
+            <w:tcBorders>
+              <w:top w:val="single" w:sz="4" w:color="d4af37"/>
+              <w:left w:val="single" w:sz="4" w:color="d4af37"/>
+              <w:bottom w:val="single" w:sz="4" w:color="d4af37"/>
+              <w:right w:val="single" w:sz="4" w:color="d4af37"/>
+            </w:tcBorders>
+          </w:tcPr>
+          <w:p>
+            <w:r>
+              <w:rPr>
+                <w:rFonts w:ascii="Consolas" w:hAnsi="Consolas"/>
+                <w:b w:val="0"/>
+                <w:color w:val="282828"/>
+                <w:sz w:val="18"/>
+              </w:rPr>
+              <w:t>void recommendForPlayers(int playerCount) {</w:t>
+              <w:br/>
+              <w:t xml:space="preserve">  bool found = false;</w:t>
+              <w:br/>
+              <w:t xml:space="preserve">  int index = 0;</w:t>
+              <w:br/>
+              <w:br/>
+              <w:t xml:space="preserve">  while (index &lt; catalog.length) {</w:t>
+              <w:br/>
+              <w:t xml:space="preserve">    final game = catalog[index];</w:t>
+              <w:br/>
+              <w:t xml:space="preserve">    if (game is BoardGame &amp;&amp;</w:t>
+              <w:br/>
+              <w:t xml:space="preserve">        game.isAvailable &amp;&amp;</w:t>
+              <w:br/>
+              <w:t xml:space="preserve">        game.playerCountMin &lt;= playerCount &amp;&amp;</w:t>
+              <w:br/>
+              <w:t xml:space="preserve">        game.playerCountMax &gt;= playerCount) {</w:t>
+              <w:br/>
+              <w:t xml:space="preserve">      print('  • ${game.title} (${game.playerRange} players, ${game.playTimeMinutes}m)');</w:t>
+              <w:br/>
+              <w:t xml:space="preserve">      found = true;</w:t>
+              <w:br/>
+              <w:t xml:space="preserve">    }</w:t>
+              <w:br/>
+              <w:t xml:space="preserve">    index++;</w:t>
+              <w:br/>
+              <w:t xml:space="preserve">  }</w:t>
+              <w:br/>
+              <w:br/>
+              <w:t xml:space="preserve">  if (!found) {</w:t>
+              <w:br/>
+              <w:t xml:space="preserve">    print('  No available board games found for $playerCount players.');</w:t>
+              <w:br/>
+              <w:t xml:space="preserve">  }</w:t>
+              <w:br/>
+              <w:t>}</w:t>
+            </w:r>
+          </w:p>
+        </w:tc>
+      </w:tr>
+    </w:tbl>
+    <w:p>
+      <w:r>
+        <w:rPr>
+          <w:rFonts w:ascii="Arial" w:hAnsi="Arial"/>
+          <w:b w:val="0"/>
+          <w:color w:val="282828"/>
+          <w:sz w:val="22"/>
+        </w:rPr>
+        <w:t>This is the heart of the app. It is why the class hierarchy exists: only `BoardGame` has `playerCountMin` and `playerCountMax`, so the `game is BoardGame` check is what makes the recommendation work.</w:t>
+      </w:r>
+    </w:p>
+    <w:p>
+      <w:pPr>
+        <w:pStyle w:val="Heading1"/>
+      </w:pPr>
+      <w:r>
+        <w:rPr>
+          <w:rFonts w:ascii="Arial" w:hAnsi="Arial"/>
+          <w:b/>
+          <w:color w:val="D4AF37"/>
+          <w:sz w:val="40"/>
+        </w:rPr>
+        <w:t>5. Code Tour</w:t>
+      </w:r>
+    </w:p>
+    <w:tbl>
+      <w:tblPr>
+        <w:tblStyle w:val="TableGrid"/>
+        <w:tblW w:type="auto" w:w="0"/>
+        <w:jc w:val="center"/>
+        <w:tblLook w:firstColumn="1" w:firstRow="1" w:lastColumn="0" w:lastRow="0" w:noHBand="0" w:noVBand="1" w:val="04A0"/>
+      </w:tblPr>
+      <w:tblGrid>
+        <w:gridCol w:w="4536"/>
+        <w:gridCol w:w="4536"/>
+      </w:tblGrid>
+      <w:tr>
+        <w:tc>
+          <w:tcPr>
+            <w:tcW w:type="dxa" w:w="4536"/>
+            <w:shd w:fill="d4af37"/>
+            <w:tcBorders>
+              <w:top w:val="single" w:sz="6" w:color="d4af37"/>
+              <w:left w:val="single" w:sz="6" w:color="d4af37"/>
+              <w:bottom w:val="single" w:sz="6" w:color="d4af37"/>
+              <w:right w:val="single" w:sz="6" w:color="d4af37"/>
+            </w:tcBorders>
+          </w:tcPr>
+          <w:p>
+            <w:r/>
+            <w:r>
+              <w:rPr>
+                <w:rFonts w:ascii="Arial" w:hAnsi="Arial"/>
+                <w:b/>
+                <w:color w:val="FFFFFF"/>
+                <w:sz w:val="22"/>
+              </w:rPr>
+              <w:t>File</w:t>
+            </w:r>
+          </w:p>
+        </w:tc>
+        <w:tc>
+          <w:tcPr>
+            <w:tcW w:type="dxa" w:w="4536"/>
+            <w:shd w:fill="d4af37"/>
+            <w:tcBorders>
+              <w:top w:val="single" w:sz="6" w:color="d4af37"/>
+              <w:left w:val="single" w:sz="6" w:color="d4af37"/>
+              <w:bottom w:val="single" w:sz="6" w:color="d4af37"/>
+              <w:right w:val="single" w:sz="6" w:color="d4af37"/>
+            </w:tcBorders>
+          </w:tcPr>
+          <w:p>
+            <w:r/>
+            <w:r>
+              <w:rPr>
+                <w:rFonts w:ascii="Arial" w:hAnsi="Arial"/>
+                <w:b/>
+                <w:color w:val="FFFFFF"/>
+                <w:sz w:val="22"/>
+              </w:rPr>
+              <w:t>What It Does</w:t>
+            </w:r>
+          </w:p>
+        </w:tc>
+      </w:tr>
+      <w:tr>
+        <w:tc>
+          <w:tcPr>
+            <w:tcW w:type="dxa" w:w="4536"/>
+            <w:shd w:fill="fff5dc"/>
+            <w:tcBorders>
+              <w:top w:val="single" w:sz="4" w:color="d4af37"/>
+              <w:left w:val="single" w:sz="4" w:color="d4af37"/>
+              <w:bottom w:val="single" w:sz="4" w:color="d4af37"/>
+              <w:right w:val="single" w:sz="4" w:color="d4af37"/>
+            </w:tcBorders>
+          </w:tcPr>
+          <w:p>
+            <w:r/>
+            <w:r>
+              <w:rPr>
+                <w:rFonts w:ascii="Arial" w:hAnsi="Arial"/>
+                <w:b w:val="0"/>
+                <w:color w:val="282828"/>
+                <w:sz w:val="22"/>
+              </w:rPr>
+              <w:t>`lib/main.dart`</w:t>
+            </w:r>
+          </w:p>
+        </w:tc>
+        <w:tc>
+          <w:tcPr>
+            <w:tcW w:type="dxa" w:w="4536"/>
+            <w:shd w:fill="fff5dc"/>
+            <w:tcBorders>
+              <w:top w:val="single" w:sz="4" w:color="d4af37"/>
+              <w:left w:val="single" w:sz="4" w:color="d4af37"/>
+              <w:bottom w:val="single" w:sz="4" w:color="d4af37"/>
+              <w:right w:val="single" w:sz="4" w:color="d4af37"/>
+            </w:tcBorders>
+          </w:tcPr>
+          <w:p>
+            <w:r/>
+            <w:r>
+              <w:rPr>
+                <w:rFonts w:ascii="Arial" w:hAnsi="Arial"/>
+                <w:b w:val="0"/>
+                <w:color w:val="282828"/>
+                <w:sz w:val="22"/>
+              </w:rPr>
+              <w:t>Entry point. Creates the library, adds games, registers members, runs the demo.</w:t>
+            </w:r>
+          </w:p>
+        </w:tc>
+      </w:tr>
+      <w:tr>
+        <w:tc>
+          <w:tcPr>
+            <w:tcW w:type="dxa" w:w="4536"/>
+            <w:shd w:fill="fff5dc"/>
+            <w:tcBorders>
+              <w:top w:val="single" w:sz="4" w:color="d4af37"/>
+              <w:left w:val="single" w:sz="4" w:color="d4af37"/>
+              <w:bottom w:val="single" w:sz="4" w:color="d4af37"/>
+              <w:right w:val="single" w:sz="4" w:color="d4af37"/>
+            </w:tcBorders>
+          </w:tcPr>
+          <w:p>
+            <w:r/>
+            <w:r>
+              <w:rPr>
+                <w:rFonts w:ascii="Arial" w:hAnsi="Arial"/>
+                <w:b w:val="0"/>
+                <w:color w:val="282828"/>
+                <w:sz w:val="22"/>
+              </w:rPr>
+              <w:t>`lib/game.dart`</w:t>
+            </w:r>
+          </w:p>
+        </w:tc>
+        <w:tc>
+          <w:tcPr>
+            <w:tcW w:type="dxa" w:w="4536"/>
+            <w:shd w:fill="fff5dc"/>
+            <w:tcBorders>
+              <w:top w:val="single" w:sz="4" w:color="d4af37"/>
+              <w:left w:val="single" w:sz="4" w:color="d4af37"/>
+              <w:bottom w:val="single" w:sz="4" w:color="d4af37"/>
+              <w:right w:val="single" w:sz="4" w:color="d4af37"/>
+            </w:tcBorders>
+          </w:tcPr>
+          <w:p>
+            <w:r/>
+            <w:r>
+              <w:rPr>
+                <w:rFonts w:ascii="Arial" w:hAnsi="Arial"/>
+                <w:b w:val="0"/>
+                <w:color w:val="282828"/>
+                <w:sz w:val="22"/>
+              </w:rPr>
+              <w:t>Abstract base class. Holds shared fields (`id`, `title`, `publisher`, `releaseYear`, `genre`, `isAvailable`) and declares `describe()`.</w:t>
+            </w:r>
+          </w:p>
+        </w:tc>
+      </w:tr>
+      <w:tr>
+        <w:tc>
+          <w:tcPr>
+            <w:tcW w:type="dxa" w:w="4536"/>
+            <w:shd w:fill="fff5dc"/>
+            <w:tcBorders>
+              <w:top w:val="single" w:sz="4" w:color="d4af37"/>
+              <w:left w:val="single" w:sz="4" w:color="d4af37"/>
+              <w:bottom w:val="single" w:sz="4" w:color="d4af37"/>
+              <w:right w:val="single" w:sz="4" w:color="d4af37"/>
+            </w:tcBorders>
+          </w:tcPr>
+          <w:p>
+            <w:r/>
+            <w:r>
+              <w:rPr>
+                <w:rFonts w:ascii="Arial" w:hAnsi="Arial"/>
+                <w:b w:val="0"/>
+                <w:color w:val="282828"/>
+                <w:sz w:val="22"/>
+              </w:rPr>
+              <w:t>`lib/board_game.dart`</w:t>
+            </w:r>
+          </w:p>
+        </w:tc>
+        <w:tc>
+          <w:tcPr>
+            <w:tcW w:type="dxa" w:w="4536"/>
+            <w:shd w:fill="fff5dc"/>
+            <w:tcBorders>
+              <w:top w:val="single" w:sz="4" w:color="d4af37"/>
+              <w:left w:val="single" w:sz="4" w:color="d4af37"/>
+              <w:bottom w:val="single" w:sz="4" w:color="d4af37"/>
+              <w:right w:val="single" w:sz="4" w:color="d4af37"/>
+            </w:tcBorders>
+          </w:tcPr>
+          <w:p>
+            <w:r/>
+            <w:r>
+              <w:rPr>
+                <w:rFonts w:ascii="Arial" w:hAnsi="Arial"/>
+                <w:b w:val="0"/>
+                <w:color w:val="282828"/>
+                <w:sz w:val="22"/>
+              </w:rPr>
+              <w:t>`BoardGame` subclass. Adds player counts, playtime, and complexity rating.</w:t>
+            </w:r>
+          </w:p>
+        </w:tc>
+      </w:tr>
+      <w:tr>
+        <w:tc>
+          <w:tcPr>
+            <w:tcW w:type="dxa" w:w="4536"/>
+            <w:shd w:fill="fff5dc"/>
+            <w:tcBorders>
+              <w:top w:val="single" w:sz="4" w:color="d4af37"/>
+              <w:left w:val="single" w:sz="4" w:color="d4af37"/>
+              <w:bottom w:val="single" w:sz="4" w:color="d4af37"/>
+              <w:right w:val="single" w:sz="4" w:color="d4af37"/>
+            </w:tcBorders>
+          </w:tcPr>
+          <w:p>
+            <w:r/>
+            <w:r>
+              <w:rPr>
+                <w:rFonts w:ascii="Arial" w:hAnsi="Arial"/>
+                <w:b w:val="0"/>
+                <w:color w:val="282828"/>
+                <w:sz w:val="22"/>
+              </w:rPr>
+              <w:t>`lib/card_game.dart`</w:t>
+            </w:r>
+          </w:p>
+        </w:tc>
+        <w:tc>
+          <w:tcPr>
+            <w:tcW w:type="dxa" w:w="4536"/>
+            <w:shd w:fill="fff5dc"/>
+            <w:tcBorders>
+              <w:top w:val="single" w:sz="4" w:color="d4af37"/>
+              <w:left w:val="single" w:sz="4" w:color="d4af37"/>
+              <w:bottom w:val="single" w:sz="4" w:color="d4af37"/>
+              <w:right w:val="single" w:sz="4" w:color="d4af37"/>
+            </w:tcBorders>
+          </w:tcPr>
+          <w:p>
+            <w:r/>
+            <w:r>
+              <w:rPr>
+                <w:rFonts w:ascii="Arial" w:hAnsi="Arial"/>
+                <w:b w:val="0"/>
+                <w:color w:val="282828"/>
+                <w:sz w:val="22"/>
+              </w:rPr>
+              <w:t>`CardGame` subclass. Adds deck size and average playtime.</w:t>
+            </w:r>
+          </w:p>
+        </w:tc>
+      </w:tr>
+      <w:tr>
+        <w:tc>
+          <w:tcPr>
+            <w:tcW w:type="dxa" w:w="4536"/>
+            <w:shd w:fill="fff5dc"/>
+            <w:tcBorders>
+              <w:top w:val="single" w:sz="4" w:color="d4af37"/>
+              <w:left w:val="single" w:sz="4" w:color="d4af37"/>
+              <w:bottom w:val="single" w:sz="4" w:color="d4af37"/>
+              <w:right w:val="single" w:sz="4" w:color="d4af37"/>
+            </w:tcBorders>
+          </w:tcPr>
+          <w:p>
+            <w:r/>
+            <w:r>
+              <w:rPr>
+                <w:rFonts w:ascii="Arial" w:hAnsi="Arial"/>
+                <w:b w:val="0"/>
+                <w:color w:val="282828"/>
+                <w:sz w:val="22"/>
+              </w:rPr>
+              <w:t>`lib/rpg_manual.dart`</w:t>
+            </w:r>
+          </w:p>
+        </w:tc>
+        <w:tc>
+          <w:tcPr>
+            <w:tcW w:type="dxa" w:w="4536"/>
+            <w:shd w:fill="fff5dc"/>
+            <w:tcBorders>
+              <w:top w:val="single" w:sz="4" w:color="d4af37"/>
+              <w:left w:val="single" w:sz="4" w:color="d4af37"/>
+              <w:bottom w:val="single" w:sz="4" w:color="d4af37"/>
+              <w:right w:val="single" w:sz="4" w:color="d4af37"/>
+            </w:tcBorders>
+          </w:tcPr>
+          <w:p>
+            <w:r/>
+            <w:r>
+              <w:rPr>
+                <w:rFonts w:ascii="Arial" w:hAnsi="Arial"/>
+                <w:b w:val="0"/>
+                <w:color w:val="282828"/>
+                <w:sz w:val="22"/>
+              </w:rPr>
+              <w:t>`RPGManual` subclass. Adds edition and page count.</w:t>
+            </w:r>
+          </w:p>
+        </w:tc>
+      </w:tr>
+      <w:tr>
+        <w:tc>
+          <w:tcPr>
+            <w:tcW w:type="dxa" w:w="4536"/>
+            <w:shd w:fill="fff5dc"/>
+            <w:tcBorders>
+              <w:top w:val="single" w:sz="4" w:color="d4af37"/>
+              <w:left w:val="single" w:sz="4" w:color="d4af37"/>
+              <w:bottom w:val="single" w:sz="4" w:color="d4af37"/>
+              <w:right w:val="single" w:sz="4" w:color="d4af37"/>
+            </w:tcBorders>
+          </w:tcPr>
+          <w:p>
+            <w:r/>
+            <w:r>
+              <w:rPr>
+                <w:rFonts w:ascii="Arial" w:hAnsi="Arial"/>
+                <w:b w:val="0"/>
+                <w:color w:val="282828"/>
+                <w:sz w:val="22"/>
+              </w:rPr>
+              <w:t>`lib/member.dart`</w:t>
+            </w:r>
+          </w:p>
+        </w:tc>
+        <w:tc>
+          <w:tcPr>
+            <w:tcW w:type="dxa" w:w="4536"/>
+            <w:shd w:fill="fff5dc"/>
+            <w:tcBorders>
+              <w:top w:val="single" w:sz="4" w:color="d4af37"/>
+              <w:left w:val="single" w:sz="4" w:color="d4af37"/>
+              <w:bottom w:val="single" w:sz="4" w:color="d4af37"/>
+              <w:right w:val="single" w:sz="4" w:color="d4af37"/>
+            </w:tcBorders>
+          </w:tcPr>
+          <w:p>
+            <w:r/>
+            <w:r>
+              <w:rPr>
+                <w:rFonts w:ascii="Arial" w:hAnsi="Arial"/>
+                <w:b w:val="0"/>
+                <w:color w:val="282828"/>
+                <w:sz w:val="22"/>
+              </w:rPr>
+              <w:t>`Member` class. Tracks a member's borrowed games.</w:t>
+            </w:r>
+          </w:p>
+        </w:tc>
+      </w:tr>
+      <w:tr>
+        <w:tc>
+          <w:tcPr>
+            <w:tcW w:type="dxa" w:w="4536"/>
+            <w:shd w:fill="fff5dc"/>
+            <w:tcBorders>
+              <w:top w:val="single" w:sz="4" w:color="d4af37"/>
+              <w:left w:val="single" w:sz="4" w:color="d4af37"/>
+              <w:bottom w:val="single" w:sz="4" w:color="d4af37"/>
+              <w:right w:val="single" w:sz="4" w:color="d4af37"/>
+            </w:tcBorders>
+          </w:tcPr>
+          <w:p>
+            <w:r/>
+            <w:r>
+              <w:rPr>
+                <w:rFonts w:ascii="Arial" w:hAnsi="Arial"/>
+                <w:b w:val="0"/>
+                <w:color w:val="282828"/>
+                <w:sz w:val="22"/>
+              </w:rPr>
+              <w:t>`lib/game_library.dart`</w:t>
+            </w:r>
+          </w:p>
+        </w:tc>
+        <w:tc>
+          <w:tcPr>
+            <w:tcW w:type="dxa" w:w="4536"/>
+            <w:shd w:fill="fff5dc"/>
+            <w:tcBorders>
+              <w:top w:val="single" w:sz="4" w:color="d4af37"/>
+              <w:left w:val="single" w:sz="4" w:color="d4af37"/>
+              <w:bottom w:val="single" w:sz="4" w:color="d4af37"/>
+              <w:right w:val="single" w:sz="4" w:color="d4af37"/>
+            </w:tcBorders>
+          </w:tcPr>
+          <w:p>
+            <w:r/>
+            <w:r>
+              <w:rPr>
+                <w:rFonts w:ascii="Arial" w:hAnsi="Arial"/>
+                <w:b w:val="0"/>
+                <w:color w:val="282828"/>
+                <w:sz w:val="22"/>
+              </w:rPr>
+              <w:t>`GameLibrary` controller. Manages catalog, members, borrowing, returning, and recommendations.</w:t>
+            </w:r>
+          </w:p>
+        </w:tc>
+      </w:tr>
+      <w:tr>
+        <w:tc>
+          <w:tcPr>
+            <w:tcW w:type="dxa" w:w="4536"/>
+            <w:shd w:fill="fff5dc"/>
+            <w:tcBorders>
+              <w:top w:val="single" w:sz="4" w:color="d4af37"/>
+              <w:left w:val="single" w:sz="4" w:color="d4af37"/>
+              <w:bottom w:val="single" w:sz="4" w:color="d4af37"/>
+              <w:right w:val="single" w:sz="4" w:color="d4af37"/>
+            </w:tcBorders>
+          </w:tcPr>
+          <w:p>
+            <w:r/>
+            <w:r>
+              <w:rPr>
+                <w:rFonts w:ascii="Arial" w:hAnsi="Arial"/>
+                <w:b w:val="0"/>
+                <w:color w:val="282828"/>
+                <w:sz w:val="22"/>
+              </w:rPr>
+              <w:t>`lib/late_fee_calculator.dart`</w:t>
+            </w:r>
+          </w:p>
+        </w:tc>
+        <w:tc>
+          <w:tcPr>
+            <w:tcW w:type="dxa" w:w="4536"/>
+            <w:shd w:fill="fff5dc"/>
+            <w:tcBorders>
+              <w:top w:val="single" w:sz="4" w:color="d4af37"/>
+              <w:left w:val="single" w:sz="4" w:color="d4af37"/>
+              <w:bottom w:val="single" w:sz="4" w:color="d4af37"/>
+              <w:right w:val="single" w:sz="4" w:color="d4af37"/>
+            </w:tcBorders>
+          </w:tcPr>
+          <w:p>
+            <w:r/>
+            <w:r>
+              <w:rPr>
+                <w:rFonts w:ascii="Arial" w:hAnsi="Arial"/>
+                <w:b w:val="0"/>
+                <w:color w:val="282828"/>
+                <w:sz w:val="22"/>
+              </w:rPr>
+              <w:t>Pure utility for overdue fees.</w:t>
+            </w:r>
+          </w:p>
+        </w:tc>
+      </w:tr>
+    </w:tbl>
+    <w:p>
+      <w:pPr>
+        <w:pStyle w:val="Heading2"/>
+      </w:pPr>
+      <w:r>
+        <w:rPr>
+          <w:rFonts w:ascii="Arial" w:hAnsi="Arial"/>
+          <w:b/>
+          <w:color w:val="D4AF37"/>
+          <w:sz w:val="32"/>
+        </w:rPr>
+        <w:t>How the pieces connect</w:t>
+      </w:r>
+    </w:p>
+    <w:tbl>
+      <w:tblPr>
+        <w:tblW w:type="auto" w:w="0"/>
+        <w:jc w:val="left"/>
+        <w:tblLook w:firstColumn="1" w:firstRow="1" w:lastColumn="0" w:lastRow="0" w:noHBand="0" w:noVBand="1" w:val="04A0"/>
+      </w:tblPr>
+      <w:tblGrid>
+        <w:gridCol w:w="9072"/>
+      </w:tblGrid>
+      <w:tr>
+        <w:tc>
+          <w:tcPr>
+            <w:tcW w:type="dxa" w:w="8640"/>
+            <w:shd w:fill="fffaeb"/>
+            <w:tcBorders>
+              <w:top w:val="single" w:sz="4" w:color="d4af37"/>
+              <w:left w:val="single" w:sz="4" w:color="d4af37"/>
+              <w:bottom w:val="single" w:sz="4" w:color="d4af37"/>
+              <w:right w:val="single" w:sz="4" w:color="d4af37"/>
+            </w:tcBorders>
+          </w:tcPr>
+          <w:p>
+            <w:r>
+              <w:rPr>
+                <w:rFonts w:ascii="Consolas" w:hAnsi="Consolas"/>
+                <w:b w:val="0"/>
+                <w:color w:val="282828"/>
+                <w:sz w:val="18"/>
+              </w:rPr>
+              <w:t>main.dart</w:t>
+              <w:br/>
+              <w:t xml:space="preserve">    ↓ creates</w:t>
+              <w:br/>
+              <w:t>GameLibrary</w:t>
+              <w:br/>
+              <w:t xml:space="preserve">    ├── manages catalog: List&lt;Game&gt;</w:t>
+              <w:br/>
+              <w:t xml:space="preserve">    │       └── Game (abstract)</w:t>
+              <w:br/>
+              <w:t xml:space="preserve">    │               ├── BoardGame  → playerCountMin/Max, playTimeMinutes, complexityRating</w:t>
+              <w:br/>
+              <w:t xml:space="preserve">    │               ├── CardGame   → deckSize, avgPlayTimeMinutes</w:t>
+              <w:br/>
+              <w:t xml:space="preserve">    │               └── RPGManual  → edition, pageCount</w:t>
+              <w:br/>
+              <w:t xml:space="preserve">    └── manages members: Map&lt;String, Member&gt;</w:t>
+              <w:br/>
+              <w:t xml:space="preserve">            └── Member → List&lt;Game&gt; borrowedGames</w:t>
+            </w:r>
+          </w:p>
+        </w:tc>
+      </w:tr>
+    </w:tbl>
+    <w:p>
+      <w:pPr>
+        <w:pStyle w:val="Heading1"/>
+      </w:pPr>
+      <w:r>
+        <w:rPr>
+          <w:rFonts w:ascii="Arial" w:hAnsi="Arial"/>
+          <w:b/>
+          <w:color w:val="D4AF37"/>
+          <w:sz w:val="40"/>
+        </w:rPr>
+        <w:t>6. When Things Go Wrong</w:t>
+      </w:r>
+    </w:p>
+    <w:p>
+      <w:r>
+        <w:rPr>
+          <w:rFonts w:ascii="Arial" w:hAnsi="Arial"/>
+          <w:b w:val="0"/>
+          <w:color w:val="282828"/>
+          <w:sz w:val="22"/>
+        </w:rPr>
+        <w:t>The app handles these board-game-specific edge cases:</w:t>
+      </w:r>
+    </w:p>
+    <w:tbl>
+      <w:tblPr>
+        <w:tblStyle w:val="TableGrid"/>
+        <w:tblW w:type="auto" w:w="0"/>
+        <w:jc w:val="center"/>
+        <w:tblLook w:firstColumn="1" w:firstRow="1" w:lastColumn="0" w:lastRow="0" w:noHBand="0" w:noVBand="1" w:val="04A0"/>
+      </w:tblPr>
+      <w:tblGrid>
+        <w:gridCol w:w="4536"/>
+        <w:gridCol w:w="4536"/>
+      </w:tblGrid>
+      <w:tr>
+        <w:tc>
+          <w:tcPr>
+            <w:tcW w:type="dxa" w:w="4536"/>
+            <w:shd w:fill="d4af37"/>
+            <w:tcBorders>
+              <w:top w:val="single" w:sz="6" w:color="d4af37"/>
+              <w:left w:val="single" w:sz="6" w:color="d4af37"/>
+              <w:bottom w:val="single" w:sz="6" w:color="d4af37"/>
+              <w:right w:val="single" w:sz="6" w:color="d4af37"/>
+            </w:tcBorders>
+          </w:tcPr>
+          <w:p>
+            <w:r/>
+            <w:r>
+              <w:rPr>
+                <w:rFonts w:ascii="Arial" w:hAnsi="Arial"/>
+                <w:b/>
+                <w:color w:val="FFFFFF"/>
+                <w:sz w:val="22"/>
+              </w:rPr>
+              <w:t>Case</w:t>
+            </w:r>
+          </w:p>
+        </w:tc>
+        <w:tc>
+          <w:tcPr>
+            <w:tcW w:type="dxa" w:w="4536"/>
+            <w:shd w:fill="d4af37"/>
+            <w:tcBorders>
+              <w:top w:val="single" w:sz="6" w:color="d4af37"/>
+              <w:left w:val="single" w:sz="6" w:color="d4af37"/>
+              <w:bottom w:val="single" w:sz="6" w:color="d4af37"/>
+              <w:right w:val="single" w:sz="6" w:color="d4af37"/>
+            </w:tcBorders>
+          </w:tcPr>
+          <w:p>
+            <w:r/>
+            <w:r>
+              <w:rPr>
+                <w:rFonts w:ascii="Arial" w:hAnsi="Arial"/>
+                <w:b/>
+                <w:color w:val="FFFFFF"/>
+                <w:sz w:val="22"/>
+              </w:rPr>
+              <w:t>What Happens</w:t>
+            </w:r>
+          </w:p>
+        </w:tc>
+      </w:tr>
+      <w:tr>
+        <w:tc>
+          <w:tcPr>
+            <w:tcW w:type="dxa" w:w="4536"/>
+            <w:shd w:fill="fff5dc"/>
+            <w:tcBorders>
+              <w:top w:val="single" w:sz="4" w:color="d4af37"/>
+              <w:left w:val="single" w:sz="4" w:color="d4af37"/>
+              <w:bottom w:val="single" w:sz="4" w:color="d4af37"/>
+              <w:right w:val="single" w:sz="4" w:color="d4af37"/>
+            </w:tcBorders>
+          </w:tcPr>
+          <w:p>
+            <w:r/>
+            <w:r>
+              <w:rPr>
+                <w:rFonts w:ascii="Arial" w:hAnsi="Arial"/>
+                <w:b w:val="0"/>
+                <w:color w:val="282828"/>
+                <w:sz w:val="22"/>
+              </w:rPr>
+              <w:t>A member tries to borrow a game that is already out</w:t>
+            </w:r>
+          </w:p>
+        </w:tc>
+        <w:tc>
+          <w:tcPr>
+            <w:tcW w:type="dxa" w:w="4536"/>
+            <w:shd w:fill="fff5dc"/>
+            <w:tcBorders>
+              <w:top w:val="single" w:sz="4" w:color="d4af37"/>
+              <w:left w:val="single" w:sz="4" w:color="d4af37"/>
+              <w:bottom w:val="single" w:sz="4" w:color="d4af37"/>
+              <w:right w:val="single" w:sz="4" w:color="d4af37"/>
+            </w:tcBorders>
+          </w:tcPr>
+          <w:p>
+            <w:r/>
+            <w:r>
+              <w:rPr>
+                <w:rFonts w:ascii="Arial" w:hAnsi="Arial"/>
+                <w:b w:val="0"/>
+                <w:color w:val="282828"/>
+                <w:sz w:val="22"/>
+              </w:rPr>
+              <w:t>`borrowGame()` checks `isAvailable` and prints a message</w:t>
+            </w:r>
+          </w:p>
+        </w:tc>
+      </w:tr>
+      <w:tr>
+        <w:tc>
+          <w:tcPr>
+            <w:tcW w:type="dxa" w:w="4536"/>
+            <w:shd w:fill="fff5dc"/>
+            <w:tcBorders>
+              <w:top w:val="single" w:sz="4" w:color="d4af37"/>
+              <w:left w:val="single" w:sz="4" w:color="d4af37"/>
+              <w:bottom w:val="single" w:sz="4" w:color="d4af37"/>
+              <w:right w:val="single" w:sz="4" w:color="d4af37"/>
+            </w:tcBorders>
+          </w:tcPr>
+          <w:p>
+            <w:r/>
+            <w:r>
+              <w:rPr>
+                <w:rFonts w:ascii="Arial" w:hAnsi="Arial"/>
+                <w:b w:val="0"/>
+                <w:color w:val="282828"/>
+                <w:sz w:val="22"/>
+              </w:rPr>
+              <w:t>A member returns a game they never borrowed</w:t>
+            </w:r>
+          </w:p>
+        </w:tc>
+        <w:tc>
+          <w:tcPr>
+            <w:tcW w:type="dxa" w:w="4536"/>
+            <w:shd w:fill="fff5dc"/>
+            <w:tcBorders>
+              <w:top w:val="single" w:sz="4" w:color="d4af37"/>
+              <w:left w:val="single" w:sz="4" w:color="d4af37"/>
+              <w:bottom w:val="single" w:sz="4" w:color="d4af37"/>
+              <w:right w:val="single" w:sz="4" w:color="d4af37"/>
+            </w:tcBorders>
+          </w:tcPr>
+          <w:p>
+            <w:r/>
+            <w:r>
+              <w:rPr>
+                <w:rFonts w:ascii="Arial" w:hAnsi="Arial"/>
+                <w:b w:val="0"/>
+                <w:color w:val="282828"/>
+                <w:sz w:val="22"/>
+              </w:rPr>
+              <w:t>`returnGame()` checks `borrowedGames.contains(game)` and rejects it</w:t>
+            </w:r>
+          </w:p>
+        </w:tc>
+      </w:tr>
+      <w:tr>
+        <w:tc>
+          <w:tcPr>
+            <w:tcW w:type="dxa" w:w="4536"/>
+            <w:shd w:fill="fff5dc"/>
+            <w:tcBorders>
+              <w:top w:val="single" w:sz="4" w:color="d4af37"/>
+              <w:left w:val="single" w:sz="4" w:color="d4af37"/>
+              <w:bottom w:val="single" w:sz="4" w:color="d4af37"/>
+              <w:right w:val="single" w:sz="4" w:color="d4af37"/>
+            </w:tcBorders>
+          </w:tcPr>
+          <w:p>
+            <w:r/>
+            <w:r>
+              <w:rPr>
+                <w:rFonts w:ascii="Arial" w:hAnsi="Arial"/>
+                <w:b w:val="0"/>
+                <w:color w:val="282828"/>
+                <w:sz w:val="22"/>
+              </w:rPr>
+              <w:t>Recommendation search for a player count nobody supports</w:t>
+            </w:r>
+          </w:p>
+        </w:tc>
+        <w:tc>
+          <w:tcPr>
+            <w:tcW w:type="dxa" w:w="4536"/>
+            <w:shd w:fill="fff5dc"/>
+            <w:tcBorders>
+              <w:top w:val="single" w:sz="4" w:color="d4af37"/>
+              <w:left w:val="single" w:sz="4" w:color="d4af37"/>
+              <w:bottom w:val="single" w:sz="4" w:color="d4af37"/>
+              <w:right w:val="single" w:sz="4" w:color="d4af37"/>
+            </w:tcBorders>
+          </w:tcPr>
+          <w:p>
+            <w:r/>
+            <w:r>
+              <w:rPr>
+                <w:rFonts w:ascii="Arial" w:hAnsi="Arial"/>
+                <w:b w:val="0"/>
+                <w:color w:val="282828"/>
+                <w:sz w:val="22"/>
+              </w:rPr>
+              <w:t>The `while` loop finishes and prints "No available board games found"</w:t>
+            </w:r>
+          </w:p>
+        </w:tc>
+      </w:tr>
+      <w:tr>
+        <w:tc>
+          <w:tcPr>
+            <w:tcW w:type="dxa" w:w="4536"/>
+            <w:shd w:fill="fff5dc"/>
+            <w:tcBorders>
+              <w:top w:val="single" w:sz="4" w:color="d4af37"/>
+              <w:left w:val="single" w:sz="4" w:color="d4af37"/>
+              <w:bottom w:val="single" w:sz="4" w:color="d4af37"/>
+              <w:right w:val="single" w:sz="4" w:color="d4af37"/>
+            </w:tcBorders>
+          </w:tcPr>
+          <w:p>
+            <w:r/>
+            <w:r>
+              <w:rPr>
+                <w:rFonts w:ascii="Arial" w:hAnsi="Arial"/>
+                <w:b w:val="0"/>
+                <w:color w:val="282828"/>
+                <w:sz w:val="22"/>
+              </w:rPr>
+              <w:t>Recommendation search for a player count but all matches are borrowed</w:t>
+            </w:r>
+          </w:p>
+        </w:tc>
+        <w:tc>
+          <w:tcPr>
+            <w:tcW w:type="dxa" w:w="4536"/>
+            <w:shd w:fill="fff5dc"/>
+            <w:tcBorders>
+              <w:top w:val="single" w:sz="4" w:color="d4af37"/>
+              <w:left w:val="single" w:sz="4" w:color="d4af37"/>
+              <w:bottom w:val="single" w:sz="4" w:color="d4af37"/>
+              <w:right w:val="single" w:sz="4" w:color="d4af37"/>
+            </w:tcBorders>
+          </w:tcPr>
+          <w:p>
+            <w:r/>
+            <w:r>
+              <w:rPr>
+                <w:rFonts w:ascii="Arial" w:hAnsi="Arial"/>
+                <w:b w:val="0"/>
+                <w:color w:val="282828"/>
+                <w:sz w:val="22"/>
+              </w:rPr>
+              <w:t>Same as above — `isAvailable` is checked before recommending</w:t>
+            </w:r>
+          </w:p>
+        </w:tc>
+      </w:tr>
+      <w:tr>
+        <w:tc>
+          <w:tcPr>
+            <w:tcW w:type="dxa" w:w="4536"/>
+            <w:shd w:fill="fff5dc"/>
+            <w:tcBorders>
+              <w:top w:val="single" w:sz="4" w:color="d4af37"/>
+              <w:left w:val="single" w:sz="4" w:color="d4af37"/>
+              <w:bottom w:val="single" w:sz="4" w:color="d4af37"/>
+              <w:right w:val="single" w:sz="4" w:color="d4af37"/>
+            </w:tcBorders>
+          </w:tcPr>
+          <w:p>
+            <w:r/>
+            <w:r>
+              <w:rPr>
+                <w:rFonts w:ascii="Arial" w:hAnsi="Arial"/>
+                <w:b w:val="0"/>
+                <w:color w:val="282828"/>
+                <w:sz w:val="22"/>
+              </w:rPr>
+              <w:t>Late fee for 0 or negative overdue days</w:t>
+            </w:r>
+          </w:p>
+        </w:tc>
+        <w:tc>
+          <w:tcPr>
+            <w:tcW w:type="dxa" w:w="4536"/>
+            <w:shd w:fill="fff5dc"/>
+            <w:tcBorders>
+              <w:top w:val="single" w:sz="4" w:color="d4af37"/>
+              <w:left w:val="single" w:sz="4" w:color="d4af37"/>
+              <w:bottom w:val="single" w:sz="4" w:color="d4af37"/>
+              <w:right w:val="single" w:sz="4" w:color="d4af37"/>
+            </w:tcBorders>
+          </w:tcPr>
+          <w:p>
+            <w:r/>
+            <w:r>
+              <w:rPr>
+                <w:rFonts w:ascii="Arial" w:hAnsi="Arial"/>
+                <w:b w:val="0"/>
+                <w:color w:val="282828"/>
+                <w:sz w:val="22"/>
+              </w:rPr>
+              <w:t>`calculateLateFee()` returns `$0.00` immediately</w:t>
+            </w:r>
+          </w:p>
+        </w:tc>
+      </w:tr>
+      <w:tr>
+        <w:tc>
+          <w:tcPr>
+            <w:tcW w:type="dxa" w:w="4536"/>
+            <w:shd w:fill="fff5dc"/>
+            <w:tcBorders>
+              <w:top w:val="single" w:sz="4" w:color="d4af37"/>
+              <w:left w:val="single" w:sz="4" w:color="d4af37"/>
+              <w:bottom w:val="single" w:sz="4" w:color="d4af37"/>
+              <w:right w:val="single" w:sz="4" w:color="d4af37"/>
+            </w:tcBorders>
+          </w:tcPr>
+          <w:p>
+            <w:r/>
+            <w:r>
+              <w:rPr>
+                <w:rFonts w:ascii="Arial" w:hAnsi="Arial"/>
+                <w:b w:val="0"/>
+                <w:color w:val="282828"/>
+                <w:sz w:val="22"/>
+              </w:rPr>
+              <w:t>Late fee for an unrecognized game type</w:t>
+            </w:r>
+          </w:p>
+        </w:tc>
+        <w:tc>
+          <w:tcPr>
+            <w:tcW w:type="dxa" w:w="4536"/>
+            <w:shd w:fill="fff5dc"/>
+            <w:tcBorders>
+              <w:top w:val="single" w:sz="4" w:color="d4af37"/>
+              <w:left w:val="single" w:sz="4" w:color="d4af37"/>
+              <w:bottom w:val="single" w:sz="4" w:color="d4af37"/>
+              <w:right w:val="single" w:sz="4" w:color="d4af37"/>
+            </w:tcBorders>
+          </w:tcPr>
+          <w:p>
+            <w:r/>
+            <w:r>
+              <w:rPr>
+                <w:rFonts w:ascii="Arial" w:hAnsi="Arial"/>
+                <w:b w:val="0"/>
+                <w:color w:val="282828"/>
+                <w:sz w:val="22"/>
+              </w:rPr>
+              <w:t>The `switch` falls back to a `1.0` multiplier (card game rate)</w:t>
+            </w:r>
+          </w:p>
+        </w:tc>
+      </w:tr>
+    </w:tbl>
+    <w:p>
+      <w:pPr>
+        <w:pStyle w:val="Heading1"/>
+      </w:pPr>
+      <w:r>
+        <w:rPr>
+          <w:rFonts w:ascii="Arial" w:hAnsi="Arial"/>
+          <w:b/>
+          <w:color w:val="D4AF37"/>
+          <w:sz w:val="40"/>
+        </w:rPr>
+        <w:t>7. Terminal Proof</w:t>
       </w:r>
     </w:p>
     <w:p>
@@ -2465,7 +1619,7 @@
           <w:color w:val="D4AF37"/>
           <w:sz w:val="40"/>
         </w:rPr>
-        <w:t>10. What Could Come Next</w:t>
+        <w:t>8. Next Steps</w:t>
       </w:r>
     </w:p>
     <w:p>
@@ -2479,7 +1633,7 @@
           <w:color w:val="282828"/>
           <w:sz w:val="22"/>
         </w:rPr>
-        <w:t>Add a `Reservation` class for holds on borrowed games.</w:t>
+        <w:t>Persist the catalog to a JSON file so the library remembers state between runs.</w:t>
       </w:r>
     </w:p>
     <w:p>
@@ -2493,7 +1647,7 @@
           <w:color w:val="282828"/>
           <w:sz w:val="22"/>
         </w:rPr>
-        <w:t>Persist the catalog and member list to JSON.</w:t>
+        <w:t>Add due dates and track how long each game has been out.</w:t>
       </w:r>
     </w:p>
     <w:p>
@@ -2507,7 +1661,7 @@
           <w:color w:val="282828"/>
           <w:sz w:val="22"/>
         </w:rPr>
-        <w:t>Add due dates and automatic overdue reminders.</w:t>
+        <w:t>Let members reserve games that are currently borrowed.</w:t>
       </w:r>
     </w:p>
     <w:p>
@@ -2521,21 +1675,7 @@
           <w:color w:val="282828"/>
           <w:sz w:val="22"/>
         </w:rPr>
-        <w:t>Build an interactive CLI menu instead of a fixed demo.</w:t>
-      </w:r>
-    </w:p>
-    <w:p>
-      <w:pPr>
-        <w:pStyle w:val="Heading1"/>
-      </w:pPr>
-      <w:r>
-        <w:rPr>
-          <w:rFonts w:ascii="Arial" w:hAnsi="Arial"/>
-          <w:b/>
-          <w:color w:val="D4AF37"/>
-          <w:sz w:val="40"/>
-        </w:rPr>
-        <w:t>11. Closing</w:t>
+        <w:t>Build an interactive menu so librarians can add games and members at runtime.</w:t>
       </w:r>
     </w:p>
     <w:p>
@@ -2546,7 +1686,23 @@
           <w:color w:val="282828"/>
           <w:sz w:val="22"/>
         </w:rPr>
-        <w:t>This assignment shows the same core Dart skills as a traditional library app, but applied to a different domain. A board game library needs the same inheritance, collections, and control flow — it just happens to be more fun to demo.</w:t>
+      </w:r>
+      <w:r>
+        <w:rPr>
+          <w:rFonts w:ascii="Arial" w:hAnsi="Arial"/>
+          <w:b/>
+          <w:color w:val="D4AF37"/>
+          <w:sz w:val="22"/>
+        </w:rPr>
+        <w:t>Built by Soumitra Deshpande · Roll No. 150096724035</w:t>
+      </w:r>
+      <w:r>
+        <w:rPr>
+          <w:rFonts w:ascii="Arial" w:hAnsi="Arial"/>
+          <w:b w:val="0"/>
+          <w:color w:val="282828"/>
+          <w:sz w:val="22"/>
+        </w:rPr>
       </w:r>
     </w:p>
     <w:sectPr>

</xml_diff>